<commit_message>
docs: TLS 1.3 (06 section 24, 07's network gaps, the TLS README's config notes)
Co-Authored-By: Claude Opus 5.5 <noreply@anthropic.com>
Claude-Session: https://claude.ai/code/session_01UcY36na7Mp1DEYttKiw1pa
</commit_message>
<xml_diff>
--- a/docs/exports/06-NETSURF-CHANGES.docx
+++ b/docs/exports/06-NETSURF-CHANGES.docx
@@ -44120,6 +44120,315 @@
           <w:b/>
           <w:bCs/>
         </w:rPr>
+        <w:t xml:space="preserve">TLS 1.3.</w:t>
+      </w:r>
+      <w:r>
+        <w:t xml:space="preserve"> </w:t>
+      </w:r>
+      <w:r>
+        <w:t xml:space="preserve">mbedTLS is built with TLS 1.3 besides 1.2 (</w:t>
+      </w:r>
+      <w:r>
+        <w:rPr>
+          <w:rStyle w:val="VerbatimChar"/>
+        </w:rPr>
+        <w:t xml:space="preserve">MBEDTLS_SSL_PROTO_TLS1_3</w:t>
+      </w:r>
+      <w:r>
+        <w:t xml:space="preserve">): 1.3</w:t>
+      </w:r>
+      <w:r>
+        <w:t xml:space="preserve"> </w:t>
+      </w:r>
+      <w:r>
+        <w:t xml:space="preserve">runs on mbedTLS' PSA crypto, whose random generator is the app's</w:t>
+      </w:r>
+      <w:r>
+        <w:t xml:space="preserve"> </w:t>
+      </w:r>
+      <w:r>
+        <w:t xml:space="preserve">(</w:t>
+      </w:r>
+      <w:r>
+        <w:rPr>
+          <w:rStyle w:val="VerbatimChar"/>
+        </w:rPr>
+        <w:t xml:space="preserve">MBEDTLS_PSA_CRYPTO_EXTERNAL_RNG</w:t>
+      </w:r>
+      <w:r>
+        <w:t xml:space="preserve">:</w:t>
+      </w:r>
+      <w:r>
+        <w:t xml:space="preserve"> </w:t>
+      </w:r>
+      <w:r>
+        <w:rPr>
+          <w:rStyle w:val="VerbatimChar"/>
+        </w:rPr>
+        <w:t xml:space="preserve">mbedtls_psa_external_get_random</w:t>
+      </w:r>
+      <w:r>
+        <w:t xml:space="preserve"> </w:t>
+      </w:r>
+      <w:r>
+        <w:t xml:space="preserve">in</w:t>
+      </w:r>
+      <w:r>
+        <w:t xml:space="preserve"> </w:t>
+      </w:r>
+      <w:r>
+        <w:rPr>
+          <w:rStyle w:val="VerbatimChar"/>
+        </w:rPr>
+        <w:t xml:space="preserve">user/tls/onyx_tls.hpp</w:t>
+      </w:r>
+      <w:r>
+        <w:t xml:space="preserve">, over</w:t>
+      </w:r>
+      <w:r>
+        <w:t xml:space="preserve"> </w:t>
+      </w:r>
+      <w:r>
+        <w:rPr>
+          <w:rStyle w:val="VerbatimChar"/>
+        </w:rPr>
+        <w:t xml:space="preserve">kapi_random</w:t>
+      </w:r>
+      <w:r>
+        <w:t xml:space="preserve">;</w:t>
+      </w:r>
+      <w:r>
+        <w:t xml:space="preserve"> </w:t>
+      </w:r>
+      <w:r>
+        <w:rPr>
+          <w:rStyle w:val="VerbatimChar"/>
+        </w:rPr>
+        <w:t xml:space="preserve">psa_crypto_init</w:t>
+      </w:r>
+      <w:r>
+        <w:t xml:space="preserve"> </w:t>
+      </w:r>
+      <w:r>
+        <w:t xml:space="preserve">once per app). The client</w:t>
+      </w:r>
+      <w:r>
+        <w:t xml:space="preserve"> </w:t>
+      </w:r>
+      <w:r>
+        <w:t xml:space="preserve">offers the cipher suites, signature algorithms and groups in Chrome's order (X25519,</w:t>
+      </w:r>
+      <w:r>
+        <w:t xml:space="preserve"> </w:t>
+      </w:r>
+      <w:r>
+        <w:t xml:space="preserve">P-256, P-384 -- not Chrome's post-quantum hybrid, which mbedTLS lacks; the TLS 1.3 key</w:t>
+      </w:r>
+      <w:r>
+        <w:t xml:space="preserve"> </w:t>
+      </w:r>
+      <w:r>
+        <w:t xml:space="preserve">share for X25519); a TLS 1.3 server's tickets are taken after the handshake (</w:t>
+      </w:r>
+      <w:r>
+        <w:rPr>
+          <w:rStyle w:val="VerbatimChar"/>
+        </w:rPr>
+        <w:t xml:space="preserve">recv</w:t>
+      </w:r>
+      <w:r>
+        <w:t xml:space="preserve">) and</w:t>
+      </w:r>
+      <w:r>
+        <w:t xml:space="preserve"> </w:t>
+      </w:r>
+      <w:r>
+        <w:t xml:space="preserve">kept like the 1.2 sessions (in memory and in</w:t>
+      </w:r>
+      <w:r>
+        <w:t xml:space="preserve"> </w:t>
+      </w:r>
+      <w:r>
+        <w:rPr>
+          <w:rStyle w:val="VerbatimChar"/>
+        </w:rPr>
+        <w:t xml:space="preserve">TLSSessions</w:t>
+      </w:r>
+      <w:r>
+        <w:t xml:space="preserve">): a known host's next connection</w:t>
+      </w:r>
+      <w:r>
+        <w:t xml:space="preserve"> </w:t>
+      </w:r>
+      <w:r>
+        <w:t xml:space="preserve">is a PSK resumption. A handshake is one round trip shorter (en.wikipedia.org on the bench:</w:t>
+      </w:r>
+      <w:r>
+        <w:t xml:space="preserve"> </w:t>
+      </w:r>
+      <w:r>
+        <w:t xml:space="preserve">~70 ms instead of ~105).</w:t>
+      </w:r>
+      <w:r>
+        <w:t xml:space="preserve"> </w:t>
+      </w:r>
+      <w:r>
+        <w:rPr>
+          <w:rStyle w:val="VerbatimChar"/>
+        </w:rPr>
+        <w:t xml:space="preserve">net:conn</w:t>
+      </w:r>
+      <w:r>
+        <w:t xml:space="preserve"> </w:t>
+      </w:r>
+      <w:r>
+        <w:t xml:space="preserve">ends with the version (</w:t>
+      </w:r>
+      <w:r>
+        <w:rPr>
+          <w:rStyle w:val="VerbatimChar"/>
+        </w:rPr>
+        <w:t xml:space="preserve">TLSv1.3</w:t>
+      </w:r>
+      <w:r>
+        <w:t xml:space="preserve">);</w:t>
+      </w:r>
+      <w:r>
+        <w:t xml:space="preserve"> </w:t>
+      </w:r>
+      <w:r>
+        <w:rPr>
+          <w:rStyle w:val="VerbatimChar"/>
+        </w:rPr>
+        <w:t xml:space="preserve">NS_TLSDEBUG=1</w:t>
+      </w:r>
+      <w:r>
+        <w:t xml:space="preserve"> </w:t>
+      </w:r>
+      <w:r>
+        <w:t xml:space="preserve">prints each handshake's version and whether a session was offered. The Pi's NetSurf grows</w:t>
+      </w:r>
+      <w:r>
+        <w:t xml:space="preserve"> </w:t>
+      </w:r>
+      <w:r>
+        <w:t xml:space="preserve">by about 170 KB (</w:t>
+      </w:r>
+      <w:r>
+        <w:rPr>
+          <w:rStyle w:val="VerbatimChar"/>
+        </w:rPr>
+        <w:t xml:space="preserve">libmbedtls.a</w:t>
+      </w:r>
+      <w:r>
+        <w:t xml:space="preserve"> </w:t>
+      </w:r>
+      <w:r>
+        <w:t xml:space="preserve">380 -&gt; 550 KB); every app built on</w:t>
+      </w:r>
+      <w:r>
+        <w:t xml:space="preserve"> </w:t>
+      </w:r>
+      <w:r>
+        <w:rPr>
+          <w:rStyle w:val="VerbatimChar"/>
+        </w:rPr>
+        <w:t xml:space="preserve">onyx_tls.hpp</w:t>
+      </w:r>
+      <w:r>
+        <w:t xml:space="preserve"> </w:t>
+      </w:r>
+      <w:r>
+        <w:t xml:space="preserve">(the</w:t>
+      </w:r>
+      <w:r>
+        <w:t xml:space="preserve"> </w:t>
+      </w:r>
+      <w:r>
+        <w:t xml:space="preserve">courier,</w:t>
+      </w:r>
+      <w:r>
+        <w:t xml:space="preserve"> </w:t>
+      </w:r>
+      <w:r>
+        <w:rPr>
+          <w:rStyle w:val="VerbatimChar"/>
+        </w:rPr>
+        <w:t xml:space="preserve">httpsget</w:t>
+      </w:r>
+      <w:r>
+        <w:t xml:space="preserve">,</w:t>
+      </w:r>
+      <w:r>
+        <w:t xml:space="preserve"> </w:t>
+      </w:r>
+      <w:r>
+        <w:rPr>
+          <w:rStyle w:val="VerbatimChar"/>
+        </w:rPr>
+        <w:t xml:space="preserve">ftpfs</w:t>
+      </w:r>
+      <w:r>
+        <w:t xml:space="preserve">) gets 1.3 at its next link. Without</w:t>
+      </w:r>
+      <w:r>
+        <w:t xml:space="preserve"> </w:t>
+      </w:r>
+      <w:r>
+        <w:rPr>
+          <w:rStyle w:val="VerbatimChar"/>
+        </w:rPr>
+        <w:t xml:space="preserve">MBEDTLS_HAVE_TIME</w:t>
+      </w:r>
+      <w:r>
+        <w:t xml:space="preserve"> </w:t>
+      </w:r>
+      <w:r>
+        <w:t xml:space="preserve">the</w:t>
+      </w:r>
+      <w:r>
+        <w:t xml:space="preserve"> </w:t>
+      </w:r>
+      <w:r>
+        <w:t xml:space="preserve">ticket's obfuscated age is sent as 0 (the servers use it for 0-RTT only, which is not</w:t>
+      </w:r>
+      <w:r>
+        <w:t xml:space="preserve"> </w:t>
+      </w:r>
+      <w:r>
+        <w:t xml:space="preserve">offered). Google's "unusual traffic" page (</w:t>
+      </w:r>
+      <w:r>
+        <w:rPr>
+          <w:rStyle w:val="VerbatimChar"/>
+        </w:rPr>
+        <w:t xml:space="preserve">/sorry/</w:t>
+      </w:r>
+      <w:r>
+        <w:t xml:space="preserve">) comes to this bench's address for</w:t>
+      </w:r>
+      <w:r>
+        <w:t xml:space="preserve"> </w:t>
+      </w:r>
+      <w:r>
+        <w:t xml:space="preserve">every client (curl included, with TLS 1.3 and HTTP/2): what TLS 1.3 changes for it cannot</w:t>
+      </w:r>
+      <w:r>
+        <w:t xml:space="preserve"> </w:t>
+      </w:r>
+      <w:r>
+        <w:t xml:space="preserve">be measured from here.</w:t>
+      </w:r>
+    </w:p>
+    <w:p>
+      <w:pPr>
+        <w:pStyle w:val="BodyText"/>
+      </w:pPr>
+      <w:r>
+        <w:rPr>
+          <w:b/>
+          <w:bCs/>
+        </w:rPr>
         <w:t xml:space="preserve">Brotli and zstd.</w:t>
       </w:r>
       <w:r>
@@ -46353,13 +46662,13 @@
         <w:t xml:space="preserve"> </w:t>
       </w:r>
       <w:r>
-        <w:t xml:space="preserve">TLS 1.3 (mbedTLS' TLS 1.3 needs its PSA crypto: a TLS 1.2-only client is</w:t>
-      </w:r>
-      <w:r>
-        <w:t xml:space="preserve"> </w:t>
-      </w:r>
-      <w:r>
-        <w:t xml:space="preserve">told apart by some CDNs -- the reason of Fastly's 403 over HTTP/2); OCSP / CRL revocation,</w:t>
+        <w:t xml:space="preserve">GREASE and the other extensions of Chrome's ClientHello (mbedTLS writes its</w:t>
+      </w:r>
+      <w:r>
+        <w:t xml:space="preserve"> </w:t>
+      </w:r>
+      <w:r>
+        <w:t xml:space="preserve">own set); OCSP / CRL revocation,</w:t>
       </w:r>
       <w:r>
         <w:t xml:space="preserve"> </w:t>
@@ -48706,7 +49015,7 @@
         </w:numPr>
       </w:pPr>
       <w:r>
-        <w:t xml:space="preserve">The network (§24): TLS 1.2 only, no revocation checks, no CSP, no SameSite cookies, no</w:t>
+        <w:t xml:space="preserve">The network (§24): no revocation checks, no CSP, no SameSite cookies, no</w:t>
       </w:r>
       <w:r>
         <w:t xml:space="preserve"> </w:t>

</xml_diff>

<commit_message>
docs: layout and rebox performance (06 section 26: the flex layout memo, the kept style selections, partial restyles, the measurements), 07's incremental restyle row and performance notes, the handoff
Co-Authored-By: Claude Opus 5.5 <noreply@anthropic.com>
Claude-Session: https://claude.ai/code/session_01UcY36na7Mp1DEYttKiw1pa
</commit_message>
<xml_diff>
--- a/docs/exports/06-NETSURF-CHANGES.docx
+++ b/docs/exports/06-NETSURF-CHANGES.docx
@@ -5254,6 +5254,18 @@
       <w:r>
         <w:t xml:space="preserve">stay its content's (its automatic minimum, its content basis).</w:t>
       </w:r>
+      <w:r>
+        <w:t xml:space="preserve"> </w:t>
+      </w:r>
+      <w:r>
+        <w:t xml:space="preserve">Each item's layout goes through a per-pass memo (§26): an item is laid out once per set of</w:t>
+      </w:r>
+      <w:r>
+        <w:t xml:space="preserve"> </w:t>
+      </w:r>
+      <w:r>
+        <w:t xml:space="preserve">inputs, however deep the nesting (it was 2^depth).</w:t>
+      </w:r>
     </w:p>
     <w:bookmarkEnd w:id="22"/>
     <w:bookmarkStart w:id="23" w:name="Xf481b35fbfd9d69098720a11251e3a256143151"/>
@@ -8738,73 +8750,199 @@
           <w:b/>
           <w:bCs/>
         </w:rPr>
-        <w:t xml:space="preserve">No touch screen</w:t>
-      </w:r>
-      <w:r>
-        <w:t xml:space="preserve">:</w:t>
-      </w:r>
-      <w:r>
-        <w:t xml:space="preserve"> </w:t>
-      </w:r>
-      <w:r>
-        <w:rPr>
-          <w:rStyle w:val="VerbatimChar"/>
-        </w:rPr>
-        <w:t xml:space="preserve">ontouchstart</w:t>
-      </w:r>
-      <w:r>
-        <w:t xml:space="preserve"> </w:t>
-      </w:r>
-      <w:r>
-        <w:t xml:space="preserve">/</w:t>
-      </w:r>
-      <w:r>
-        <w:t xml:space="preserve"> </w:t>
-      </w:r>
-      <w:r>
-        <w:rPr>
-          <w:rStyle w:val="VerbatimChar"/>
-        </w:rPr>
-        <w:t xml:space="preserve">ontouchend</w:t>
-      </w:r>
-      <w:r>
-        <w:t xml:space="preserve"> </w:t>
-      </w:r>
-      <w:r>
-        <w:t xml:space="preserve">/</w:t>
-      </w:r>
-      <w:r>
-        <w:t xml:space="preserve"> </w:t>
-      </w:r>
-      <w:r>
-        <w:rPr>
-          <w:rStyle w:val="VerbatimChar"/>
-        </w:rPr>
-        <w:t xml:space="preserve">ontouchmove</w:t>
-      </w:r>
-      <w:r>
-        <w:t xml:space="preserve"> </w:t>
-      </w:r>
-      <w:r>
-        <w:t xml:space="preserve">are gone from the</w:t>
-      </w:r>
-      <w:r>
-        <w:t xml:space="preserve"> </w:t>
-      </w:r>
-      <w:r>
-        <w:t xml:space="preserve">elements and the window (</w:t>
-      </w:r>
-      <w:r>
-        <w:rPr>
-          <w:rStyle w:val="VerbatimChar"/>
-        </w:rPr>
-        <w:t xml:space="preserve">'ontouchstart' in window</w:t>
-      </w:r>
-      <w:r>
-        <w:t xml:space="preserve"> </w:t>
-      </w:r>
-      <w:r>
-        <w:t xml:space="preserve">told the pages there was one).</w:t>
+        <w:t xml:space="preserve">A dialog capped to the viewport</w:t>
+      </w:r>
+      <w:r>
+        <w:t xml:space="preserve"> </w:t>
+      </w:r>
+      <w:r>
+        <w:t xml:space="preserve">(Facebook's cookie dialog: a fixed backdrop,</w:t>
+      </w:r>
+      <w:r>
+        <w:t xml:space="preserve"> </w:t>
+      </w:r>
+      <w:r>
+        <w:rPr>
+          <w:rStyle w:val="VerbatimChar"/>
+        </w:rPr>
+        <w:t xml:space="preserve">inset: 0</w:t>
+      </w:r>
+      <w:r>
+        <w:t xml:space="preserve">, centring a flex column with</w:t>
+      </w:r>
+      <w:r>
+        <w:t xml:space="preserve"> </w:t>
+      </w:r>
+      <w:r>
+        <w:rPr>
+          <w:rStyle w:val="VerbatimChar"/>
+        </w:rPr>
+        <w:t xml:space="preserve">max-height: 90%</w:t>
+      </w:r>
+      <w:r>
+        <w:t xml:space="preserve">, its middle</w:t>
+      </w:r>
+      <w:r>
+        <w:t xml:space="preserve"> </w:t>
+      </w:r>
+      <w:r>
+        <w:rPr>
+          <w:rStyle w:val="VerbatimChar"/>
+        </w:rPr>
+        <w:t xml:space="preserve">overflow: auto</w:t>
+      </w:r>
+      <w:r>
+        <w:t xml:space="preserve">,</w:t>
+      </w:r>
+      <w:r>
+        <w:t xml:space="preserve"> </w:t>
+      </w:r>
+      <w:r>
+        <w:t xml:space="preserve">the buttons pinned): an absolute / fixed box whose height is given by its insets (</w:t>
+      </w:r>
+      <w:r>
+        <w:rPr>
+          <w:rStyle w:val="VerbatimChar"/>
+        </w:rPr>
+        <w:t xml:space="preserve">top</w:t>
+      </w:r>
+      <w:r>
+        <w:t xml:space="preserve"> </w:t>
+      </w:r>
+      <w:r>
+        <w:t xml:space="preserve">and</w:t>
+      </w:r>
+      <w:r>
+        <w:t xml:space="preserve"> </w:t>
+      </w:r>
+      <w:r>
+        <w:rPr>
+          <w:rStyle w:val="VerbatimChar"/>
+        </w:rPr>
+        <w:t xml:space="preserve">bottom</w:t>
+      </w:r>
+      <w:r>
+        <w:t xml:space="preserve"> </w:t>
+      </w:r>
+      <w:r>
+        <w:t xml:space="preserve">set,</w:t>
+      </w:r>
+      <w:r>
+        <w:t xml:space="preserve"> </w:t>
+      </w:r>
+      <w:r>
+        <w:rPr>
+          <w:rStyle w:val="VerbatimChar"/>
+        </w:rPr>
+        <w:t xml:space="preserve">height: auto</w:t>
+      </w:r>
+      <w:r>
+        <w:t xml:space="preserve">) now knows it before its content is laid out</w:t>
+      </w:r>
+      <w:r>
+        <w:t xml:space="preserve"> </w:t>
+      </w:r>
+      <w:r>
+        <w:t xml:space="preserve">(</w:t>
+      </w:r>
+      <w:r>
+        <w:rPr>
+          <w:rStyle w:val="VerbatimChar"/>
+        </w:rPr>
+        <w:t xml:space="preserve">layout_absolute</w:t>
+      </w:r>
+      <w:r>
+        <w:t xml:space="preserve">,</w:t>
+      </w:r>
+      <w:r>
+        <w:t xml:space="preserve"> </w:t>
+      </w:r>
+      <w:r>
+        <w:rPr>
+          <w:rStyle w:val="VerbatimChar"/>
+        </w:rPr>
+        <w:t xml:space="preserve">DEF_HEIGHT</w:t>
+      </w:r>
+      <w:r>
+        <w:t xml:space="preserve">): a flex container centres and flexes its items in it,</w:t>
+      </w:r>
+      <w:r>
+        <w:t xml:space="preserve"> </w:t>
+      </w:r>
+      <w:r>
+        <w:t xml:space="preserve">its children's percentages resolve against it. The dialog took its whole content's height</w:t>
+      </w:r>
+      <w:r>
+        <w:t xml:space="preserve"> </w:t>
+      </w:r>
+      <w:r>
+        <w:t xml:space="preserve">(the buttons below the screen, nothing to scroll). A stretched grid item that is a scroll</w:t>
+      </w:r>
+      <w:r>
+        <w:t xml:space="preserve"> </w:t>
+      </w:r>
+      <w:r>
+        <w:t xml:space="preserve">container is its area's height even when its content is taller (</w:t>
+      </w:r>
+      <w:r>
+        <w:rPr>
+          <w:rStyle w:val="VerbatimChar"/>
+        </w:rPr>
+        <w:t xml:space="preserve">layout_grid.c</w:t>
+      </w:r>
+      <w:r>
+        <w:t xml:space="preserve">: a</w:t>
+      </w:r>
+      <w:r>
+        <w:t xml:space="preserve"> </w:t>
+      </w:r>
+      <w:r>
+        <w:rPr>
+          <w:rStyle w:val="VerbatimChar"/>
+        </w:rPr>
+        <w:t xml:space="preserve">minmax(0, 1fr)</w:t>
+      </w:r>
+      <w:r>
+        <w:t xml:space="preserve"> </w:t>
+      </w:r>
+      <w:r>
+        <w:t xml:space="preserve">middle row). Tests:</w:t>
+      </w:r>
+      <w:r>
+        <w:t xml:space="preserve"> </w:t>
+      </w:r>
+      <w:r>
+        <w:rPr>
+          <w:rStyle w:val="VerbatimChar"/>
+        </w:rPr>
+        <w:t xml:space="preserve">pages/layout/dialogs.html</w:t>
+      </w:r>
+      <w:r>
+        <w:t xml:space="preserve"> </w:t>
+      </w:r>
+      <w:r>
+        <w:t xml:space="preserve">(layouttest: 0 of 49</w:t>
+      </w:r>
+      <w:r>
+        <w:t xml:space="preserve"> </w:t>
+      </w:r>
+      <w:r>
+        <w:t xml:space="preserve">differ),</w:t>
+      </w:r>
+      <w:r>
+        <w:t xml:space="preserve"> </w:t>
+      </w:r>
+      <w:r>
+        <w:rPr>
+          <w:rStyle w:val="VerbatimChar"/>
+        </w:rPr>
+        <w:t xml:space="preserve">pages/js-dialog.html</w:t>
+      </w:r>
+      <w:r>
+        <w:t xml:space="preserve"> </w:t>
+      </w:r>
+      <w:r>
+        <w:t xml:space="preserve">(jstest).</w:t>
       </w:r>
     </w:p>
     <w:p>
@@ -8817,6 +8955,88 @@
       </w:pPr>
       <w:r>
         <w:rPr>
+          <w:b/>
+          <w:bCs/>
+        </w:rPr>
+        <w:t xml:space="preserve">No touch screen</w:t>
+      </w:r>
+      <w:r>
+        <w:t xml:space="preserve">:</w:t>
+      </w:r>
+      <w:r>
+        <w:t xml:space="preserve"> </w:t>
+      </w:r>
+      <w:r>
+        <w:rPr>
+          <w:rStyle w:val="VerbatimChar"/>
+        </w:rPr>
+        <w:t xml:space="preserve">ontouchstart</w:t>
+      </w:r>
+      <w:r>
+        <w:t xml:space="preserve"> </w:t>
+      </w:r>
+      <w:r>
+        <w:t xml:space="preserve">/</w:t>
+      </w:r>
+      <w:r>
+        <w:t xml:space="preserve"> </w:t>
+      </w:r>
+      <w:r>
+        <w:rPr>
+          <w:rStyle w:val="VerbatimChar"/>
+        </w:rPr>
+        <w:t xml:space="preserve">ontouchend</w:t>
+      </w:r>
+      <w:r>
+        <w:t xml:space="preserve"> </w:t>
+      </w:r>
+      <w:r>
+        <w:t xml:space="preserve">/</w:t>
+      </w:r>
+      <w:r>
+        <w:t xml:space="preserve"> </w:t>
+      </w:r>
+      <w:r>
+        <w:rPr>
+          <w:rStyle w:val="VerbatimChar"/>
+        </w:rPr>
+        <w:t xml:space="preserve">ontouchmove</w:t>
+      </w:r>
+      <w:r>
+        <w:t xml:space="preserve"> </w:t>
+      </w:r>
+      <w:r>
+        <w:t xml:space="preserve">are gone from the</w:t>
+      </w:r>
+      <w:r>
+        <w:t xml:space="preserve"> </w:t>
+      </w:r>
+      <w:r>
+        <w:t xml:space="preserve">elements and the window (</w:t>
+      </w:r>
+      <w:r>
+        <w:rPr>
+          <w:rStyle w:val="VerbatimChar"/>
+        </w:rPr>
+        <w:t xml:space="preserve">'ontouchstart' in window</w:t>
+      </w:r>
+      <w:r>
+        <w:t xml:space="preserve"> </w:t>
+      </w:r>
+      <w:r>
+        <w:t xml:space="preserve">told the pages there was one).</w:t>
+      </w:r>
+    </w:p>
+    <w:p>
+      <w:pPr>
+        <w:pStyle w:val="Compact"/>
+        <w:numPr>
+          <w:ilvl w:val="0"/>
+          <w:numId w:val="1009"/>
+        </w:numPr>
+      </w:pPr>
+      <w:r>
+        <w:rPr>
           <w:rStyle w:val="VerbatimChar"/>
           <w:b/>
           <w:bCs/>
@@ -11814,6 +12034,55 @@
       </w:r>
       <w:r>
         <w:t xml:space="preserve">results are kept until the next rebox (a box the walk missed would still point at them).</w:t>
+      </w:r>
+    </w:p>
+    <w:p>
+      <w:pPr>
+        <w:pStyle w:val="Compact"/>
+        <w:numPr>
+          <w:ilvl w:val="0"/>
+          <w:numId w:val="1012"/>
+        </w:numPr>
+      </w:pPr>
+      <w:r>
+        <w:rPr>
+          <w:b/>
+          <w:bCs/>
+        </w:rPr>
+        <w:t xml:space="preserve">The rebox after a script's change</w:t>
+      </w:r>
+      <w:r>
+        <w:t xml:space="preserve"> </w:t>
+      </w:r>
+      <w:r>
+        <w:t xml:space="preserve">keeps the elements' style selections and selects</w:t>
+      </w:r>
+      <w:r>
+        <w:t xml:space="preserve"> </w:t>
+      </w:r>
+      <w:r>
+        <w:t xml:space="preserve">again only what the change can have restyled; attribute-only changes are restyled in the</w:t>
+      </w:r>
+      <w:r>
+        <w:t xml:space="preserve"> </w:t>
+      </w:r>
+      <w:r>
+        <w:t xml:space="preserve">boxes as a hover is (</w:t>
+      </w:r>
+      <w:r>
+        <w:rPr>
+          <w:rStyle w:val="VerbatimChar"/>
+        </w:rPr>
+        <w:t xml:space="preserve">onyx_hover_restyle_nodes</w:t>
+      </w:r>
+      <w:r>
+        <w:t xml:space="preserve">); reboxes are coalesced and throttled:</w:t>
+      </w:r>
+      <w:r>
+        <w:t xml:space="preserve"> </w:t>
+      </w:r>
+      <w:r>
+        <w:t xml:space="preserve">§26.</w:t>
       </w:r>
     </w:p>
     <w:p>
@@ -28586,7 +28855,34 @@
         <w:t xml:space="preserve">user_agent_for_host</w:t>
       </w:r>
       <w:r>
-        <w:t xml:space="preserve">, utils/useragent.c).</w:t>
+        <w:t xml:space="preserve">, utils/useragent.c). The disk cache keys a desktop site's objects apart</w:t>
+      </w:r>
+      <w:r>
+        <w:t xml:space="preserve"> </w:t>
+      </w:r>
+      <w:r>
+        <w:t xml:space="preserve">(</w:t>
+      </w:r>
+      <w:r>
+        <w:rPr>
+          <w:rStyle w:val="VerbatimChar"/>
+        </w:rPr>
+        <w:t xml:space="preserve">D|&lt;url&gt;</w:t>
+      </w:r>
+      <w:r>
+        <w:t xml:space="preserve">,</w:t>
+      </w:r>
+      <w:r>
+        <w:t xml:space="preserve"> </w:t>
+      </w:r>
+      <w:r>
+        <w:rPr>
+          <w:rStyle w:val="VerbatimChar"/>
+        </w:rPr>
+        <w:t xml:space="preserve">onyx_cache.c</w:t>
+      </w:r>
+      <w:r>
+        <w:t xml:space="preserve">): a site switched back to mobile found its desktop copies.</w:t>
       </w:r>
     </w:p>
     <w:p>
@@ -48817,13 +49113,113 @@
       </w:r>
     </w:p>
     <w:bookmarkEnd w:id="49"/>
-    <w:bookmarkStart w:id="50" w:name="X2d96bac25f45ec9241507797951d2bb0b2591ad"/>
+    <w:bookmarkStart w:id="50" w:name="Xcddc0d44771492206ec664cfa3583253b1dec4c"/>
     <w:p>
       <w:pPr>
         <w:pStyle w:val="Heading2"/>
       </w:pPr>
       <w:r>
-        <w:t xml:space="preserve">8. Known gaps</w:t>
+        <w:t xml:space="preserve">26. Layout and rebox performance: the flex layout memo, the kept style selections, partial restyles</w:t>
+      </w:r>
+    </w:p>
+    <w:p>
+      <w:pPr>
+        <w:pStyle w:val="FirstParagraph"/>
+      </w:pPr>
+      <w:r>
+        <w:t xml:space="preserve">Profiled on the PC bench (</w:t>
+      </w:r>
+      <w:r>
+        <w:rPr>
+          <w:rStyle w:val="VerbatimChar"/>
+        </w:rPr>
+        <w:t xml:space="preserve">NS_PERF=1</w:t>
+      </w:r>
+      <w:r>
+        <w:t xml:space="preserve">, the sampling profiler</w:t>
+      </w:r>
+      <w:r>
+        <w:t xml:space="preserve"> </w:t>
+      </w:r>
+      <w:r>
+        <w:rPr>
+          <w:rStyle w:val="VerbatimChar"/>
+        </w:rPr>
+        <w:t xml:space="preserve">NS_PROF=&lt;file&gt;</w:t>
+      </w:r>
+      <w:r>
+        <w:t xml:space="preserve"> </w:t>
+      </w:r>
+      <w:r>
+        <w:t xml:space="preserve">+</w:t>
+      </w:r>
+      <w:r>
+        <w:t xml:space="preserve"> </w:t>
+      </w:r>
+      <w:r>
+        <w:rPr>
+          <w:rStyle w:val="VerbatimChar"/>
+        </w:rPr>
+        <w:t xml:space="preserve">prof.sh</w:t>
+      </w:r>
+      <w:r>
+        <w:t xml:space="preserve">; the Pi is ~5-20x slower -- m.facebook.com's layout pass was 175 ms on the PC and</w:t>
+      </w:r>
+      <w:r>
+        <w:t xml:space="preserve"> </w:t>
+      </w:r>
+      <w:r>
+        <w:t xml:space="preserve">3.5 s on the Pi). Two costs dominated: m.facebook.com's</w:t>
+      </w:r>
+      <w:r>
+        <w:t xml:space="preserve"> </w:t>
+      </w:r>
+      <w:r>
+        <w:rPr>
+          <w:b/>
+          <w:bCs/>
+        </w:rPr>
+        <w:t xml:space="preserve">layout</w:t>
+      </w:r>
+      <w:r>
+        <w:t xml:space="preserve"> </w:t>
+      </w:r>
+      <w:r>
+        <w:t xml:space="preserve">(each pass ~170 ms, 64 % of</w:t>
+      </w:r>
+      <w:r>
+        <w:t xml:space="preserve"> </w:t>
+      </w:r>
+      <w:r>
+        <w:t xml:space="preserve">the samples in the flex layout, nested up to 10 levels) and github.com's</w:t>
+      </w:r>
+      <w:r>
+        <w:t xml:space="preserve"> </w:t>
+      </w:r>
+      <w:r>
+        <w:rPr>
+          <w:b/>
+          <w:bCs/>
+        </w:rPr>
+        <w:t xml:space="preserve">reboxes</w:t>
+      </w:r>
+      <w:r>
+        <w:t xml:space="preserve"> </w:t>
+      </w:r>
+      <w:r>
+        <w:t xml:space="preserve">(the box</w:t>
+      </w:r>
+      <w:r>
+        <w:t xml:space="preserve"> </w:t>
+      </w:r>
+      <w:r>
+        <w:t xml:space="preserve">tree built again 8-9 times while it loads, ~150 ms each, nine tenths of it the style selection</w:t>
+      </w:r>
+      <w:r>
+        <w:t xml:space="preserve"> </w:t>
+      </w:r>
+      <w:r>
+        <w:t xml:space="preserve">of every element).</w:t>
       </w:r>
     </w:p>
     <w:p>
@@ -48835,46 +49231,146 @@
         </w:numPr>
       </w:pPr>
       <w:r>
-        <w:t xml:space="preserve">JavaScript: synchronous XHR (runs async), multipart request bodies, binary request bodies</w:t>
-      </w:r>
-      <w:r>
-        <w:t xml:space="preserve"> </w:t>
-      </w:r>
-      <w:r>
-        <w:t xml:space="preserve">(sent as text: a NUL ends them); no IndexedDB, editing APIs, Service</w:t>
-      </w:r>
-      <w:r>
-        <w:t xml:space="preserve"> </w:t>
-      </w:r>
-      <w:r>
-        <w:t xml:space="preserve">Workers; CSS</w:t>
-      </w:r>
-      <w:r>
-        <w:t xml:space="preserve"> </w:t>
-      </w:r>
-      <w:r>
-        <w:rPr>
-          <w:rStyle w:val="VerbatimChar"/>
-        </w:rPr>
-        <w:t xml:space="preserve">:active</w:t>
-      </w:r>
-      <w:r>
-        <w:t xml:space="preserve"> </w:t>
-      </w:r>
-      <w:r>
-        <w:t xml:space="preserve">/</w:t>
-      </w:r>
-      <w:r>
-        <w:t xml:space="preserve"> </w:t>
-      </w:r>
-      <w:r>
-        <w:rPr>
-          <w:rStyle w:val="VerbatimChar"/>
-        </w:rPr>
-        <w:t xml:space="preserve">:focus</w:t>
-      </w:r>
-      <w:r>
-        <w:t xml:space="preserve">.</w:t>
+        <w:rPr>
+          <w:b/>
+          <w:bCs/>
+        </w:rPr>
+        <w:t xml:space="preserve">The flex / grid items' layout memo</w:t>
+      </w:r>
+      <w:r>
+        <w:t xml:space="preserve"> </w:t>
+      </w:r>
+      <w:r>
+        <w:t xml:space="preserve">(</w:t>
+      </w:r>
+      <w:r>
+        <w:rPr>
+          <w:rStyle w:val="VerbatimChar"/>
+        </w:rPr>
+        <w:t xml:space="preserve">layout_flex.c</w:t>
+      </w:r>
+      <w:r>
+        <w:t xml:space="preserve">:</w:t>
+      </w:r>
+      <w:r>
+        <w:t xml:space="preserve"> </w:t>
+      </w:r>
+      <w:r>
+        <w:rPr>
+          <w:rStyle w:val="VerbatimChar"/>
+        </w:rPr>
+        <w:t xml:space="preserve">layout_memo_*</w:t>
+      </w:r>
+      <w:r>
+        <w:t xml:space="preserve">,</w:t>
+      </w:r>
+      <w:r>
+        <w:t xml:space="preserve"> </w:t>
+      </w:r>
+      <w:r>
+        <w:rPr>
+          <w:rStyle w:val="VerbatimChar"/>
+        </w:rPr>
+        <w:t xml:space="preserve">layout_internal.h</w:t>
+      </w:r>
+      <w:r>
+        <w:t xml:space="preserve">). A flex item was laid out to measure it (its height at an auto height,</w:t>
+      </w:r>
+      <w:r>
+        <w:t xml:space="preserve"> </w:t>
+      </w:r>
+      <w:r>
+        <w:t xml:space="preserve">in a column; its cross size, in a row) and again to place it (at its flexed or stretched</w:t>
+      </w:r>
+      <w:r>
+        <w:t xml:space="preserve"> </w:t>
+      </w:r>
+      <w:r>
+        <w:t xml:space="preserve">size) -- at each nesting level, so nested flex containers cost 2^depth layouts. Within one</w:t>
+      </w:r>
+      <w:r>
+        <w:t xml:space="preserve"> </w:t>
+      </w:r>
+      <w:r>
+        <w:rPr>
+          <w:rStyle w:val="VerbatimChar"/>
+        </w:rPr>
+        <w:t xml:space="preserve">layout_document()</w:t>
+      </w:r>
+      <w:r>
+        <w:t xml:space="preserve"> </w:t>
+      </w:r>
+      <w:r>
+        <w:t xml:space="preserve">pass, two tables keyed by the box: the size a layout gave per inputs</w:t>
+      </w:r>
+      <w:r>
+        <w:t xml:space="preserve"> </w:t>
+      </w:r>
+      <w:r>
+        <w:t xml:space="preserve">(its width, its height or AUTO,</w:t>
+      </w:r>
+      <w:r>
+        <w:t xml:space="preserve"> </w:t>
+      </w:r>
+      <w:r>
+        <w:rPr>
+          <w:rStyle w:val="VerbatimChar"/>
+        </w:rPr>
+        <w:t xml:space="preserve">DEF_HEIGHT</w:t>
+      </w:r>
+      <w:r>
+        <w:t xml:space="preserve">, the available width, its paddings and</w:t>
+      </w:r>
+      <w:r>
+        <w:t xml:space="preserve"> </w:t>
+      </w:r>
+      <w:r>
+        <w:t xml:space="preserve">borders), and the inputs its subtree is laid out at now. An item's layout asks the memo:</w:t>
+      </w:r>
+      <w:r>
+        <w:t xml:space="preserve"> </w:t>
+      </w:r>
+      <w:r>
+        <w:t xml:space="preserve">a size known is taken without laying out ("size only"); the container lays its items out</w:t>
+      </w:r>
+      <w:r>
+        <w:t xml:space="preserve"> </w:t>
+      </w:r>
+      <w:r>
+        <w:t xml:space="preserve">again at the end (</w:t>
+      </w:r>
+      <w:r>
+        <w:rPr>
+          <w:rStyle w:val="VerbatimChar"/>
+        </w:rPr>
+        <w:t xml:space="preserve">fx_ensure_item</w:t>
+      </w:r>
+      <w:r>
+        <w:t xml:space="preserve">) only when the memo gave a size without the subtree's</w:t>
+      </w:r>
+      <w:r>
+        <w:t xml:space="preserve"> </w:t>
+      </w:r>
+      <w:r>
+        <w:t xml:space="preserve">state (and before a baseline is read). Grid items take the memo when their subtree is</w:t>
+      </w:r>
+      <w:r>
+        <w:t xml:space="preserve"> </w:t>
+      </w:r>
+      <w:r>
+        <w:t xml:space="preserve">already laid out at the same inputs. Outside a pass (an early layout, a textarea) nothing</w:t>
+      </w:r>
+      <w:r>
+        <w:t xml:space="preserve"> </w:t>
+      </w:r>
+      <w:r>
+        <w:t xml:space="preserve">is kept. m.facebook.com: a layout pass 165-175 ms -&gt; under 1 ms (the first one 8 ms) on the</w:t>
+      </w:r>
+      <w:r>
+        <w:t xml:space="preserve"> </w:t>
+      </w:r>
+      <w:r>
+        <w:t xml:space="preserve">PC, the pixels the same; the box dumps of every bench page identical.</w:t>
       </w:r>
     </w:p>
     <w:p>
@@ -48886,91 +49382,83 @@
         </w:numPr>
       </w:pPr>
       <w:r>
-        <w:t xml:space="preserve">The network APIs (§19): a worker runs on the UI thread (a long computation in a worker</w:t>
-      </w:r>
-      <w:r>
-        <w:t xml:space="preserve"> </w:t>
-      </w:r>
-      <w:r>
-        <w:t xml:space="preserve">holds the window as a page's script does;</w:t>
-      </w:r>
-      <w:r>
-        <w:t xml:space="preserve"> </w:t>
-      </w:r>
-      <w:r>
-        <w:rPr>
-          <w:rStyle w:val="VerbatimChar"/>
-        </w:rPr>
-        <w:t xml:space="preserve">script_timeout</w:t>
-      </w:r>
-      <w:r>
-        <w:t xml:space="preserve"> </w:t>
-      </w:r>
-      <w:r>
-        <w:t xml:space="preserve">stops it); an</w:t>
-      </w:r>
-      <w:r>
-        <w:t xml:space="preserve"> </w:t>
-      </w:r>
-      <w:r>
-        <w:rPr>
-          <w:rStyle w:val="VerbatimChar"/>
-        </w:rPr>
-        <w:t xml:space="preserve">importScripts</w:t>
-      </w:r>
-      <w:r>
-        <w:t xml:space="preserve"> </w:t>
-      </w:r>
-      <w:r>
-        <w:t xml:space="preserve">whose URL is not a literal in the script, over http(s), blocks the UI thread while it is</w:t>
-      </w:r>
-      <w:r>
-        <w:t xml:space="preserve"> </w:t>
-      </w:r>
-      <w:r>
-        <w:t xml:space="preserve">read; a SharedWorker is shared within its document only; no</w:t>
-      </w:r>
-      <w:r>
-        <w:t xml:space="preserve"> </w:t>
-      </w:r>
-      <w:r>
-        <w:rPr>
-          <w:rStyle w:val="VerbatimChar"/>
-        </w:rPr>
-        <w:t xml:space="preserve">MessagePort</w:t>
-      </w:r>
-      <w:r>
-        <w:t xml:space="preserve"> </w:t>
-      </w:r>
-      <w:r>
-        <w:t xml:space="preserve">transferred to a</w:t>
-      </w:r>
-      <w:r>
-        <w:t xml:space="preserve"> </w:t>
-      </w:r>
-      <w:r>
-        <w:t xml:space="preserve">worker, no</w:t>
-      </w:r>
-      <w:r>
-        <w:t xml:space="preserve"> </w:t>
-      </w:r>
-      <w:r>
-        <w:rPr>
-          <w:rStyle w:val="VerbatimChar"/>
-        </w:rPr>
-        <w:t xml:space="preserve">OffscreenCanvas</w:t>
-      </w:r>
-      <w:r>
-        <w:t xml:space="preserve">,</w:t>
-      </w:r>
-      <w:r>
-        <w:t xml:space="preserve"> </w:t>
-      </w:r>
-      <w:r>
-        <w:rPr>
-          <w:rStyle w:val="VerbatimChar"/>
-        </w:rPr>
-        <w:t xml:space="preserve">SharedArrayBuffer</w:t>
+        <w:rPr>
+          <w:b/>
+          <w:bCs/>
+        </w:rPr>
+        <w:t xml:space="preserve">The kept style selections</w:t>
+      </w:r>
+      <w:r>
+        <w:t xml:space="preserve"> </w:t>
+      </w:r>
+      <w:r>
+        <w:t xml:space="preserve">(</w:t>
+      </w:r>
+      <w:r>
+        <w:rPr>
+          <w:rStyle w:val="VerbatimChar"/>
+        </w:rPr>
+        <w:t xml:space="preserve">html/onyx_restyle.c</w:t>
+      </w:r>
+      <w:r>
+        <w:t xml:space="preserve">). Each element keeps its last</w:t>
+      </w:r>
+      <w:r>
+        <w:t xml:space="preserve"> </w:t>
+      </w:r>
+      <w:r>
+        <w:t xml:space="preserve">selection (the cascade's result, before the transitions and animations) in its DOM user</w:t>
+      </w:r>
+      <w:r>
+        <w:t xml:space="preserve"> </w:t>
+      </w:r>
+      <w:r>
+        <w:t xml:space="preserve">data (</w:t>
+      </w:r>
+      <w:r>
+        <w:rPr>
+          <w:rStyle w:val="VerbatimChar"/>
+        </w:rPr>
+        <w:t xml:space="preserve">__ns_key_onyx_style_memo</w:t>
+      </w:r>
+      <w:r>
+        <w:t xml:space="preserve">), and a box tree selects again only the elements a change</w:t>
+      </w:r>
+      <w:r>
+        <w:t xml:space="preserve"> </w:t>
+      </w:r>
+      <w:r>
+        <w:t xml:space="preserve">since can have restyled. The marks come from the mutation events (</w:t>
+      </w:r>
+      <w:r>
+        <w:rPr>
+          <w:rStyle w:val="VerbatimChar"/>
+        </w:rPr>
+        <w:t xml:space="preserve">dom_event.c</w:t>
+      </w:r>
+      <w:r>
+        <w:t xml:space="preserve">:</w:t>
+      </w:r>
+      <w:r>
+        <w:t xml:space="preserve"> </w:t>
+      </w:r>
+      <w:r>
+        <w:rPr>
+          <w:rStyle w:val="VerbatimChar"/>
+        </w:rPr>
+        <w:t xml:space="preserve">DOMAttrModified</w:t>
+      </w:r>
+      <w:r>
+        <w:t xml:space="preserve">,</w:t>
+      </w:r>
+      <w:r>
+        <w:t xml:space="preserve"> </w:t>
+      </w:r>
+      <w:r>
+        <w:rPr>
+          <w:rStyle w:val="VerbatimChar"/>
+        </w:rPr>
+        <w:t xml:space="preserve">DOMNodeInserted</w:t>
       </w:r>
       <w:r>
         <w:t xml:space="preserve"> </w:t>
@@ -48985,25 +49473,595 @@
         <w:rPr>
           <w:rStyle w:val="VerbatimChar"/>
         </w:rPr>
-        <w:t xml:space="preserve">Atomics</w:t>
-      </w:r>
-      <w:r>
-        <w:t xml:space="preserve"> </w:t>
-      </w:r>
-      <w:r>
-        <w:t xml:space="preserve">between workers; the</w:t>
-      </w:r>
-      <w:r>
-        <w:t xml:space="preserve"> </w:t>
-      </w:r>
-      <w:r>
-        <w:t xml:space="preserve">WebSocket client sends its messages uncompressed (permessage-deflate inflates only) and</w:t>
-      </w:r>
-      <w:r>
-        <w:t xml:space="preserve"> </w:t>
-      </w:r>
-      <w:r>
-        <w:t xml:space="preserve">never pings; CORS is not checked for EventSource either.</w:t>
+        <w:t xml:space="preserve">Removed</w:t>
+      </w:r>
+      <w:r>
+        <w:t xml:space="preserve">,</w:t>
+      </w:r>
+      <w:r>
+        <w:t xml:space="preserve"> </w:t>
+      </w:r>
+      <w:r>
+        <w:rPr>
+          <w:rStyle w:val="VerbatimChar"/>
+        </w:rPr>
+        <w:t xml:space="preserve">DOMCharacterDataModified</w:t>
+      </w:r>
+      <w:r>
+        <w:t xml:space="preserve">; and the</w:t>
+      </w:r>
+      <w:r>
+        <w:t xml:space="preserve"> </w:t>
+      </w:r>
+      <w:r>
+        <w:t xml:space="preserve">scripts' states,</w:t>
+      </w:r>
+      <w:r>
+        <w:t xml:space="preserve"> </w:t>
+      </w:r>
+      <w:r>
+        <w:rPr>
+          <w:rStyle w:val="VerbatimChar"/>
+        </w:rPr>
+        <w:t xml:space="preserve">n_set_state</w:t>
+      </w:r>
+      <w:r>
+        <w:t xml:space="preserve">), stamped with the next box tree's serial:</w:t>
+      </w:r>
+    </w:p>
+    <w:p>
+      <w:pPr>
+        <w:pStyle w:val="Compact"/>
+        <w:numPr>
+          <w:ilvl w:val="1"/>
+          <w:numId w:val="1034"/>
+        </w:numPr>
+      </w:pPr>
+      <w:r>
+        <w:t xml:space="preserve">an element's attribute changed or the element inserted: it and its subtree (descendant</w:t>
+      </w:r>
+      <w:r>
+        <w:t xml:space="preserve"> </w:t>
+      </w:r>
+      <w:r>
+        <w:t xml:space="preserve">and child combinators);</w:t>
+      </w:r>
+    </w:p>
+    <w:p>
+      <w:pPr>
+        <w:pStyle w:val="Compact"/>
+        <w:numPr>
+          <w:ilvl w:val="1"/>
+          <w:numId w:val="1034"/>
+        </w:numPr>
+      </w:pPr>
+      <w:r>
+        <w:t xml:space="preserve">a child of P inserted or removed, its children or text changed: P's "children" mark --</w:t>
+      </w:r>
+      <w:r>
+        <w:t xml:space="preserve"> </w:t>
+      </w:r>
+      <w:r>
+        <w:t xml:space="preserve">the children whose selection looked at their position (</w:t>
+      </w:r>
+      <w:r>
+        <w:rPr>
+          <w:rStyle w:val="VerbatimChar"/>
+        </w:rPr>
+        <w:t xml:space="preserve">NSCSS_STRUCT_SELF</w:t>
+      </w:r>
+      <w:r>
+        <w:t xml:space="preserve">:</w:t>
+      </w:r>
+      <w:r>
+        <w:t xml:space="preserve"> </w:t>
+      </w:r>
+      <w:r>
+        <w:rPr>
+          <w:rStyle w:val="VerbatimChar"/>
+        </w:rPr>
+        <w:t xml:space="preserve">:nth-child</w:t>
+      </w:r>
+      <w:r>
+        <w:t xml:space="preserve">,</w:t>
+      </w:r>
+      <w:r>
+        <w:t xml:space="preserve"> </w:t>
+      </w:r>
+      <w:r>
+        <w:rPr>
+          <w:rStyle w:val="VerbatimChar"/>
+        </w:rPr>
+        <w:t xml:space="preserve">:first-child</w:t>
+      </w:r>
+      <w:r>
+        <w:t xml:space="preserve">,</w:t>
+      </w:r>
+      <w:r>
+        <w:t xml:space="preserve"> </w:t>
+      </w:r>
+      <w:r>
+        <w:rPr>
+          <w:rStyle w:val="VerbatimChar"/>
+        </w:rPr>
+        <w:t xml:space="preserve">:empty</w:t>
+      </w:r>
+      <w:r>
+        <w:t xml:space="preserve">, recorded by the selection callbacks in</w:t>
+      </w:r>
+      <w:r>
+        <w:t xml:space="preserve"> </w:t>
+      </w:r>
+      <w:r>
+        <w:rPr>
+          <w:rStyle w:val="VerbatimChar"/>
+        </w:rPr>
+        <w:t xml:space="preserve">css/select.c</w:t>
+      </w:r>
+      <w:r>
+        <w:t xml:space="preserve">) or at</w:t>
+      </w:r>
+      <w:r>
+        <w:t xml:space="preserve"> </w:t>
+      </w:r>
+      <w:r>
+        <w:t xml:space="preserve">their previous siblings (</w:t>
+      </w:r>
+      <w:r>
+        <w:rPr>
+          <w:rStyle w:val="VerbatimChar"/>
+        </w:rPr>
+        <w:t xml:space="preserve">NSCSS_STRUCT_SIB</w:t>
+      </w:r>
+      <w:r>
+        <w:t xml:space="preserve">: sibling combinators,</w:t>
+      </w:r>
+      <w:r>
+        <w:t xml:space="preserve"> </w:t>
+      </w:r>
+      <w:r>
+        <w:rPr>
+          <w:rStyle w:val="VerbatimChar"/>
+        </w:rPr>
+        <w:t xml:space="preserve">:nth-child(of S)</w:t>
+      </w:r>
+      <w:r>
+        <w:t xml:space="preserve">);</w:t>
+      </w:r>
+      <w:r>
+        <w:t xml:space="preserve"> </w:t>
+      </w:r>
+      <w:r>
+        <w:t xml:space="preserve">a child's attributes changed: P's "children's attributes" mark, for the</w:t>
+      </w:r>
+      <w:r>
+        <w:t xml:space="preserve"> </w:t>
+      </w:r>
+      <w:r>
+        <w:rPr>
+          <w:rStyle w:val="VerbatimChar"/>
+        </w:rPr>
+        <w:t xml:space="preserve">SIB</w:t>
+      </w:r>
+      <w:r>
+        <w:t xml:space="preserve"> </w:t>
+      </w:r>
+      <w:r>
+        <w:t xml:space="preserve">ones only</w:t>
+      </w:r>
+      <w:r>
+        <w:t xml:space="preserve"> </w:t>
+      </w:r>
+      <w:r>
+        <w:t xml:space="preserve">(a class toggled in a list striped by</w:t>
+      </w:r>
+      <w:r>
+        <w:t xml:space="preserve"> </w:t>
+      </w:r>
+      <w:r>
+        <w:rPr>
+          <w:rStyle w:val="VerbatimChar"/>
+        </w:rPr>
+        <w:t xml:space="preserve">:nth-child</w:t>
+      </w:r>
+      <w:r>
+        <w:t xml:space="preserve"> </w:t>
+      </w:r>
+      <w:r>
+        <w:t xml:space="preserve">restyles one row); and every</w:t>
+      </w:r>
+      <w:r>
+        <w:t xml:space="preserve"> </w:t>
+      </w:r>
+      <w:r>
+        <w:t xml:space="preserve">descendant whose selection looked at the structure around another node</w:t>
+      </w:r>
+      <w:r>
+        <w:t xml:space="preserve"> </w:t>
+      </w:r>
+      <w:r>
+        <w:t xml:space="preserve">(</w:t>
+      </w:r>
+      <w:r>
+        <w:rPr>
+          <w:rStyle w:val="VerbatimChar"/>
+        </w:rPr>
+        <w:t xml:space="preserve">NSCSS_STRUCT_ANC</w:t>
+      </w:r>
+      <w:r>
+        <w:t xml:space="preserve">) when an ancestor has such a mark.</w:t>
+      </w:r>
+      <w:r>
+        <w:t xml:space="preserve"> </w:t>
+      </w:r>
+      <w:r>
+        <w:t xml:space="preserve">An element selected again for a mark gives its subtree the mark. A kept selection is also</w:t>
+      </w:r>
+      <w:r>
+        <w:t xml:space="preserve"> </w:t>
+      </w:r>
+      <w:r>
+        <w:t xml:space="preserve">checked against its parent's and the root's computed styles (interned by libcss: the same</w:t>
+      </w:r>
+      <w:r>
+        <w:t xml:space="preserve"> </w:t>
+      </w:r>
+      <w:r>
+        <w:t xml:space="preserve">pointer is the same style; references held), its parent's custom properties (libcss keeps</w:t>
+      </w:r>
+      <w:r>
+        <w:t xml:space="preserve"> </w:t>
+      </w:r>
+      <w:r>
+        <w:t xml:space="preserve">them in the node data, not in the computed style:</w:t>
+      </w:r>
+      <w:r>
+        <w:t xml:space="preserve"> </w:t>
+      </w:r>
+      <w:r>
+        <w:rPr>
+          <w:rStyle w:val="VerbatimChar"/>
+        </w:rPr>
+        <w:t xml:space="preserve">css_onyx_node_vars_ref</w:t>
+      </w:r>
+      <w:r>
+        <w:t xml:space="preserve"> </w:t>
+      </w:r>
+      <w:r>
+        <w:t xml:space="preserve">/</w:t>
+      </w:r>
+      <w:r>
+        <w:t xml:space="preserve"> </w:t>
+      </w:r>
+      <w:r>
+        <w:rPr>
+          <w:rStyle w:val="VerbatimChar"/>
+        </w:rPr>
+        <w:t xml:space="preserve">css_onyx_vars_same</w:t>
+      </w:r>
+      <w:r>
+        <w:t xml:space="preserve">), the</w:t>
+      </w:r>
+      <w:r>
+        <w:t xml:space="preserve"> </w:t>
+      </w:r>
+      <w:r>
+        <w:rPr>
+          <w:rStyle w:val="VerbatimChar"/>
+        </w:rPr>
+        <w:t xml:space="preserve">:hover</w:t>
+      </w:r>
+      <w:r>
+        <w:t xml:space="preserve"> </w:t>
+      </w:r>
+      <w:r>
+        <w:t xml:space="preserve">state of each node its selection tried</w:t>
+      </w:r>
+      <w:r>
+        <w:t xml:space="preserve"> </w:t>
+      </w:r>
+      <w:r>
+        <w:rPr>
+          <w:rStyle w:val="VerbatimChar"/>
+        </w:rPr>
+        <w:t xml:space="preserve">:hover</w:t>
+      </w:r>
+      <w:r>
+        <w:t xml:space="preserve"> </w:t>
+      </w:r>
+      <w:r>
+        <w:t xml:space="preserve">on (the</w:t>
+      </w:r>
+      <w:r>
+        <w:t xml:space="preserve"> </w:t>
+      </w:r>
+      <w:r>
+        <w:t xml:space="preserve">element and its ancestors -- libcss asks it of every element; a</w:t>
+      </w:r>
+      <w:r>
+        <w:t xml:space="preserve"> </w:t>
+      </w:r>
+      <w:r>
+        <w:rPr>
+          <w:rStyle w:val="VerbatimChar"/>
+        </w:rPr>
+        <w:t xml:space="preserve">:hover</w:t>
+      </w:r>
+      <w:r>
+        <w:t xml:space="preserve"> </w:t>
+      </w:r>
+      <w:r>
+        <w:t xml:space="preserve">tried on another</w:t>
+      </w:r>
+      <w:r>
+        <w:t xml:space="preserve"> </w:t>
+      </w:r>
+      <w:r>
+        <w:t xml:space="preserve">node is not kept) whose notes for</w:t>
+      </w:r>
+      <w:r>
+        <w:t xml:space="preserve"> </w:t>
+      </w:r>
+      <w:r>
+        <w:rPr>
+          <w:rStyle w:val="VerbatimChar"/>
+        </w:rPr>
+        <w:t xml:space="preserve">onyx_hover.c</w:t>
+      </w:r>
+      <w:r>
+        <w:t xml:space="preserve"> </w:t>
+      </w:r>
+      <w:r>
+        <w:t xml:space="preserve">are replayed, a link's</w:t>
+      </w:r>
+      <w:r>
+        <w:t xml:space="preserve"> </w:t>
+      </w:r>
+      <w:r>
+        <w:rPr>
+          <w:rStyle w:val="VerbatimChar"/>
+        </w:rPr>
+        <w:t xml:space="preserve">:visited</w:t>
+      </w:r>
+      <w:r>
+        <w:t xml:space="preserve"> </w:t>
+      </w:r>
+      <w:r>
+        <w:t xml:space="preserve">state</w:t>
+      </w:r>
+      <w:r>
+        <w:t xml:space="preserve"> </w:t>
+      </w:r>
+      <w:r>
+        <w:t xml:space="preserve">(the history changes without the DOM), and an epoch that a new selection context or a</w:t>
+      </w:r>
+      <w:r>
+        <w:t xml:space="preserve"> </w:t>
+      </w:r>
+      <w:r>
+        <w:t xml:space="preserve">media change moves. When the new context only adds or takes out sheets (a late</w:t>
+      </w:r>
+      <w:r>
+        <w:t xml:space="preserve"> </w:t>
+      </w:r>
+      <w:r>
+        <w:rPr>
+          <w:rStyle w:val="VerbatimChar"/>
+        </w:rPr>
+        <w:t xml:space="preserve">&lt;link&gt;</w:t>
+      </w:r>
+      <w:r>
+        <w:t xml:space="preserve">, a</w:t>
+      </w:r>
+      <w:r>
+        <w:t xml:space="preserve"> </w:t>
+      </w:r>
+      <w:r>
+        <w:t xml:space="preserve">script's</w:t>
+      </w:r>
+      <w:r>
+        <w:t xml:space="preserve"> </w:t>
+      </w:r>
+      <w:r>
+        <w:rPr>
+          <w:rStyle w:val="VerbatimChar"/>
+        </w:rPr>
+        <w:t xml:space="preserve">&lt;style&gt;</w:t>
+      </w:r>
+      <w:r>
+        <w:t xml:space="preserve">, a</w:t>
+      </w:r>
+      <w:r>
+        <w:t xml:space="preserve"> </w:t>
+      </w:r>
+      <w:r>
+        <w:rPr>
+          <w:rStyle w:val="VerbatimChar"/>
+        </w:rPr>
+        <w:t xml:space="preserve">&lt;style&gt;</w:t>
+      </w:r>
+      <w:r>
+        <w:t xml:space="preserve">'s text changed -- github.com loads its sheets after the</w:t>
+      </w:r>
+      <w:r>
+        <w:t xml:space="preserve"> </w:t>
+      </w:r>
+      <w:r>
+        <w:t xml:space="preserve">page), a kept selection of an epoch since stays for an element no selector of those sheets</w:t>
+      </w:r>
+      <w:r>
+        <w:t xml:space="preserve"> </w:t>
+      </w:r>
+      <w:r>
+        <w:t xml:space="preserve">matches (libcss</w:t>
+      </w:r>
+      <w:r>
+        <w:t xml:space="preserve"> </w:t>
+      </w:r>
+      <w:r>
+        <w:rPr>
+          <w:rStyle w:val="VerbatimChar"/>
+        </w:rPr>
+        <w:t xml:space="preserve">css_select_style_onyx_probe</w:t>
+      </w:r>
+      <w:r>
+        <w:t xml:space="preserve"> </w:t>
+      </w:r>
+      <w:r>
+        <w:t xml:space="preserve">on a context of those sheets only; a probe</w:t>
+      </w:r>
+      <w:r>
+        <w:t xml:space="preserve"> </w:t>
+      </w:r>
+      <w:r>
+        <w:t xml:space="preserve">that looks at another node's</w:t>
+      </w:r>
+      <w:r>
+        <w:t xml:space="preserve"> </w:t>
+      </w:r>
+      <w:r>
+        <w:rPr>
+          <w:rStyle w:val="VerbatimChar"/>
+        </w:rPr>
+        <w:t xml:space="preserve">:hover</w:t>
+      </w:r>
+      <w:r>
+        <w:t xml:space="preserve"> </w:t>
+      </w:r>
+      <w:r>
+        <w:t xml:space="preserve">or at the structure counts as a match); the sheets</w:t>
+      </w:r>
+      <w:r>
+        <w:t xml:space="preserve"> </w:t>
+      </w:r>
+      <w:r>
+        <w:t xml:space="preserve">taken out are kept alive meanwhile (</w:t>
+      </w:r>
+      <w:r>
+        <w:rPr>
+          <w:rStyle w:val="VerbatimChar"/>
+        </w:rPr>
+        <w:t xml:space="preserve">onyx_restyle_keep_sheet</w:t>
+      </w:r>
+      <w:r>
+        <w:t xml:space="preserve">). Never kept: the elements</w:t>
+      </w:r>
+      <w:r>
+        <w:t xml:space="preserve"> </w:t>
+      </w:r>
+      <w:r>
+        <w:t xml:space="preserve">in a shadow tree, shadow hosts and their light children (the first shadow root does not</w:t>
+      </w:r>
+      <w:r>
+        <w:t xml:space="preserve"> </w:t>
+      </w:r>
+      <w:r>
+        <w:t xml:space="preserve">move the epoch: a light element's selection is the same through</w:t>
+      </w:r>
+      <w:r>
+        <w:t xml:space="preserve"> </w:t>
+      </w:r>
+      <w:r>
+        <w:rPr>
+          <w:rStyle w:val="VerbatimChar"/>
+        </w:rPr>
+        <w:t xml:space="preserve">onyx_shadow_style</w:t>
+      </w:r>
+      <w:r>
+        <w:t xml:space="preserve">).</w:t>
+      </w:r>
+      <w:r>
+        <w:t xml:space="preserve"> </w:t>
+      </w:r>
+      <w:r>
+        <w:t xml:space="preserve">The PC bench:</w:t>
+      </w:r>
+      <w:r>
+        <w:t xml:space="preserve"> </w:t>
+      </w:r>
+      <w:r>
+        <w:rPr>
+          <w:rStyle w:val="VerbatimChar"/>
+        </w:rPr>
+        <w:t xml:space="preserve">NS_NORESTYLE=1</w:t>
+      </w:r>
+      <w:r>
+        <w:t xml:space="preserve"> </w:t>
+      </w:r>
+      <w:r>
+        <w:t xml:space="preserve">selects every element;</w:t>
+      </w:r>
+      <w:r>
+        <w:t xml:space="preserve"> </w:t>
+      </w:r>
+      <w:r>
+        <w:rPr>
+          <w:rStyle w:val="VerbatimChar"/>
+        </w:rPr>
+        <w:t xml:space="preserve">NS_RESTYLE_CHECK=1</w:t>
+      </w:r>
+      <w:r>
+        <w:t xml:space="preserve"> </w:t>
+      </w:r>
+      <w:r>
+        <w:t xml:space="preserve">compares each</w:t>
+      </w:r>
+      <w:r>
+        <w:t xml:space="preserve"> </w:t>
+      </w:r>
+      <w:r>
+        <w:t xml:space="preserve">kept selection with a new one (</w:t>
+      </w:r>
+      <w:r>
+        <w:rPr>
+          <w:rStyle w:val="VerbatimChar"/>
+        </w:rPr>
+        <w:t xml:space="preserve">RESTYLE-MISMATCH</w:t>
+      </w:r>
+      <w:r>
+        <w:t xml:space="preserve"> </w:t>
+      </w:r>
+      <w:r>
+        <w:t xml:space="preserve">lines: 0 on github.com, bbc.com,</w:t>
+      </w:r>
+      <w:r>
+        <w:t xml:space="preserve"> </w:t>
+      </w:r>
+      <w:r>
+        <w:t xml:space="preserve">m.facebook.com, en.wikipedia.org, reddit.com, amazon.fr, lemonde.fr, yahoo.com,</w:t>
+      </w:r>
+      <w:r>
+        <w:t xml:space="preserve"> </w:t>
+      </w:r>
+      <w:r>
+        <w:t xml:space="preserve">duckduckgo.com, developer.mozilla.org, youtube.com);</w:t>
+      </w:r>
+      <w:r>
+        <w:t xml:space="preserve"> </w:t>
+      </w:r>
+      <w:r>
+        <w:rPr>
+          <w:rStyle w:val="VerbatimChar"/>
+        </w:rPr>
+        <w:t xml:space="preserve">NS_PERF</w:t>
+      </w:r>
+      <w:r>
+        <w:t xml:space="preserve"> </w:t>
+      </w:r>
+      <w:r>
+        <w:t xml:space="preserve">prints</w:t>
+      </w:r>
+      <w:r>
+        <w:t xml:space="preserve"> </w:t>
+      </w:r>
+      <w:r>
+        <w:rPr>
+          <w:rStyle w:val="VerbatimChar"/>
+        </w:rPr>
+        <w:t xml:space="preserve">styles: K of N kept</w:t>
+      </w:r>
+      <w:r>
+        <w:t xml:space="preserve">.</w:t>
       </w:r>
     </w:p>
     <w:p>
@@ -49015,31 +50073,110 @@
         </w:numPr>
       </w:pPr>
       <w:r>
-        <w:t xml:space="preserve">The network (§24): no revocation checks, no CSP, no SameSite cookies, no</w:t>
-      </w:r>
-      <w:r>
-        <w:t xml:space="preserve"> </w:t>
-      </w:r>
-      <w:r>
-        <w:t xml:space="preserve">CORS for the core's loads (EventSource, fonts,</w:t>
-      </w:r>
-      <w:r>
-        <w:t xml:space="preserve"> </w:t>
-      </w:r>
-      <w:r>
-        <w:rPr>
-          <w:rStyle w:val="VerbatimChar"/>
-        </w:rPr>
-        <w:t xml:space="preserve">&lt;img crossorigin&gt;</w:t>
-      </w:r>
-      <w:r>
-        <w:t xml:space="preserve">, module scripts), no</w:t>
-      </w:r>
-      <w:r>
-        <w:t xml:space="preserve"> </w:t>
-      </w:r>
-      <w:r>
-        <w:t xml:space="preserve">HTTP/3, no back-forward cache.</w:t>
+        <w:rPr>
+          <w:b/>
+          <w:bCs/>
+        </w:rPr>
+        <w:t xml:space="preserve">Selection costs that were n^2</w:t>
+      </w:r>
+      <w:r>
+        <w:t xml:space="preserve"> </w:t>
+      </w:r>
+      <w:r>
+        <w:t xml:space="preserve">(</w:t>
+      </w:r>
+      <w:r>
+        <w:rPr>
+          <w:rStyle w:val="VerbatimChar"/>
+        </w:rPr>
+        <w:t xml:space="preserve">css/select.c</w:t>
+      </w:r>
+      <w:r>
+        <w:t xml:space="preserve">, libcss):</w:t>
+      </w:r>
+      <w:r>
+        <w:t xml:space="preserve"> </w:t>
+      </w:r>
+      <w:r>
+        <w:rPr>
+          <w:rStyle w:val="VerbatimChar"/>
+        </w:rPr>
+        <w:t xml:space="preserve">:nth-child</w:t>
+      </w:r>
+      <w:r>
+        <w:t xml:space="preserve"> </w:t>
+      </w:r>
+      <w:r>
+        <w:t xml:space="preserve">and</w:t>
+      </w:r>
+      <w:r>
+        <w:t xml:space="preserve"> </w:t>
+      </w:r>
+      <w:r>
+        <w:rPr>
+          <w:rStyle w:val="VerbatimChar"/>
+        </w:rPr>
+        <w:t xml:space="preserve">:last-child</w:t>
+      </w:r>
+      <w:r>
+        <w:t xml:space="preserve"> </w:t>
+      </w:r>
+      <w:r>
+        <w:t xml:space="preserve">counted an element's siblings for each element -- the counts are now found for all a</w:t>
+      </w:r>
+      <w:r>
+        <w:t xml:space="preserve"> </w:t>
+      </w:r>
+      <w:r>
+        <w:t xml:space="preserve">parent's children at once and kept until the next mutation event (</w:t>
+      </w:r>
+      <w:r>
+        <w:rPr>
+          <w:rStyle w:val="VerbatimChar"/>
+        </w:rPr>
+        <w:t xml:space="preserve">nscss_dom_changed</w:t>
+      </w:r>
+      <w:r>
+        <w:t xml:space="preserve">);</w:t>
+      </w:r>
+      <w:r>
+        <w:t xml:space="preserve"> </w:t>
+      </w:r>
+      <w:r>
+        <w:t xml:space="preserve">libcss's style-sharing search walked back over every previous sibling of the same name that</w:t>
+      </w:r>
+      <w:r>
+        <w:t xml:space="preserve"> </w:t>
+      </w:r>
+      <w:r>
+        <w:t xml:space="preserve">could not share (a list striped by</w:t>
+      </w:r>
+      <w:r>
+        <w:t xml:space="preserve"> </w:t>
+      </w:r>
+      <w:r>
+        <w:rPr>
+          <w:rStyle w:val="VerbatimChar"/>
+        </w:rPr>
+        <w:t xml:space="preserve">:nth-child</w:t>
+      </w:r>
+      <w:r>
+        <w:t xml:space="preserve">) -- it tries 8 candidates. A 2500-row list</w:t>
+      </w:r>
+      <w:r>
+        <w:t xml:space="preserve"> </w:t>
+      </w:r>
+      <w:r>
+        <w:t xml:space="preserve">(</w:t>
+      </w:r>
+      <w:r>
+        <w:rPr>
+          <w:rStyle w:val="VerbatimChar"/>
+        </w:rPr>
+        <w:t xml:space="preserve">pages/rebox-perf.html</w:t>
+      </w:r>
+      <w:r>
+        <w:t xml:space="preserve">, 10 000 elements): a rebox 380 ms -&gt; 20-40 ms.</w:t>
       </w:r>
     </w:p>
     <w:p>
@@ -49051,142 +50188,134 @@
         </w:numPr>
       </w:pPr>
       <w:r>
-        <w:t xml:space="preserve">Shadow DOM (§20): the manual slot assignment's rendering,</w:t>
-      </w:r>
-      <w:r>
-        <w:t xml:space="preserve"> </w:t>
-      </w:r>
-      <w:r>
-        <w:rPr>
-          <w:rStyle w:val="VerbatimChar"/>
-        </w:rPr>
-        <w:t xml:space="preserve">exportparts</w:t>
-      </w:r>
-      <w:r>
-        <w:t xml:space="preserve">, a clonable root's</w:t>
-      </w:r>
-      <w:r>
-        <w:t xml:space="preserve"> </w:t>
-      </w:r>
-      <w:r>
-        <w:t xml:space="preserve">cloning,</w:t>
-      </w:r>
-      <w:r>
-        <w:t xml:space="preserve"> </w:t>
-      </w:r>
-      <w:r>
-        <w:rPr>
-          <w:rStyle w:val="VerbatimChar"/>
-        </w:rPr>
-        <w:t xml:space="preserve">&lt;link&gt;</w:t>
-      </w:r>
-      <w:r>
-        <w:t xml:space="preserve"> </w:t>
-      </w:r>
-      <w:r>
-        <w:t xml:space="preserve">/</w:t>
-      </w:r>
-      <w:r>
-        <w:t xml:space="preserve"> </w:t>
-      </w:r>
-      <w:r>
-        <w:rPr>
-          <w:rStyle w:val="VerbatimChar"/>
-        </w:rPr>
-        <w:t xml:space="preserve">@import</w:t>
-      </w:r>
-      <w:r>
-        <w:t xml:space="preserve"> </w:t>
-      </w:r>
-      <w:r>
-        <w:t xml:space="preserve">/</w:t>
-      </w:r>
-      <w:r>
-        <w:t xml:space="preserve"> </w:t>
-      </w:r>
-      <w:r>
-        <w:rPr>
-          <w:rStyle w:val="VerbatimChar"/>
-        </w:rPr>
-        <w:t xml:space="preserve">@font-face</w:t>
-      </w:r>
-      <w:r>
-        <w:t xml:space="preserve"> </w:t>
-      </w:r>
-      <w:r>
-        <w:t xml:space="preserve">in shadow trees,</w:t>
-      </w:r>
-      <w:r>
-        <w:t xml:space="preserve"> </w:t>
-      </w:r>
-      <w:r>
-        <w:rPr>
-          <w:rStyle w:val="VerbatimChar"/>
-        </w:rPr>
-        <w:t xml:space="preserve">:host</w:t>
-      </w:r>
-      <w:r>
-        <w:t xml:space="preserve"> </w:t>
-      </w:r>
-      <w:r>
-        <w:t xml:space="preserve">in</w:t>
-      </w:r>
-      <w:r>
-        <w:t xml:space="preserve"> </w:t>
-      </w:r>
-      <w:r>
-        <w:rPr>
-          <w:rStyle w:val="VerbatimChar"/>
-        </w:rPr>
-        <w:t xml:space="preserve">matches()</w:t>
-      </w:r>
-      <w:r>
-        <w:t xml:space="preserve">;</w:t>
-      </w:r>
-      <w:r>
-        <w:t xml:space="preserve"> </w:t>
-      </w:r>
-      <w:r>
-        <w:rPr>
-          <w:rStyle w:val="VerbatimChar"/>
-        </w:rPr>
-        <w:t xml:space="preserve">::before</w:t>
-      </w:r>
-      <w:r>
-        <w:t xml:space="preserve"> </w:t>
-      </w:r>
-      <w:r>
-        <w:t xml:space="preserve">/</w:t>
-      </w:r>
-      <w:r>
-        <w:t xml:space="preserve"> </w:t>
-      </w:r>
-      <w:r>
-        <w:rPr>
-          <w:rStyle w:val="VerbatimChar"/>
-        </w:rPr>
-        <w:t xml:space="preserve">::after</w:t>
-      </w:r>
-      <w:r>
-        <w:t xml:space="preserve"> </w:t>
-      </w:r>
-      <w:r>
-        <w:t xml:space="preserve">of a</w:t>
-      </w:r>
-      <w:r>
-        <w:t xml:space="preserve"> </w:t>
-      </w:r>
-      <w:r>
-        <w:rPr>
-          <w:rStyle w:val="VerbatimChar"/>
-        </w:rPr>
-        <w:t xml:space="preserve">display: contents</w:t>
-      </w:r>
-      <w:r>
-        <w:t xml:space="preserve"> </w:t>
-      </w:r>
-      <w:r>
-        <w:t xml:space="preserve">element.</w:t>
+        <w:rPr>
+          <w:b/>
+          <w:bCs/>
+        </w:rPr>
+        <w:t xml:space="preserve">Reboxes coalesced and throttled</w:t>
+      </w:r>
+      <w:r>
+        <w:t xml:space="preserve"> </w:t>
+      </w:r>
+      <w:r>
+        <w:t xml:space="preserve">(</w:t>
+      </w:r>
+      <w:r>
+        <w:rPr>
+          <w:rStyle w:val="VerbatimChar"/>
+        </w:rPr>
+        <w:t xml:space="preserve">html.c</w:t>
+      </w:r>
+      <w:r>
+        <w:t xml:space="preserve"> </w:t>
+      </w:r>
+      <w:r>
+        <w:rPr>
+          <w:rStyle w:val="VerbatimChar"/>
+        </w:rPr>
+        <w:t xml:space="preserve">html_script_dom_changed</w:t>
+      </w:r>
+      <w:r>
+        <w:t xml:space="preserve">): the first change</w:t>
+      </w:r>
+      <w:r>
+        <w:t xml:space="preserve"> </w:t>
+      </w:r>
+      <w:r>
+        <w:t xml:space="preserve">sets when the rebox comes (a later one no longer puts it off -- a script changing the DOM</w:t>
+      </w:r>
+      <w:r>
+        <w:t xml:space="preserve"> </w:t>
+      </w:r>
+      <w:r>
+        <w:t xml:space="preserve">every few ms kept it from ever coming), and while the scripts keep changing the DOM, one</w:t>
+      </w:r>
+      <w:r>
+        <w:t xml:space="preserve"> </w:t>
+      </w:r>
+      <w:r>
+        <w:t xml:space="preserve">every max(50 ms, twice the last rebox's cost) at most; a script asking for a geometry still</w:t>
+      </w:r>
+      <w:r>
+        <w:t xml:space="preserve"> </w:t>
+      </w:r>
+      <w:r>
+        <w:t xml:space="preserve">has its rebox at once (</w:t>
+      </w:r>
+      <w:r>
+        <w:rPr>
+          <w:rStyle w:val="VerbatimChar"/>
+        </w:rPr>
+        <w:t xml:space="preserve">html_script_layout_now</w:t>
+      </w:r>
+      <w:r>
+        <w:t xml:space="preserve">). A script turn whose DOM changes were all</w:t>
+      </w:r>
+      <w:r>
+        <w:t xml:space="preserve"> </w:t>
+      </w:r>
+      <w:r>
+        <w:t xml:space="preserve">under a</w:t>
+      </w:r>
+      <w:r>
+        <w:t xml:space="preserve"> </w:t>
+      </w:r>
+      <w:r>
+        <w:rPr>
+          <w:rStyle w:val="VerbatimChar"/>
+        </w:rPr>
+        <w:t xml:space="preserve">display: none</w:t>
+      </w:r>
+      <w:r>
+        <w:t xml:space="preserve"> </w:t>
+      </w:r>
+      <w:r>
+        <w:t xml:space="preserve">ancestor of the last box tree (head, script, template, a hidden</w:t>
+      </w:r>
+      <w:r>
+        <w:t xml:space="preserve"> </w:t>
+      </w:r>
+      <w:r>
+        <w:t xml:space="preserve">panel:</w:t>
+      </w:r>
+      <w:r>
+        <w:t xml:space="preserve"> </w:t>
+      </w:r>
+      <w:r>
+        <w:rPr>
+          <w:rStyle w:val="VerbatimChar"/>
+        </w:rPr>
+        <w:t xml:space="preserve">onyx_restyle_node_hidden</w:t>
+      </w:r>
+      <w:r>
+        <w:t xml:space="preserve">) reboxes nothing (</w:t>
+      </w:r>
+      <w:r>
+        <w:rPr>
+          <w:rStyle w:val="VerbatimChar"/>
+        </w:rPr>
+        <w:t xml:space="preserve">html_script_dom_changed_by_script</w:t>
+      </w:r>
+      <w:r>
+        <w:t xml:space="preserve">,</w:t>
+      </w:r>
+      <w:r>
+        <w:t xml:space="preserve"> </w:t>
+      </w:r>
+      <w:r>
+        <w:t xml:space="preserve">from</w:t>
+      </w:r>
+      <w:r>
+        <w:t xml:space="preserve"> </w:t>
+      </w:r>
+      <w:r>
+        <w:rPr>
+          <w:rStyle w:val="VerbatimChar"/>
+        </w:rPr>
+        <w:t xml:space="preserve">qjs.c</w:t>
+      </w:r>
+      <w:r>
+        <w:t xml:space="preserve">).</w:t>
       </w:r>
     </w:p>
     <w:p>
@@ -49198,16 +50327,154 @@
         </w:numPr>
       </w:pPr>
       <w:r>
-        <w:t xml:space="preserve">The compositing layers' gaps (§21: a real perspective,</w:t>
-      </w:r>
-      <w:r>
-        <w:t xml:space="preserve"> </w:t>
-      </w:r>
-      <w:r>
-        <w:rPr>
-          <w:rStyle w:val="VerbatimChar"/>
-        </w:rPr>
-        <w:t xml:space="preserve">clip-path</w:t>
+        <w:rPr>
+          <w:b/>
+          <w:bCs/>
+        </w:rPr>
+        <w:t xml:space="preserve">Attribute-only changes restyled in the boxes</w:t>
+      </w:r>
+      <w:r>
+        <w:t xml:space="preserve"> </w:t>
+      </w:r>
+      <w:r>
+        <w:t xml:space="preserve">(</w:t>
+      </w:r>
+      <w:r>
+        <w:rPr>
+          <w:rStyle w:val="VerbatimChar"/>
+        </w:rPr>
+        <w:t xml:space="preserve">html_restyle_in_place</w:t>
+      </w:r>
+      <w:r>
+        <w:t xml:space="preserve">,</w:t>
+      </w:r>
+      <w:r>
+        <w:t xml:space="preserve"> </w:t>
+      </w:r>
+      <w:r>
+        <w:rPr>
+          <w:rStyle w:val="VerbatimChar"/>
+        </w:rPr>
+        <w:t xml:space="preserve">onyx_hover_restyle_nodes</w:t>
+      </w:r>
+      <w:r>
+        <w:t xml:space="preserve">): when every DOM change since the last rebox set attributes (a</w:t>
+      </w:r>
+      <w:r>
+        <w:t xml:space="preserve"> </w:t>
+      </w:r>
+      <w:r>
+        <w:t xml:space="preserve">class toggled by a timer, a style attribute,</w:t>
+      </w:r>
+      <w:r>
+        <w:t xml:space="preserve"> </w:t>
+      </w:r>
+      <w:r>
+        <w:rPr>
+          <w:rStyle w:val="VerbatimChar"/>
+        </w:rPr>
+        <w:t xml:space="preserve">aria-expanded</w:t>
+      </w:r>
+      <w:r>
+        <w:t xml:space="preserve">, a popover state), the changed</w:t>
+      </w:r>
+      <w:r>
+        <w:t xml:space="preserve"> </w:t>
+      </w:r>
+      <w:r>
+        <w:t xml:space="preserve">elements' subtrees -- with their following siblings whose selections looked at previous</w:t>
+      </w:r>
+      <w:r>
+        <w:t xml:space="preserve"> </w:t>
+      </w:r>
+      <w:r>
+        <w:t xml:space="preserve">siblings -- are styled again in their boxes with the</w:t>
+      </w:r>
+      <w:r>
+        <w:t xml:space="preserve"> </w:t>
+      </w:r>
+      <w:r>
+        <w:rPr>
+          <w:rStyle w:val="VerbatimChar"/>
+        </w:rPr>
+        <w:t xml:space="preserve">:hover</w:t>
+      </w:r>
+      <w:r>
+        <w:t xml:space="preserve"> </w:t>
+      </w:r>
+      <w:r>
+        <w:t xml:space="preserve">machinery (§9): redrawn when</w:t>
+      </w:r>
+      <w:r>
+        <w:t xml:space="preserve"> </w:t>
+      </w:r>
+      <w:r>
+        <w:t xml:space="preserve">only how they are painted changed, else laid out again without building the boxes; anything</w:t>
+      </w:r>
+      <w:r>
+        <w:t xml:space="preserve"> </w:t>
+      </w:r>
+      <w:r>
+        <w:t xml:space="preserve">else (an unboxed element shown, a pseudo-element appearing, an image to fetch) builds the</w:t>
+      </w:r>
+      <w:r>
+        <w:t xml:space="preserve"> </w:t>
+      </w:r>
+      <w:r>
+        <w:t xml:space="preserve">boxes again.</w:t>
+      </w:r>
+      <w:r>
+        <w:t xml:space="preserve"> </w:t>
+      </w:r>
+      <w:r>
+        <w:rPr>
+          <w:rStyle w:val="VerbatimChar"/>
+        </w:rPr>
+        <w:t xml:space="preserve">rebox-perf.html</w:t>
+      </w:r>
+      <w:r>
+        <w:t xml:space="preserve"> </w:t>
+      </w:r>
+      <w:r>
+        <w:t xml:space="preserve">(a class toggled every 100 ms): rebox + layout 60-100 ms -&gt;</w:t>
+      </w:r>
+      <w:r>
+        <w:t xml:space="preserve"> </w:t>
+      </w:r>
+      <w:r>
+        <w:t xml:space="preserve">5-9 ms.</w:t>
+      </w:r>
+      <w:r>
+        <w:t xml:space="preserve"> </w:t>
+      </w:r>
+      <w:r>
+        <w:rPr>
+          <w:rStyle w:val="VerbatimChar"/>
+        </w:rPr>
+        <w:t xml:space="preserve">NS_NOINPLACE=1</w:t>
+      </w:r>
+      <w:r>
+        <w:t xml:space="preserve"> </w:t>
+      </w:r>
+      <w:r>
+        <w:t xml:space="preserve">turns it off.</w:t>
+      </w:r>
+    </w:p>
+    <w:p>
+      <w:pPr>
+        <w:pStyle w:val="FirstParagraph"/>
+      </w:pPr>
+      <w:r>
+        <w:t xml:space="preserve">Measured on the PC bench (the sites live, the same session;</w:t>
+      </w:r>
+      <w:r>
+        <w:t xml:space="preserve"> </w:t>
+      </w:r>
+      <w:r>
+        <w:rPr>
+          <w:rStyle w:val="VerbatimChar"/>
+        </w:rPr>
+        <w:t xml:space="preserve">layout</w:t>
       </w:r>
       <w:r>
         <w:t xml:space="preserve"> </w:t>
@@ -49222,25 +50489,519 @@
         <w:rPr>
           <w:rStyle w:val="VerbatimChar"/>
         </w:rPr>
-        <w:t xml:space="preserve">mask</w:t>
-      </w:r>
-      <w:r>
-        <w:t xml:space="preserve"> </w:t>
-      </w:r>
-      <w:r>
-        <w:t xml:space="preserve">on a layer, the</w:t>
-      </w:r>
-      <w:r>
-        <w:t xml:space="preserve"> </w:t>
-      </w:r>
-      <w:r>
-        <w:t xml:space="preserve">non-separable blend modes); animations: §22's "Not done"; GPU compositing: §25's (scrollers</w:t>
-      </w:r>
-      <w:r>
-        <w:t xml:space="preserve"> </w:t>
-      </w:r>
-      <w:r>
-        <w:t xml:space="preserve">and groups as layers, fixed boxes that stay in view).</w:t>
+        <w:t xml:space="preserve">rebox:boxes</w:t>
+      </w:r>
+      <w:r>
+        <w:t xml:space="preserve"> </w:t>
+      </w:r>
+      <w:r>
+        <w:t xml:space="preserve">summed</w:t>
+      </w:r>
+      <w:r>
+        <w:t xml:space="preserve"> </w:t>
+      </w:r>
+      <w:r>
+        <w:t xml:space="preserve">over the load with its scripts, ~16 s), before (the branch without these changes) -&gt; after:</w:t>
+      </w:r>
+    </w:p>
+    <w:tbl>
+      <w:tblPr>
+        <w:tblStyle w:val="Table"/>
+        <w:tblW w:type="auto" w:w="0"/>
+        <w:tblLook w:firstRow="1" w:lastRow="0" w:firstColumn="0" w:lastColumn="0" w:noHBand="0" w:noVBand="0" w:val="0020"/>
+      </w:tblPr>
+      <w:tblGrid>
+        <w:gridCol w:w="1980"/>
+        <w:gridCol w:w="1980"/>
+        <w:gridCol w:w="1980"/>
+        <w:gridCol w:w="1980"/>
+      </w:tblGrid>
+      <w:tr>
+        <w:trPr>
+          <w:tblHeader w:val="on"/>
+        </w:trPr>
+        <w:tc>
+          <w:tcPr/>
+          <w:p>
+            <w:pPr>
+              <w:pStyle w:val="Compact"/>
+            </w:pPr>
+            <w:r>
+              <w:t xml:space="preserve">Site</w:t>
+            </w:r>
+          </w:p>
+        </w:tc>
+        <w:tc>
+          <w:tcPr/>
+          <w:p>
+            <w:pPr>
+              <w:pStyle w:val="Compact"/>
+            </w:pPr>
+            <w:r>
+              <w:t xml:space="preserve">layout</w:t>
+            </w:r>
+          </w:p>
+        </w:tc>
+        <w:tc>
+          <w:tcPr/>
+          <w:p>
+            <w:pPr>
+              <w:pStyle w:val="Compact"/>
+            </w:pPr>
+            <w:r>
+              <w:t xml:space="preserve">rebox:boxes</w:t>
+            </w:r>
+          </w:p>
+        </w:tc>
+        <w:tc>
+          <w:tcPr/>
+          <w:p>
+            <w:pPr>
+              <w:pStyle w:val="Compact"/>
+            </w:pPr>
+            <w:r>
+              <w:t xml:space="preserve">note</w:t>
+            </w:r>
+          </w:p>
+        </w:tc>
+      </w:tr>
+      <w:tr>
+        <w:tc>
+          <w:tcPr/>
+          <w:p>
+            <w:pPr>
+              <w:pStyle w:val="Compact"/>
+            </w:pPr>
+            <w:r>
+              <w:t xml:space="preserve">m.facebook.com</w:t>
+            </w:r>
+          </w:p>
+        </w:tc>
+        <w:tc>
+          <w:tcPr/>
+          <w:p>
+            <w:pPr>
+              <w:pStyle w:val="Compact"/>
+            </w:pPr>
+            <w:r>
+              <w:t xml:space="preserve">10 passes, 1971 ms -&gt; 1 pass over 1 ms, 8 ms</w:t>
+            </w:r>
+          </w:p>
+        </w:tc>
+        <w:tc>
+          <w:tcPr/>
+          <w:p>
+            <w:pPr>
+              <w:pStyle w:val="Compact"/>
+            </w:pPr>
+            <w:r>
+              <w:t xml:space="preserve">37 -&gt; 11 ms</w:t>
+            </w:r>
+          </w:p>
+        </w:tc>
+        <w:tc>
+          <w:tcPr/>
+          <w:p>
+            <w:pPr>
+              <w:pStyle w:val="Compact"/>
+            </w:pPr>
+            <w:r>
+              <w:t xml:space="preserve">each pass ~170 ms -&gt; &lt; 1 ms</w:t>
+            </w:r>
+          </w:p>
+        </w:tc>
+      </w:tr>
+      <w:tr>
+        <w:tc>
+          <w:tcPr/>
+          <w:p>
+            <w:pPr>
+              <w:pStyle w:val="Compact"/>
+            </w:pPr>
+            <w:r>
+              <w:t xml:space="preserve">github.com/stephaneweg/Onyx</w:t>
+            </w:r>
+          </w:p>
+        </w:tc>
+        <w:tc>
+          <w:tcPr/>
+          <w:p>
+            <w:pPr>
+              <w:pStyle w:val="Compact"/>
+            </w:pPr>
+            <w:r>
+              <w:t xml:space="preserve">30 -&gt; 23-42 ms</w:t>
+            </w:r>
+          </w:p>
+        </w:tc>
+        <w:tc>
+          <w:tcPr/>
+          <w:p>
+            <w:pPr>
+              <w:pStyle w:val="Compact"/>
+            </w:pPr>
+            <w:r>
+              <w:t xml:space="preserve">8 reboxes, 1613 -&gt; 87-280 ms</w:t>
+            </w:r>
+          </w:p>
+        </w:tc>
+        <w:tc>
+          <w:tcPr/>
+          <w:p>
+            <w:pPr>
+              <w:pStyle w:val="Compact"/>
+            </w:pPr>
+            <w:r>
+              <w:t xml:space="preserve">a rebox 150 ms -&gt; 6-20 ms (the first one full)</w:t>
+            </w:r>
+          </w:p>
+        </w:tc>
+      </w:tr>
+      <w:tr>
+        <w:tc>
+          <w:tcPr/>
+          <w:p>
+            <w:pPr>
+              <w:pStyle w:val="Compact"/>
+            </w:pPr>
+            <w:r>
+              <w:t xml:space="preserve">bbc.com</w:t>
+            </w:r>
+          </w:p>
+        </w:tc>
+        <w:tc>
+          <w:tcPr/>
+          <w:p>
+            <w:pPr>
+              <w:pStyle w:val="Compact"/>
+            </w:pPr>
+            <w:r>
+              <w:t xml:space="preserve">~9 ms a pass (unchanged)</w:t>
+            </w:r>
+          </w:p>
+        </w:tc>
+        <w:tc>
+          <w:tcPr/>
+          <w:p>
+            <w:pPr>
+              <w:pStyle w:val="Compact"/>
+            </w:pPr>
+            <w:r>
+              <w:t xml:space="preserve">~33 -&gt; ~8-15 ms a rebox</w:t>
+            </w:r>
+          </w:p>
+        </w:tc>
+        <w:tc>
+          <w:tcPr/>
+          <w:p>
+            <w:pPr>
+              <w:pStyle w:val="Compact"/>
+            </w:pPr>
+            <w:r>
+              <w:t xml:space="preserve">a sheet taken out restyles the root: two full reboxes left</w:t>
+            </w:r>
+          </w:p>
+        </w:tc>
+      </w:tr>
+      <w:tr>
+        <w:tc>
+          <w:tcPr/>
+          <w:p>
+            <w:pPr>
+              <w:pStyle w:val="Compact"/>
+            </w:pPr>
+            <w:r>
+              <w:t xml:space="preserve">en.wikipedia.org</w:t>
+            </w:r>
+          </w:p>
+        </w:tc>
+        <w:tc>
+          <w:tcPr/>
+          <w:p>
+            <w:pPr>
+              <w:pStyle w:val="Compact"/>
+            </w:pPr>
+            <w:r>
+              <w:t xml:space="preserve">~45 ms a pass</w:t>
+            </w:r>
+          </w:p>
+        </w:tc>
+        <w:tc>
+          <w:tcPr/>
+          <w:p>
+            <w:pPr>
+              <w:pStyle w:val="Compact"/>
+            </w:pPr>
+            <w:r>
+              <w:t xml:space="preserve">237 -&gt; 110-195 ms a rebox</w:t>
+            </w:r>
+          </w:p>
+        </w:tc>
+        <w:tc>
+          <w:tcPr/>
+          <w:p>
+            <w:pPr>
+              <w:pStyle w:val="Compact"/>
+            </w:pPr>
+            <w:r>
+              <w:t xml:space="preserve">its startup script changes</w:t>
+            </w:r>
+            <w:r>
+              <w:t xml:space="preserve"> </w:t>
+            </w:r>
+            <w:r>
+              <w:rPr>
+                <w:rStyle w:val="VerbatimChar"/>
+              </w:rPr>
+              <w:t xml:space="preserve">&lt;html&gt;</w:t>
+            </w:r>
+            <w:r>
+              <w:t xml:space="preserve">'s class: the first rebox is full</w:t>
+            </w:r>
+          </w:p>
+        </w:tc>
+      </w:tr>
+      <w:tr>
+        <w:tc>
+          <w:tcPr/>
+          <w:p>
+            <w:pPr>
+              <w:pStyle w:val="Compact"/>
+            </w:pPr>
+            <w:r>
+              <w:t xml:space="preserve">rebox-perf.html (10 000 elements)</w:t>
+            </w:r>
+          </w:p>
+        </w:tc>
+        <w:tc>
+          <w:tcPr/>
+          <w:p>
+            <w:pPr>
+              <w:pStyle w:val="Compact"/>
+            </w:pPr>
+            <w:r>
+              <w:t xml:space="preserve">40-60 ms -&gt; none (paint-only)</w:t>
+            </w:r>
+          </w:p>
+        </w:tc>
+        <w:tc>
+          <w:tcPr/>
+          <w:p>
+            <w:pPr>
+              <w:pStyle w:val="Compact"/>
+            </w:pPr>
+            <w:r>
+              <w:t xml:space="preserve">380 ms -&gt; 5-9 ms (in place)</w:t>
+            </w:r>
+          </w:p>
+        </w:tc>
+        <w:tc>
+          <w:tcPr/>
+          <w:p>
+            <w:pPr>
+              <w:pStyle w:val="Compact"/>
+            </w:pPr>
+            <w:r>
+              <w:t xml:space="preserve">a class toggled every 100 ms</w:t>
+            </w:r>
+          </w:p>
+        </w:tc>
+      </w:tr>
+    </w:tbl>
+    <w:p>
+      <w:pPr>
+        <w:pStyle w:val="BodyText"/>
+      </w:pPr>
+      <w:r>
+        <w:t xml:space="preserve">On the Pi (~20x for m.facebook.com's layout): its cookie dialog's 3.5 s passes should drop to</w:t>
+      </w:r>
+      <w:r>
+        <w:t xml:space="preserve"> </w:t>
+      </w:r>
+      <w:r>
+        <w:t xml:space="preserve">~20-160 ms; github's reboxes from ~1.5-3 s to ~0.1-0.4 s. The scripts are now the bulk of</w:t>
+      </w:r>
+      <w:r>
+        <w:t xml:space="preserve"> </w:t>
+      </w:r>
+      <w:r>
+        <w:t xml:space="preserve">the time on these sites (bbc.com: 86 % of the samples in QuickJS).</w:t>
+      </w:r>
+    </w:p>
+    <w:p>
+      <w:pPr>
+        <w:pStyle w:val="BodyText"/>
+      </w:pPr>
+      <w:r>
+        <w:t xml:space="preserve">Left: an</w:t>
+      </w:r>
+      <w:r>
+        <w:t xml:space="preserve"> </w:t>
+      </w:r>
+      <w:r>
+        <w:rPr>
+          <w:b/>
+          <w:bCs/>
+        </w:rPr>
+        <w:t xml:space="preserve">incremental layout</w:t>
+      </w:r>
+      <w:r>
+        <w:t xml:space="preserve"> </w:t>
+      </w:r>
+      <w:r>
+        <w:t xml:space="preserve">(a pass lays out the whole tree: wikipedia ~45 ms on the PC;</w:t>
+      </w:r>
+      <w:r>
+        <w:t xml:space="preserve"> </w:t>
+      </w:r>
+      <w:r>
+        <w:t xml:space="preserve">the dirty boxes and their ancestors only, from the nearest box whose size cannot change),</w:t>
+      </w:r>
+      <w:r>
+        <w:t xml:space="preserve"> </w:t>
+      </w:r>
+      <w:r>
+        <w:rPr>
+          <w:b/>
+          <w:bCs/>
+        </w:rPr>
+        <w:t xml:space="preserve">incremental box construction</w:t>
+      </w:r>
+      <w:r>
+        <w:t xml:space="preserve"> </w:t>
+      </w:r>
+      <w:r>
+        <w:t xml:space="preserve">(a rebox builds every box even when every style is kept:</w:t>
+      </w:r>
+      <w:r>
+        <w:t xml:space="preserve"> </w:t>
+      </w:r>
+      <w:r>
+        <w:t xml:space="preserve">~3 µs an element on the PC), the in-place restyle for child-list changes (a node inserted</w:t>
+      </w:r>
+      <w:r>
+        <w:t xml:space="preserve"> </w:t>
+      </w:r>
+      <w:r>
+        <w:t xml:space="preserve">into a flex container) and for elements whose parent has no box (</w:t>
+      </w:r>
+      <w:r>
+        <w:rPr>
+          <w:rStyle w:val="VerbatimChar"/>
+        </w:rPr>
+        <w:t xml:space="preserve">display: contents</w:t>
+      </w:r>
+      <w:r>
+        <w:t xml:space="preserve">).</w:t>
+      </w:r>
+      <w:r>
+        <w:t xml:space="preserve"> </w:t>
+      </w:r>
+      <w:r>
+        <w:t xml:space="preserve">Tests:</w:t>
+      </w:r>
+      <w:r>
+        <w:t xml:space="preserve"> </w:t>
+      </w:r>
+      <w:r>
+        <w:rPr>
+          <w:rStyle w:val="VerbatimChar"/>
+        </w:rPr>
+        <w:t xml:space="preserve">jstest.sh</w:t>
+      </w:r>
+      <w:r>
+        <w:t xml:space="preserve"> </w:t>
+      </w:r>
+      <w:r>
+        <w:t xml:space="preserve">--</w:t>
+      </w:r>
+      <w:r>
+        <w:t xml:space="preserve"> </w:t>
+      </w:r>
+      <w:r>
+        <w:rPr>
+          <w:rStyle w:val="VerbatimChar"/>
+        </w:rPr>
+        <w:t xml:space="preserve">js-restyle</w:t>
+      </w:r>
+      <w:r>
+        <w:t xml:space="preserve"> </w:t>
+      </w:r>
+      <w:r>
+        <w:t xml:space="preserve">(46 checks: each kind of DOM change, sibling</w:t>
+      </w:r>
+      <w:r>
+        <w:t xml:space="preserve"> </w:t>
+      </w:r>
+      <w:r>
+        <w:t xml:space="preserve">combinators,</w:t>
+      </w:r>
+      <w:r>
+        <w:t xml:space="preserve"> </w:t>
+      </w:r>
+      <w:r>
+        <w:rPr>
+          <w:rStyle w:val="VerbatimChar"/>
+        </w:rPr>
+        <w:t xml:space="preserve">:nth-child</w:t>
+      </w:r>
+      <w:r>
+        <w:t xml:space="preserve">,</w:t>
+      </w:r>
+      <w:r>
+        <w:t xml:space="preserve"> </w:t>
+      </w:r>
+      <w:r>
+        <w:rPr>
+          <w:rStyle w:val="VerbatimChar"/>
+        </w:rPr>
+        <w:t xml:space="preserve">:empty</w:t>
+      </w:r>
+      <w:r>
+        <w:t xml:space="preserve">, moves, custom properties, sheets added / taken out /</w:t>
+      </w:r>
+      <w:r>
+        <w:t xml:space="preserve"> </w:t>
+      </w:r>
+      <w:r>
+        <w:t xml:space="preserve">changed, a change under a hidden ancestor); perf pages</w:t>
+      </w:r>
+      <w:r>
+        <w:t xml:space="preserve"> </w:t>
+      </w:r>
+      <w:r>
+        <w:rPr>
+          <w:rStyle w:val="VerbatimChar"/>
+        </w:rPr>
+        <w:t xml:space="preserve">rebox-perf.html</w:t>
+      </w:r>
+      <w:r>
+        <w:t xml:space="preserve">,</w:t>
+      </w:r>
+      <w:r>
+        <w:t xml:space="preserve"> </w:t>
+      </w:r>
+      <w:r>
+        <w:rPr>
+          <w:rStyle w:val="VerbatimChar"/>
+        </w:rPr>
+        <w:t xml:space="preserve">flex-deep-perf.html</w:t>
+      </w:r>
+      <w:r>
+        <w:t xml:space="preserve"> </w:t>
+      </w:r>
+      <w:r>
+        <w:t xml:space="preserve">(a Facebook-like dialog of nested flex containers).</w:t>
+      </w:r>
+    </w:p>
+    <w:bookmarkEnd w:id="50"/>
+    <w:bookmarkStart w:id="51" w:name="X2d96bac25f45ec9241507797951d2bb0b2591ad"/>
+    <w:p>
+      <w:pPr>
+        <w:pStyle w:val="Heading2"/>
+      </w:pPr>
+      <w:r>
+        <w:t xml:space="preserve">8. Known gaps</w:t>
       </w:r>
     </w:p>
     <w:p>
@@ -49248,92 +51009,32 @@
         <w:pStyle w:val="Compact"/>
         <w:numPr>
           <w:ilvl w:val="0"/>
-          <w:numId w:val="1033"/>
+          <w:numId w:val="1035"/>
         </w:numPr>
       </w:pPr>
       <w:r>
-        <w:t xml:space="preserve">SVG: no</w:t>
-      </w:r>
-      <w:r>
-        <w:t xml:space="preserve"> </w:t>
-      </w:r>
-      <w:r>
-        <w:rPr>
-          <w:rStyle w:val="VerbatimChar"/>
-        </w:rPr>
-        <w:t xml:space="preserve">&lt;mask&gt;</w:t>
-      </w:r>
-      <w:r>
-        <w:t xml:space="preserve">,</w:t>
-      </w:r>
-      <w:r>
-        <w:t xml:space="preserve"> </w:t>
-      </w:r>
-      <w:r>
-        <w:rPr>
-          <w:rStyle w:val="VerbatimChar"/>
-        </w:rPr>
-        <w:t xml:space="preserve">&lt;pattern&gt;</w:t>
-      </w:r>
-      <w:r>
-        <w:t xml:space="preserve">,</w:t>
-      </w:r>
-      <w:r>
-        <w:t xml:space="preserve"> </w:t>
-      </w:r>
-      <w:r>
-        <w:rPr>
-          <w:rStyle w:val="VerbatimChar"/>
-        </w:rPr>
-        <w:t xml:space="preserve">&lt;marker&gt;</w:t>
-      </w:r>
-      <w:r>
-        <w:t xml:space="preserve">, filters, SMIL animations,</w:t>
-      </w:r>
-      <w:r>
-        <w:t xml:space="preserve"> </w:t>
-      </w:r>
-      <w:r>
-        <w:rPr>
-          <w:rStyle w:val="VerbatimChar"/>
-        </w:rPr>
-        <w:t xml:space="preserve">&lt;textPath&gt;</w:t>
-      </w:r>
-      <w:r>
-        <w:t xml:space="preserve">, per-glyph</w:t>
-      </w:r>
-      <w:r>
-        <w:t xml:space="preserve"> </w:t>
-      </w:r>
-      <w:r>
-        <w:t xml:space="preserve">position lists, the page's web fonts in</w:t>
-      </w:r>
-      <w:r>
-        <w:t xml:space="preserve"> </w:t>
-      </w:r>
-      <w:r>
-        <w:rPr>
-          <w:rStyle w:val="VerbatimChar"/>
-        </w:rPr>
-        <w:t xml:space="preserve">&lt;text&gt;</w:t>
-      </w:r>
-      <w:r>
-        <w:t xml:space="preserve">; the page's</w:t>
-      </w:r>
-      <w:r>
-        <w:t xml:space="preserve"> </w:t>
-      </w:r>
-      <w:r>
-        <w:t xml:space="preserve">CSS</w:t>
-      </w:r>
-      <w:r>
-        <w:t xml:space="preserve"> </w:t>
-      </w:r>
-      <w:r>
-        <w:rPr>
-          <w:rStyle w:val="VerbatimChar"/>
-        </w:rPr>
-        <w:t xml:space="preserve">fill</w:t>
+        <w:t xml:space="preserve">JavaScript: synchronous XHR (runs async), multipart request bodies, binary request bodies</w:t>
+      </w:r>
+      <w:r>
+        <w:t xml:space="preserve"> </w:t>
+      </w:r>
+      <w:r>
+        <w:t xml:space="preserve">(sent as text: a NUL ends them); no IndexedDB, editing APIs, Service</w:t>
+      </w:r>
+      <w:r>
+        <w:t xml:space="preserve"> </w:t>
+      </w:r>
+      <w:r>
+        <w:t xml:space="preserve">Workers; CSS</w:t>
+      </w:r>
+      <w:r>
+        <w:t xml:space="preserve"> </w:t>
+      </w:r>
+      <w:r>
+        <w:rPr>
+          <w:rStyle w:val="VerbatimChar"/>
+        </w:rPr>
+        <w:t xml:space="preserve">:active</w:t>
       </w:r>
       <w:r>
         <w:t xml:space="preserve"> </w:t>
@@ -49348,247 +51049,10 @@
         <w:rPr>
           <w:rStyle w:val="VerbatimChar"/>
         </w:rPr>
-        <w:t xml:space="preserve">stroke</w:t>
-      </w:r>
-      <w:r>
-        <w:t xml:space="preserve"> </w:t>
-      </w:r>
-      <w:r>
-        <w:t xml:space="preserve">(</w:t>
-      </w:r>
-      <w:r>
-        <w:rPr>
-          <w:rStyle w:val="VerbatimChar"/>
-        </w:rPr>
-        <w:t xml:space="preserve">.icon path { fill: red }</w:t>
-      </w:r>
-      <w:r>
-        <w:t xml:space="preserve">) do not reach an inline</w:t>
-      </w:r>
-      <w:r>
-        <w:t xml:space="preserve"> </w:t>
-      </w:r>
-      <w:r>
-        <w:rPr>
-          <w:rStyle w:val="VerbatimChar"/>
-        </w:rPr>
-        <w:t xml:space="preserve">&lt;svg&gt;</w:t>
-      </w:r>
-      <w:r>
-        <w:t xml:space="preserve"> </w:t>
-      </w:r>
-      <w:r>
-        <w:t xml:space="preserve">-- libcss</w:t>
-      </w:r>
-      <w:r>
-        <w:t xml:space="preserve"> </w:t>
-      </w:r>
-      <w:r>
-        <w:t xml:space="preserve">has no</w:t>
-      </w:r>
-      <w:r>
-        <w:t xml:space="preserve"> </w:t>
-      </w:r>
-      <w:r>
-        <w:rPr>
-          <w:rStyle w:val="VerbatimChar"/>
-        </w:rPr>
-        <w:t xml:space="preserve">fill</w:t>
-      </w:r>
-      <w:r>
-        <w:t xml:space="preserve"> </w:t>
-      </w:r>
-      <w:r>
-        <w:t xml:space="preserve">/</w:t>
-      </w:r>
-      <w:r>
-        <w:t xml:space="preserve"> </w:t>
-      </w:r>
-      <w:r>
-        <w:rPr>
-          <w:rStyle w:val="VerbatimChar"/>
-        </w:rPr>
-        <w:t xml:space="preserve">stroke</w:t>
-      </w:r>
-      <w:r>
-        <w:t xml:space="preserve"> </w:t>
-      </w:r>
-      <w:r>
-        <w:t xml:space="preserve">properties (only</w:t>
-      </w:r>
-      <w:r>
-        <w:t xml:space="preserve"> </w:t>
-      </w:r>
-      <w:r>
-        <w:rPr>
-          <w:rStyle w:val="VerbatimChar"/>
-        </w:rPr>
-        <w:t xml:space="preserve">fill-opacity</w:t>
-      </w:r>
-      <w:r>
-        <w:t xml:space="preserve"> </w:t>
-      </w:r>
-      <w:r>
-        <w:t xml:space="preserve">/</w:t>
-      </w:r>
-      <w:r>
-        <w:t xml:space="preserve"> </w:t>
-      </w:r>
-      <w:r>
-        <w:rPr>
-          <w:rStyle w:val="VerbatimChar"/>
-        </w:rPr>
-        <w:t xml:space="preserve">stroke-opacity</w:t>
-      </w:r>
-      <w:r>
-        <w:t xml:space="preserve">): with them</w:t>
-      </w:r>
-      <w:r>
-        <w:t xml:space="preserve"> </w:t>
-      </w:r>
-      <w:r>
-        <w:t xml:space="preserve">(inherited, as text),</w:t>
-      </w:r>
-      <w:r>
-        <w:t xml:space="preserve"> </w:t>
-      </w:r>
-      <w:r>
-        <w:rPr>
-          <w:rStyle w:val="VerbatimChar"/>
-        </w:rPr>
-        <w:t xml:space="preserve">onyx_svg_inline.c</w:t>
-      </w:r>
-      <w:r>
-        <w:t xml:space="preserve"> </w:t>
-      </w:r>
-      <w:r>
-        <w:t xml:space="preserve">would write the</w:t>
-      </w:r>
-      <w:r>
-        <w:t xml:space="preserve"> </w:t>
-      </w:r>
-      <w:r>
-        <w:rPr>
-          <w:rStyle w:val="VerbatimChar"/>
-        </w:rPr>
-        <w:t xml:space="preserve">&lt;svg&gt;</w:t>
-      </w:r>
-      <w:r>
-        <w:t xml:space="preserve">'s computed ones on its</w:t>
-      </w:r>
-      <w:r>
-        <w:t xml:space="preserve"> </w:t>
-      </w:r>
-      <w:r>
-        <w:t xml:space="preserve">root; its</w:t>
-      </w:r>
-      <w:r>
-        <w:t xml:space="preserve"> </w:t>
-      </w:r>
-      <w:r>
-        <w:rPr>
-          <w:rStyle w:val="VerbatimChar"/>
-        </w:rPr>
-        <w:t xml:space="preserve">color</w:t>
-      </w:r>
-      <w:r>
-        <w:t xml:space="preserve">, its custom properties and the SVG's own attributes and</w:t>
-      </w:r>
-      <w:r>
-        <w:t xml:space="preserve"> </w:t>
-      </w:r>
-      <w:r>
-        <w:rPr>
-          <w:rStyle w:val="VerbatimChar"/>
-        </w:rPr>
-        <w:t xml:space="preserve">&lt;style&gt;</w:t>
-      </w:r>
-      <w:r>
-        <w:t xml:space="preserve"> </w:t>
-      </w:r>
-      <w:r>
-        <w:t xml:space="preserve">do. An</w:t>
-      </w:r>
-      <w:r>
-        <w:t xml:space="preserve"> </w:t>
-      </w:r>
-      <w:r>
-        <w:rPr>
-          <w:rStyle w:val="VerbatimChar"/>
-        </w:rPr>
-        <w:t xml:space="preserve">&lt;svg&gt;</w:t>
-      </w:r>
-      <w:r>
-        <w:t xml:space="preserve"> </w:t>
-      </w:r>
-      <w:r>
-        <w:t xml:space="preserve">/ SVG</w:t>
-      </w:r>
-      <w:r>
-        <w:t xml:space="preserve"> </w:t>
-      </w:r>
-      <w:r>
-        <w:rPr>
-          <w:rStyle w:val="VerbatimChar"/>
-        </w:rPr>
-        <w:t xml:space="preserve">&lt;img&gt;</w:t>
-      </w:r>
-      <w:r>
-        <w:t xml:space="preserve"> </w:t>
-      </w:r>
-      <w:r>
-        <w:t xml:space="preserve">with only a viewBox and no CSS size takes the viewBox's size (Chrome:</w:t>
-      </w:r>
-      <w:r>
-        <w:t xml:space="preserve"> </w:t>
-      </w:r>
-      <w:r>
-        <w:t xml:space="preserve">the containing block's width); a</w:t>
-      </w:r>
-      <w:r>
-        <w:t xml:space="preserve"> </w:t>
-      </w:r>
-      <w:r>
-        <w:rPr>
-          <w:rStyle w:val="VerbatimChar"/>
-        </w:rPr>
-        <w:t xml:space="preserve">list-style-image</w:t>
-      </w:r>
-      <w:r>
-        <w:t xml:space="preserve"> </w:t>
-      </w:r>
-      <w:r>
-        <w:t xml:space="preserve">SVG without a size is drawn at its</w:t>
-      </w:r>
-      <w:r>
-        <w:t xml:space="preserve"> </w:t>
-      </w:r>
-      <w:r>
-        <w:t xml:space="preserve">viewBox's size (Chrome: small). The scripts' SVG DOM is dom.js' generic one (</w:t>
-      </w:r>
-      <w:r>
-        <w:rPr>
-          <w:rStyle w:val="VerbatimChar"/>
-        </w:rPr>
-        <w:t xml:space="preserve">namespaceURI</w:t>
-      </w:r>
-      <w:r>
-        <w:t xml:space="preserve">,</w:t>
-      </w:r>
-      <w:r>
-        <w:t xml:space="preserve"> </w:t>
-      </w:r>
-      <w:r>
-        <w:rPr>
-          <w:rStyle w:val="VerbatimChar"/>
-        </w:rPr>
-        <w:t xml:space="preserve">getBBox</w:t>
-      </w:r>
-      <w:r>
-        <w:t xml:space="preserve"> </w:t>
-      </w:r>
-      <w:r>
-        <w:t xml:space="preserve">from the box).</w:t>
+        <w:t xml:space="preserve">:focus</w:t>
+      </w:r>
+      <w:r>
+        <w:t xml:space="preserve">.</w:t>
       </w:r>
     </w:p>
     <w:p>
@@ -49596,89 +51060,128 @@
         <w:pStyle w:val="Compact"/>
         <w:numPr>
           <w:ilvl w:val="0"/>
-          <w:numId w:val="1033"/>
+          <w:numId w:val="1035"/>
         </w:numPr>
       </w:pPr>
       <w:r>
-        <w:t xml:space="preserve">Canvas: no shadows, filters, blend modes (source-over), conic gradients (a solid colour),</w:t>
-      </w:r>
-      <w:r>
-        <w:t xml:space="preserve"> </w:t>
-      </w:r>
-      <w:r>
-        <w:t xml:space="preserve">per-corner</w:t>
-      </w:r>
-      <w:r>
-        <w:t xml:space="preserve"> </w:t>
-      </w:r>
-      <w:r>
-        <w:rPr>
-          <w:rStyle w:val="VerbatimChar"/>
-        </w:rPr>
-        <w:t xml:space="preserve">roundRect</w:t>
-      </w:r>
-      <w:r>
-        <w:t xml:space="preserve"> </w:t>
-      </w:r>
-      <w:r>
-        <w:t xml:space="preserve">radii;</w:t>
-      </w:r>
-      <w:r>
-        <w:t xml:space="preserve"> </w:t>
-      </w:r>
-      <w:r>
-        <w:rPr>
-          <w:rStyle w:val="VerbatimChar"/>
-        </w:rPr>
-        <w:t xml:space="preserve">drawImage</w:t>
-      </w:r>
-      <w:r>
-        <w:t xml:space="preserve"> </w:t>
-      </w:r>
-      <w:r>
-        <w:t xml:space="preserve">scales with the nearest pixel (PlutoVG's</w:t>
-      </w:r>
-      <w:r>
-        <w:t xml:space="preserve"> </w:t>
-      </w:r>
-      <w:r>
-        <w:t xml:space="preserve">textures), and a canvas shown at another CSS size too (the framebuffer's bitmap plot);</w:t>
-      </w:r>
-      <w:r>
-        <w:t xml:space="preserve"> </w:t>
-      </w:r>
-      <w:r>
-        <w:t xml:space="preserve">no</w:t>
-      </w:r>
-      <w:r>
-        <w:t xml:space="preserve"> </w:t>
-      </w:r>
-      <w:r>
-        <w:rPr>
-          <w:rStyle w:val="VerbatimChar"/>
-        </w:rPr>
-        <w:t xml:space="preserve">getContext('webgl')</w:t>
-      </w:r>
-      <w:r>
-        <w:t xml:space="preserve">,</w:t>
-      </w:r>
-      <w:r>
-        <w:t xml:space="preserve"> </w:t>
-      </w:r>
-      <w:r>
-        <w:rPr>
-          <w:rStyle w:val="VerbatimChar"/>
-        </w:rPr>
-        <w:t xml:space="preserve">captureStream</w:t>
-      </w:r>
-      <w:r>
-        <w:t xml:space="preserve">, video frames; the page's web fonts are not used</w:t>
-      </w:r>
-      <w:r>
-        <w:t xml:space="preserve"> </w:t>
-      </w:r>
-      <w:r>
-        <w:t xml:space="preserve">(the card's fonts by family).</w:t>
+        <w:t xml:space="preserve">The network APIs (§19): a worker runs on the UI thread (a long computation in a worker</w:t>
+      </w:r>
+      <w:r>
+        <w:t xml:space="preserve"> </w:t>
+      </w:r>
+      <w:r>
+        <w:t xml:space="preserve">holds the window as a page's script does;</w:t>
+      </w:r>
+      <w:r>
+        <w:t xml:space="preserve"> </w:t>
+      </w:r>
+      <w:r>
+        <w:rPr>
+          <w:rStyle w:val="VerbatimChar"/>
+        </w:rPr>
+        <w:t xml:space="preserve">script_timeout</w:t>
+      </w:r>
+      <w:r>
+        <w:t xml:space="preserve"> </w:t>
+      </w:r>
+      <w:r>
+        <w:t xml:space="preserve">stops it); an</w:t>
+      </w:r>
+      <w:r>
+        <w:t xml:space="preserve"> </w:t>
+      </w:r>
+      <w:r>
+        <w:rPr>
+          <w:rStyle w:val="VerbatimChar"/>
+        </w:rPr>
+        <w:t xml:space="preserve">importScripts</w:t>
+      </w:r>
+      <w:r>
+        <w:t xml:space="preserve"> </w:t>
+      </w:r>
+      <w:r>
+        <w:t xml:space="preserve">whose URL is not a literal in the script, over http(s), blocks the UI thread while it is</w:t>
+      </w:r>
+      <w:r>
+        <w:t xml:space="preserve"> </w:t>
+      </w:r>
+      <w:r>
+        <w:t xml:space="preserve">read; a SharedWorker is shared within its document only; no</w:t>
+      </w:r>
+      <w:r>
+        <w:t xml:space="preserve"> </w:t>
+      </w:r>
+      <w:r>
+        <w:rPr>
+          <w:rStyle w:val="VerbatimChar"/>
+        </w:rPr>
+        <w:t xml:space="preserve">MessagePort</w:t>
+      </w:r>
+      <w:r>
+        <w:t xml:space="preserve"> </w:t>
+      </w:r>
+      <w:r>
+        <w:t xml:space="preserve">transferred to a</w:t>
+      </w:r>
+      <w:r>
+        <w:t xml:space="preserve"> </w:t>
+      </w:r>
+      <w:r>
+        <w:t xml:space="preserve">worker, no</w:t>
+      </w:r>
+      <w:r>
+        <w:t xml:space="preserve"> </w:t>
+      </w:r>
+      <w:r>
+        <w:rPr>
+          <w:rStyle w:val="VerbatimChar"/>
+        </w:rPr>
+        <w:t xml:space="preserve">OffscreenCanvas</w:t>
+      </w:r>
+      <w:r>
+        <w:t xml:space="preserve">,</w:t>
+      </w:r>
+      <w:r>
+        <w:t xml:space="preserve"> </w:t>
+      </w:r>
+      <w:r>
+        <w:rPr>
+          <w:rStyle w:val="VerbatimChar"/>
+        </w:rPr>
+        <w:t xml:space="preserve">SharedArrayBuffer</w:t>
+      </w:r>
+      <w:r>
+        <w:t xml:space="preserve"> </w:t>
+      </w:r>
+      <w:r>
+        <w:t xml:space="preserve">/</w:t>
+      </w:r>
+      <w:r>
+        <w:t xml:space="preserve"> </w:t>
+      </w:r>
+      <w:r>
+        <w:rPr>
+          <w:rStyle w:val="VerbatimChar"/>
+        </w:rPr>
+        <w:t xml:space="preserve">Atomics</w:t>
+      </w:r>
+      <w:r>
+        <w:t xml:space="preserve"> </w:t>
+      </w:r>
+      <w:r>
+        <w:t xml:space="preserve">between workers; the</w:t>
+      </w:r>
+      <w:r>
+        <w:t xml:space="preserve"> </w:t>
+      </w:r>
+      <w:r>
+        <w:t xml:space="preserve">WebSocket client sends its messages uncompressed (permessage-deflate inflates only) and</w:t>
+      </w:r>
+      <w:r>
+        <w:t xml:space="preserve"> </w:t>
+      </w:r>
+      <w:r>
+        <w:t xml:space="preserve">never pings; CORS is not checked for EventSource either.</w:t>
       </w:r>
     </w:p>
     <w:p>
@@ -49686,26 +51189,35 @@
         <w:pStyle w:val="Compact"/>
         <w:numPr>
           <w:ilvl w:val="0"/>
-          <w:numId w:val="1033"/>
+          <w:numId w:val="1035"/>
         </w:numPr>
       </w:pPr>
       <w:r>
-        <w:t xml:space="preserve">A face split by</w:t>
-      </w:r>
-      <w:r>
-        <w:t xml:space="preserve"> </w:t>
-      </w:r>
-      <w:r>
-        <w:rPr>
-          <w:rStyle w:val="VerbatimChar"/>
-        </w:rPr>
-        <w:t xml:space="preserve">unicode-range</w:t>
-      </w:r>
-      <w:r>
-        <w:t xml:space="preserve"> </w:t>
-      </w:r>
-      <w:r>
-        <w:t xml:space="preserve">outside Latin-1 falls back to the card's fonts.</w:t>
+        <w:t xml:space="preserve">The network (§24): no revocation checks, no CSP, no SameSite cookies, no</w:t>
+      </w:r>
+      <w:r>
+        <w:t xml:space="preserve"> </w:t>
+      </w:r>
+      <w:r>
+        <w:t xml:space="preserve">CORS for the core's loads (EventSource, fonts,</w:t>
+      </w:r>
+      <w:r>
+        <w:t xml:space="preserve"> </w:t>
+      </w:r>
+      <w:r>
+        <w:rPr>
+          <w:rStyle w:val="VerbatimChar"/>
+        </w:rPr>
+        <w:t xml:space="preserve">&lt;img crossorigin&gt;</w:t>
+      </w:r>
+      <w:r>
+        <w:t xml:space="preserve">, module scripts), no</w:t>
+      </w:r>
+      <w:r>
+        <w:t xml:space="preserve"> </w:t>
+      </w:r>
+      <w:r>
+        <w:t xml:space="preserve">HTTP/3, no back-forward cache.</w:t>
       </w:r>
     </w:p>
     <w:p>
@@ -49713,10 +51225,676 @@
         <w:pStyle w:val="Compact"/>
         <w:numPr>
           <w:ilvl w:val="0"/>
-          <w:numId w:val="1033"/>
+          <w:numId w:val="1035"/>
         </w:numPr>
       </w:pPr>
       <w:r>
+        <w:t xml:space="preserve">Shadow DOM (§20): the manual slot assignment's rendering,</w:t>
+      </w:r>
+      <w:r>
+        <w:t xml:space="preserve"> </w:t>
+      </w:r>
+      <w:r>
+        <w:rPr>
+          <w:rStyle w:val="VerbatimChar"/>
+        </w:rPr>
+        <w:t xml:space="preserve">exportparts</w:t>
+      </w:r>
+      <w:r>
+        <w:t xml:space="preserve">, a clonable root's</w:t>
+      </w:r>
+      <w:r>
+        <w:t xml:space="preserve"> </w:t>
+      </w:r>
+      <w:r>
+        <w:t xml:space="preserve">cloning,</w:t>
+      </w:r>
+      <w:r>
+        <w:t xml:space="preserve"> </w:t>
+      </w:r>
+      <w:r>
+        <w:rPr>
+          <w:rStyle w:val="VerbatimChar"/>
+        </w:rPr>
+        <w:t xml:space="preserve">&lt;link&gt;</w:t>
+      </w:r>
+      <w:r>
+        <w:t xml:space="preserve"> </w:t>
+      </w:r>
+      <w:r>
+        <w:t xml:space="preserve">/</w:t>
+      </w:r>
+      <w:r>
+        <w:t xml:space="preserve"> </w:t>
+      </w:r>
+      <w:r>
+        <w:rPr>
+          <w:rStyle w:val="VerbatimChar"/>
+        </w:rPr>
+        <w:t xml:space="preserve">@import</w:t>
+      </w:r>
+      <w:r>
+        <w:t xml:space="preserve"> </w:t>
+      </w:r>
+      <w:r>
+        <w:t xml:space="preserve">/</w:t>
+      </w:r>
+      <w:r>
+        <w:t xml:space="preserve"> </w:t>
+      </w:r>
+      <w:r>
+        <w:rPr>
+          <w:rStyle w:val="VerbatimChar"/>
+        </w:rPr>
+        <w:t xml:space="preserve">@font-face</w:t>
+      </w:r>
+      <w:r>
+        <w:t xml:space="preserve"> </w:t>
+      </w:r>
+      <w:r>
+        <w:t xml:space="preserve">in shadow trees,</w:t>
+      </w:r>
+      <w:r>
+        <w:t xml:space="preserve"> </w:t>
+      </w:r>
+      <w:r>
+        <w:rPr>
+          <w:rStyle w:val="VerbatimChar"/>
+        </w:rPr>
+        <w:t xml:space="preserve">:host</w:t>
+      </w:r>
+      <w:r>
+        <w:t xml:space="preserve"> </w:t>
+      </w:r>
+      <w:r>
+        <w:t xml:space="preserve">in</w:t>
+      </w:r>
+      <w:r>
+        <w:t xml:space="preserve"> </w:t>
+      </w:r>
+      <w:r>
+        <w:rPr>
+          <w:rStyle w:val="VerbatimChar"/>
+        </w:rPr>
+        <w:t xml:space="preserve">matches()</w:t>
+      </w:r>
+      <w:r>
+        <w:t xml:space="preserve">;</w:t>
+      </w:r>
+      <w:r>
+        <w:t xml:space="preserve"> </w:t>
+      </w:r>
+      <w:r>
+        <w:rPr>
+          <w:rStyle w:val="VerbatimChar"/>
+        </w:rPr>
+        <w:t xml:space="preserve">::before</w:t>
+      </w:r>
+      <w:r>
+        <w:t xml:space="preserve"> </w:t>
+      </w:r>
+      <w:r>
+        <w:t xml:space="preserve">/</w:t>
+      </w:r>
+      <w:r>
+        <w:t xml:space="preserve"> </w:t>
+      </w:r>
+      <w:r>
+        <w:rPr>
+          <w:rStyle w:val="VerbatimChar"/>
+        </w:rPr>
+        <w:t xml:space="preserve">::after</w:t>
+      </w:r>
+      <w:r>
+        <w:t xml:space="preserve"> </w:t>
+      </w:r>
+      <w:r>
+        <w:t xml:space="preserve">of a</w:t>
+      </w:r>
+      <w:r>
+        <w:t xml:space="preserve"> </w:t>
+      </w:r>
+      <w:r>
+        <w:rPr>
+          <w:rStyle w:val="VerbatimChar"/>
+        </w:rPr>
+        <w:t xml:space="preserve">display: contents</w:t>
+      </w:r>
+      <w:r>
+        <w:t xml:space="preserve"> </w:t>
+      </w:r>
+      <w:r>
+        <w:t xml:space="preserve">element.</w:t>
+      </w:r>
+    </w:p>
+    <w:p>
+      <w:pPr>
+        <w:pStyle w:val="Compact"/>
+        <w:numPr>
+          <w:ilvl w:val="0"/>
+          <w:numId w:val="1035"/>
+        </w:numPr>
+      </w:pPr>
+      <w:r>
+        <w:t xml:space="preserve">The compositing layers' gaps (§21: a real perspective,</w:t>
+      </w:r>
+      <w:r>
+        <w:t xml:space="preserve"> </w:t>
+      </w:r>
+      <w:r>
+        <w:rPr>
+          <w:rStyle w:val="VerbatimChar"/>
+        </w:rPr>
+        <w:t xml:space="preserve">clip-path</w:t>
+      </w:r>
+      <w:r>
+        <w:t xml:space="preserve"> </w:t>
+      </w:r>
+      <w:r>
+        <w:t xml:space="preserve">/</w:t>
+      </w:r>
+      <w:r>
+        <w:t xml:space="preserve"> </w:t>
+      </w:r>
+      <w:r>
+        <w:rPr>
+          <w:rStyle w:val="VerbatimChar"/>
+        </w:rPr>
+        <w:t xml:space="preserve">mask</w:t>
+      </w:r>
+      <w:r>
+        <w:t xml:space="preserve"> </w:t>
+      </w:r>
+      <w:r>
+        <w:t xml:space="preserve">on a layer, the</w:t>
+      </w:r>
+      <w:r>
+        <w:t xml:space="preserve"> </w:t>
+      </w:r>
+      <w:r>
+        <w:t xml:space="preserve">non-separable blend modes); animations: §22's "Not done"; GPU compositing: §25's (scrollers</w:t>
+      </w:r>
+      <w:r>
+        <w:t xml:space="preserve"> </w:t>
+      </w:r>
+      <w:r>
+        <w:t xml:space="preserve">and groups as layers, fixed boxes that stay in view).</w:t>
+      </w:r>
+    </w:p>
+    <w:p>
+      <w:pPr>
+        <w:pStyle w:val="Compact"/>
+        <w:numPr>
+          <w:ilvl w:val="0"/>
+          <w:numId w:val="1035"/>
+        </w:numPr>
+      </w:pPr>
+      <w:r>
+        <w:t xml:space="preserve">SVG: no</w:t>
+      </w:r>
+      <w:r>
+        <w:t xml:space="preserve"> </w:t>
+      </w:r>
+      <w:r>
+        <w:rPr>
+          <w:rStyle w:val="VerbatimChar"/>
+        </w:rPr>
+        <w:t xml:space="preserve">&lt;mask&gt;</w:t>
+      </w:r>
+      <w:r>
+        <w:t xml:space="preserve">,</w:t>
+      </w:r>
+      <w:r>
+        <w:t xml:space="preserve"> </w:t>
+      </w:r>
+      <w:r>
+        <w:rPr>
+          <w:rStyle w:val="VerbatimChar"/>
+        </w:rPr>
+        <w:t xml:space="preserve">&lt;pattern&gt;</w:t>
+      </w:r>
+      <w:r>
+        <w:t xml:space="preserve">,</w:t>
+      </w:r>
+      <w:r>
+        <w:t xml:space="preserve"> </w:t>
+      </w:r>
+      <w:r>
+        <w:rPr>
+          <w:rStyle w:val="VerbatimChar"/>
+        </w:rPr>
+        <w:t xml:space="preserve">&lt;marker&gt;</w:t>
+      </w:r>
+      <w:r>
+        <w:t xml:space="preserve">, filters, SMIL animations,</w:t>
+      </w:r>
+      <w:r>
+        <w:t xml:space="preserve"> </w:t>
+      </w:r>
+      <w:r>
+        <w:rPr>
+          <w:rStyle w:val="VerbatimChar"/>
+        </w:rPr>
+        <w:t xml:space="preserve">&lt;textPath&gt;</w:t>
+      </w:r>
+      <w:r>
+        <w:t xml:space="preserve">, per-glyph</w:t>
+      </w:r>
+      <w:r>
+        <w:t xml:space="preserve"> </w:t>
+      </w:r>
+      <w:r>
+        <w:t xml:space="preserve">position lists, the page's web fonts in</w:t>
+      </w:r>
+      <w:r>
+        <w:t xml:space="preserve"> </w:t>
+      </w:r>
+      <w:r>
+        <w:rPr>
+          <w:rStyle w:val="VerbatimChar"/>
+        </w:rPr>
+        <w:t xml:space="preserve">&lt;text&gt;</w:t>
+      </w:r>
+      <w:r>
+        <w:t xml:space="preserve">; the page's</w:t>
+      </w:r>
+      <w:r>
+        <w:t xml:space="preserve"> </w:t>
+      </w:r>
+      <w:r>
+        <w:t xml:space="preserve">CSS</w:t>
+      </w:r>
+      <w:r>
+        <w:t xml:space="preserve"> </w:t>
+      </w:r>
+      <w:r>
+        <w:rPr>
+          <w:rStyle w:val="VerbatimChar"/>
+        </w:rPr>
+        <w:t xml:space="preserve">fill</w:t>
+      </w:r>
+      <w:r>
+        <w:t xml:space="preserve"> </w:t>
+      </w:r>
+      <w:r>
+        <w:t xml:space="preserve">/</w:t>
+      </w:r>
+      <w:r>
+        <w:t xml:space="preserve"> </w:t>
+      </w:r>
+      <w:r>
+        <w:rPr>
+          <w:rStyle w:val="VerbatimChar"/>
+        </w:rPr>
+        <w:t xml:space="preserve">stroke</w:t>
+      </w:r>
+      <w:r>
+        <w:t xml:space="preserve"> </w:t>
+      </w:r>
+      <w:r>
+        <w:t xml:space="preserve">(</w:t>
+      </w:r>
+      <w:r>
+        <w:rPr>
+          <w:rStyle w:val="VerbatimChar"/>
+        </w:rPr>
+        <w:t xml:space="preserve">.icon path { fill: red }</w:t>
+      </w:r>
+      <w:r>
+        <w:t xml:space="preserve">) do not reach an inline</w:t>
+      </w:r>
+      <w:r>
+        <w:t xml:space="preserve"> </w:t>
+      </w:r>
+      <w:r>
+        <w:rPr>
+          <w:rStyle w:val="VerbatimChar"/>
+        </w:rPr>
+        <w:t xml:space="preserve">&lt;svg&gt;</w:t>
+      </w:r>
+      <w:r>
+        <w:t xml:space="preserve"> </w:t>
+      </w:r>
+      <w:r>
+        <w:t xml:space="preserve">-- libcss</w:t>
+      </w:r>
+      <w:r>
+        <w:t xml:space="preserve"> </w:t>
+      </w:r>
+      <w:r>
+        <w:t xml:space="preserve">has no</w:t>
+      </w:r>
+      <w:r>
+        <w:t xml:space="preserve"> </w:t>
+      </w:r>
+      <w:r>
+        <w:rPr>
+          <w:rStyle w:val="VerbatimChar"/>
+        </w:rPr>
+        <w:t xml:space="preserve">fill</w:t>
+      </w:r>
+      <w:r>
+        <w:t xml:space="preserve"> </w:t>
+      </w:r>
+      <w:r>
+        <w:t xml:space="preserve">/</w:t>
+      </w:r>
+      <w:r>
+        <w:t xml:space="preserve"> </w:t>
+      </w:r>
+      <w:r>
+        <w:rPr>
+          <w:rStyle w:val="VerbatimChar"/>
+        </w:rPr>
+        <w:t xml:space="preserve">stroke</w:t>
+      </w:r>
+      <w:r>
+        <w:t xml:space="preserve"> </w:t>
+      </w:r>
+      <w:r>
+        <w:t xml:space="preserve">properties (only</w:t>
+      </w:r>
+      <w:r>
+        <w:t xml:space="preserve"> </w:t>
+      </w:r>
+      <w:r>
+        <w:rPr>
+          <w:rStyle w:val="VerbatimChar"/>
+        </w:rPr>
+        <w:t xml:space="preserve">fill-opacity</w:t>
+      </w:r>
+      <w:r>
+        <w:t xml:space="preserve"> </w:t>
+      </w:r>
+      <w:r>
+        <w:t xml:space="preserve">/</w:t>
+      </w:r>
+      <w:r>
+        <w:t xml:space="preserve"> </w:t>
+      </w:r>
+      <w:r>
+        <w:rPr>
+          <w:rStyle w:val="VerbatimChar"/>
+        </w:rPr>
+        <w:t xml:space="preserve">stroke-opacity</w:t>
+      </w:r>
+      <w:r>
+        <w:t xml:space="preserve">): with them</w:t>
+      </w:r>
+      <w:r>
+        <w:t xml:space="preserve"> </w:t>
+      </w:r>
+      <w:r>
+        <w:t xml:space="preserve">(inherited, as text),</w:t>
+      </w:r>
+      <w:r>
+        <w:t xml:space="preserve"> </w:t>
+      </w:r>
+      <w:r>
+        <w:rPr>
+          <w:rStyle w:val="VerbatimChar"/>
+        </w:rPr>
+        <w:t xml:space="preserve">onyx_svg_inline.c</w:t>
+      </w:r>
+      <w:r>
+        <w:t xml:space="preserve"> </w:t>
+      </w:r>
+      <w:r>
+        <w:t xml:space="preserve">would write the</w:t>
+      </w:r>
+      <w:r>
+        <w:t xml:space="preserve"> </w:t>
+      </w:r>
+      <w:r>
+        <w:rPr>
+          <w:rStyle w:val="VerbatimChar"/>
+        </w:rPr>
+        <w:t xml:space="preserve">&lt;svg&gt;</w:t>
+      </w:r>
+      <w:r>
+        <w:t xml:space="preserve">'s computed ones on its</w:t>
+      </w:r>
+      <w:r>
+        <w:t xml:space="preserve"> </w:t>
+      </w:r>
+      <w:r>
+        <w:t xml:space="preserve">root; its</w:t>
+      </w:r>
+      <w:r>
+        <w:t xml:space="preserve"> </w:t>
+      </w:r>
+      <w:r>
+        <w:rPr>
+          <w:rStyle w:val="VerbatimChar"/>
+        </w:rPr>
+        <w:t xml:space="preserve">color</w:t>
+      </w:r>
+      <w:r>
+        <w:t xml:space="preserve">, its custom properties and the SVG's own attributes and</w:t>
+      </w:r>
+      <w:r>
+        <w:t xml:space="preserve"> </w:t>
+      </w:r>
+      <w:r>
+        <w:rPr>
+          <w:rStyle w:val="VerbatimChar"/>
+        </w:rPr>
+        <w:t xml:space="preserve">&lt;style&gt;</w:t>
+      </w:r>
+      <w:r>
+        <w:t xml:space="preserve"> </w:t>
+      </w:r>
+      <w:r>
+        <w:t xml:space="preserve">do. An</w:t>
+      </w:r>
+      <w:r>
+        <w:t xml:space="preserve"> </w:t>
+      </w:r>
+      <w:r>
+        <w:rPr>
+          <w:rStyle w:val="VerbatimChar"/>
+        </w:rPr>
+        <w:t xml:space="preserve">&lt;svg&gt;</w:t>
+      </w:r>
+      <w:r>
+        <w:t xml:space="preserve"> </w:t>
+      </w:r>
+      <w:r>
+        <w:t xml:space="preserve">/ SVG</w:t>
+      </w:r>
+      <w:r>
+        <w:t xml:space="preserve"> </w:t>
+      </w:r>
+      <w:r>
+        <w:rPr>
+          <w:rStyle w:val="VerbatimChar"/>
+        </w:rPr>
+        <w:t xml:space="preserve">&lt;img&gt;</w:t>
+      </w:r>
+      <w:r>
+        <w:t xml:space="preserve"> </w:t>
+      </w:r>
+      <w:r>
+        <w:t xml:space="preserve">with only a viewBox and no CSS size takes the viewBox's size (Chrome:</w:t>
+      </w:r>
+      <w:r>
+        <w:t xml:space="preserve"> </w:t>
+      </w:r>
+      <w:r>
+        <w:t xml:space="preserve">the containing block's width); a</w:t>
+      </w:r>
+      <w:r>
+        <w:t xml:space="preserve"> </w:t>
+      </w:r>
+      <w:r>
+        <w:rPr>
+          <w:rStyle w:val="VerbatimChar"/>
+        </w:rPr>
+        <w:t xml:space="preserve">list-style-image</w:t>
+      </w:r>
+      <w:r>
+        <w:t xml:space="preserve"> </w:t>
+      </w:r>
+      <w:r>
+        <w:t xml:space="preserve">SVG without a size is drawn at its</w:t>
+      </w:r>
+      <w:r>
+        <w:t xml:space="preserve"> </w:t>
+      </w:r>
+      <w:r>
+        <w:t xml:space="preserve">viewBox's size (Chrome: small). The scripts' SVG DOM is dom.js' generic one (</w:t>
+      </w:r>
+      <w:r>
+        <w:rPr>
+          <w:rStyle w:val="VerbatimChar"/>
+        </w:rPr>
+        <w:t xml:space="preserve">namespaceURI</w:t>
+      </w:r>
+      <w:r>
+        <w:t xml:space="preserve">,</w:t>
+      </w:r>
+      <w:r>
+        <w:t xml:space="preserve"> </w:t>
+      </w:r>
+      <w:r>
+        <w:rPr>
+          <w:rStyle w:val="VerbatimChar"/>
+        </w:rPr>
+        <w:t xml:space="preserve">getBBox</w:t>
+      </w:r>
+      <w:r>
+        <w:t xml:space="preserve"> </w:t>
+      </w:r>
+      <w:r>
+        <w:t xml:space="preserve">from the box).</w:t>
+      </w:r>
+    </w:p>
+    <w:p>
+      <w:pPr>
+        <w:pStyle w:val="Compact"/>
+        <w:numPr>
+          <w:ilvl w:val="0"/>
+          <w:numId w:val="1035"/>
+        </w:numPr>
+      </w:pPr>
+      <w:r>
+        <w:t xml:space="preserve">Canvas: no shadows, filters, blend modes (source-over), conic gradients (a solid colour),</w:t>
+      </w:r>
+      <w:r>
+        <w:t xml:space="preserve"> </w:t>
+      </w:r>
+      <w:r>
+        <w:t xml:space="preserve">per-corner</w:t>
+      </w:r>
+      <w:r>
+        <w:t xml:space="preserve"> </w:t>
+      </w:r>
+      <w:r>
+        <w:rPr>
+          <w:rStyle w:val="VerbatimChar"/>
+        </w:rPr>
+        <w:t xml:space="preserve">roundRect</w:t>
+      </w:r>
+      <w:r>
+        <w:t xml:space="preserve"> </w:t>
+      </w:r>
+      <w:r>
+        <w:t xml:space="preserve">radii;</w:t>
+      </w:r>
+      <w:r>
+        <w:t xml:space="preserve"> </w:t>
+      </w:r>
+      <w:r>
+        <w:rPr>
+          <w:rStyle w:val="VerbatimChar"/>
+        </w:rPr>
+        <w:t xml:space="preserve">drawImage</w:t>
+      </w:r>
+      <w:r>
+        <w:t xml:space="preserve"> </w:t>
+      </w:r>
+      <w:r>
+        <w:t xml:space="preserve">scales with the nearest pixel (PlutoVG's</w:t>
+      </w:r>
+      <w:r>
+        <w:t xml:space="preserve"> </w:t>
+      </w:r>
+      <w:r>
+        <w:t xml:space="preserve">textures), and a canvas shown at another CSS size too (the framebuffer's bitmap plot);</w:t>
+      </w:r>
+      <w:r>
+        <w:t xml:space="preserve"> </w:t>
+      </w:r>
+      <w:r>
+        <w:t xml:space="preserve">no</w:t>
+      </w:r>
+      <w:r>
+        <w:t xml:space="preserve"> </w:t>
+      </w:r>
+      <w:r>
+        <w:rPr>
+          <w:rStyle w:val="VerbatimChar"/>
+        </w:rPr>
+        <w:t xml:space="preserve">getContext('webgl')</w:t>
+      </w:r>
+      <w:r>
+        <w:t xml:space="preserve">,</w:t>
+      </w:r>
+      <w:r>
+        <w:t xml:space="preserve"> </w:t>
+      </w:r>
+      <w:r>
+        <w:rPr>
+          <w:rStyle w:val="VerbatimChar"/>
+        </w:rPr>
+        <w:t xml:space="preserve">captureStream</w:t>
+      </w:r>
+      <w:r>
+        <w:t xml:space="preserve">, video frames; the page's web fonts are not used</w:t>
+      </w:r>
+      <w:r>
+        <w:t xml:space="preserve"> </w:t>
+      </w:r>
+      <w:r>
+        <w:t xml:space="preserve">(the card's fonts by family).</w:t>
+      </w:r>
+    </w:p>
+    <w:p>
+      <w:pPr>
+        <w:pStyle w:val="Compact"/>
+        <w:numPr>
+          <w:ilvl w:val="0"/>
+          <w:numId w:val="1035"/>
+        </w:numPr>
+      </w:pPr>
+      <w:r>
+        <w:t xml:space="preserve">A face split by</w:t>
+      </w:r>
+      <w:r>
+        <w:t xml:space="preserve"> </w:t>
+      </w:r>
+      <w:r>
+        <w:rPr>
+          <w:rStyle w:val="VerbatimChar"/>
+        </w:rPr>
+        <w:t xml:space="preserve">unicode-range</w:t>
+      </w:r>
+      <w:r>
+        <w:t xml:space="preserve"> </w:t>
+      </w:r>
+      <w:r>
+        <w:t xml:space="preserve">outside Latin-1 falls back to the card's fonts.</w:t>
+      </w:r>
+    </w:p>
+    <w:p>
+      <w:pPr>
+        <w:pStyle w:val="Compact"/>
+        <w:numPr>
+          <w:ilvl w:val="0"/>
+          <w:numId w:val="1035"/>
+        </w:numPr>
+      </w:pPr>
+      <w:r>
         <w:t xml:space="preserve">Intl (§15): no</w:t>
       </w:r>
       <w:r>
@@ -49819,7 +51997,7 @@
         <w:t xml:space="preserve">(ja, zh, ko, ru, pl, sv, da, nb, fi, tr, cs) have English units, display names and zone names.</w:t>
       </w:r>
     </w:p>
-    <w:bookmarkEnd w:id="50"/>
+    <w:bookmarkEnd w:id="51"/>
     <w:sectPr>
       <w:footerReference r:id="rId9" w:type="default"/>
       <w:footnotePr>
@@ -50291,6 +52469,12 @@
     <w:abstractNumId w:val="991"/>
   </w:num>
   <w:num w:numId="1033">
+    <w:abstractNumId w:val="991"/>
+  </w:num>
+  <w:num w:numId="1034">
+    <w:abstractNumId w:val="991"/>
+  </w:num>
+  <w:num w:numId="1035">
     <w:abstractNumId w:val="991"/>
   </w:num>
 </w:numbering>

</xml_diff>

<commit_message>
docs: the 06 export regenerated (§26: Vue's render on the Pi, the time limit)
Co-Authored-By: Claude Opus 5.5 <noreply@anthropic.com>
Claude-Session: https://claude.ai/code/session_01UcY36na7Mp1DEYttKiw1pa
</commit_message>
<xml_diff>
--- a/docs/exports/06-NETSURF-CHANGES.docx
+++ b/docs/exports/06-NETSURF-CHANGES.docx
@@ -8738,6 +8738,214 @@
           <w:b/>
           <w:bCs/>
         </w:rPr>
+        <w:t xml:space="preserve">A dialog capped to the viewport</w:t>
+      </w:r>
+      <w:r>
+        <w:t xml:space="preserve"> </w:t>
+      </w:r>
+      <w:r>
+        <w:t xml:space="preserve">(Facebook's cookie dialog: a fixed backdrop,</w:t>
+      </w:r>
+      <w:r>
+        <w:t xml:space="preserve"> </w:t>
+      </w:r>
+      <w:r>
+        <w:rPr>
+          <w:rStyle w:val="VerbatimChar"/>
+        </w:rPr>
+        <w:t xml:space="preserve">inset: 0</w:t>
+      </w:r>
+      <w:r>
+        <w:t xml:space="preserve">, centring a flex column with</w:t>
+      </w:r>
+      <w:r>
+        <w:t xml:space="preserve"> </w:t>
+      </w:r>
+      <w:r>
+        <w:rPr>
+          <w:rStyle w:val="VerbatimChar"/>
+        </w:rPr>
+        <w:t xml:space="preserve">max-height: 90%</w:t>
+      </w:r>
+      <w:r>
+        <w:t xml:space="preserve">, its middle</w:t>
+      </w:r>
+      <w:r>
+        <w:t xml:space="preserve"> </w:t>
+      </w:r>
+      <w:r>
+        <w:rPr>
+          <w:rStyle w:val="VerbatimChar"/>
+        </w:rPr>
+        <w:t xml:space="preserve">overflow: auto</w:t>
+      </w:r>
+      <w:r>
+        <w:t xml:space="preserve">,</w:t>
+      </w:r>
+      <w:r>
+        <w:t xml:space="preserve"> </w:t>
+      </w:r>
+      <w:r>
+        <w:t xml:space="preserve">the buttons pinned): an absolute / fixed box whose height is given by its insets (</w:t>
+      </w:r>
+      <w:r>
+        <w:rPr>
+          <w:rStyle w:val="VerbatimChar"/>
+        </w:rPr>
+        <w:t xml:space="preserve">top</w:t>
+      </w:r>
+      <w:r>
+        <w:t xml:space="preserve"> </w:t>
+      </w:r>
+      <w:r>
+        <w:t xml:space="preserve">and</w:t>
+      </w:r>
+      <w:r>
+        <w:t xml:space="preserve"> </w:t>
+      </w:r>
+      <w:r>
+        <w:rPr>
+          <w:rStyle w:val="VerbatimChar"/>
+        </w:rPr>
+        <w:t xml:space="preserve">bottom</w:t>
+      </w:r>
+      <w:r>
+        <w:t xml:space="preserve"> </w:t>
+      </w:r>
+      <w:r>
+        <w:t xml:space="preserve">set,</w:t>
+      </w:r>
+      <w:r>
+        <w:t xml:space="preserve"> </w:t>
+      </w:r>
+      <w:r>
+        <w:rPr>
+          <w:rStyle w:val="VerbatimChar"/>
+        </w:rPr>
+        <w:t xml:space="preserve">height: auto</w:t>
+      </w:r>
+      <w:r>
+        <w:t xml:space="preserve">) now knows it before its content is laid out</w:t>
+      </w:r>
+      <w:r>
+        <w:t xml:space="preserve"> </w:t>
+      </w:r>
+      <w:r>
+        <w:t xml:space="preserve">(</w:t>
+      </w:r>
+      <w:r>
+        <w:rPr>
+          <w:rStyle w:val="VerbatimChar"/>
+        </w:rPr>
+        <w:t xml:space="preserve">layout_absolute</w:t>
+      </w:r>
+      <w:r>
+        <w:t xml:space="preserve">,</w:t>
+      </w:r>
+      <w:r>
+        <w:t xml:space="preserve"> </w:t>
+      </w:r>
+      <w:r>
+        <w:rPr>
+          <w:rStyle w:val="VerbatimChar"/>
+        </w:rPr>
+        <w:t xml:space="preserve">DEF_HEIGHT</w:t>
+      </w:r>
+      <w:r>
+        <w:t xml:space="preserve">): a flex container centres and flexes its items in it,</w:t>
+      </w:r>
+      <w:r>
+        <w:t xml:space="preserve"> </w:t>
+      </w:r>
+      <w:r>
+        <w:t xml:space="preserve">its children's percentages resolve against it. The dialog took its whole content's height</w:t>
+      </w:r>
+      <w:r>
+        <w:t xml:space="preserve"> </w:t>
+      </w:r>
+      <w:r>
+        <w:t xml:space="preserve">(the buttons below the screen, nothing to scroll). A stretched grid item that is a scroll</w:t>
+      </w:r>
+      <w:r>
+        <w:t xml:space="preserve"> </w:t>
+      </w:r>
+      <w:r>
+        <w:t xml:space="preserve">container is its area's height even when its content is taller (</w:t>
+      </w:r>
+      <w:r>
+        <w:rPr>
+          <w:rStyle w:val="VerbatimChar"/>
+        </w:rPr>
+        <w:t xml:space="preserve">layout_grid.c</w:t>
+      </w:r>
+      <w:r>
+        <w:t xml:space="preserve">: a</w:t>
+      </w:r>
+      <w:r>
+        <w:t xml:space="preserve"> </w:t>
+      </w:r>
+      <w:r>
+        <w:rPr>
+          <w:rStyle w:val="VerbatimChar"/>
+        </w:rPr>
+        <w:t xml:space="preserve">minmax(0, 1fr)</w:t>
+      </w:r>
+      <w:r>
+        <w:t xml:space="preserve"> </w:t>
+      </w:r>
+      <w:r>
+        <w:t xml:space="preserve">middle row). Tests:</w:t>
+      </w:r>
+      <w:r>
+        <w:t xml:space="preserve"> </w:t>
+      </w:r>
+      <w:r>
+        <w:rPr>
+          <w:rStyle w:val="VerbatimChar"/>
+        </w:rPr>
+        <w:t xml:space="preserve">pages/layout/dialogs.html</w:t>
+      </w:r>
+      <w:r>
+        <w:t xml:space="preserve"> </w:t>
+      </w:r>
+      <w:r>
+        <w:t xml:space="preserve">(layouttest: 0 of 49</w:t>
+      </w:r>
+      <w:r>
+        <w:t xml:space="preserve"> </w:t>
+      </w:r>
+      <w:r>
+        <w:t xml:space="preserve">differ),</w:t>
+      </w:r>
+      <w:r>
+        <w:t xml:space="preserve"> </w:t>
+      </w:r>
+      <w:r>
+        <w:rPr>
+          <w:rStyle w:val="VerbatimChar"/>
+        </w:rPr>
+        <w:t xml:space="preserve">pages/js-dialog.html</w:t>
+      </w:r>
+      <w:r>
+        <w:t xml:space="preserve"> </w:t>
+      </w:r>
+      <w:r>
+        <w:t xml:space="preserve">(jstest).</w:t>
+      </w:r>
+    </w:p>
+    <w:p>
+      <w:pPr>
+        <w:pStyle w:val="Compact"/>
+        <w:numPr>
+          <w:ilvl w:val="0"/>
+          <w:numId w:val="1009"/>
+        </w:numPr>
+      </w:pPr>
+      <w:r>
+        <w:rPr>
+          <w:b/>
+          <w:bCs/>
+        </w:rPr>
         <w:t xml:space="preserve">No touch screen</w:t>
       </w:r>
       <w:r>
@@ -28586,7 +28794,34 @@
         <w:t xml:space="preserve">user_agent_for_host</w:t>
       </w:r>
       <w:r>
-        <w:t xml:space="preserve">, utils/useragent.c).</w:t>
+        <w:t xml:space="preserve">, utils/useragent.c). The disk cache keys a desktop site's objects apart</w:t>
+      </w:r>
+      <w:r>
+        <w:t xml:space="preserve"> </w:t>
+      </w:r>
+      <w:r>
+        <w:t xml:space="preserve">(</w:t>
+      </w:r>
+      <w:r>
+        <w:rPr>
+          <w:rStyle w:val="VerbatimChar"/>
+        </w:rPr>
+        <w:t xml:space="preserve">D|&lt;url&gt;</w:t>
+      </w:r>
+      <w:r>
+        <w:t xml:space="preserve">,</w:t>
+      </w:r>
+      <w:r>
+        <w:t xml:space="preserve"> </w:t>
+      </w:r>
+      <w:r>
+        <w:rPr>
+          <w:rStyle w:val="VerbatimChar"/>
+        </w:rPr>
+        <w:t xml:space="preserve">onyx_cache.c</w:t>
+      </w:r>
+      <w:r>
+        <w:t xml:space="preserve">): a site switched back to mobile found its desktop copies.</w:t>
       </w:r>
     </w:p>
     <w:p>
@@ -41226,7 +41461,13 @@
         <w:t xml:space="preserve"> </w:t>
       </w:r>
       <w:r>
-        <w:t xml:space="preserve">0 = none). Browsers do not stop a script at all; the limit only ends a loop that never does.</w:t>
+        <w:t xml:space="preserve">0 = none). Browsers do not stop a script at all; the limit only ends a loop that never does</w:t>
+      </w:r>
+      <w:r>
+        <w:t xml:space="preserve"> </w:t>
+      </w:r>
+      <w:r>
+        <w:t xml:space="preserve">(§26: past it, a script still changing the page now runs on).</w:t>
       </w:r>
     </w:p>
     <w:p>
@@ -41379,7 +41620,7 @@
         <w:t xml:space="preserve"> </w:t>
       </w:r>
       <w:r>
-        <w:t xml:space="preserve">of its time, a minute with the log on).</w:t>
+        <w:t xml:space="preserve">of its time, a minute with the log on) -- bounded harder since (§26).</w:t>
       </w:r>
     </w:p>
     <w:p>
@@ -48817,13 +49058,235 @@
       </w:r>
     </w:p>
     <w:bookmarkEnd w:id="49"/>
-    <w:bookmarkStart w:id="50" w:name="X2d96bac25f45ec9241507797951d2bb0b2591ad"/>
+    <w:bookmarkStart w:id="50" w:name="X119e4575858bf11d22b52b72612b42f6e8c498d"/>
     <w:p>
       <w:pPr>
         <w:pStyle w:val="Heading2"/>
       </w:pPr>
       <w:r>
-        <w:t xml:space="preserve">8. Known gaps</w:t>
+        <w:t xml:space="preserve">26. Vue's first render on the Pi (browserscore.dev "0 of 0 features"); the time limit</w:t>
+      </w:r>
+    </w:p>
+    <w:p>
+      <w:pPr>
+        <w:pStyle w:val="FirstParagraph"/>
+      </w:pPr>
+      <w:r>
+        <w:rPr>
+          <w:b/>
+          <w:bCs/>
+        </w:rPr>
+        <w:t xml:space="preserve">What the Pi showed</w:t>
+      </w:r>
+      <w:r>
+        <w:t xml:space="preserve"> </w:t>
+      </w:r>
+      <w:r>
+        <w:t xml:space="preserve">(after §23): browserscore.dev still at "0 of 0 features, 0 %". Its kmsg:</w:t>
+      </w:r>
+      <w:r>
+        <w:t xml:space="preserve"> </w:t>
+      </w:r>
+      <w:r>
+        <w:t xml:space="preserve">1646</w:t>
+      </w:r>
+      <w:r>
+        <w:t xml:space="preserve"> </w:t>
+      </w:r>
+      <w:r>
+        <w:rPr>
+          <w:rStyle w:val="VerbatimChar"/>
+        </w:rPr>
+        <w:t xml:space="preserve">[Vue warn]</w:t>
+      </w:r>
+      <w:r>
+        <w:t xml:space="preserve"> </w:t>
+      </w:r>
+      <w:r>
+        <w:t xml:space="preserve">lines (the site's own: Vue's development build warns the same in Chrome), then</w:t>
+      </w:r>
+      <w:r>
+        <w:t xml:space="preserve"> </w:t>
+      </w:r>
+      <w:r>
+        <w:rPr>
+          <w:rStyle w:val="VerbatimChar"/>
+        </w:rPr>
+        <w:t xml:space="preserve">JS job: InternalError: interrupted at refreshComputed</w:t>
+      </w:r>
+      <w:r>
+        <w:t xml:space="preserve"> </w:t>
+      </w:r>
+      <w:r>
+        <w:t xml:space="preserve">and</w:t>
+      </w:r>
+      <w:r>
+        <w:t xml:space="preserve"> </w:t>
+      </w:r>
+      <w:r>
+        <w:rPr>
+          <w:rStyle w:val="VerbatimChar"/>
+        </w:rPr>
+        <w:t xml:space="preserve">ONYX-PERF js:job 60030626 us</w:t>
+      </w:r>
+      <w:r>
+        <w:t xml:space="preserve"> </w:t>
+      </w:r>
+      <w:r>
+        <w:t xml:space="preserve">--</w:t>
+      </w:r>
+      <w:r>
+        <w:t xml:space="preserve"> </w:t>
+      </w:r>
+      <w:r>
+        <w:t xml:space="preserve">Vue's first render, one promise job, cut off by the 60 s</w:t>
+      </w:r>
+      <w:r>
+        <w:t xml:space="preserve"> </w:t>
+      </w:r>
+      <w:r>
+        <w:rPr>
+          <w:rStyle w:val="VerbatimChar"/>
+        </w:rPr>
+        <w:t xml:space="preserve">script_timeout</w:t>
+      </w:r>
+      <w:r>
+        <w:t xml:space="preserve">. On the PC bench the</w:t>
+      </w:r>
+      <w:r>
+        <w:t xml:space="preserve"> </w:t>
+      </w:r>
+      <w:r>
+        <w:t xml:space="preserve">job took 8.5 s with the log on (</w:t>
+      </w:r>
+      <w:r>
+        <w:rPr>
+          <w:rStyle w:val="VerbatimChar"/>
+        </w:rPr>
+        <w:t xml:space="preserve">NS_JSDEBUG</w:t>
+      </w:r>
+      <w:r>
+        <w:t xml:space="preserve">; the Pi had its</w:t>
+      </w:r>
+      <w:r>
+        <w:t xml:space="preserve"> </w:t>
+      </w:r>
+      <w:r>
+        <w:rPr>
+          <w:rStyle w:val="VerbatimChar"/>
+        </w:rPr>
+        <w:t xml:space="preserve">jsdebug</w:t>
+      </w:r>
+      <w:r>
+        <w:t xml:space="preserve"> </w:t>
+      </w:r>
+      <w:r>
+        <w:t xml:space="preserve">file), 6.6-7 s without;</w:t>
+      </w:r>
+      <w:r>
+        <w:t xml:space="preserve"> </w:t>
+      </w:r>
+      <w:r>
+        <w:t xml:space="preserve">the Pi is 5-7 times slower.</w:t>
+      </w:r>
+    </w:p>
+    <w:p>
+      <w:pPr>
+        <w:pStyle w:val="BodyText"/>
+      </w:pPr>
+      <w:r>
+        <w:rPr>
+          <w:b/>
+          <w:bCs/>
+        </w:rPr>
+        <w:t xml:space="preserve">The profile</w:t>
+      </w:r>
+      <w:r>
+        <w:t xml:space="preserve"> </w:t>
+      </w:r>
+      <w:r>
+        <w:t xml:space="preserve">(</w:t>
+      </w:r>
+      <w:r>
+        <w:rPr>
+          <w:rStyle w:val="VerbatimChar"/>
+        </w:rPr>
+        <w:t xml:space="preserve">NS_JSPROF</w:t>
+      </w:r>
+      <w:r>
+        <w:t xml:space="preserve"> </w:t>
+      </w:r>
+      <w:r>
+        <w:t xml:space="preserve">+</w:t>
+      </w:r>
+      <w:r>
+        <w:t xml:space="preserve"> </w:t>
+      </w:r>
+      <w:r>
+        <w:rPr>
+          <w:rStyle w:val="VerbatimChar"/>
+        </w:rPr>
+        <w:t xml:space="preserve">jsprof.py</w:t>
+      </w:r>
+      <w:r>
+        <w:t xml:space="preserve">,</w:t>
+      </w:r>
+      <w:r>
+        <w:t xml:space="preserve"> </w:t>
+      </w:r>
+      <w:r>
+        <w:rPr>
+          <w:rStyle w:val="VerbatimChar"/>
+        </w:rPr>
+        <w:t xml:space="preserve">NS_PROF</w:t>
+      </w:r>
+      <w:r>
+        <w:t xml:space="preserve"> </w:t>
+      </w:r>
+      <w:r>
+        <w:t xml:space="preserve">+</w:t>
+      </w:r>
+      <w:r>
+        <w:t xml:space="preserve"> </w:t>
+      </w:r>
+      <w:r>
+        <w:rPr>
+          <w:rStyle w:val="VerbatimChar"/>
+        </w:rPr>
+        <w:t xml:space="preserve">prof.sh</w:t>
+      </w:r>
+      <w:r>
+        <w:t xml:space="preserve">): 85 % of the job is QuickJS</w:t>
+      </w:r>
+      <w:r>
+        <w:t xml:space="preserve"> </w:t>
+      </w:r>
+      <w:r>
+        <w:t xml:space="preserve">interpreting the site's code and Vue's (the component mounts, the reactivity's proxies and</w:t>
+      </w:r>
+      <w:r>
+        <w:t xml:space="preserve"> </w:t>
+      </w:r>
+      <w:r>
+        <w:rPr>
+          <w:rStyle w:val="VerbatimChar"/>
+        </w:rPr>
+        <w:t xml:space="preserve">track()</w:t>
+      </w:r>
+      <w:r>
+        <w:t xml:space="preserve">, Score.js's recalculation of every ancestor at each feature -- quadratic, the site's</w:t>
+      </w:r>
+      <w:r>
+        <w:t xml:space="preserve"> </w:t>
+      </w:r>
+      <w:r>
+        <w:t xml:space="preserve">own); DOM-in-JS work (insertBefore, setAttribute, createElement, textContent) is 2-3 %. What was</w:t>
+      </w:r>
+      <w:r>
+        <w:t xml:space="preserve"> </w:t>
+      </w:r>
+      <w:r>
+        <w:t xml:space="preserve">ours and slow:</w:t>
       </w:r>
     </w:p>
     <w:p>
@@ -48835,46 +49298,155 @@
         </w:numPr>
       </w:pPr>
       <w:r>
-        <w:t xml:space="preserve">JavaScript: synchronous XHR (runs async), multipart request bodies, binary request bodies</w:t>
-      </w:r>
-      <w:r>
-        <w:t xml:space="preserve"> </w:t>
-      </w:r>
-      <w:r>
-        <w:t xml:space="preserve">(sent as text: a NUL ends them); no IndexedDB, editing APIs, Service</w:t>
-      </w:r>
-      <w:r>
-        <w:t xml:space="preserve"> </w:t>
-      </w:r>
-      <w:r>
-        <w:t xml:space="preserve">Workers; CSS</w:t>
-      </w:r>
-      <w:r>
-        <w:t xml:space="preserve"> </w:t>
-      </w:r>
-      <w:r>
-        <w:rPr>
-          <w:rStyle w:val="VerbatimChar"/>
-        </w:rPr>
-        <w:t xml:space="preserve">:active</w:t>
-      </w:r>
-      <w:r>
-        <w:t xml:space="preserve"> </w:t>
-      </w:r>
-      <w:r>
-        <w:t xml:space="preserve">/</w:t>
-      </w:r>
-      <w:r>
-        <w:t xml:space="preserve"> </w:t>
-      </w:r>
-      <w:r>
-        <w:rPr>
-          <w:rStyle w:val="VerbatimChar"/>
-        </w:rPr>
-        <w:t xml:space="preserve">:focus</w:t>
-      </w:r>
-      <w:r>
-        <w:t xml:space="preserve">.</w:t>
+        <w:rPr>
+          <w:b/>
+          <w:bCs/>
+        </w:rPr>
+        <w:t xml:space="preserve">The console with the log on</w:t>
+      </w:r>
+      <w:r>
+        <w:t xml:space="preserve">: each warning's arguments (Vue's component trace: reactive</w:t>
+      </w:r>
+      <w:r>
+        <w:t xml:space="preserve"> </w:t>
+      </w:r>
+      <w:r>
+        <w:t xml:space="preserve">proxies of the features, every value read a tracked</w:t>
+      </w:r>
+      <w:r>
+        <w:t xml:space="preserve"> </w:t>
+      </w:r>
+      <w:r>
+        <w:rPr>
+          <w:rStyle w:val="VerbatimChar"/>
+        </w:rPr>
+        <w:t xml:space="preserve">get</w:t>
+      </w:r>
+      <w:r>
+        <w:t xml:space="preserve">) formatted up to 2000 values --</w:t>
+      </w:r>
+      <w:r>
+        <w:t xml:space="preserve"> </w:t>
+      </w:r>
+      <w:r>
+        <w:t xml:space="preserve">~2 s of the job. Now (</w:t>
+      </w:r>
+      <w:r>
+        <w:rPr>
+          <w:rStyle w:val="VerbatimChar"/>
+        </w:rPr>
+        <w:t xml:space="preserve">dom.js</w:t>
+      </w:r>
+      <w:r>
+        <w:t xml:space="preserve"> </w:t>
+      </w:r>
+      <w:r>
+        <w:rPr>
+          <w:rStyle w:val="VerbatimChar"/>
+        </w:rPr>
+        <w:t xml:space="preserve">fmt</w:t>
+      </w:r>
+      <w:r>
+        <w:t xml:space="preserve">,</w:t>
+      </w:r>
+      <w:r>
+        <w:t xml:space="preserve"> </w:t>
+      </w:r>
+      <w:r>
+        <w:rPr>
+          <w:rStyle w:val="VerbatimChar"/>
+        </w:rPr>
+        <w:t xml:space="preserve">fmtJSON</w:t>
+      </w:r>
+      <w:r>
+        <w:t xml:space="preserve">) an object is JSON's text but 40 values,</w:t>
+      </w:r>
+      <w:r>
+        <w:t xml:space="preserve"> </w:t>
+      </w:r>
+      <w:r>
+        <w:t xml:space="preserve">4 levels and 160 characters at most (a long string cut with</w:t>
+      </w:r>
+      <w:r>
+        <w:t xml:space="preserve"> </w:t>
+      </w:r>
+      <w:r>
+        <w:rPr>
+          <w:rStyle w:val="VerbatimChar"/>
+        </w:rPr>
+        <w:t xml:space="preserve">…</w:t>
+      </w:r>
+      <w:r>
+        <w:t xml:space="preserve">), and once the line passes</w:t>
+      </w:r>
+      <w:r>
+        <w:t xml:space="preserve"> </w:t>
+      </w:r>
+      <w:r>
+        <w:t xml:space="preserve">256 characters the further objects are only named (</w:t>
+      </w:r>
+      <w:r>
+        <w:rPr>
+          <w:rStyle w:val="VerbatimChar"/>
+        </w:rPr>
+        <w:t xml:space="preserve">[Object ...]</w:t>
+      </w:r>
+      <w:r>
+        <w:t xml:space="preserve">): the kmsg line is cut at</w:t>
+      </w:r>
+      <w:r>
+        <w:t xml:space="preserve"> </w:t>
+      </w:r>
+      <w:r>
+        <w:t xml:space="preserve">~128 characters anyway, and a string argument (Vue's message) costs nothing. A function shows</w:t>
+      </w:r>
+      <w:r>
+        <w:t xml:space="preserve"> </w:t>
+      </w:r>
+      <w:r>
+        <w:t xml:space="preserve">as</w:t>
+      </w:r>
+      <w:r>
+        <w:t xml:space="preserve"> </w:t>
+      </w:r>
+      <w:r>
+        <w:rPr>
+          <w:rStyle w:val="VerbatimChar"/>
+        </w:rPr>
+        <w:t xml:space="preserve">function name()</w:t>
+      </w:r>
+      <w:r>
+        <w:t xml:space="preserve">,</w:t>
+      </w:r>
+      <w:r>
+        <w:t xml:space="preserve"> </w:t>
+      </w:r>
+      <w:r>
+        <w:rPr>
+          <w:rStyle w:val="VerbatimChar"/>
+        </w:rPr>
+        <w:t xml:space="preserve">undefined</w:t>
+      </w:r>
+      <w:r>
+        <w:t xml:space="preserve"> </w:t>
+      </w:r>
+      <w:r>
+        <w:t xml:space="preserve">as</w:t>
+      </w:r>
+      <w:r>
+        <w:t xml:space="preserve"> </w:t>
+      </w:r>
+      <w:r>
+        <w:rPr>
+          <w:rStyle w:val="VerbatimChar"/>
+        </w:rPr>
+        <w:t xml:space="preserve">undefined</w:t>
+      </w:r>
+      <w:r>
+        <w:t xml:space="preserve"> </w:t>
+      </w:r>
+      <w:r>
+        <w:t xml:space="preserve">(it printed nothing).</w:t>
       </w:r>
     </w:p>
     <w:p>
@@ -48886,91 +49458,107 @@
         </w:numPr>
       </w:pPr>
       <w:r>
-        <w:t xml:space="preserve">The network APIs (§19): a worker runs on the UI thread (a long computation in a worker</w:t>
-      </w:r>
-      <w:r>
-        <w:t xml:space="preserve"> </w:t>
-      </w:r>
-      <w:r>
-        <w:t xml:space="preserve">holds the window as a page's script does;</w:t>
-      </w:r>
-      <w:r>
-        <w:t xml:space="preserve"> </w:t>
-      </w:r>
-      <w:r>
-        <w:rPr>
-          <w:rStyle w:val="VerbatimChar"/>
-        </w:rPr>
-        <w:t xml:space="preserve">script_timeout</w:t>
-      </w:r>
-      <w:r>
-        <w:t xml:space="preserve"> </w:t>
-      </w:r>
-      <w:r>
-        <w:t xml:space="preserve">stops it); an</w:t>
-      </w:r>
-      <w:r>
-        <w:t xml:space="preserve"> </w:t>
-      </w:r>
-      <w:r>
-        <w:rPr>
-          <w:rStyle w:val="VerbatimChar"/>
-        </w:rPr>
-        <w:t xml:space="preserve">importScripts</w:t>
-      </w:r>
-      <w:r>
-        <w:t xml:space="preserve"> </w:t>
-      </w:r>
-      <w:r>
-        <w:t xml:space="preserve">whose URL is not a literal in the script, over http(s), blocks the UI thread while it is</w:t>
-      </w:r>
-      <w:r>
-        <w:t xml:space="preserve"> </w:t>
-      </w:r>
-      <w:r>
-        <w:t xml:space="preserve">read; a SharedWorker is shared within its document only; no</w:t>
-      </w:r>
-      <w:r>
-        <w:t xml:space="preserve"> </w:t>
-      </w:r>
-      <w:r>
-        <w:rPr>
-          <w:rStyle w:val="VerbatimChar"/>
-        </w:rPr>
-        <w:t xml:space="preserve">MessagePort</w:t>
-      </w:r>
-      <w:r>
-        <w:t xml:space="preserve"> </w:t>
-      </w:r>
-      <w:r>
-        <w:t xml:space="preserve">transferred to a</w:t>
-      </w:r>
-      <w:r>
-        <w:t xml:space="preserve"> </w:t>
-      </w:r>
-      <w:r>
-        <w:t xml:space="preserve">worker, no</w:t>
-      </w:r>
-      <w:r>
-        <w:t xml:space="preserve"> </w:t>
-      </w:r>
-      <w:r>
-        <w:rPr>
-          <w:rStyle w:val="VerbatimChar"/>
-        </w:rPr>
-        <w:t xml:space="preserve">OffscreenCanvas</w:t>
-      </w:r>
-      <w:r>
-        <w:t xml:space="preserve">,</w:t>
-      </w:r>
-      <w:r>
-        <w:t xml:space="preserve"> </w:t>
-      </w:r>
-      <w:r>
-        <w:rPr>
-          <w:rStyle w:val="VerbatimChar"/>
-        </w:rPr>
-        <w:t xml:space="preserve">SharedArrayBuffer</w:t>
+        <w:rPr>
+          <w:b/>
+          <w:bCs/>
+        </w:rPr>
+        <w:t xml:space="preserve">Map / Set / WeakMap keyed by objects</w:t>
+      </w:r>
+      <w:r>
+        <w:t xml:space="preserve"> </w:t>
+      </w:r>
+      <w:r>
+        <w:t xml:space="preserve">(</w:t>
+      </w:r>
+      <w:r>
+        <w:rPr>
+          <w:rStyle w:val="VerbatimChar"/>
+        </w:rPr>
+        <w:t xml:space="preserve">quickjs.c</w:t>
+      </w:r>
+      <w:r>
+        <w:t xml:space="preserve"> </w:t>
+      </w:r>
+      <w:r>
+        <w:rPr>
+          <w:rStyle w:val="VerbatimChar"/>
+        </w:rPr>
+        <w:t xml:space="preserve">map_hash_key</w:t>
+      </w:r>
+      <w:r>
+        <w:t xml:space="preserve">, marked Onyx): the hash of</w:t>
+      </w:r>
+      <w:r>
+        <w:t xml:space="preserve"> </w:t>
+      </w:r>
+      <w:r>
+        <w:t xml:space="preserve">an object key was</w:t>
+      </w:r>
+      <w:r>
+        <w:t xml:space="preserve"> </w:t>
+      </w:r>
+      <w:r>
+        <w:rPr>
+          <w:rStyle w:val="VerbatimChar"/>
+        </w:rPr>
+        <w:t xml:space="preserve">pointer * 3163</w:t>
+      </w:r>
+      <w:r>
+        <w:t xml:space="preserve"> </w:t>
+      </w:r>
+      <w:r>
+        <w:t xml:space="preserve">-- the low bits of an 8- or 16-byte aligned pointer stay</w:t>
+      </w:r>
+      <w:r>
+        <w:t xml:space="preserve"> </w:t>
+      </w:r>
+      <w:r>
+        <w:t xml:space="preserve">zero, and the bucket is the low bits: one bucket in 8 to 16 used, chains as long</w:t>
+      </w:r>
+      <w:r>
+        <w:t xml:space="preserve"> </w:t>
+      </w:r>
+      <w:r>
+        <w:t xml:space="preserve">(</w:t>
+      </w:r>
+      <w:r>
+        <w:rPr>
+          <w:rStyle w:val="VerbatimChar"/>
+        </w:rPr>
+        <w:t xml:space="preserve">js_map_get</w:t>
+      </w:r>
+      <w:r>
+        <w:t xml:space="preserve"> </w:t>
+      </w:r>
+      <w:r>
+        <w:t xml:space="preserve">spent its time in</w:t>
+      </w:r>
+      <w:r>
+        <w:t xml:space="preserve"> </w:t>
+      </w:r>
+      <w:r>
+        <w:rPr>
+          <w:rStyle w:val="VerbatimChar"/>
+        </w:rPr>
+        <w:t xml:space="preserve">js_same_value_zero</w:t>
+      </w:r>
+      <w:r>
+        <w:t xml:space="preserve">). The pointer is now mixed (murmur3's</w:t>
+      </w:r>
+      <w:r>
+        <w:t xml:space="preserve"> </w:t>
+      </w:r>
+      <w:r>
+        <w:t xml:space="preserve">finalizer). Vue's</w:t>
+      </w:r>
+      <w:r>
+        <w:t xml:space="preserve"> </w:t>
+      </w:r>
+      <w:r>
+        <w:rPr>
+          <w:rStyle w:val="VerbatimChar"/>
+        </w:rPr>
+        <w:t xml:space="preserve">targetMap</w:t>
       </w:r>
       <w:r>
         <w:t xml:space="preserve"> </w:t>
@@ -48985,25 +49573,40 @@
         <w:rPr>
           <w:rStyle w:val="VerbatimChar"/>
         </w:rPr>
-        <w:t xml:space="preserve">Atomics</w:t>
-      </w:r>
-      <w:r>
-        <w:t xml:space="preserve"> </w:t>
-      </w:r>
-      <w:r>
-        <w:t xml:space="preserve">between workers; the</w:t>
-      </w:r>
-      <w:r>
-        <w:t xml:space="preserve"> </w:t>
-      </w:r>
-      <w:r>
-        <w:t xml:space="preserve">WebSocket client sends its messages uncompressed (permessage-deflate inflates only) and</w:t>
-      </w:r>
-      <w:r>
-        <w:t xml:space="preserve"> </w:t>
-      </w:r>
-      <w:r>
-        <w:t xml:space="preserve">never pings; CORS is not checked for EventSource either.</w:t>
+        <w:t xml:space="preserve">reactiveMap</w:t>
+      </w:r>
+      <w:r>
+        <w:t xml:space="preserve"> </w:t>
+      </w:r>
+      <w:r>
+        <w:t xml:space="preserve">(WeakMaps of every reactive object) and its</w:t>
+      </w:r>
+      <w:r>
+        <w:t xml:space="preserve"> </w:t>
+      </w:r>
+      <w:r>
+        <w:t xml:space="preserve">dependency maps are looked up at each property read: a WeakMap / Map lookup 1.4-1.7x faster.</w:t>
+      </w:r>
+      <w:r>
+        <w:t xml:space="preserve"> </w:t>
+      </w:r>
+      <w:r>
+        <w:t xml:space="preserve">The Pi's</w:t>
+      </w:r>
+      <w:r>
+        <w:t xml:space="preserve"> </w:t>
+      </w:r>
+      <w:r>
+        <w:rPr>
+          <w:rStyle w:val="VerbatimChar"/>
+        </w:rPr>
+        <w:t xml:space="preserve">libquickjs.a</w:t>
+      </w:r>
+      <w:r>
+        <w:t xml:space="preserve"> </w:t>
+      </w:r>
+      <w:r>
+        <w:t xml:space="preserve">rebuilt.</w:t>
       </w:r>
     </w:p>
     <w:p>
@@ -49015,31 +49618,147 @@
         </w:numPr>
       </w:pPr>
       <w:r>
-        <w:t xml:space="preserve">The network (§24): no revocation checks, no CSP, no SameSite cookies, no</w:t>
-      </w:r>
-      <w:r>
-        <w:t xml:space="preserve"> </w:t>
-      </w:r>
-      <w:r>
-        <w:t xml:space="preserve">CORS for the core's loads (EventSource, fonts,</w:t>
-      </w:r>
-      <w:r>
-        <w:t xml:space="preserve"> </w:t>
-      </w:r>
-      <w:r>
-        <w:rPr>
-          <w:rStyle w:val="VerbatimChar"/>
-        </w:rPr>
-        <w:t xml:space="preserve">&lt;img crossorigin&gt;</w:t>
-      </w:r>
-      <w:r>
-        <w:t xml:space="preserve">, module scripts), no</w:t>
-      </w:r>
-      <w:r>
-        <w:t xml:space="preserve"> </w:t>
-      </w:r>
-      <w:r>
-        <w:t xml:space="preserve">HTTP/3, no back-forward cache.</w:t>
+        <w:rPr>
+          <w:rStyle w:val="VerbatimChar"/>
+          <w:b/>
+          <w:bCs/>
+        </w:rPr>
+        <w:t xml:space="preserve">new URL(link, base).href</w:t>
+      </w:r>
+      <w:r>
+        <w:t xml:space="preserve"> </w:t>
+      </w:r>
+      <w:r>
+        <w:t xml:space="preserve">(</w:t>
+      </w:r>
+      <w:r>
+        <w:rPr>
+          <w:rStyle w:val="VerbatimChar"/>
+        </w:rPr>
+        <w:t xml:space="preserve">dom.js</w:t>
+      </w:r>
+      <w:r>
+        <w:t xml:space="preserve">): the parse cache held 1024 URLs and was cleared when</w:t>
+      </w:r>
+      <w:r>
+        <w:t xml:space="preserve"> </w:t>
+      </w:r>
+      <w:r>
+        <w:t xml:space="preserve">full -- browserscore.dev makes 3000 links a render (its features' spec and draft links), so</w:t>
+      </w:r>
+      <w:r>
+        <w:t xml:space="preserve"> </w:t>
+      </w:r>
+      <w:r>
+        <w:t xml:space="preserve">every URL was parsed again; now 8192. A URL keeps the cached parse itself (</w:t>
+      </w:r>
+      <w:r>
+        <w:rPr>
+          <w:rStyle w:val="VerbatimChar"/>
+        </w:rPr>
+        <w:t xml:space="preserve">_c</w:t>
+      </w:r>
+      <w:r>
+        <w:t xml:space="preserve">, shared, never</w:t>
+      </w:r>
+      <w:r>
+        <w:t xml:space="preserve"> </w:t>
+      </w:r>
+      <w:r>
+        <w:t xml:space="preserve">changed) and copies it only when something reads its record to change it (</w:t>
+      </w:r>
+      <w:r>
+        <w:rPr>
+          <w:rStyle w:val="VerbatimChar"/>
+        </w:rPr>
+        <w:t xml:space="preserve">_u</w:t>
+      </w:r>
+      <w:r>
+        <w:t xml:space="preserve">, a getter;</w:t>
+      </w:r>
+      <w:r>
+        <w:t xml:space="preserve"> </w:t>
+      </w:r>
+      <w:r>
+        <w:t xml:space="preserve">the getters read</w:t>
+      </w:r>
+      <w:r>
+        <w:t xml:space="preserve"> </w:t>
+      </w:r>
+      <w:r>
+        <w:rPr>
+          <w:rStyle w:val="VerbatimChar"/>
+        </w:rPr>
+        <w:t xml:space="preserve">_r</w:t>
+      </w:r>
+      <w:r>
+        <w:t xml:space="preserve">), and its</w:t>
+      </w:r>
+      <w:r>
+        <w:t xml:space="preserve"> </w:t>
+      </w:r>
+      <w:r>
+        <w:rPr>
+          <w:rStyle w:val="VerbatimChar"/>
+        </w:rPr>
+        <w:t xml:space="preserve">href</w:t>
+      </w:r>
+      <w:r>
+        <w:t xml:space="preserve"> </w:t>
+      </w:r>
+      <w:r>
+        <w:t xml:space="preserve">is serialized once per cached parse (a WeakMap). The</w:t>
+      </w:r>
+      <w:r>
+        <w:t xml:space="preserve"> </w:t>
+      </w:r>
+      <w:r>
+        <w:t xml:space="preserve">lone surrogates' replacement (</w:t>
+      </w:r>
+      <w:r>
+        <w:rPr>
+          <w:rStyle w:val="VerbatimChar"/>
+        </w:rPr>
+        <w:t xml:space="preserve">toUSV</w:t>
+      </w:r>
+      <w:r>
+        <w:t xml:space="preserve">) is the native</w:t>
+      </w:r>
+      <w:r>
+        <w:t xml:space="preserve"> </w:t>
+      </w:r>
+      <w:r>
+        <w:rPr>
+          <w:rStyle w:val="VerbatimChar"/>
+        </w:rPr>
+        <w:t xml:space="preserve">String.prototype.toWellFormed</w:t>
+      </w:r>
+      <w:r>
+        <w:t xml:space="preserve"> </w:t>
+      </w:r>
+      <w:r>
+        <w:t xml:space="preserve">(a</w:t>
+      </w:r>
+      <w:r>
+        <w:t xml:space="preserve"> </w:t>
+      </w:r>
+      <w:r>
+        <w:t xml:space="preserve">regexp with a look-behind before). 3000</w:t>
+      </w:r>
+      <w:r>
+        <w:t xml:space="preserve"> </w:t>
+      </w:r>
+      <w:r>
+        <w:rPr>
+          <w:rStyle w:val="VerbatimChar"/>
+        </w:rPr>
+        <w:t xml:space="preserve">new URL(..).href</w:t>
+      </w:r>
+      <w:r>
+        <w:t xml:space="preserve"> </w:t>
+      </w:r>
+      <w:r>
+        <w:t xml:space="preserve">126 -&gt; 36 ms, again 93 -&gt; 13 ms.</w:t>
       </w:r>
     </w:p>
     <w:p>
@@ -49051,34 +49770,90 @@
         </w:numPr>
       </w:pPr>
       <w:r>
-        <w:t xml:space="preserve">Shadow DOM (§20): the manual slot assignment's rendering,</w:t>
-      </w:r>
-      <w:r>
-        <w:t xml:space="preserve"> </w:t>
-      </w:r>
-      <w:r>
-        <w:rPr>
-          <w:rStyle w:val="VerbatimChar"/>
-        </w:rPr>
-        <w:t xml:space="preserve">exportparts</w:t>
-      </w:r>
-      <w:r>
-        <w:t xml:space="preserve">, a clonable root's</w:t>
-      </w:r>
-      <w:r>
-        <w:t xml:space="preserve"> </w:t>
-      </w:r>
-      <w:r>
-        <w:t xml:space="preserve">cloning,</w:t>
-      </w:r>
-      <w:r>
-        <w:t xml:space="preserve"> </w:t>
-      </w:r>
-      <w:r>
-        <w:rPr>
-          <w:rStyle w:val="VerbatimChar"/>
-        </w:rPr>
-        <w:t xml:space="preserve">&lt;link&gt;</w:t>
+        <w:rPr>
+          <w:rStyle w:val="VerbatimChar"/>
+          <w:b/>
+          <w:bCs/>
+        </w:rPr>
+        <w:t xml:space="preserve">getComputedStyle(el).getPropertyValue('--color')</w:t>
+      </w:r>
+      <w:r>
+        <w:t xml:space="preserve"> </w:t>
+      </w:r>
+      <w:r>
+        <w:t xml:space="preserve">after a render (the site's favicon):</w:t>
+      </w:r>
+      <w:r>
+        <w:t xml:space="preserve"> </w:t>
+      </w:r>
+      <w:r>
+        <w:rPr>
+          <w:rStyle w:val="VerbatimChar"/>
+        </w:rPr>
+        <w:t xml:space="preserve">N.cstyle</w:t>
+      </w:r>
+      <w:r>
+        <w:t xml:space="preserve"> </w:t>
+      </w:r>
+      <w:r>
+        <w:t xml:space="preserve">laid the page out first (a whole rebox of 10000 elements: 0.4-0.5 s on the PC,</w:t>
+      </w:r>
+      <w:r>
+        <w:t xml:space="preserve"> </w:t>
+      </w:r>
+      <w:r>
+        <w:t xml:space="preserve">seconds on the Pi) to answer a property it does not compute (dom.js answers a custom property</w:t>
+      </w:r>
+      <w:r>
+        <w:t xml:space="preserve"> </w:t>
+      </w:r>
+      <w:r>
+        <w:t xml:space="preserve">from the style attribute).</w:t>
+      </w:r>
+      <w:r>
+        <w:t xml:space="preserve"> </w:t>
+      </w:r>
+      <w:r>
+        <w:rPr>
+          <w:rStyle w:val="VerbatimChar"/>
+        </w:rPr>
+        <w:t xml:space="preserve">qjs_cstyle_known</w:t>
+      </w:r>
+      <w:r>
+        <w:t xml:space="preserve"> </w:t>
+      </w:r>
+      <w:r>
+        <w:t xml:space="preserve">lists what</w:t>
+      </w:r>
+      <w:r>
+        <w:t xml:space="preserve"> </w:t>
+      </w:r>
+      <w:r>
+        <w:rPr>
+          <w:rStyle w:val="VerbatimChar"/>
+        </w:rPr>
+        <w:t xml:space="preserve">n_cstyle</w:t>
+      </w:r>
+      <w:r>
+        <w:t xml:space="preserve"> </w:t>
+      </w:r>
+      <w:r>
+        <w:t xml:space="preserve">answers; for the others it</w:t>
+      </w:r>
+      <w:r>
+        <w:t xml:space="preserve"> </w:t>
+      </w:r>
+      <w:r>
+        <w:t xml:space="preserve">returns at once, no layout. (Also:</w:t>
+      </w:r>
+      <w:r>
+        <w:t xml:space="preserve"> </w:t>
+      </w:r>
+      <w:r>
+        <w:rPr>
+          <w:rStyle w:val="VerbatimChar"/>
+        </w:rPr>
+        <w:t xml:space="preserve">fill</w:t>
       </w:r>
       <w:r>
         <w:t xml:space="preserve"> </w:t>
@@ -49093,7 +49868,7 @@
         <w:rPr>
           <w:rStyle w:val="VerbatimChar"/>
         </w:rPr>
-        <w:t xml:space="preserve">@import</w:t>
+        <w:t xml:space="preserve">stroke</w:t>
       </w:r>
       <w:r>
         <w:t xml:space="preserve"> </w:t>
@@ -49108,85 +49883,31 @@
         <w:rPr>
           <w:rStyle w:val="VerbatimChar"/>
         </w:rPr>
-        <w:t xml:space="preserve">@font-face</w:t>
-      </w:r>
-      <w:r>
-        <w:t xml:space="preserve"> </w:t>
-      </w:r>
-      <w:r>
-        <w:t xml:space="preserve">in shadow trees,</w:t>
-      </w:r>
-      <w:r>
-        <w:t xml:space="preserve"> </w:t>
-      </w:r>
-      <w:r>
-        <w:rPr>
-          <w:rStyle w:val="VerbatimChar"/>
-        </w:rPr>
-        <w:t xml:space="preserve">:host</w:t>
-      </w:r>
-      <w:r>
-        <w:t xml:space="preserve"> </w:t>
-      </w:r>
-      <w:r>
-        <w:t xml:space="preserve">in</w:t>
-      </w:r>
-      <w:r>
-        <w:t xml:space="preserve"> </w:t>
-      </w:r>
-      <w:r>
-        <w:rPr>
-          <w:rStyle w:val="VerbatimChar"/>
-        </w:rPr>
-        <w:t xml:space="preserve">matches()</w:t>
-      </w:r>
-      <w:r>
-        <w:t xml:space="preserve">;</w:t>
-      </w:r>
-      <w:r>
-        <w:t xml:space="preserve"> </w:t>
-      </w:r>
-      <w:r>
-        <w:rPr>
-          <w:rStyle w:val="VerbatimChar"/>
-        </w:rPr>
-        <w:t xml:space="preserve">::before</w:t>
-      </w:r>
-      <w:r>
-        <w:t xml:space="preserve"> </w:t>
-      </w:r>
-      <w:r>
-        <w:t xml:space="preserve">/</w:t>
-      </w:r>
-      <w:r>
-        <w:t xml:space="preserve"> </w:t>
-      </w:r>
-      <w:r>
-        <w:rPr>
-          <w:rStyle w:val="VerbatimChar"/>
-        </w:rPr>
-        <w:t xml:space="preserve">::after</w:t>
-      </w:r>
-      <w:r>
-        <w:t xml:space="preserve"> </w:t>
-      </w:r>
-      <w:r>
-        <w:t xml:space="preserve">of a</w:t>
-      </w:r>
-      <w:r>
-        <w:t xml:space="preserve"> </w:t>
-      </w:r>
-      <w:r>
-        <w:rPr>
-          <w:rStyle w:val="VerbatimChar"/>
-        </w:rPr>
-        <w:t xml:space="preserve">display: contents</w:t>
-      </w:r>
-      <w:r>
-        <w:t xml:space="preserve"> </w:t>
-      </w:r>
-      <w:r>
-        <w:t xml:space="preserve">element.</w:t>
+        <w:t xml:space="preserve">stroke-width</w:t>
+      </w:r>
+      <w:r>
+        <w:t xml:space="preserve"> </w:t>
+      </w:r>
+      <w:r>
+        <w:t xml:space="preserve">read the style found,</w:t>
+      </w:r>
+      <w:r>
+        <w:t xml:space="preserve"> </w:t>
+      </w:r>
+      <w:r>
+        <w:t xml:space="preserve">not</w:t>
+      </w:r>
+      <w:r>
+        <w:t xml:space="preserve"> </w:t>
+      </w:r>
+      <w:r>
+        <w:rPr>
+          <w:rStyle w:val="VerbatimChar"/>
+        </w:rPr>
+        <w:t xml:space="preserve">box-&gt;style</w:t>
+      </w:r>
+      <w:r>
+        <w:t xml:space="preserve">: an element without a box crashed there.)</w:t>
       </w:r>
     </w:p>
     <w:p>
@@ -49198,49 +49919,48 @@
         </w:numPr>
       </w:pPr>
       <w:r>
-        <w:t xml:space="preserve">The compositing layers' gaps (§21: a real perspective,</w:t>
-      </w:r>
-      <w:r>
-        <w:t xml:space="preserve"> </w:t>
-      </w:r>
-      <w:r>
-        <w:rPr>
-          <w:rStyle w:val="VerbatimChar"/>
-        </w:rPr>
-        <w:t xml:space="preserve">clip-path</w:t>
-      </w:r>
-      <w:r>
-        <w:t xml:space="preserve"> </w:t>
-      </w:r>
-      <w:r>
-        <w:t xml:space="preserve">/</w:t>
-      </w:r>
-      <w:r>
-        <w:t xml:space="preserve"> </w:t>
-      </w:r>
-      <w:r>
-        <w:rPr>
-          <w:rStyle w:val="VerbatimChar"/>
-        </w:rPr>
-        <w:t xml:space="preserve">mask</w:t>
-      </w:r>
-      <w:r>
-        <w:t xml:space="preserve"> </w:t>
-      </w:r>
-      <w:r>
-        <w:t xml:space="preserve">on a layer, the</w:t>
-      </w:r>
-      <w:r>
-        <w:t xml:space="preserve"> </w:t>
-      </w:r>
-      <w:r>
-        <w:t xml:space="preserve">non-separable blend modes); animations: §22's "Not done"; GPU compositing: §25's (scrollers</w:t>
-      </w:r>
-      <w:r>
-        <w:t xml:space="preserve"> </w:t>
-      </w:r>
-      <w:r>
-        <w:t xml:space="preserve">and groups as layers, fixed boxes that stay in view).</w:t>
+        <w:rPr>
+          <w:rStyle w:val="VerbatimChar"/>
+          <w:b/>
+          <w:bCs/>
+        </w:rPr>
+        <w:t xml:space="preserve">getElementsByClassName</w:t>
+      </w:r>
+      <w:r>
+        <w:t xml:space="preserve"> </w:t>
+      </w:r>
+      <w:r>
+        <w:t xml:space="preserve">(carbon ads asks it of the whole document after the render): it</w:t>
+      </w:r>
+      <w:r>
+        <w:t xml:space="preserve"> </w:t>
+      </w:r>
+      <w:r>
+        <w:t xml:space="preserve">wrapped every element of the tree and split its classes in JS;</w:t>
+      </w:r>
+      <w:r>
+        <w:t xml:space="preserve"> </w:t>
+      </w:r>
+      <w:r>
+        <w:rPr>
+          <w:rStyle w:val="VerbatimChar"/>
+        </w:rPr>
+        <w:t xml:space="preserve">N.descendants(root, names)</w:t>
+      </w:r>
+      <w:r>
+        <w:t xml:space="preserve"> </w:t>
+      </w:r>
+      <w:r>
+        <w:t xml:space="preserve">matches the class attribute natively (</w:t>
+      </w:r>
+      <w:r>
+        <w:rPr>
+          <w:rStyle w:val="VerbatimChar"/>
+        </w:rPr>
+        <w:t xml:space="preserve">qjs_has_classes</w:t>
+      </w:r>
+      <w:r>
+        <w:t xml:space="preserve">; ASCII white space, as the spec).</w:t>
       </w:r>
     </w:p>
     <w:p>
@@ -49252,88 +49972,10 @@
         </w:numPr>
       </w:pPr>
       <w:r>
-        <w:t xml:space="preserve">SVG: no</w:t>
-      </w:r>
-      <w:r>
-        <w:t xml:space="preserve"> </w:t>
-      </w:r>
-      <w:r>
-        <w:rPr>
-          <w:rStyle w:val="VerbatimChar"/>
-        </w:rPr>
-        <w:t xml:space="preserve">&lt;mask&gt;</w:t>
-      </w:r>
-      <w:r>
-        <w:t xml:space="preserve">,</w:t>
-      </w:r>
-      <w:r>
-        <w:t xml:space="preserve"> </w:t>
-      </w:r>
-      <w:r>
-        <w:rPr>
-          <w:rStyle w:val="VerbatimChar"/>
-        </w:rPr>
-        <w:t xml:space="preserve">&lt;pattern&gt;</w:t>
-      </w:r>
-      <w:r>
-        <w:t xml:space="preserve">,</w:t>
-      </w:r>
-      <w:r>
-        <w:t xml:space="preserve"> </w:t>
-      </w:r>
-      <w:r>
-        <w:rPr>
-          <w:rStyle w:val="VerbatimChar"/>
-        </w:rPr>
-        <w:t xml:space="preserve">&lt;marker&gt;</w:t>
-      </w:r>
-      <w:r>
-        <w:t xml:space="preserve">, filters, SMIL animations,</w:t>
-      </w:r>
-      <w:r>
-        <w:t xml:space="preserve"> </w:t>
-      </w:r>
-      <w:r>
-        <w:rPr>
-          <w:rStyle w:val="VerbatimChar"/>
-        </w:rPr>
-        <w:t xml:space="preserve">&lt;textPath&gt;</w:t>
-      </w:r>
-      <w:r>
-        <w:t xml:space="preserve">, per-glyph</w:t>
-      </w:r>
-      <w:r>
-        <w:t xml:space="preserve"> </w:t>
-      </w:r>
-      <w:r>
-        <w:t xml:space="preserve">position lists, the page's web fonts in</w:t>
-      </w:r>
-      <w:r>
-        <w:t xml:space="preserve"> </w:t>
-      </w:r>
-      <w:r>
-        <w:rPr>
-          <w:rStyle w:val="VerbatimChar"/>
-        </w:rPr>
-        <w:t xml:space="preserve">&lt;text&gt;</w:t>
-      </w:r>
-      <w:r>
-        <w:t xml:space="preserve">; the page's</w:t>
-      </w:r>
-      <w:r>
-        <w:t xml:space="preserve"> </w:t>
-      </w:r>
-      <w:r>
-        <w:t xml:space="preserve">CSS</w:t>
-      </w:r>
-      <w:r>
-        <w:t xml:space="preserve"> </w:t>
-      </w:r>
-      <w:r>
-        <w:rPr>
-          <w:rStyle w:val="VerbatimChar"/>
-        </w:rPr>
-        <w:t xml:space="preserve">fill</w:t>
+        <w:rPr>
+          <w:rStyle w:val="VerbatimChar"/>
+        </w:rPr>
+        <w:t xml:space="preserve">CSS.supports</w:t>
       </w:r>
       <w:r>
         <w:t xml:space="preserve"> </w:t>
@@ -49348,247 +49990,28 @@
         <w:rPr>
           <w:rStyle w:val="VerbatimChar"/>
         </w:rPr>
-        <w:t xml:space="preserve">stroke</w:t>
-      </w:r>
-      <w:r>
-        <w:t xml:space="preserve"> </w:t>
-      </w:r>
-      <w:r>
-        <w:t xml:space="preserve">(</w:t>
-      </w:r>
-      <w:r>
-        <w:rPr>
-          <w:rStyle w:val="VerbatimChar"/>
-        </w:rPr>
-        <w:t xml:space="preserve">.icon path { fill: red }</w:t>
-      </w:r>
-      <w:r>
-        <w:t xml:space="preserve">) do not reach an inline</w:t>
-      </w:r>
-      <w:r>
-        <w:t xml:space="preserve"> </w:t>
-      </w:r>
-      <w:r>
-        <w:rPr>
-          <w:rStyle w:val="VerbatimChar"/>
-        </w:rPr>
-        <w:t xml:space="preserve">&lt;svg&gt;</w:t>
-      </w:r>
-      <w:r>
-        <w:t xml:space="preserve"> </w:t>
-      </w:r>
-      <w:r>
-        <w:t xml:space="preserve">-- libcss</w:t>
-      </w:r>
-      <w:r>
-        <w:t xml:space="preserve"> </w:t>
-      </w:r>
-      <w:r>
-        <w:t xml:space="preserve">has no</w:t>
-      </w:r>
-      <w:r>
-        <w:t xml:space="preserve"> </w:t>
-      </w:r>
-      <w:r>
-        <w:rPr>
-          <w:rStyle w:val="VerbatimChar"/>
-        </w:rPr>
-        <w:t xml:space="preserve">fill</w:t>
-      </w:r>
-      <w:r>
-        <w:t xml:space="preserve"> </w:t>
-      </w:r>
-      <w:r>
-        <w:t xml:space="preserve">/</w:t>
-      </w:r>
-      <w:r>
-        <w:t xml:space="preserve"> </w:t>
-      </w:r>
-      <w:r>
-        <w:rPr>
-          <w:rStyle w:val="VerbatimChar"/>
-        </w:rPr>
-        <w:t xml:space="preserve">stroke</w:t>
-      </w:r>
-      <w:r>
-        <w:t xml:space="preserve"> </w:t>
-      </w:r>
-      <w:r>
-        <w:t xml:space="preserve">properties (only</w:t>
-      </w:r>
-      <w:r>
-        <w:t xml:space="preserve"> </w:t>
-      </w:r>
-      <w:r>
-        <w:rPr>
-          <w:rStyle w:val="VerbatimChar"/>
-        </w:rPr>
-        <w:t xml:space="preserve">fill-opacity</w:t>
-      </w:r>
-      <w:r>
-        <w:t xml:space="preserve"> </w:t>
-      </w:r>
-      <w:r>
-        <w:t xml:space="preserve">/</w:t>
-      </w:r>
-      <w:r>
-        <w:t xml:space="preserve"> </w:t>
-      </w:r>
-      <w:r>
-        <w:rPr>
-          <w:rStyle w:val="VerbatimChar"/>
-        </w:rPr>
-        <w:t xml:space="preserve">stroke-opacity</w:t>
-      </w:r>
-      <w:r>
-        <w:t xml:space="preserve">): with them</w:t>
-      </w:r>
-      <w:r>
-        <w:t xml:space="preserve"> </w:t>
-      </w:r>
-      <w:r>
-        <w:t xml:space="preserve">(inherited, as text),</w:t>
-      </w:r>
-      <w:r>
-        <w:t xml:space="preserve"> </w:t>
-      </w:r>
-      <w:r>
-        <w:rPr>
-          <w:rStyle w:val="VerbatimChar"/>
-        </w:rPr>
-        <w:t xml:space="preserve">onyx_svg_inline.c</w:t>
-      </w:r>
-      <w:r>
-        <w:t xml:space="preserve"> </w:t>
-      </w:r>
-      <w:r>
-        <w:t xml:space="preserve">would write the</w:t>
-      </w:r>
-      <w:r>
-        <w:t xml:space="preserve"> </w:t>
-      </w:r>
-      <w:r>
-        <w:rPr>
-          <w:rStyle w:val="VerbatimChar"/>
-        </w:rPr>
-        <w:t xml:space="preserve">&lt;svg&gt;</w:t>
-      </w:r>
-      <w:r>
-        <w:t xml:space="preserve">'s computed ones on its</w:t>
-      </w:r>
-      <w:r>
-        <w:t xml:space="preserve"> </w:t>
-      </w:r>
-      <w:r>
-        <w:t xml:space="preserve">root; its</w:t>
-      </w:r>
-      <w:r>
-        <w:t xml:space="preserve"> </w:t>
-      </w:r>
-      <w:r>
-        <w:rPr>
-          <w:rStyle w:val="VerbatimChar"/>
-        </w:rPr>
-        <w:t xml:space="preserve">color</w:t>
-      </w:r>
-      <w:r>
-        <w:t xml:space="preserve">, its custom properties and the SVG's own attributes and</w:t>
-      </w:r>
-      <w:r>
-        <w:t xml:space="preserve"> </w:t>
-      </w:r>
-      <w:r>
-        <w:rPr>
-          <w:rStyle w:val="VerbatimChar"/>
-        </w:rPr>
-        <w:t xml:space="preserve">&lt;style&gt;</w:t>
-      </w:r>
-      <w:r>
-        <w:t xml:space="preserve"> </w:t>
-      </w:r>
-      <w:r>
-        <w:t xml:space="preserve">do. An</w:t>
-      </w:r>
-      <w:r>
-        <w:t xml:space="preserve"> </w:t>
-      </w:r>
-      <w:r>
-        <w:rPr>
-          <w:rStyle w:val="VerbatimChar"/>
-        </w:rPr>
-        <w:t xml:space="preserve">&lt;svg&gt;</w:t>
-      </w:r>
-      <w:r>
-        <w:t xml:space="preserve"> </w:t>
-      </w:r>
-      <w:r>
-        <w:t xml:space="preserve">/ SVG</w:t>
-      </w:r>
-      <w:r>
-        <w:t xml:space="preserve"> </w:t>
-      </w:r>
-      <w:r>
-        <w:rPr>
-          <w:rStyle w:val="VerbatimChar"/>
-        </w:rPr>
-        <w:t xml:space="preserve">&lt;img&gt;</w:t>
-      </w:r>
-      <w:r>
-        <w:t xml:space="preserve"> </w:t>
-      </w:r>
-      <w:r>
-        <w:t xml:space="preserve">with only a viewBox and no CSS size takes the viewBox's size (Chrome:</w:t>
-      </w:r>
-      <w:r>
-        <w:t xml:space="preserve"> </w:t>
-      </w:r>
-      <w:r>
-        <w:t xml:space="preserve">the containing block's width); a</w:t>
-      </w:r>
-      <w:r>
-        <w:t xml:space="preserve"> </w:t>
-      </w:r>
-      <w:r>
-        <w:rPr>
-          <w:rStyle w:val="VerbatimChar"/>
-        </w:rPr>
-        <w:t xml:space="preserve">list-style-image</w:t>
-      </w:r>
-      <w:r>
-        <w:t xml:space="preserve"> </w:t>
-      </w:r>
-      <w:r>
-        <w:t xml:space="preserve">SVG without a size is drawn at its</w:t>
-      </w:r>
-      <w:r>
-        <w:t xml:space="preserve"> </w:t>
-      </w:r>
-      <w:r>
-        <w:t xml:space="preserve">viewBox's size (Chrome: small). The scripts' SVG DOM is dom.js' generic one (</w:t>
-      </w:r>
-      <w:r>
-        <w:rPr>
-          <w:rStyle w:val="VerbatimChar"/>
-        </w:rPr>
-        <w:t xml:space="preserve">namespaceURI</w:t>
-      </w:r>
-      <w:r>
-        <w:t xml:space="preserve">,</w:t>
-      </w:r>
-      <w:r>
-        <w:t xml:space="preserve"> </w:t>
-      </w:r>
-      <w:r>
-        <w:rPr>
-          <w:rStyle w:val="VerbatimChar"/>
-        </w:rPr>
-        <w:t xml:space="preserve">getBBox</w:t>
-      </w:r>
-      <w:r>
-        <w:t xml:space="preserve"> </w:t>
-      </w:r>
-      <w:r>
-        <w:t xml:space="preserve">from the box).</w:t>
+        <w:t xml:space="preserve">element.style</w:t>
+      </w:r>
+      <w:r>
+        <w:t xml:space="preserve">'s value check runs its string-stripping regexp only when the</w:t>
+      </w:r>
+      <w:r>
+        <w:t xml:space="preserve"> </w:t>
+      </w:r>
+      <w:r>
+        <w:t xml:space="preserve">value holds one of</w:t>
+      </w:r>
+      <w:r>
+        <w:t xml:space="preserve"> </w:t>
+      </w:r>
+      <w:r>
+        <w:rPr>
+          <w:rStyle w:val="VerbatimChar"/>
+        </w:rPr>
+        <w:t xml:space="preserve">;{}!</w:t>
+      </w:r>
+      <w:r>
+        <w:t xml:space="preserve">.</w:t>
       </w:r>
     </w:p>
     <w:p>
@@ -49600,85 +50023,623 @@
         </w:numPr>
       </w:pPr>
       <w:r>
-        <w:t xml:space="preserve">Canvas: no shadows, filters, blend modes (source-over), conic gradients (a solid colour),</w:t>
-      </w:r>
-      <w:r>
-        <w:t xml:space="preserve"> </w:t>
-      </w:r>
-      <w:r>
-        <w:t xml:space="preserve">per-corner</w:t>
-      </w:r>
-      <w:r>
-        <w:t xml:space="preserve"> </w:t>
-      </w:r>
-      <w:r>
-        <w:rPr>
-          <w:rStyle w:val="VerbatimChar"/>
-        </w:rPr>
-        <w:t xml:space="preserve">roundRect</w:t>
-      </w:r>
-      <w:r>
-        <w:t xml:space="preserve"> </w:t>
-      </w:r>
-      <w:r>
-        <w:t xml:space="preserve">radii;</w:t>
-      </w:r>
-      <w:r>
-        <w:t xml:space="preserve"> </w:t>
-      </w:r>
-      <w:r>
-        <w:rPr>
-          <w:rStyle w:val="VerbatimChar"/>
-        </w:rPr>
-        <w:t xml:space="preserve">drawImage</w:t>
-      </w:r>
-      <w:r>
-        <w:t xml:space="preserve"> </w:t>
-      </w:r>
-      <w:r>
-        <w:t xml:space="preserve">scales with the nearest pixel (PlutoVG's</w:t>
-      </w:r>
-      <w:r>
-        <w:t xml:space="preserve"> </w:t>
-      </w:r>
-      <w:r>
-        <w:t xml:space="preserve">textures), and a canvas shown at another CSS size too (the framebuffer's bitmap plot);</w:t>
-      </w:r>
-      <w:r>
-        <w:t xml:space="preserve"> </w:t>
-      </w:r>
-      <w:r>
-        <w:t xml:space="preserve">no</w:t>
-      </w:r>
-      <w:r>
-        <w:t xml:space="preserve"> </w:t>
-      </w:r>
-      <w:r>
-        <w:rPr>
-          <w:rStyle w:val="VerbatimChar"/>
-        </w:rPr>
-        <w:t xml:space="preserve">getContext('webgl')</w:t>
-      </w:r>
-      <w:r>
-        <w:t xml:space="preserve">,</w:t>
-      </w:r>
-      <w:r>
-        <w:t xml:space="preserve"> </w:t>
-      </w:r>
-      <w:r>
-        <w:rPr>
-          <w:rStyle w:val="VerbatimChar"/>
-        </w:rPr>
-        <w:t xml:space="preserve">captureStream</w:t>
-      </w:r>
-      <w:r>
-        <w:t xml:space="preserve">, video frames; the page's web fonts are not used</w:t>
-      </w:r>
-      <w:r>
-        <w:t xml:space="preserve"> </w:t>
-      </w:r>
-      <w:r>
-        <w:t xml:space="preserve">(the card's fonts by family).</w:t>
+        <w:rPr>
+          <w:rStyle w:val="VerbatimChar"/>
+          <w:b/>
+          <w:bCs/>
+        </w:rPr>
+        <w:t xml:space="preserve">NS_PERF</w:t>
+      </w:r>
+      <w:r>
+        <w:t xml:space="preserve"> </w:t>
+      </w:r>
+      <w:r>
+        <w:t xml:space="preserve">logs a layout a script's read forced when it is over 50 ms, with the script's</w:t>
+      </w:r>
+      <w:r>
+        <w:t xml:space="preserve"> </w:t>
+      </w:r>
+      <w:r>
+        <w:t xml:space="preserve">stack (</w:t>
+      </w:r>
+      <w:r>
+        <w:rPr>
+          <w:rStyle w:val="VerbatimChar"/>
+        </w:rPr>
+        <w:t xml:space="preserve">js:forced-layout at cstyle (native)|at get (dom.js...)|...</w:t>
+      </w:r>
+      <w:r>
+        <w:t xml:space="preserve">).</w:t>
+      </w:r>
+    </w:p>
+    <w:p>
+      <w:pPr>
+        <w:pStyle w:val="FirstParagraph"/>
+      </w:pPr>
+      <w:r>
+        <w:rPr>
+          <w:b/>
+          <w:bCs/>
+        </w:rPr>
+        <w:t xml:space="preserve">The timings</w:t>
+      </w:r>
+      <w:r>
+        <w:t xml:space="preserve"> </w:t>
+      </w:r>
+      <w:r>
+        <w:t xml:space="preserve">(the PC bench, the job's CPU time; the machine shared, ±0.5 s):</w:t>
+      </w:r>
+    </w:p>
+    <w:tbl>
+      <w:tblPr>
+        <w:tblStyle w:val="Table"/>
+        <w:tblW w:type="auto" w:w="0"/>
+        <w:tblLook w:firstRow="1" w:lastRow="0" w:firstColumn="0" w:lastColumn="0" w:noHBand="0" w:noVBand="0" w:val="0020"/>
+      </w:tblPr>
+      <w:tblGrid>
+        <w:gridCol w:w="2640"/>
+        <w:gridCol w:w="2640"/>
+        <w:gridCol w:w="2640"/>
+      </w:tblGrid>
+      <w:tr>
+        <w:trPr>
+          <w:tblHeader w:val="on"/>
+        </w:trPr>
+        <w:tc>
+          <w:tcPr/>
+          <w:p>
+            <w:pPr>
+              <w:pStyle w:val="Compact"/>
+            </w:pPr>
+            <w:r>
+              <w:t xml:space="preserve">browserscore.dev's render job</w:t>
+            </w:r>
+          </w:p>
+        </w:tc>
+        <w:tc>
+          <w:tcPr/>
+          <w:p>
+            <w:pPr>
+              <w:pStyle w:val="Compact"/>
+            </w:pPr>
+            <w:r>
+              <w:t xml:space="preserve">before</w:t>
+            </w:r>
+          </w:p>
+        </w:tc>
+        <w:tc>
+          <w:tcPr/>
+          <w:p>
+            <w:pPr>
+              <w:pStyle w:val="Compact"/>
+            </w:pPr>
+            <w:r>
+              <w:t xml:space="preserve">after</w:t>
+            </w:r>
+          </w:p>
+        </w:tc>
+      </w:tr>
+      <w:tr>
+        <w:tc>
+          <w:tcPr/>
+          <w:p>
+            <w:pPr>
+              <w:pStyle w:val="Compact"/>
+            </w:pPr>
+            <w:r>
+              <w:t xml:space="preserve">log on (</w:t>
+            </w:r>
+            <w:r>
+              <w:rPr>
+                <w:rStyle w:val="VerbatimChar"/>
+              </w:rPr>
+              <w:t xml:space="preserve">NS_JSDEBUG</w:t>
+            </w:r>
+            <w:r>
+              <w:t xml:space="preserve">)</w:t>
+            </w:r>
+          </w:p>
+        </w:tc>
+        <w:tc>
+          <w:tcPr/>
+          <w:p>
+            <w:pPr>
+              <w:pStyle w:val="Compact"/>
+            </w:pPr>
+            <w:r>
+              <w:t xml:space="preserve">8.3-9.4 s</w:t>
+            </w:r>
+          </w:p>
+        </w:tc>
+        <w:tc>
+          <w:tcPr/>
+          <w:p>
+            <w:pPr>
+              <w:pStyle w:val="Compact"/>
+            </w:pPr>
+            <w:r>
+              <w:t xml:space="preserve">6.4 s</w:t>
+            </w:r>
+          </w:p>
+        </w:tc>
+      </w:tr>
+      <w:tr>
+        <w:tc>
+          <w:tcPr/>
+          <w:p>
+            <w:pPr>
+              <w:pStyle w:val="Compact"/>
+            </w:pPr>
+            <w:r>
+              <w:t xml:space="preserve">log off</w:t>
+            </w:r>
+          </w:p>
+        </w:tc>
+        <w:tc>
+          <w:tcPr/>
+          <w:p>
+            <w:pPr>
+              <w:pStyle w:val="Compact"/>
+            </w:pPr>
+            <w:r>
+              <w:t xml:space="preserve">7.0-7.1 s</w:t>
+            </w:r>
+          </w:p>
+        </w:tc>
+        <w:tc>
+          <w:tcPr/>
+          <w:p>
+            <w:pPr>
+              <w:pStyle w:val="Compact"/>
+            </w:pPr>
+            <w:r>
+              <w:t xml:space="preserve">6.5-6.6 s</w:t>
+            </w:r>
+          </w:p>
+        </w:tc>
+      </w:tr>
+      <w:tr>
+        <w:tc>
+          <w:tcPr/>
+          <w:p>
+            <w:pPr>
+              <w:pStyle w:val="Compact"/>
+            </w:pPr>
+            <w:r>
+              <w:t xml:space="preserve">the next job (favicon's</w:t>
+            </w:r>
+            <w:r>
+              <w:t xml:space="preserve"> </w:t>
+            </w:r>
+            <w:r>
+              <w:rPr>
+                <w:rStyle w:val="VerbatimChar"/>
+              </w:rPr>
+              <w:t xml:space="preserve">getComputedStyle</w:t>
+            </w:r>
+            <w:r>
+              <w:t xml:space="preserve">)</w:t>
+            </w:r>
+          </w:p>
+        </w:tc>
+        <w:tc>
+          <w:tcPr/>
+          <w:p>
+            <w:pPr>
+              <w:pStyle w:val="Compact"/>
+            </w:pPr>
+            <w:r>
+              <w:t xml:space="preserve">0.8-1.4 s</w:t>
+            </w:r>
+          </w:p>
+        </w:tc>
+        <w:tc>
+          <w:tcPr/>
+          <w:p>
+            <w:pPr>
+              <w:pStyle w:val="Compact"/>
+            </w:pPr>
+            <w:r>
+              <w:t xml:space="preserve">0.07 s</w:t>
+            </w:r>
+          </w:p>
+        </w:tc>
+      </w:tr>
+    </w:tbl>
+    <w:p>
+      <w:pPr>
+        <w:pStyle w:val="BodyText"/>
+      </w:pPr>
+      <w:r>
+        <w:t xml:space="preserve">The score is unchanged (86 %, 1283 / 1489). The goal of ~3 s on the PC is not reached: what is</w:t>
+      </w:r>
+      <w:r>
+        <w:t xml:space="preserve"> </w:t>
+      </w:r>
+      <w:r>
+        <w:t xml:space="preserve">left is the interpreter itself running the site's code (the JIT / bytecode work on QuickJS is</w:t>
+      </w:r>
+      <w:r>
+        <w:t xml:space="preserve"> </w:t>
+      </w:r>
+      <w:r>
+        <w:t xml:space="preserve">separate). On the Pi the job is some 35-45 s -- under the limit with the log on or off, and the</w:t>
+      </w:r>
+      <w:r>
+        <w:t xml:space="preserve"> </w:t>
+      </w:r>
+      <w:r>
+        <w:t xml:space="preserve">limit no longer stops a render that works:</w:t>
+      </w:r>
+    </w:p>
+    <w:p>
+      <w:pPr>
+        <w:pStyle w:val="BodyText"/>
+      </w:pPr>
+      <w:r>
+        <w:rPr>
+          <w:b/>
+          <w:bCs/>
+        </w:rPr>
+        <w:t xml:space="preserve">The time limit spares a working script</w:t>
+      </w:r>
+      <w:r>
+        <w:t xml:space="preserve"> </w:t>
+      </w:r>
+      <w:r>
+        <w:t xml:space="preserve">(</w:t>
+      </w:r>
+      <w:r>
+        <w:rPr>
+          <w:rStyle w:val="VerbatimChar"/>
+        </w:rPr>
+        <w:t xml:space="preserve">qjs.c</w:t>
+      </w:r>
+      <w:r>
+        <w:t xml:space="preserve"> </w:t>
+      </w:r>
+      <w:r>
+        <w:rPr>
+          <w:rStyle w:val="VerbatimChar"/>
+        </w:rPr>
+        <w:t xml:space="preserve">qjs_interrupt</w:t>
+      </w:r>
+      <w:r>
+        <w:t xml:space="preserve">,</w:t>
+      </w:r>
+      <w:r>
+        <w:t xml:space="preserve"> </w:t>
+      </w:r>
+      <w:r>
+        <w:rPr>
+          <w:rStyle w:val="VerbatimChar"/>
+        </w:rPr>
+        <w:t xml:space="preserve">QJS_TIMEOUT_MAX</w:t>
+      </w:r>
+      <w:r>
+        <w:t xml:space="preserve">):</w:t>
+      </w:r>
+      <w:r>
+        <w:t xml:space="preserve"> </w:t>
+      </w:r>
+      <w:r>
+        <w:t xml:space="preserve">browsers do not stop a script at all (Chrome asks after a while: "Page unresponsive"); NetSurf</w:t>
+      </w:r>
+      <w:r>
+        <w:t xml:space="preserve"> </w:t>
+      </w:r>
+      <w:r>
+        <w:t xml:space="preserve">has no such dialog, and its limit only has to end a script that is stuck. The scripts' DOM</w:t>
+      </w:r>
+      <w:r>
+        <w:t xml:space="preserve"> </w:t>
+      </w:r>
+      <w:r>
+        <w:t xml:space="preserve">changes are counted (</w:t>
+      </w:r>
+      <w:r>
+        <w:rPr>
+          <w:rStyle w:val="VerbatimChar"/>
+        </w:rPr>
+        <w:t xml:space="preserve">QJS_DIRTY</w:t>
+      </w:r>
+      <w:r>
+        <w:t xml:space="preserve">, where a change marks the page to lay out again:</w:t>
+      </w:r>
+      <w:r>
+        <w:t xml:space="preserve"> </w:t>
+      </w:r>
+      <w:r>
+        <w:rPr>
+          <w:rStyle w:val="VerbatimChar"/>
+        </w:rPr>
+        <w:t xml:space="preserve">qjs_dom_writes</w:t>
+      </w:r>
+      <w:r>
+        <w:t xml:space="preserve">); past</w:t>
+      </w:r>
+      <w:r>
+        <w:t xml:space="preserve"> </w:t>
+      </w:r>
+      <w:r>
+        <w:rPr>
+          <w:rStyle w:val="VerbatimChar"/>
+        </w:rPr>
+        <w:t xml:space="preserve">script_timeout</w:t>
+      </w:r>
+      <w:r>
+        <w:t xml:space="preserve"> </w:t>
+      </w:r>
+      <w:r>
+        <w:t xml:space="preserve">a script (a call or one promise job) runs on while it</w:t>
+      </w:r>
+      <w:r>
+        <w:t xml:space="preserve"> </w:t>
+      </w:r>
+      <w:r>
+        <w:t xml:space="preserve">still changes the page -- its last change less than a quarter of the limit ago (15 s for 60) --</w:t>
+      </w:r>
+      <w:r>
+        <w:t xml:space="preserve"> </w:t>
+      </w:r>
+      <w:r>
+        <w:t xml:space="preserve">up to 4 times the limit (240 s). A loop that never ends changes nothing and stops at the limit</w:t>
+      </w:r>
+      <w:r>
+        <w:t xml:space="preserve"> </w:t>
+      </w:r>
+      <w:r>
+        <w:t xml:space="preserve">as before; one that changes the page for ever stops at 4 times the limit. The first time a script</w:t>
+      </w:r>
+      <w:r>
+        <w:t xml:space="preserve"> </w:t>
+      </w:r>
+      <w:r>
+        <w:t xml:space="preserve">runs past the limit the log says</w:t>
+      </w:r>
+      <w:r>
+        <w:t xml:space="preserve"> </w:t>
+      </w:r>
+      <w:r>
+        <w:rPr>
+          <w:rStyle w:val="VerbatimChar"/>
+        </w:rPr>
+        <w:t xml:space="preserve">JS: a script past 60 s still changing the page: let run</w:t>
+      </w:r>
+      <w:r>
+        <w:t xml:space="preserve">. The</w:t>
+      </w:r>
+      <w:r>
+        <w:t xml:space="preserve"> </w:t>
+      </w:r>
+      <w:r>
+        <w:t xml:space="preserve">default stays 60 s (</w:t>
+      </w:r>
+      <w:r>
+        <w:rPr>
+          <w:rStyle w:val="VerbatimChar"/>
+        </w:rPr>
+        <w:t xml:space="preserve">script_timeout</w:t>
+      </w:r>
+      <w:r>
+        <w:t xml:space="preserve"> </w:t>
+      </w:r>
+      <w:r>
+        <w:t xml:space="preserve">in</w:t>
+      </w:r>
+      <w:r>
+        <w:t xml:space="preserve"> </w:t>
+      </w:r>
+      <w:r>
+        <w:rPr>
+          <w:rStyle w:val="VerbatimChar"/>
+        </w:rPr>
+        <w:t xml:space="preserve">SD:/res/Choices</w:t>
+      </w:r>
+      <w:r>
+        <w:t xml:space="preserve">, 0 = none);</w:t>
+      </w:r>
+      <w:r>
+        <w:t xml:space="preserve"> </w:t>
+      </w:r>
+      <w:r>
+        <w:rPr>
+          <w:rStyle w:val="VerbatimChar"/>
+        </w:rPr>
+        <w:t xml:space="preserve">NS_SCRIPT_TIMEOUT=&lt;s&gt;</w:t>
+      </w:r>
+      <w:r>
+        <w:t xml:space="preserve"> </w:t>
+      </w:r>
+      <w:r>
+        <w:t xml:space="preserve">overrides it on the PC bench.</w:t>
+      </w:r>
+    </w:p>
+    <w:p>
+      <w:pPr>
+        <w:pStyle w:val="BodyText"/>
+      </w:pPr>
+      <w:r>
+        <w:rPr>
+          <w:b/>
+          <w:bCs/>
+        </w:rPr>
+        <w:t xml:space="preserve">Tests</w:t>
+      </w:r>
+      <w:r>
+        <w:t xml:space="preserve">:</w:t>
+      </w:r>
+      <w:r>
+        <w:t xml:space="preserve"> </w:t>
+      </w:r>
+      <w:r>
+        <w:rPr>
+          <w:rStyle w:val="VerbatimChar"/>
+        </w:rPr>
+        <w:t xml:space="preserve">jstest.sh</w:t>
+      </w:r>
+      <w:r>
+        <w:t xml:space="preserve">'s</w:t>
+      </w:r>
+      <w:r>
+        <w:t xml:space="preserve"> </w:t>
+      </w:r>
+      <w:r>
+        <w:rPr>
+          <w:rStyle w:val="VerbatimChar"/>
+        </w:rPr>
+        <w:t xml:space="preserve">js-scripttime.html</w:t>
+      </w:r>
+      <w:r>
+        <w:t xml:space="preserve"> </w:t>
+      </w:r>
+      <w:r>
+        <w:t xml:space="preserve">(run with</w:t>
+      </w:r>
+      <w:r>
+        <w:t xml:space="preserve"> </w:t>
+      </w:r>
+      <w:r>
+        <w:rPr>
+          <w:rStyle w:val="VerbatimChar"/>
+        </w:rPr>
+        <w:t xml:space="preserve">NS_SCRIPT_TIMEOUT=1</w:t>
+      </w:r>
+      <w:r>
+        <w:t xml:space="preserve">): a script changing</w:t>
+      </w:r>
+      <w:r>
+        <w:t xml:space="preserve"> </w:t>
+      </w:r>
+      <w:r>
+        <w:t xml:space="preserve">the page for 2.5 s finishes, a stuck one is stopped at 1 s, a runaway that changes the page for</w:t>
+      </w:r>
+      <w:r>
+        <w:t xml:space="preserve"> </w:t>
+      </w:r>
+      <w:r>
+        <w:t xml:space="preserve">ever at ~4 s;</w:t>
+      </w:r>
+      <w:r>
+        <w:t xml:space="preserve"> </w:t>
+      </w:r>
+      <w:r>
+        <w:rPr>
+          <w:rStyle w:val="VerbatimChar"/>
+        </w:rPr>
+        <w:t xml:space="preserve">getElementsByClassName</w:t>
+      </w:r>
+      <w:r>
+        <w:t xml:space="preserve"> </w:t>
+      </w:r>
+      <w:r>
+        <w:t xml:space="preserve">(several names, white space, none, a miss), a custom</w:t>
+      </w:r>
+      <w:r>
+        <w:t xml:space="preserve"> </w:t>
+      </w:r>
+      <w:r>
+        <w:t xml:space="preserve">property through</w:t>
+      </w:r>
+      <w:r>
+        <w:t xml:space="preserve"> </w:t>
+      </w:r>
+      <w:r>
+        <w:rPr>
+          <w:rStyle w:val="VerbatimChar"/>
+        </w:rPr>
+        <w:t xml:space="preserve">getComputedStyle</w:t>
+      </w:r>
+      <w:r>
+        <w:t xml:space="preserve">, the console's JSON for a small object, a 5000-key object</w:t>
+      </w:r>
+      <w:r>
+        <w:t xml:space="preserve"> </w:t>
+      </w:r>
+      <w:r>
+        <w:t xml:space="preserve">named fast, a long string whole.</w:t>
+      </w:r>
+      <w:r>
+        <w:t xml:space="preserve"> </w:t>
+      </w:r>
+      <w:r>
+        <w:rPr>
+          <w:rStyle w:val="VerbatimChar"/>
+        </w:rPr>
+        <w:t xml:space="preserve">urltest.sh</w:t>
+      </w:r>
+      <w:r>
+        <w:t xml:space="preserve"> </w:t>
+      </w:r>
+      <w:r>
+        <w:t xml:space="preserve">(WPT's URL data) as before: 896 / 896, 278 / 278,</w:t>
+      </w:r>
+      <w:r>
+        <w:t xml:space="preserve"> </w:t>
+      </w:r>
+      <w:r>
+        <w:t xml:space="preserve">72 / 87.</w:t>
+      </w:r>
+      <w:r>
+        <w:t xml:space="preserve"> </w:t>
+      </w:r>
+      <w:r>
+        <w:rPr>
+          <w:rStyle w:val="VerbatimChar"/>
+        </w:rPr>
+        <w:t xml:space="preserve">jstest.sh</w:t>
+      </w:r>
+      <w:r>
+        <w:t xml:space="preserve">,</w:t>
+      </w:r>
+      <w:r>
+        <w:t xml:space="preserve"> </w:t>
+      </w:r>
+      <w:r>
+        <w:rPr>
+          <w:rStyle w:val="VerbatimChar"/>
+        </w:rPr>
+        <w:t xml:space="preserve">nettest.sh</w:t>
+      </w:r>
+      <w:r>
+        <w:t xml:space="preserve">,</w:t>
+      </w:r>
+      <w:r>
+        <w:t xml:space="preserve"> </w:t>
+      </w:r>
+      <w:r>
+        <w:rPr>
+          <w:rStyle w:val="VerbatimChar"/>
+        </w:rPr>
+        <w:t xml:space="preserve">fxtest.sh</w:t>
+      </w:r>
+      <w:r>
+        <w:t xml:space="preserve"> </w:t>
+      </w:r>
+      <w:r>
+        <w:t xml:space="preserve">pass;</w:t>
+      </w:r>
+      <w:r>
+        <w:t xml:space="preserve"> </w:t>
+      </w:r>
+      <w:r>
+        <w:rPr>
+          <w:rStyle w:val="VerbatimChar"/>
+        </w:rPr>
+        <w:t xml:space="preserve">sitesweep.sh</w:t>
+      </w:r>
+      <w:r>
+        <w:t xml:space="preserve">: no crash.</w:t>
+      </w:r>
+    </w:p>
+    <w:bookmarkEnd w:id="50"/>
+    <w:bookmarkStart w:id="51" w:name="X2d96bac25f45ec9241507797951d2bb0b2591ad"/>
+    <w:p>
+      <w:pPr>
+        <w:pStyle w:val="Heading2"/>
+      </w:pPr>
+      <w:r>
+        <w:t xml:space="preserve">8. Known gaps</w:t>
       </w:r>
     </w:p>
     <w:p>
@@ -49686,26 +50647,50 @@
         <w:pStyle w:val="Compact"/>
         <w:numPr>
           <w:ilvl w:val="0"/>
-          <w:numId w:val="1033"/>
+          <w:numId w:val="1034"/>
         </w:numPr>
       </w:pPr>
       <w:r>
-        <w:t xml:space="preserve">A face split by</w:t>
-      </w:r>
-      <w:r>
-        <w:t xml:space="preserve"> </w:t>
-      </w:r>
-      <w:r>
-        <w:rPr>
-          <w:rStyle w:val="VerbatimChar"/>
-        </w:rPr>
-        <w:t xml:space="preserve">unicode-range</w:t>
-      </w:r>
-      <w:r>
-        <w:t xml:space="preserve"> </w:t>
-      </w:r>
-      <w:r>
-        <w:t xml:space="preserve">outside Latin-1 falls back to the card's fonts.</w:t>
+        <w:t xml:space="preserve">JavaScript: synchronous XHR (runs async), multipart request bodies, binary request bodies</w:t>
+      </w:r>
+      <w:r>
+        <w:t xml:space="preserve"> </w:t>
+      </w:r>
+      <w:r>
+        <w:t xml:space="preserve">(sent as text: a NUL ends them); no IndexedDB, editing APIs, Service</w:t>
+      </w:r>
+      <w:r>
+        <w:t xml:space="preserve"> </w:t>
+      </w:r>
+      <w:r>
+        <w:t xml:space="preserve">Workers; CSS</w:t>
+      </w:r>
+      <w:r>
+        <w:t xml:space="preserve"> </w:t>
+      </w:r>
+      <w:r>
+        <w:rPr>
+          <w:rStyle w:val="VerbatimChar"/>
+        </w:rPr>
+        <w:t xml:space="preserve">:active</w:t>
+      </w:r>
+      <w:r>
+        <w:t xml:space="preserve"> </w:t>
+      </w:r>
+      <w:r>
+        <w:t xml:space="preserve">/</w:t>
+      </w:r>
+      <w:r>
+        <w:t xml:space="preserve"> </w:t>
+      </w:r>
+      <w:r>
+        <w:rPr>
+          <w:rStyle w:val="VerbatimChar"/>
+        </w:rPr>
+        <w:t xml:space="preserve">:focus</w:t>
+      </w:r>
+      <w:r>
+        <w:t xml:space="preserve">.</w:t>
       </w:r>
     </w:p>
     <w:p>
@@ -49713,10 +50698,841 @@
         <w:pStyle w:val="Compact"/>
         <w:numPr>
           <w:ilvl w:val="0"/>
-          <w:numId w:val="1033"/>
+          <w:numId w:val="1034"/>
         </w:numPr>
       </w:pPr>
       <w:r>
+        <w:t xml:space="preserve">The network APIs (§19): a worker runs on the UI thread (a long computation in a worker</w:t>
+      </w:r>
+      <w:r>
+        <w:t xml:space="preserve"> </w:t>
+      </w:r>
+      <w:r>
+        <w:t xml:space="preserve">holds the window as a page's script does;</w:t>
+      </w:r>
+      <w:r>
+        <w:t xml:space="preserve"> </w:t>
+      </w:r>
+      <w:r>
+        <w:rPr>
+          <w:rStyle w:val="VerbatimChar"/>
+        </w:rPr>
+        <w:t xml:space="preserve">script_timeout</w:t>
+      </w:r>
+      <w:r>
+        <w:t xml:space="preserve"> </w:t>
+      </w:r>
+      <w:r>
+        <w:t xml:space="preserve">stops it); an</w:t>
+      </w:r>
+      <w:r>
+        <w:t xml:space="preserve"> </w:t>
+      </w:r>
+      <w:r>
+        <w:rPr>
+          <w:rStyle w:val="VerbatimChar"/>
+        </w:rPr>
+        <w:t xml:space="preserve">importScripts</w:t>
+      </w:r>
+      <w:r>
+        <w:t xml:space="preserve"> </w:t>
+      </w:r>
+      <w:r>
+        <w:t xml:space="preserve">whose URL is not a literal in the script, over http(s), blocks the UI thread while it is</w:t>
+      </w:r>
+      <w:r>
+        <w:t xml:space="preserve"> </w:t>
+      </w:r>
+      <w:r>
+        <w:t xml:space="preserve">read; a SharedWorker is shared within its document only; no</w:t>
+      </w:r>
+      <w:r>
+        <w:t xml:space="preserve"> </w:t>
+      </w:r>
+      <w:r>
+        <w:rPr>
+          <w:rStyle w:val="VerbatimChar"/>
+        </w:rPr>
+        <w:t xml:space="preserve">MessagePort</w:t>
+      </w:r>
+      <w:r>
+        <w:t xml:space="preserve"> </w:t>
+      </w:r>
+      <w:r>
+        <w:t xml:space="preserve">transferred to a</w:t>
+      </w:r>
+      <w:r>
+        <w:t xml:space="preserve"> </w:t>
+      </w:r>
+      <w:r>
+        <w:t xml:space="preserve">worker, no</w:t>
+      </w:r>
+      <w:r>
+        <w:t xml:space="preserve"> </w:t>
+      </w:r>
+      <w:r>
+        <w:rPr>
+          <w:rStyle w:val="VerbatimChar"/>
+        </w:rPr>
+        <w:t xml:space="preserve">OffscreenCanvas</w:t>
+      </w:r>
+      <w:r>
+        <w:t xml:space="preserve">,</w:t>
+      </w:r>
+      <w:r>
+        <w:t xml:space="preserve"> </w:t>
+      </w:r>
+      <w:r>
+        <w:rPr>
+          <w:rStyle w:val="VerbatimChar"/>
+        </w:rPr>
+        <w:t xml:space="preserve">SharedArrayBuffer</w:t>
+      </w:r>
+      <w:r>
+        <w:t xml:space="preserve"> </w:t>
+      </w:r>
+      <w:r>
+        <w:t xml:space="preserve">/</w:t>
+      </w:r>
+      <w:r>
+        <w:t xml:space="preserve"> </w:t>
+      </w:r>
+      <w:r>
+        <w:rPr>
+          <w:rStyle w:val="VerbatimChar"/>
+        </w:rPr>
+        <w:t xml:space="preserve">Atomics</w:t>
+      </w:r>
+      <w:r>
+        <w:t xml:space="preserve"> </w:t>
+      </w:r>
+      <w:r>
+        <w:t xml:space="preserve">between workers; the</w:t>
+      </w:r>
+      <w:r>
+        <w:t xml:space="preserve"> </w:t>
+      </w:r>
+      <w:r>
+        <w:t xml:space="preserve">WebSocket client sends its messages uncompressed (permessage-deflate inflates only) and</w:t>
+      </w:r>
+      <w:r>
+        <w:t xml:space="preserve"> </w:t>
+      </w:r>
+      <w:r>
+        <w:t xml:space="preserve">never pings; CORS is not checked for EventSource either.</w:t>
+      </w:r>
+    </w:p>
+    <w:p>
+      <w:pPr>
+        <w:pStyle w:val="Compact"/>
+        <w:numPr>
+          <w:ilvl w:val="0"/>
+          <w:numId w:val="1034"/>
+        </w:numPr>
+      </w:pPr>
+      <w:r>
+        <w:t xml:space="preserve">The network (§24): no revocation checks, no CSP, no SameSite cookies, no</w:t>
+      </w:r>
+      <w:r>
+        <w:t xml:space="preserve"> </w:t>
+      </w:r>
+      <w:r>
+        <w:t xml:space="preserve">CORS for the core's loads (EventSource, fonts,</w:t>
+      </w:r>
+      <w:r>
+        <w:t xml:space="preserve"> </w:t>
+      </w:r>
+      <w:r>
+        <w:rPr>
+          <w:rStyle w:val="VerbatimChar"/>
+        </w:rPr>
+        <w:t xml:space="preserve">&lt;img crossorigin&gt;</w:t>
+      </w:r>
+      <w:r>
+        <w:t xml:space="preserve">, module scripts), no</w:t>
+      </w:r>
+      <w:r>
+        <w:t xml:space="preserve"> </w:t>
+      </w:r>
+      <w:r>
+        <w:t xml:space="preserve">HTTP/3, no back-forward cache.</w:t>
+      </w:r>
+    </w:p>
+    <w:p>
+      <w:pPr>
+        <w:pStyle w:val="Compact"/>
+        <w:numPr>
+          <w:ilvl w:val="0"/>
+          <w:numId w:val="1034"/>
+        </w:numPr>
+      </w:pPr>
+      <w:r>
+        <w:t xml:space="preserve">Shadow DOM (§20): the manual slot assignment's rendering,</w:t>
+      </w:r>
+      <w:r>
+        <w:t xml:space="preserve"> </w:t>
+      </w:r>
+      <w:r>
+        <w:rPr>
+          <w:rStyle w:val="VerbatimChar"/>
+        </w:rPr>
+        <w:t xml:space="preserve">exportparts</w:t>
+      </w:r>
+      <w:r>
+        <w:t xml:space="preserve">, a clonable root's</w:t>
+      </w:r>
+      <w:r>
+        <w:t xml:space="preserve"> </w:t>
+      </w:r>
+      <w:r>
+        <w:t xml:space="preserve">cloning,</w:t>
+      </w:r>
+      <w:r>
+        <w:t xml:space="preserve"> </w:t>
+      </w:r>
+      <w:r>
+        <w:rPr>
+          <w:rStyle w:val="VerbatimChar"/>
+        </w:rPr>
+        <w:t xml:space="preserve">&lt;link&gt;</w:t>
+      </w:r>
+      <w:r>
+        <w:t xml:space="preserve"> </w:t>
+      </w:r>
+      <w:r>
+        <w:t xml:space="preserve">/</w:t>
+      </w:r>
+      <w:r>
+        <w:t xml:space="preserve"> </w:t>
+      </w:r>
+      <w:r>
+        <w:rPr>
+          <w:rStyle w:val="VerbatimChar"/>
+        </w:rPr>
+        <w:t xml:space="preserve">@import</w:t>
+      </w:r>
+      <w:r>
+        <w:t xml:space="preserve"> </w:t>
+      </w:r>
+      <w:r>
+        <w:t xml:space="preserve">/</w:t>
+      </w:r>
+      <w:r>
+        <w:t xml:space="preserve"> </w:t>
+      </w:r>
+      <w:r>
+        <w:rPr>
+          <w:rStyle w:val="VerbatimChar"/>
+        </w:rPr>
+        <w:t xml:space="preserve">@font-face</w:t>
+      </w:r>
+      <w:r>
+        <w:t xml:space="preserve"> </w:t>
+      </w:r>
+      <w:r>
+        <w:t xml:space="preserve">in shadow trees,</w:t>
+      </w:r>
+      <w:r>
+        <w:t xml:space="preserve"> </w:t>
+      </w:r>
+      <w:r>
+        <w:rPr>
+          <w:rStyle w:val="VerbatimChar"/>
+        </w:rPr>
+        <w:t xml:space="preserve">:host</w:t>
+      </w:r>
+      <w:r>
+        <w:t xml:space="preserve"> </w:t>
+      </w:r>
+      <w:r>
+        <w:t xml:space="preserve">in</w:t>
+      </w:r>
+      <w:r>
+        <w:t xml:space="preserve"> </w:t>
+      </w:r>
+      <w:r>
+        <w:rPr>
+          <w:rStyle w:val="VerbatimChar"/>
+        </w:rPr>
+        <w:t xml:space="preserve">matches()</w:t>
+      </w:r>
+      <w:r>
+        <w:t xml:space="preserve">;</w:t>
+      </w:r>
+      <w:r>
+        <w:t xml:space="preserve"> </w:t>
+      </w:r>
+      <w:r>
+        <w:rPr>
+          <w:rStyle w:val="VerbatimChar"/>
+        </w:rPr>
+        <w:t xml:space="preserve">::before</w:t>
+      </w:r>
+      <w:r>
+        <w:t xml:space="preserve"> </w:t>
+      </w:r>
+      <w:r>
+        <w:t xml:space="preserve">/</w:t>
+      </w:r>
+      <w:r>
+        <w:t xml:space="preserve"> </w:t>
+      </w:r>
+      <w:r>
+        <w:rPr>
+          <w:rStyle w:val="VerbatimChar"/>
+        </w:rPr>
+        <w:t xml:space="preserve">::after</w:t>
+      </w:r>
+      <w:r>
+        <w:t xml:space="preserve"> </w:t>
+      </w:r>
+      <w:r>
+        <w:t xml:space="preserve">of a</w:t>
+      </w:r>
+      <w:r>
+        <w:t xml:space="preserve"> </w:t>
+      </w:r>
+      <w:r>
+        <w:rPr>
+          <w:rStyle w:val="VerbatimChar"/>
+        </w:rPr>
+        <w:t xml:space="preserve">display: contents</w:t>
+      </w:r>
+      <w:r>
+        <w:t xml:space="preserve"> </w:t>
+      </w:r>
+      <w:r>
+        <w:t xml:space="preserve">element.</w:t>
+      </w:r>
+    </w:p>
+    <w:p>
+      <w:pPr>
+        <w:pStyle w:val="Compact"/>
+        <w:numPr>
+          <w:ilvl w:val="0"/>
+          <w:numId w:val="1034"/>
+        </w:numPr>
+      </w:pPr>
+      <w:r>
+        <w:t xml:space="preserve">The compositing layers' gaps (§21: a real perspective,</w:t>
+      </w:r>
+      <w:r>
+        <w:t xml:space="preserve"> </w:t>
+      </w:r>
+      <w:r>
+        <w:rPr>
+          <w:rStyle w:val="VerbatimChar"/>
+        </w:rPr>
+        <w:t xml:space="preserve">clip-path</w:t>
+      </w:r>
+      <w:r>
+        <w:t xml:space="preserve"> </w:t>
+      </w:r>
+      <w:r>
+        <w:t xml:space="preserve">/</w:t>
+      </w:r>
+      <w:r>
+        <w:t xml:space="preserve"> </w:t>
+      </w:r>
+      <w:r>
+        <w:rPr>
+          <w:rStyle w:val="VerbatimChar"/>
+        </w:rPr>
+        <w:t xml:space="preserve">mask</w:t>
+      </w:r>
+      <w:r>
+        <w:t xml:space="preserve"> </w:t>
+      </w:r>
+      <w:r>
+        <w:t xml:space="preserve">on a layer, the</w:t>
+      </w:r>
+      <w:r>
+        <w:t xml:space="preserve"> </w:t>
+      </w:r>
+      <w:r>
+        <w:t xml:space="preserve">non-separable blend modes); animations: §22's "Not done"; GPU compositing: §25's (scrollers</w:t>
+      </w:r>
+      <w:r>
+        <w:t xml:space="preserve"> </w:t>
+      </w:r>
+      <w:r>
+        <w:t xml:space="preserve">and groups as layers, fixed boxes that stay in view).</w:t>
+      </w:r>
+    </w:p>
+    <w:p>
+      <w:pPr>
+        <w:pStyle w:val="Compact"/>
+        <w:numPr>
+          <w:ilvl w:val="0"/>
+          <w:numId w:val="1034"/>
+        </w:numPr>
+      </w:pPr>
+      <w:r>
+        <w:t xml:space="preserve">SVG: no</w:t>
+      </w:r>
+      <w:r>
+        <w:t xml:space="preserve"> </w:t>
+      </w:r>
+      <w:r>
+        <w:rPr>
+          <w:rStyle w:val="VerbatimChar"/>
+        </w:rPr>
+        <w:t xml:space="preserve">&lt;mask&gt;</w:t>
+      </w:r>
+      <w:r>
+        <w:t xml:space="preserve">,</w:t>
+      </w:r>
+      <w:r>
+        <w:t xml:space="preserve"> </w:t>
+      </w:r>
+      <w:r>
+        <w:rPr>
+          <w:rStyle w:val="VerbatimChar"/>
+        </w:rPr>
+        <w:t xml:space="preserve">&lt;pattern&gt;</w:t>
+      </w:r>
+      <w:r>
+        <w:t xml:space="preserve">,</w:t>
+      </w:r>
+      <w:r>
+        <w:t xml:space="preserve"> </w:t>
+      </w:r>
+      <w:r>
+        <w:rPr>
+          <w:rStyle w:val="VerbatimChar"/>
+        </w:rPr>
+        <w:t xml:space="preserve">&lt;marker&gt;</w:t>
+      </w:r>
+      <w:r>
+        <w:t xml:space="preserve">, filters, SMIL animations,</w:t>
+      </w:r>
+      <w:r>
+        <w:t xml:space="preserve"> </w:t>
+      </w:r>
+      <w:r>
+        <w:rPr>
+          <w:rStyle w:val="VerbatimChar"/>
+        </w:rPr>
+        <w:t xml:space="preserve">&lt;textPath&gt;</w:t>
+      </w:r>
+      <w:r>
+        <w:t xml:space="preserve">, per-glyph</w:t>
+      </w:r>
+      <w:r>
+        <w:t xml:space="preserve"> </w:t>
+      </w:r>
+      <w:r>
+        <w:t xml:space="preserve">position lists, the page's web fonts in</w:t>
+      </w:r>
+      <w:r>
+        <w:t xml:space="preserve"> </w:t>
+      </w:r>
+      <w:r>
+        <w:rPr>
+          <w:rStyle w:val="VerbatimChar"/>
+        </w:rPr>
+        <w:t xml:space="preserve">&lt;text&gt;</w:t>
+      </w:r>
+      <w:r>
+        <w:t xml:space="preserve">; the page's</w:t>
+      </w:r>
+      <w:r>
+        <w:t xml:space="preserve"> </w:t>
+      </w:r>
+      <w:r>
+        <w:t xml:space="preserve">CSS</w:t>
+      </w:r>
+      <w:r>
+        <w:t xml:space="preserve"> </w:t>
+      </w:r>
+      <w:r>
+        <w:rPr>
+          <w:rStyle w:val="VerbatimChar"/>
+        </w:rPr>
+        <w:t xml:space="preserve">fill</w:t>
+      </w:r>
+      <w:r>
+        <w:t xml:space="preserve"> </w:t>
+      </w:r>
+      <w:r>
+        <w:t xml:space="preserve">/</w:t>
+      </w:r>
+      <w:r>
+        <w:t xml:space="preserve"> </w:t>
+      </w:r>
+      <w:r>
+        <w:rPr>
+          <w:rStyle w:val="VerbatimChar"/>
+        </w:rPr>
+        <w:t xml:space="preserve">stroke</w:t>
+      </w:r>
+      <w:r>
+        <w:t xml:space="preserve"> </w:t>
+      </w:r>
+      <w:r>
+        <w:t xml:space="preserve">(</w:t>
+      </w:r>
+      <w:r>
+        <w:rPr>
+          <w:rStyle w:val="VerbatimChar"/>
+        </w:rPr>
+        <w:t xml:space="preserve">.icon path { fill: red }</w:t>
+      </w:r>
+      <w:r>
+        <w:t xml:space="preserve">) do not reach an inline</w:t>
+      </w:r>
+      <w:r>
+        <w:t xml:space="preserve"> </w:t>
+      </w:r>
+      <w:r>
+        <w:rPr>
+          <w:rStyle w:val="VerbatimChar"/>
+        </w:rPr>
+        <w:t xml:space="preserve">&lt;svg&gt;</w:t>
+      </w:r>
+      <w:r>
+        <w:t xml:space="preserve"> </w:t>
+      </w:r>
+      <w:r>
+        <w:t xml:space="preserve">-- libcss</w:t>
+      </w:r>
+      <w:r>
+        <w:t xml:space="preserve"> </w:t>
+      </w:r>
+      <w:r>
+        <w:t xml:space="preserve">has no</w:t>
+      </w:r>
+      <w:r>
+        <w:t xml:space="preserve"> </w:t>
+      </w:r>
+      <w:r>
+        <w:rPr>
+          <w:rStyle w:val="VerbatimChar"/>
+        </w:rPr>
+        <w:t xml:space="preserve">fill</w:t>
+      </w:r>
+      <w:r>
+        <w:t xml:space="preserve"> </w:t>
+      </w:r>
+      <w:r>
+        <w:t xml:space="preserve">/</w:t>
+      </w:r>
+      <w:r>
+        <w:t xml:space="preserve"> </w:t>
+      </w:r>
+      <w:r>
+        <w:rPr>
+          <w:rStyle w:val="VerbatimChar"/>
+        </w:rPr>
+        <w:t xml:space="preserve">stroke</w:t>
+      </w:r>
+      <w:r>
+        <w:t xml:space="preserve"> </w:t>
+      </w:r>
+      <w:r>
+        <w:t xml:space="preserve">properties (only</w:t>
+      </w:r>
+      <w:r>
+        <w:t xml:space="preserve"> </w:t>
+      </w:r>
+      <w:r>
+        <w:rPr>
+          <w:rStyle w:val="VerbatimChar"/>
+        </w:rPr>
+        <w:t xml:space="preserve">fill-opacity</w:t>
+      </w:r>
+      <w:r>
+        <w:t xml:space="preserve"> </w:t>
+      </w:r>
+      <w:r>
+        <w:t xml:space="preserve">/</w:t>
+      </w:r>
+      <w:r>
+        <w:t xml:space="preserve"> </w:t>
+      </w:r>
+      <w:r>
+        <w:rPr>
+          <w:rStyle w:val="VerbatimChar"/>
+        </w:rPr>
+        <w:t xml:space="preserve">stroke-opacity</w:t>
+      </w:r>
+      <w:r>
+        <w:t xml:space="preserve">): with them</w:t>
+      </w:r>
+      <w:r>
+        <w:t xml:space="preserve"> </w:t>
+      </w:r>
+      <w:r>
+        <w:t xml:space="preserve">(inherited, as text),</w:t>
+      </w:r>
+      <w:r>
+        <w:t xml:space="preserve"> </w:t>
+      </w:r>
+      <w:r>
+        <w:rPr>
+          <w:rStyle w:val="VerbatimChar"/>
+        </w:rPr>
+        <w:t xml:space="preserve">onyx_svg_inline.c</w:t>
+      </w:r>
+      <w:r>
+        <w:t xml:space="preserve"> </w:t>
+      </w:r>
+      <w:r>
+        <w:t xml:space="preserve">would write the</w:t>
+      </w:r>
+      <w:r>
+        <w:t xml:space="preserve"> </w:t>
+      </w:r>
+      <w:r>
+        <w:rPr>
+          <w:rStyle w:val="VerbatimChar"/>
+        </w:rPr>
+        <w:t xml:space="preserve">&lt;svg&gt;</w:t>
+      </w:r>
+      <w:r>
+        <w:t xml:space="preserve">'s computed ones on its</w:t>
+      </w:r>
+      <w:r>
+        <w:t xml:space="preserve"> </w:t>
+      </w:r>
+      <w:r>
+        <w:t xml:space="preserve">root; its</w:t>
+      </w:r>
+      <w:r>
+        <w:t xml:space="preserve"> </w:t>
+      </w:r>
+      <w:r>
+        <w:rPr>
+          <w:rStyle w:val="VerbatimChar"/>
+        </w:rPr>
+        <w:t xml:space="preserve">color</w:t>
+      </w:r>
+      <w:r>
+        <w:t xml:space="preserve">, its custom properties and the SVG's own attributes and</w:t>
+      </w:r>
+      <w:r>
+        <w:t xml:space="preserve"> </w:t>
+      </w:r>
+      <w:r>
+        <w:rPr>
+          <w:rStyle w:val="VerbatimChar"/>
+        </w:rPr>
+        <w:t xml:space="preserve">&lt;style&gt;</w:t>
+      </w:r>
+      <w:r>
+        <w:t xml:space="preserve"> </w:t>
+      </w:r>
+      <w:r>
+        <w:t xml:space="preserve">do. An</w:t>
+      </w:r>
+      <w:r>
+        <w:t xml:space="preserve"> </w:t>
+      </w:r>
+      <w:r>
+        <w:rPr>
+          <w:rStyle w:val="VerbatimChar"/>
+        </w:rPr>
+        <w:t xml:space="preserve">&lt;svg&gt;</w:t>
+      </w:r>
+      <w:r>
+        <w:t xml:space="preserve"> </w:t>
+      </w:r>
+      <w:r>
+        <w:t xml:space="preserve">/ SVG</w:t>
+      </w:r>
+      <w:r>
+        <w:t xml:space="preserve"> </w:t>
+      </w:r>
+      <w:r>
+        <w:rPr>
+          <w:rStyle w:val="VerbatimChar"/>
+        </w:rPr>
+        <w:t xml:space="preserve">&lt;img&gt;</w:t>
+      </w:r>
+      <w:r>
+        <w:t xml:space="preserve"> </w:t>
+      </w:r>
+      <w:r>
+        <w:t xml:space="preserve">with only a viewBox and no CSS size takes the viewBox's size (Chrome:</w:t>
+      </w:r>
+      <w:r>
+        <w:t xml:space="preserve"> </w:t>
+      </w:r>
+      <w:r>
+        <w:t xml:space="preserve">the containing block's width); a</w:t>
+      </w:r>
+      <w:r>
+        <w:t xml:space="preserve"> </w:t>
+      </w:r>
+      <w:r>
+        <w:rPr>
+          <w:rStyle w:val="VerbatimChar"/>
+        </w:rPr>
+        <w:t xml:space="preserve">list-style-image</w:t>
+      </w:r>
+      <w:r>
+        <w:t xml:space="preserve"> </w:t>
+      </w:r>
+      <w:r>
+        <w:t xml:space="preserve">SVG without a size is drawn at its</w:t>
+      </w:r>
+      <w:r>
+        <w:t xml:space="preserve"> </w:t>
+      </w:r>
+      <w:r>
+        <w:t xml:space="preserve">viewBox's size (Chrome: small). The scripts' SVG DOM is dom.js' generic one (</w:t>
+      </w:r>
+      <w:r>
+        <w:rPr>
+          <w:rStyle w:val="VerbatimChar"/>
+        </w:rPr>
+        <w:t xml:space="preserve">namespaceURI</w:t>
+      </w:r>
+      <w:r>
+        <w:t xml:space="preserve">,</w:t>
+      </w:r>
+      <w:r>
+        <w:t xml:space="preserve"> </w:t>
+      </w:r>
+      <w:r>
+        <w:rPr>
+          <w:rStyle w:val="VerbatimChar"/>
+        </w:rPr>
+        <w:t xml:space="preserve">getBBox</w:t>
+      </w:r>
+      <w:r>
+        <w:t xml:space="preserve"> </w:t>
+      </w:r>
+      <w:r>
+        <w:t xml:space="preserve">from the box).</w:t>
+      </w:r>
+    </w:p>
+    <w:p>
+      <w:pPr>
+        <w:pStyle w:val="Compact"/>
+        <w:numPr>
+          <w:ilvl w:val="0"/>
+          <w:numId w:val="1034"/>
+        </w:numPr>
+      </w:pPr>
+      <w:r>
+        <w:t xml:space="preserve">Canvas: no shadows, filters, blend modes (source-over), conic gradients (a solid colour),</w:t>
+      </w:r>
+      <w:r>
+        <w:t xml:space="preserve"> </w:t>
+      </w:r>
+      <w:r>
+        <w:t xml:space="preserve">per-corner</w:t>
+      </w:r>
+      <w:r>
+        <w:t xml:space="preserve"> </w:t>
+      </w:r>
+      <w:r>
+        <w:rPr>
+          <w:rStyle w:val="VerbatimChar"/>
+        </w:rPr>
+        <w:t xml:space="preserve">roundRect</w:t>
+      </w:r>
+      <w:r>
+        <w:t xml:space="preserve"> </w:t>
+      </w:r>
+      <w:r>
+        <w:t xml:space="preserve">radii;</w:t>
+      </w:r>
+      <w:r>
+        <w:t xml:space="preserve"> </w:t>
+      </w:r>
+      <w:r>
+        <w:rPr>
+          <w:rStyle w:val="VerbatimChar"/>
+        </w:rPr>
+        <w:t xml:space="preserve">drawImage</w:t>
+      </w:r>
+      <w:r>
+        <w:t xml:space="preserve"> </w:t>
+      </w:r>
+      <w:r>
+        <w:t xml:space="preserve">scales with the nearest pixel (PlutoVG's</w:t>
+      </w:r>
+      <w:r>
+        <w:t xml:space="preserve"> </w:t>
+      </w:r>
+      <w:r>
+        <w:t xml:space="preserve">textures), and a canvas shown at another CSS size too (the framebuffer's bitmap plot);</w:t>
+      </w:r>
+      <w:r>
+        <w:t xml:space="preserve"> </w:t>
+      </w:r>
+      <w:r>
+        <w:t xml:space="preserve">no</w:t>
+      </w:r>
+      <w:r>
+        <w:t xml:space="preserve"> </w:t>
+      </w:r>
+      <w:r>
+        <w:rPr>
+          <w:rStyle w:val="VerbatimChar"/>
+        </w:rPr>
+        <w:t xml:space="preserve">getContext('webgl')</w:t>
+      </w:r>
+      <w:r>
+        <w:t xml:space="preserve">,</w:t>
+      </w:r>
+      <w:r>
+        <w:t xml:space="preserve"> </w:t>
+      </w:r>
+      <w:r>
+        <w:rPr>
+          <w:rStyle w:val="VerbatimChar"/>
+        </w:rPr>
+        <w:t xml:space="preserve">captureStream</w:t>
+      </w:r>
+      <w:r>
+        <w:t xml:space="preserve">, video frames; the page's web fonts are not used</w:t>
+      </w:r>
+      <w:r>
+        <w:t xml:space="preserve"> </w:t>
+      </w:r>
+      <w:r>
+        <w:t xml:space="preserve">(the card's fonts by family).</w:t>
+      </w:r>
+    </w:p>
+    <w:p>
+      <w:pPr>
+        <w:pStyle w:val="Compact"/>
+        <w:numPr>
+          <w:ilvl w:val="0"/>
+          <w:numId w:val="1034"/>
+        </w:numPr>
+      </w:pPr>
+      <w:r>
+        <w:t xml:space="preserve">A face split by</w:t>
+      </w:r>
+      <w:r>
+        <w:t xml:space="preserve"> </w:t>
+      </w:r>
+      <w:r>
+        <w:rPr>
+          <w:rStyle w:val="VerbatimChar"/>
+        </w:rPr>
+        <w:t xml:space="preserve">unicode-range</w:t>
+      </w:r>
+      <w:r>
+        <w:t xml:space="preserve"> </w:t>
+      </w:r>
+      <w:r>
+        <w:t xml:space="preserve">outside Latin-1 falls back to the card's fonts.</w:t>
+      </w:r>
+    </w:p>
+    <w:p>
+      <w:pPr>
+        <w:pStyle w:val="Compact"/>
+        <w:numPr>
+          <w:ilvl w:val="0"/>
+          <w:numId w:val="1034"/>
+        </w:numPr>
+      </w:pPr>
+      <w:r>
         <w:t xml:space="preserve">Intl (§15): no</w:t>
       </w:r>
       <w:r>
@@ -49819,7 +51635,7 @@
         <w:t xml:space="preserve">(ja, zh, ko, ru, pl, sv, da, nb, fi, tr, cs) have English units, display names and zone names.</w:t>
       </w:r>
     </w:p>
-    <w:bookmarkEnd w:id="50"/>
+    <w:bookmarkEnd w:id="51"/>
     <w:sectPr>
       <w:footerReference r:id="rId9" w:type="default"/>
       <w:footnotePr>
@@ -50291,6 +52107,9 @@
     <w:abstractNumId w:val="991"/>
   </w:num>
   <w:num w:numId="1033">
+    <w:abstractNumId w:val="991"/>
+  </w:num>
+  <w:num w:numId="1034">
     <w:abstractNumId w:val="991"/>
   </w:num>
 </w:numbering>

</xml_diff>

<commit_message>
docs: the 06 export (.docx) with section 26 (iframes, messaging between windows)
The PDF is not regenerated: the container's LibreOffice cannot load the .docx.

Co-Authored-By: Claude Opus 5.5 <noreply@anthropic.com>
Claude-Session: https://claude.ai/code/session_01UcY36na7Mp1DEYttKiw1pa
</commit_message>
<xml_diff>
--- a/docs/exports/06-NETSURF-CHANGES.docx
+++ b/docs/exports/06-NETSURF-CHANGES.docx
@@ -693,7 +693,22 @@
               <w:t xml:space="preserve"> </w:t>
             </w:r>
             <w:r>
-              <w:t xml:space="preserve">(WebSocket, EventSource, the streamed fetch, Workers: §19)</w:t>
+              <w:t xml:space="preserve">(WebSocket, EventSource, the streamed fetch, Workers: §19),</w:t>
+            </w:r>
+            <w:r>
+              <w:t xml:space="preserve"> </w:t>
+            </w:r>
+            <w:r>
+              <w:rPr>
+                <w:rStyle w:val="VerbatimChar"/>
+              </w:rPr>
+              <w:t xml:space="preserve">qjs_frames.c</w:t>
+            </w:r>
+            <w:r>
+              <w:t xml:space="preserve"> </w:t>
+            </w:r>
+            <w:r>
+              <w:t xml:space="preserve">(the frames' windows, postMessage between them, MessagePort across realms: §26)</w:t>
             </w:r>
           </w:p>
         </w:tc>
@@ -1344,7 +1359,22 @@
               <w:t xml:space="preserve"> </w:t>
             </w:r>
             <w:r>
-              <w:t xml:space="preserve">(the compositing layers against Chromium pixel by pixel, a hover's partial redraw against a full one: §21)</w:t>
+              <w:t xml:space="preserve">(the compositing layers against Chromium pixel by pixel, a hover's partial redraw against a full one: §21),</w:t>
+            </w:r>
+            <w:r>
+              <w:t xml:space="preserve"> </w:t>
+            </w:r>
+            <w:r>
+              <w:rPr>
+                <w:rStyle w:val="VerbatimChar"/>
+              </w:rPr>
+              <w:t xml:space="preserve">iframetest.sh</w:t>
+            </w:r>
+            <w:r>
+              <w:t xml:space="preserve"> </w:t>
+            </w:r>
+            <w:r>
+              <w:t xml:space="preserve">(iframes, postMessage, MessageChannel, a reCAPTCHA mimic over two local origins: §26)</w:t>
             </w:r>
           </w:p>
         </w:tc>
@@ -8738,6 +8768,214 @@
           <w:b/>
           <w:bCs/>
         </w:rPr>
+        <w:t xml:space="preserve">A dialog capped to the viewport</w:t>
+      </w:r>
+      <w:r>
+        <w:t xml:space="preserve"> </w:t>
+      </w:r>
+      <w:r>
+        <w:t xml:space="preserve">(Facebook's cookie dialog: a fixed backdrop,</w:t>
+      </w:r>
+      <w:r>
+        <w:t xml:space="preserve"> </w:t>
+      </w:r>
+      <w:r>
+        <w:rPr>
+          <w:rStyle w:val="VerbatimChar"/>
+        </w:rPr>
+        <w:t xml:space="preserve">inset: 0</w:t>
+      </w:r>
+      <w:r>
+        <w:t xml:space="preserve">, centring a flex column with</w:t>
+      </w:r>
+      <w:r>
+        <w:t xml:space="preserve"> </w:t>
+      </w:r>
+      <w:r>
+        <w:rPr>
+          <w:rStyle w:val="VerbatimChar"/>
+        </w:rPr>
+        <w:t xml:space="preserve">max-height: 90%</w:t>
+      </w:r>
+      <w:r>
+        <w:t xml:space="preserve">, its middle</w:t>
+      </w:r>
+      <w:r>
+        <w:t xml:space="preserve"> </w:t>
+      </w:r>
+      <w:r>
+        <w:rPr>
+          <w:rStyle w:val="VerbatimChar"/>
+        </w:rPr>
+        <w:t xml:space="preserve">overflow: auto</w:t>
+      </w:r>
+      <w:r>
+        <w:t xml:space="preserve">,</w:t>
+      </w:r>
+      <w:r>
+        <w:t xml:space="preserve"> </w:t>
+      </w:r>
+      <w:r>
+        <w:t xml:space="preserve">the buttons pinned): an absolute / fixed box whose height is given by its insets (</w:t>
+      </w:r>
+      <w:r>
+        <w:rPr>
+          <w:rStyle w:val="VerbatimChar"/>
+        </w:rPr>
+        <w:t xml:space="preserve">top</w:t>
+      </w:r>
+      <w:r>
+        <w:t xml:space="preserve"> </w:t>
+      </w:r>
+      <w:r>
+        <w:t xml:space="preserve">and</w:t>
+      </w:r>
+      <w:r>
+        <w:t xml:space="preserve"> </w:t>
+      </w:r>
+      <w:r>
+        <w:rPr>
+          <w:rStyle w:val="VerbatimChar"/>
+        </w:rPr>
+        <w:t xml:space="preserve">bottom</w:t>
+      </w:r>
+      <w:r>
+        <w:t xml:space="preserve"> </w:t>
+      </w:r>
+      <w:r>
+        <w:t xml:space="preserve">set,</w:t>
+      </w:r>
+      <w:r>
+        <w:t xml:space="preserve"> </w:t>
+      </w:r>
+      <w:r>
+        <w:rPr>
+          <w:rStyle w:val="VerbatimChar"/>
+        </w:rPr>
+        <w:t xml:space="preserve">height: auto</w:t>
+      </w:r>
+      <w:r>
+        <w:t xml:space="preserve">) now knows it before its content is laid out</w:t>
+      </w:r>
+      <w:r>
+        <w:t xml:space="preserve"> </w:t>
+      </w:r>
+      <w:r>
+        <w:t xml:space="preserve">(</w:t>
+      </w:r>
+      <w:r>
+        <w:rPr>
+          <w:rStyle w:val="VerbatimChar"/>
+        </w:rPr>
+        <w:t xml:space="preserve">layout_absolute</w:t>
+      </w:r>
+      <w:r>
+        <w:t xml:space="preserve">,</w:t>
+      </w:r>
+      <w:r>
+        <w:t xml:space="preserve"> </w:t>
+      </w:r>
+      <w:r>
+        <w:rPr>
+          <w:rStyle w:val="VerbatimChar"/>
+        </w:rPr>
+        <w:t xml:space="preserve">DEF_HEIGHT</w:t>
+      </w:r>
+      <w:r>
+        <w:t xml:space="preserve">): a flex container centres and flexes its items in it,</w:t>
+      </w:r>
+      <w:r>
+        <w:t xml:space="preserve"> </w:t>
+      </w:r>
+      <w:r>
+        <w:t xml:space="preserve">its children's percentages resolve against it. The dialog took its whole content's height</w:t>
+      </w:r>
+      <w:r>
+        <w:t xml:space="preserve"> </w:t>
+      </w:r>
+      <w:r>
+        <w:t xml:space="preserve">(the buttons below the screen, nothing to scroll). A stretched grid item that is a scroll</w:t>
+      </w:r>
+      <w:r>
+        <w:t xml:space="preserve"> </w:t>
+      </w:r>
+      <w:r>
+        <w:t xml:space="preserve">container is its area's height even when its content is taller (</w:t>
+      </w:r>
+      <w:r>
+        <w:rPr>
+          <w:rStyle w:val="VerbatimChar"/>
+        </w:rPr>
+        <w:t xml:space="preserve">layout_grid.c</w:t>
+      </w:r>
+      <w:r>
+        <w:t xml:space="preserve">: a</w:t>
+      </w:r>
+      <w:r>
+        <w:t xml:space="preserve"> </w:t>
+      </w:r>
+      <w:r>
+        <w:rPr>
+          <w:rStyle w:val="VerbatimChar"/>
+        </w:rPr>
+        <w:t xml:space="preserve">minmax(0, 1fr)</w:t>
+      </w:r>
+      <w:r>
+        <w:t xml:space="preserve"> </w:t>
+      </w:r>
+      <w:r>
+        <w:t xml:space="preserve">middle row). Tests:</w:t>
+      </w:r>
+      <w:r>
+        <w:t xml:space="preserve"> </w:t>
+      </w:r>
+      <w:r>
+        <w:rPr>
+          <w:rStyle w:val="VerbatimChar"/>
+        </w:rPr>
+        <w:t xml:space="preserve">pages/layout/dialogs.html</w:t>
+      </w:r>
+      <w:r>
+        <w:t xml:space="preserve"> </w:t>
+      </w:r>
+      <w:r>
+        <w:t xml:space="preserve">(layouttest: 0 of 49</w:t>
+      </w:r>
+      <w:r>
+        <w:t xml:space="preserve"> </w:t>
+      </w:r>
+      <w:r>
+        <w:t xml:space="preserve">differ),</w:t>
+      </w:r>
+      <w:r>
+        <w:t xml:space="preserve"> </w:t>
+      </w:r>
+      <w:r>
+        <w:rPr>
+          <w:rStyle w:val="VerbatimChar"/>
+        </w:rPr>
+        <w:t xml:space="preserve">pages/js-dialog.html</w:t>
+      </w:r>
+      <w:r>
+        <w:t xml:space="preserve"> </w:t>
+      </w:r>
+      <w:r>
+        <w:t xml:space="preserve">(jstest).</w:t>
+      </w:r>
+    </w:p>
+    <w:p>
+      <w:pPr>
+        <w:pStyle w:val="Compact"/>
+        <w:numPr>
+          <w:ilvl w:val="0"/>
+          <w:numId w:val="1009"/>
+        </w:numPr>
+      </w:pPr>
+      <w:r>
+        <w:rPr>
+          <w:b/>
+          <w:bCs/>
+        </w:rPr>
         <w:t xml:space="preserve">No touch screen</w:t>
       </w:r>
       <w:r>
@@ -28586,7 +28824,34 @@
         <w:t xml:space="preserve">user_agent_for_host</w:t>
       </w:r>
       <w:r>
-        <w:t xml:space="preserve">, utils/useragent.c).</w:t>
+        <w:t xml:space="preserve">, utils/useragent.c). The disk cache keys a desktop site's objects apart</w:t>
+      </w:r>
+      <w:r>
+        <w:t xml:space="preserve"> </w:t>
+      </w:r>
+      <w:r>
+        <w:t xml:space="preserve">(</w:t>
+      </w:r>
+      <w:r>
+        <w:rPr>
+          <w:rStyle w:val="VerbatimChar"/>
+        </w:rPr>
+        <w:t xml:space="preserve">D|&lt;url&gt;</w:t>
+      </w:r>
+      <w:r>
+        <w:t xml:space="preserve">,</w:t>
+      </w:r>
+      <w:r>
+        <w:t xml:space="preserve"> </w:t>
+      </w:r>
+      <w:r>
+        <w:rPr>
+          <w:rStyle w:val="VerbatimChar"/>
+        </w:rPr>
+        <w:t xml:space="preserve">onyx_cache.c</w:t>
+      </w:r>
+      <w:r>
+        <w:t xml:space="preserve">): a site switched back to mobile found its desktop copies.</w:t>
       </w:r>
     </w:p>
     <w:p>
@@ -48817,13 +49082,331 @@
       </w:r>
     </w:p>
     <w:bookmarkEnd w:id="49"/>
-    <w:bookmarkStart w:id="50" w:name="X2d96bac25f45ec9241507797951d2bb0b2591ad"/>
+    <w:bookmarkStart w:id="51" w:name="X071cfa7482cdade00d0ba5cc51cdd7b23741f54"/>
     <w:p>
       <w:pPr>
         <w:pStyle w:val="Heading2"/>
       </w:pPr>
       <w:r>
-        <w:t xml:space="preserve">8. Known gaps</w:t>
+        <w:t xml:space="preserve">26. Iframes and the messaging between windows (reCAPTCHA's frames)</w:t>
+      </w:r>
+    </w:p>
+    <w:p>
+      <w:pPr>
+        <w:pStyle w:val="FirstParagraph"/>
+      </w:pPr>
+      <w:r>
+        <w:t xml:space="preserve">The aim: the sites that work through frames -- Google's reCAPTCHA (the "I'm not a robot" box of</w:t>
+      </w:r>
+      <w:r>
+        <w:t xml:space="preserve"> </w:t>
+      </w:r>
+      <w:hyperlink r:id="rId50">
+        <w:r>
+          <w:rPr>
+            <w:rStyle w:val="Hyperlink"/>
+          </w:rPr>
+          <w:t xml:space="preserve">www.google.com/sorry/</w:t>
+        </w:r>
+      </w:hyperlink>
+      <w:r>
+        <w:t xml:space="preserve"> </w:t>
+      </w:r>
+      <w:r>
+        <w:t xml:space="preserve">could not be validated), embedded videos, login and payment widgets,</w:t>
+      </w:r>
+      <w:r>
+        <w:t xml:space="preserve"> </w:t>
+      </w:r>
+      <w:r>
+        <w:t xml:space="preserve">consent managers -- working as in Chrome. What was there: NetSurf's iframes drawn and given the</w:t>
+      </w:r>
+      <w:r>
+        <w:t xml:space="preserve"> </w:t>
+      </w:r>
+      <w:r>
+        <w:t xml:space="preserve">mouse, but each in a JavaScript world of its own (its own QuickJS runtime) with</w:t>
+      </w:r>
+      <w:r>
+        <w:t xml:space="preserve"> </w:t>
+      </w:r>
+      <w:r>
+        <w:rPr>
+          <w:rStyle w:val="VerbatimChar"/>
+        </w:rPr>
+        <w:t xml:space="preserve">window.parent</w:t>
+      </w:r>
+      <w:r>
+        <w:t xml:space="preserve"> </w:t>
+      </w:r>
+      <w:r>
+        <w:t xml:space="preserve">=</w:t>
+      </w:r>
+      <w:r>
+        <w:t xml:space="preserve"> </w:t>
+      </w:r>
+      <w:r>
+        <w:rPr>
+          <w:rStyle w:val="VerbatimChar"/>
+        </w:rPr>
+        <w:t xml:space="preserve">window.top</w:t>
+      </w:r>
+      <w:r>
+        <w:t xml:space="preserve"> </w:t>
+      </w:r>
+      <w:r>
+        <w:t xml:space="preserve">= itself,</w:t>
+      </w:r>
+      <w:r>
+        <w:t xml:space="preserve"> </w:t>
+      </w:r>
+      <w:r>
+        <w:rPr>
+          <w:rStyle w:val="VerbatimChar"/>
+        </w:rPr>
+        <w:t xml:space="preserve">contentWindow</w:t>
+      </w:r>
+      <w:r>
+        <w:t xml:space="preserve"> </w:t>
+      </w:r>
+      <w:r>
+        <w:t xml:space="preserve">/</w:t>
+      </w:r>
+      <w:r>
+        <w:t xml:space="preserve"> </w:t>
+      </w:r>
+      <w:r>
+        <w:rPr>
+          <w:rStyle w:val="VerbatimChar"/>
+        </w:rPr>
+        <w:t xml:space="preserve">contentDocument</w:t>
+      </w:r>
+      <w:r>
+        <w:t xml:space="preserve"> </w:t>
+      </w:r>
+      <w:r>
+        <w:t xml:space="preserve">null,</w:t>
+      </w:r>
+      <w:r>
+        <w:t xml:space="preserve"> </w:t>
+      </w:r>
+      <w:r>
+        <w:rPr>
+          <w:rStyle w:val="VerbatimChar"/>
+        </w:rPr>
+        <w:t xml:space="preserve">window.length</w:t>
+      </w:r>
+      <w:r>
+        <w:t xml:space="preserve"> </w:t>
+      </w:r>
+      <w:r>
+        <w:t xml:space="preserve">undefined,</w:t>
+      </w:r>
+      <w:r>
+        <w:t xml:space="preserve"> </w:t>
+      </w:r>
+      <w:r>
+        <w:rPr>
+          <w:rStyle w:val="VerbatimChar"/>
+        </w:rPr>
+        <w:t xml:space="preserve">postMessage</w:t>
+      </w:r>
+      <w:r>
+        <w:t xml:space="preserve"> </w:t>
+      </w:r>
+      <w:r>
+        <w:t xml:space="preserve">to itself only, no</w:t>
+      </w:r>
+      <w:r>
+        <w:t xml:space="preserve"> </w:t>
+      </w:r>
+      <w:r>
+        <w:rPr>
+          <w:rStyle w:val="VerbatimChar"/>
+        </w:rPr>
+        <w:t xml:space="preserve">load</w:t>
+      </w:r>
+      <w:r>
+        <w:t xml:space="preserve"> </w:t>
+      </w:r>
+      <w:r>
+        <w:t xml:space="preserve">event on the element; an iframe without</w:t>
+      </w:r>
+      <w:r>
+        <w:t xml:space="preserve"> </w:t>
+      </w:r>
+      <w:r>
+        <w:rPr>
+          <w:rStyle w:val="VerbatimChar"/>
+        </w:rPr>
+        <w:t xml:space="preserve">src</w:t>
+      </w:r>
+      <w:r>
+        <w:t xml:space="preserve"> </w:t>
+      </w:r>
+      <w:r>
+        <w:t xml:space="preserve">(srcdoc,</w:t>
+      </w:r>
+      <w:r>
+        <w:t xml:space="preserve"> </w:t>
+      </w:r>
+      <w:r>
+        <w:t xml:space="preserve">about:blank) or hidden (</w:t>
+      </w:r>
+      <w:r>
+        <w:rPr>
+          <w:rStyle w:val="VerbatimChar"/>
+        </w:rPr>
+        <w:t xml:space="preserve">visibility: hidden</w:t>
+      </w:r>
+      <w:r>
+        <w:t xml:space="preserve">: reCAPTCHA's challenge frame waits so, off the page)</w:t>
+      </w:r>
+      <w:r>
+        <w:t xml:space="preserve"> </w:t>
+      </w:r>
+      <w:r>
+        <w:t xml:space="preserve">had no frame at all; and</w:t>
+      </w:r>
+      <w:r>
+        <w:t xml:space="preserve"> </w:t>
+      </w:r>
+      <w:r>
+        <w:rPr>
+          <w:b/>
+          <w:bCs/>
+        </w:rPr>
+        <w:t xml:space="preserve">every DOM change of the parent made all its frames again</w:t>
+      </w:r>
+      <w:r>
+        <w:t xml:space="preserve"> </w:t>
+      </w:r>
+      <w:r>
+        <w:t xml:space="preserve">(a rebox</w:t>
+      </w:r>
+      <w:r>
+        <w:t xml:space="preserve"> </w:t>
+      </w:r>
+      <w:r>
+        <w:t xml:space="preserve">destroyed the iframes' windows and loaded them anew: their scripts' state lost at each change</w:t>
+      </w:r>
+      <w:r>
+        <w:t xml:space="preserve"> </w:t>
+      </w:r>
+      <w:r>
+        <w:t xml:space="preserve">of the page around them).</w:t>
+      </w:r>
+    </w:p>
+    <w:p>
+      <w:pPr>
+        <w:pStyle w:val="BodyText"/>
+      </w:pPr>
+      <w:r>
+        <w:rPr>
+          <w:b/>
+          <w:bCs/>
+        </w:rPr>
+        <w:t xml:space="preserve">The frames follow the document's elements</w:t>
+      </w:r>
+      <w:r>
+        <w:t xml:space="preserve"> </w:t>
+      </w:r>
+      <w:r>
+        <w:t xml:space="preserve">(</w:t>
+      </w:r>
+      <w:r>
+        <w:rPr>
+          <w:rStyle w:val="VerbatimChar"/>
+        </w:rPr>
+        <w:t xml:space="preserve">desktop/frames.c</w:t>
+      </w:r>
+      <w:r>
+        <w:t xml:space="preserve">,</w:t>
+      </w:r>
+      <w:r>
+        <w:t xml:space="preserve"> </w:t>
+      </w:r>
+      <w:r>
+        <w:rPr>
+          <w:rStyle w:val="VerbatimChar"/>
+        </w:rPr>
+        <w:t xml:space="preserve">onyx_frames_sync</w:t>
+      </w:r>
+      <w:r>
+        <w:t xml:space="preserve">). A</w:t>
+      </w:r>
+      <w:r>
+        <w:t xml:space="preserve"> </w:t>
+      </w:r>
+      <w:r>
+        <w:t xml:space="preserve">document's frames are its</w:t>
+      </w:r>
+      <w:r>
+        <w:t xml:space="preserve"> </w:t>
+      </w:r>
+      <w:r>
+        <w:rPr>
+          <w:rStyle w:val="VerbatimChar"/>
+        </w:rPr>
+        <w:t xml:space="preserve">&lt;iframe&gt;</w:t>
+      </w:r>
+      <w:r>
+        <w:t xml:space="preserve"> </w:t>
+      </w:r>
+      <w:r>
+        <w:t xml:space="preserve">elements -- all of them, shown or not, with a</w:t>
+      </w:r>
+      <w:r>
+        <w:t xml:space="preserve"> </w:t>
+      </w:r>
+      <w:r>
+        <w:rPr>
+          <w:rStyle w:val="VerbatimChar"/>
+        </w:rPr>
+        <w:t xml:space="preserve">src</w:t>
+      </w:r>
+      <w:r>
+        <w:t xml:space="preserve">, a</w:t>
+      </w:r>
+      <w:r>
+        <w:t xml:space="preserve"> </w:t>
+      </w:r>
+      <w:r>
+        <w:rPr>
+          <w:rStyle w:val="VerbatimChar"/>
+        </w:rPr>
+        <w:t xml:space="preserve">srcdoc</w:t>
+      </w:r>
+      <w:r>
+        <w:t xml:space="preserve"> </w:t>
+      </w:r>
+      <w:r>
+        <w:t xml:space="preserve">or neither -- each a browser window</w:t>
+      </w:r>
+      <w:r>
+        <w:t xml:space="preserve"> </w:t>
+      </w:r>
+      <w:r>
+        <w:rPr>
+          <w:b/>
+          <w:bCs/>
+        </w:rPr>
+        <w:t xml:space="preserve">kept by its element</w:t>
+      </w:r>
+      <w:r>
+        <w:t xml:space="preserve"> </w:t>
+      </w:r>
+      <w:r>
+        <w:t xml:space="preserve">(</w:t>
+      </w:r>
+      <w:r>
+        <w:rPr>
+          <w:rStyle w:val="VerbatimChar"/>
+        </w:rPr>
+        <w:t xml:space="preserve">bw-&gt;onyx_el</w:t>
+      </w:r>
+      <w:r>
+        <w:t xml:space="preserve">):</w:t>
       </w:r>
     </w:p>
     <w:p>
@@ -48835,46 +49418,142 @@
         </w:numPr>
       </w:pPr>
       <w:r>
-        <w:t xml:space="preserve">JavaScript: synchronous XHR (runs async), multipart request bodies, binary request bodies</w:t>
-      </w:r>
-      <w:r>
-        <w:t xml:space="preserve"> </w:t>
-      </w:r>
-      <w:r>
-        <w:t xml:space="preserve">(sent as text: a NUL ends them); no IndexedDB, editing APIs, Service</w:t>
-      </w:r>
-      <w:r>
-        <w:t xml:space="preserve"> </w:t>
-      </w:r>
-      <w:r>
-        <w:t xml:space="preserve">Workers; CSS</w:t>
-      </w:r>
-      <w:r>
-        <w:t xml:space="preserve"> </w:t>
-      </w:r>
-      <w:r>
-        <w:rPr>
-          <w:rStyle w:val="VerbatimChar"/>
-        </w:rPr>
-        <w:t xml:space="preserve">:active</w:t>
-      </w:r>
-      <w:r>
-        <w:t xml:space="preserve"> </w:t>
-      </w:r>
-      <w:r>
-        <w:t xml:space="preserve">/</w:t>
-      </w:r>
-      <w:r>
-        <w:t xml:space="preserve"> </w:t>
-      </w:r>
-      <w:r>
-        <w:rPr>
-          <w:rStyle w:val="VerbatimChar"/>
-        </w:rPr>
-        <w:t xml:space="preserve">:focus</w:t>
-      </w:r>
-      <w:r>
-        <w:t xml:space="preserve">.</w:t>
+        <w:rPr>
+          <w:rStyle w:val="VerbatimChar"/>
+        </w:rPr>
+        <w:t xml:space="preserve">bw-&gt;iframes</w:t>
+      </w:r>
+      <w:r>
+        <w:t xml:space="preserve"> </w:t>
+      </w:r>
+      <w:r>
+        <w:t xml:space="preserve">is an array of pointers (each window its own allocation), in the document's</w:t>
+      </w:r>
+      <w:r>
+        <w:t xml:space="preserve"> </w:t>
+      </w:r>
+      <w:r>
+        <w:t xml:space="preserve">order; the sync (at the document's first layout, at each rebox, and when a script asks:</w:t>
+      </w:r>
+      <w:r>
+        <w:t xml:space="preserve"> </w:t>
+      </w:r>
+      <w:r>
+        <w:rPr>
+          <w:rStyle w:val="VerbatimChar"/>
+        </w:rPr>
+        <w:t xml:space="preserve">contentWindow</w:t>
+      </w:r>
+      <w:r>
+        <w:t xml:space="preserve"> </w:t>
+      </w:r>
+      <w:r>
+        <w:t xml:space="preserve">right after</w:t>
+      </w:r>
+      <w:r>
+        <w:t xml:space="preserve"> </w:t>
+      </w:r>
+      <w:r>
+        <w:rPr>
+          <w:rStyle w:val="VerbatimChar"/>
+        </w:rPr>
+        <w:t xml:space="preserve">appendChild</w:t>
+      </w:r>
+      <w:r>
+        <w:t xml:space="preserve">,</w:t>
+      </w:r>
+      <w:r>
+        <w:t xml:space="preserve"> </w:t>
+      </w:r>
+      <w:r>
+        <w:rPr>
+          <w:rStyle w:val="VerbatimChar"/>
+        </w:rPr>
+        <w:t xml:space="preserve">window.length</w:t>
+      </w:r>
+      <w:r>
+        <w:t xml:space="preserve">,</w:t>
+      </w:r>
+      <w:r>
+        <w:t xml:space="preserve"> </w:t>
+      </w:r>
+      <w:r>
+        <w:rPr>
+          <w:rStyle w:val="VerbatimChar"/>
+        </w:rPr>
+        <w:t xml:space="preserve">window[i]</w:t>
+      </w:r>
+      <w:r>
+        <w:t xml:space="preserve">) keeps the windows of</w:t>
+      </w:r>
+      <w:r>
+        <w:t xml:space="preserve"> </w:t>
+      </w:r>
+      <w:r>
+        <w:t xml:space="preserve">the elements still there, makes the new ones, destroys the ones whose element left</w:t>
+      </w:r>
+      <w:r>
+        <w:t xml:space="preserve"> </w:t>
+      </w:r>
+      <w:r>
+        <w:t xml:space="preserve">(</w:t>
+      </w:r>
+      <w:r>
+        <w:rPr>
+          <w:rStyle w:val="VerbatimChar"/>
+        </w:rPr>
+        <w:t xml:space="preserve">html_rebox</w:t>
+      </w:r>
+      <w:r>
+        <w:t xml:space="preserve"> </w:t>
+      </w:r>
+      <w:r>
+        <w:t xml:space="preserve">used to destroy them all). The box tree only links them:</w:t>
+      </w:r>
+      <w:r>
+        <w:t xml:space="preserve"> </w:t>
+      </w:r>
+      <w:r>
+        <w:rPr>
+          <w:rStyle w:val="VerbatimChar"/>
+        </w:rPr>
+        <w:t xml:space="preserve">box-&gt;iframe</w:t>
+      </w:r>
+      <w:r>
+        <w:t xml:space="preserve"> </w:t>
+      </w:r>
+      <w:r>
+        <w:t xml:space="preserve">set on</w:t>
+      </w:r>
+      <w:r>
+        <w:t xml:space="preserve"> </w:t>
+      </w:r>
+      <w:r>
+        <w:t xml:space="preserve">the new boxes (</w:t>
+      </w:r>
+      <w:r>
+        <w:rPr>
+          <w:rStyle w:val="VerbatimChar"/>
+        </w:rPr>
+        <w:t xml:space="preserve">content_html_iframe.node</w:t>
+      </w:r>
+      <w:r>
+        <w:t xml:space="preserve">); a frame whose element has no box (</w:t>
+      </w:r>
+      <w:r>
+        <w:rPr>
+          <w:rStyle w:val="VerbatimChar"/>
+        </w:rPr>
+        <w:t xml:space="preserve">display: none</w:t>
+      </w:r>
+      <w:r>
+        <w:t xml:space="preserve">,</w:t>
+      </w:r>
+      <w:r>
+        <w:t xml:space="preserve"> </w:t>
+      </w:r>
+      <w:r>
+        <w:t xml:space="preserve">its document still loading) is laid out at 300 x 150 and not drawn.</w:t>
       </w:r>
     </w:p>
     <w:p>
@@ -48886,91 +49565,41 @@
         </w:numPr>
       </w:pPr>
       <w:r>
-        <w:t xml:space="preserve">The network APIs (§19): a worker runs on the UI thread (a long computation in a worker</w:t>
-      </w:r>
-      <w:r>
-        <w:t xml:space="preserve"> </w:t>
-      </w:r>
-      <w:r>
-        <w:t xml:space="preserve">holds the window as a page's script does;</w:t>
-      </w:r>
-      <w:r>
-        <w:t xml:space="preserve"> </w:t>
-      </w:r>
-      <w:r>
-        <w:rPr>
-          <w:rStyle w:val="VerbatimChar"/>
-        </w:rPr>
-        <w:t xml:space="preserve">script_timeout</w:t>
-      </w:r>
-      <w:r>
-        <w:t xml:space="preserve"> </w:t>
-      </w:r>
-      <w:r>
-        <w:t xml:space="preserve">stops it); an</w:t>
-      </w:r>
-      <w:r>
-        <w:t xml:space="preserve"> </w:t>
-      </w:r>
-      <w:r>
-        <w:rPr>
-          <w:rStyle w:val="VerbatimChar"/>
-        </w:rPr>
-        <w:t xml:space="preserve">importScripts</w:t>
-      </w:r>
-      <w:r>
-        <w:t xml:space="preserve"> </w:t>
-      </w:r>
-      <w:r>
-        <w:t xml:space="preserve">whose URL is not a literal in the script, over http(s), blocks the UI thread while it is</w:t>
-      </w:r>
-      <w:r>
-        <w:t xml:space="preserve"> </w:t>
-      </w:r>
-      <w:r>
-        <w:t xml:space="preserve">read; a SharedWorker is shared within its document only; no</w:t>
-      </w:r>
-      <w:r>
-        <w:t xml:space="preserve"> </w:t>
-      </w:r>
-      <w:r>
-        <w:rPr>
-          <w:rStyle w:val="VerbatimChar"/>
-        </w:rPr>
-        <w:t xml:space="preserve">MessagePort</w:t>
-      </w:r>
-      <w:r>
-        <w:t xml:space="preserve"> </w:t>
-      </w:r>
-      <w:r>
-        <w:t xml:space="preserve">transferred to a</w:t>
-      </w:r>
-      <w:r>
-        <w:t xml:space="preserve"> </w:t>
-      </w:r>
-      <w:r>
-        <w:t xml:space="preserve">worker, no</w:t>
-      </w:r>
-      <w:r>
-        <w:t xml:space="preserve"> </w:t>
-      </w:r>
-      <w:r>
-        <w:rPr>
-          <w:rStyle w:val="VerbatimChar"/>
-        </w:rPr>
-        <w:t xml:space="preserve">OffscreenCanvas</w:t>
-      </w:r>
-      <w:r>
-        <w:t xml:space="preserve">,</w:t>
-      </w:r>
-      <w:r>
-        <w:t xml:space="preserve"> </w:t>
-      </w:r>
-      <w:r>
-        <w:rPr>
-          <w:rStyle w:val="VerbatimChar"/>
-        </w:rPr>
-        <w:t xml:space="preserve">SharedArrayBuffer</w:t>
+        <w:t xml:space="preserve">A frame is</w:t>
+      </w:r>
+      <w:r>
+        <w:t xml:space="preserve"> </w:t>
+      </w:r>
+      <w:r>
+        <w:rPr>
+          <w:b/>
+          <w:bCs/>
+        </w:rPr>
+        <w:t xml:space="preserve">navigated when what its element asks for changes</w:t>
+      </w:r>
+      <w:r>
+        <w:t xml:space="preserve"> </w:t>
+      </w:r>
+      <w:r>
+        <w:t xml:space="preserve">(</w:t>
+      </w:r>
+      <w:r>
+        <w:rPr>
+          <w:rStyle w:val="VerbatimChar"/>
+        </w:rPr>
+        <w:t xml:space="preserve">bw-&gt;onyx_src</w:t>
+      </w:r>
+      <w:r>
+        <w:t xml:space="preserve">:</w:t>
+      </w:r>
+      <w:r>
+        <w:t xml:space="preserve"> </w:t>
+      </w:r>
+      <w:r>
+        <w:rPr>
+          <w:rStyle w:val="VerbatimChar"/>
+        </w:rPr>
+        <w:t xml:space="preserve">U:&lt;url&gt;</w:t>
       </w:r>
       <w:r>
         <w:t xml:space="preserve"> </w:t>
@@ -48985,25 +49614,127 @@
         <w:rPr>
           <w:rStyle w:val="VerbatimChar"/>
         </w:rPr>
-        <w:t xml:space="preserve">Atomics</w:t>
-      </w:r>
-      <w:r>
-        <w:t xml:space="preserve"> </w:t>
-      </w:r>
-      <w:r>
-        <w:t xml:space="preserve">between workers; the</w:t>
-      </w:r>
-      <w:r>
-        <w:t xml:space="preserve"> </w:t>
-      </w:r>
-      <w:r>
-        <w:t xml:space="preserve">WebSocket client sends its messages uncompressed (permessage-deflate inflates only) and</w:t>
-      </w:r>
-      <w:r>
-        <w:t xml:space="preserve"> </w:t>
-      </w:r>
-      <w:r>
-        <w:t xml:space="preserve">never pings; CORS is not checked for EventSource either.</w:t>
+        <w:t xml:space="preserve">D:&lt;srcdoc&gt;</w:t>
+      </w:r>
+      <w:r>
+        <w:t xml:space="preserve">): a script's</w:t>
+      </w:r>
+      <w:r>
+        <w:t xml:space="preserve"> </w:t>
+      </w:r>
+      <w:r>
+        <w:rPr>
+          <w:rStyle w:val="VerbatimChar"/>
+        </w:rPr>
+        <w:t xml:space="preserve">iframe.src = ...</w:t>
+      </w:r>
+      <w:r>
+        <w:t xml:space="preserve"> </w:t>
+      </w:r>
+      <w:r>
+        <w:t xml:space="preserve">loads it again; the window's own navigations</w:t>
+      </w:r>
+      <w:r>
+        <w:t xml:space="preserve"> </w:t>
+      </w:r>
+      <w:r>
+        <w:t xml:space="preserve">(its links,</w:t>
+      </w:r>
+      <w:r>
+        <w:t xml:space="preserve"> </w:t>
+      </w:r>
+      <w:r>
+        <w:rPr>
+          <w:rStyle w:val="VerbatimChar"/>
+        </w:rPr>
+        <w:t xml:space="preserve">location</w:t>
+      </w:r>
+      <w:r>
+        <w:t xml:space="preserve">) do not touch it.</w:t>
+      </w:r>
+      <w:r>
+        <w:t xml:space="preserve"> </w:t>
+      </w:r>
+      <w:r>
+        <w:rPr>
+          <w:rStyle w:val="VerbatimChar"/>
+        </w:rPr>
+        <w:t xml:space="preserve">srcdoc</w:t>
+      </w:r>
+      <w:r>
+        <w:t xml:space="preserve"> </w:t>
+      </w:r>
+      <w:r>
+        <w:t xml:space="preserve">is loaded as a</w:t>
+      </w:r>
+      <w:r>
+        <w:t xml:space="preserve"> </w:t>
+      </w:r>
+      <w:r>
+        <w:rPr>
+          <w:rStyle w:val="VerbatimChar"/>
+        </w:rPr>
+        <w:t xml:space="preserve">data:text/html</w:t>
+      </w:r>
+      <w:r>
+        <w:t xml:space="preserve"> </w:t>
+      </w:r>
+      <w:r>
+        <w:t xml:space="preserve">URL whose</w:t>
+      </w:r>
+      <w:r>
+        <w:t xml:space="preserve"> </w:t>
+      </w:r>
+      <w:r>
+        <w:t xml:space="preserve">document takes the parent's base URL (</w:t>
+      </w:r>
+      <w:r>
+        <w:rPr>
+          <w:rStyle w:val="VerbatimChar"/>
+        </w:rPr>
+        <w:t xml:space="preserve">onyx_frames_srcdoc_base</w:t>
+      </w:r>
+      <w:r>
+        <w:t xml:space="preserve">, read by</w:t>
+      </w:r>
+      <w:r>
+        <w:t xml:space="preserve"> </w:t>
+      </w:r>
+      <w:r>
+        <w:rPr>
+          <w:rStyle w:val="VerbatimChar"/>
+        </w:rPr>
+        <w:t xml:space="preserve">html.c</w:t>
+      </w:r>
+      <w:r>
+        <w:t xml:space="preserve"> </w:t>
+      </w:r>
+      <w:r>
+        <w:t xml:space="preserve">where the</w:t>
+      </w:r>
+      <w:r>
+        <w:t xml:space="preserve"> </w:t>
+      </w:r>
+      <w:r>
+        <w:t xml:space="preserve">base URL is set); no src:</w:t>
+      </w:r>
+      <w:r>
+        <w:t xml:space="preserve"> </w:t>
+      </w:r>
+      <w:r>
+        <w:rPr>
+          <w:rStyle w:val="VerbatimChar"/>
+        </w:rPr>
+        <w:t xml:space="preserve">about:blank</w:t>
+      </w:r>
+      <w:r>
+        <w:t xml:space="preserve">. A frame showing one of its ancestors' URLs (or 10</w:t>
+      </w:r>
+      <w:r>
+        <w:t xml:space="preserve"> </w:t>
+      </w:r>
+      <w:r>
+        <w:t xml:space="preserve">frames deep) stays blank, as in Chrome.</w:t>
       </w:r>
     </w:p>
     <w:p>
@@ -49015,31 +49746,112 @@
         </w:numPr>
       </w:pPr>
       <w:r>
-        <w:t xml:space="preserve">The network (§24): no revocation checks, no CSP, no SameSite cookies, no</w:t>
-      </w:r>
-      <w:r>
-        <w:t xml:space="preserve"> </w:t>
-      </w:r>
-      <w:r>
-        <w:t xml:space="preserve">CORS for the core's loads (EventSource, fonts,</w:t>
-      </w:r>
-      <w:r>
-        <w:t xml:space="preserve"> </w:t>
-      </w:r>
-      <w:r>
-        <w:rPr>
-          <w:rStyle w:val="VerbatimChar"/>
-        </w:rPr>
-        <w:t xml:space="preserve">&lt;img crossorigin&gt;</w:t>
-      </w:r>
-      <w:r>
-        <w:t xml:space="preserve">, module scripts), no</w:t>
-      </w:r>
-      <w:r>
-        <w:t xml:space="preserve"> </w:t>
-      </w:r>
-      <w:r>
-        <w:t xml:space="preserve">HTTP/3, no back-forward cache.</w:t>
+        <w:rPr>
+          <w:rStyle w:val="VerbatimChar"/>
+        </w:rPr>
+        <w:t xml:space="preserve">sandbox</w:t>
+      </w:r>
+      <w:r>
+        <w:t xml:space="preserve">: read when the frame is navigated (</w:t>
+      </w:r>
+      <w:r>
+        <w:rPr>
+          <w:rStyle w:val="VerbatimChar"/>
+        </w:rPr>
+        <w:t xml:space="preserve">ONYX_SANDBOX*</w:t>
+      </w:r>
+      <w:r>
+        <w:t xml:space="preserve">); without</w:t>
+      </w:r>
+      <w:r>
+        <w:t xml:space="preserve"> </w:t>
+      </w:r>
+      <w:r>
+        <w:rPr>
+          <w:rStyle w:val="VerbatimChar"/>
+        </w:rPr>
+        <w:t xml:space="preserve">allow-scripts</w:t>
+      </w:r>
+      <w:r>
+        <w:t xml:space="preserve"> </w:t>
+      </w:r>
+      <w:r>
+        <w:t xml:space="preserve">the</w:t>
+      </w:r>
+      <w:r>
+        <w:t xml:space="preserve"> </w:t>
+      </w:r>
+      <w:r>
+        <w:t xml:space="preserve">document gets no JavaScript thread (</w:t>
+      </w:r>
+      <w:r>
+        <w:rPr>
+          <w:rStyle w:val="VerbatimChar"/>
+        </w:rPr>
+        <w:t xml:space="preserve">CONTENT_MSG_GETTHREAD</w:t>
+      </w:r>
+      <w:r>
+        <w:t xml:space="preserve"> </w:t>
+      </w:r>
+      <w:r>
+        <w:t xml:space="preserve">refused), without</w:t>
+      </w:r>
+      <w:r>
+        <w:t xml:space="preserve"> </w:t>
+      </w:r>
+      <w:r>
+        <w:rPr>
+          <w:rStyle w:val="VerbatimChar"/>
+        </w:rPr>
+        <w:t xml:space="preserve">allow-same-origin</w:t>
+      </w:r>
+      <w:r>
+        <w:t xml:space="preserve"> </w:t>
+      </w:r>
+      <w:r>
+        <w:t xml:space="preserve">its origin is opaque.</w:t>
+      </w:r>
+      <w:r>
+        <w:t xml:space="preserve"> </w:t>
+      </w:r>
+      <w:r>
+        <w:rPr>
+          <w:rStyle w:val="VerbatimChar"/>
+        </w:rPr>
+        <w:t xml:space="preserve">allow</w:t>
+      </w:r>
+      <w:r>
+        <w:t xml:space="preserve">,</w:t>
+      </w:r>
+      <w:r>
+        <w:t xml:space="preserve"> </w:t>
+      </w:r>
+      <w:r>
+        <w:rPr>
+          <w:rStyle w:val="VerbatimChar"/>
+        </w:rPr>
+        <w:t xml:space="preserve">loading</w:t>
+      </w:r>
+      <w:r>
+        <w:t xml:space="preserve">,</w:t>
+      </w:r>
+      <w:r>
+        <w:t xml:space="preserve"> </w:t>
+      </w:r>
+      <w:r>
+        <w:rPr>
+          <w:rStyle w:val="VerbatimChar"/>
+        </w:rPr>
+        <w:t xml:space="preserve">referrerpolicy</w:t>
+      </w:r>
+      <w:r>
+        <w:t xml:space="preserve">... are</w:t>
+      </w:r>
+      <w:r>
+        <w:t xml:space="preserve"> </w:t>
+      </w:r>
+      <w:r>
+        <w:t xml:space="preserve">reflected and otherwise ignored.</w:t>
       </w:r>
     </w:p>
     <w:p>
@@ -49051,142 +49863,74 @@
         </w:numPr>
       </w:pPr>
       <w:r>
-        <w:t xml:space="preserve">Shadow DOM (§20): the manual slot assignment's rendering,</w:t>
-      </w:r>
-      <w:r>
-        <w:t xml:space="preserve"> </w:t>
-      </w:r>
-      <w:r>
-        <w:rPr>
-          <w:rStyle w:val="VerbatimChar"/>
-        </w:rPr>
-        <w:t xml:space="preserve">exportparts</w:t>
-      </w:r>
-      <w:r>
-        <w:t xml:space="preserve">, a clonable root's</w:t>
-      </w:r>
-      <w:r>
-        <w:t xml:space="preserve"> </w:t>
-      </w:r>
-      <w:r>
-        <w:t xml:space="preserve">cloning,</w:t>
-      </w:r>
-      <w:r>
-        <w:t xml:space="preserve"> </w:t>
-      </w:r>
-      <w:r>
-        <w:rPr>
-          <w:rStyle w:val="VerbatimChar"/>
-        </w:rPr>
-        <w:t xml:space="preserve">&lt;link&gt;</w:t>
-      </w:r>
-      <w:r>
-        <w:t xml:space="preserve"> </w:t>
-      </w:r>
-      <w:r>
-        <w:t xml:space="preserve">/</w:t>
-      </w:r>
-      <w:r>
-        <w:t xml:space="preserve"> </w:t>
-      </w:r>
-      <w:r>
-        <w:rPr>
-          <w:rStyle w:val="VerbatimChar"/>
-        </w:rPr>
-        <w:t xml:space="preserve">@import</w:t>
-      </w:r>
-      <w:r>
-        <w:t xml:space="preserve"> </w:t>
-      </w:r>
-      <w:r>
-        <w:t xml:space="preserve">/</w:t>
-      </w:r>
-      <w:r>
-        <w:t xml:space="preserve"> </w:t>
-      </w:r>
-      <w:r>
-        <w:rPr>
-          <w:rStyle w:val="VerbatimChar"/>
-        </w:rPr>
-        <w:t xml:space="preserve">@font-face</w:t>
-      </w:r>
-      <w:r>
-        <w:t xml:space="preserve"> </w:t>
-      </w:r>
-      <w:r>
-        <w:t xml:space="preserve">in shadow trees,</w:t>
-      </w:r>
-      <w:r>
-        <w:t xml:space="preserve"> </w:t>
-      </w:r>
-      <w:r>
-        <w:rPr>
-          <w:rStyle w:val="VerbatimChar"/>
-        </w:rPr>
-        <w:t xml:space="preserve">:host</w:t>
-      </w:r>
-      <w:r>
-        <w:t xml:space="preserve"> </w:t>
-      </w:r>
-      <w:r>
-        <w:t xml:space="preserve">in</w:t>
-      </w:r>
-      <w:r>
-        <w:t xml:space="preserve"> </w:t>
-      </w:r>
-      <w:r>
-        <w:rPr>
-          <w:rStyle w:val="VerbatimChar"/>
-        </w:rPr>
-        <w:t xml:space="preserve">matches()</w:t>
-      </w:r>
-      <w:r>
-        <w:t xml:space="preserve">;</w:t>
-      </w:r>
-      <w:r>
-        <w:t xml:space="preserve"> </w:t>
-      </w:r>
-      <w:r>
-        <w:rPr>
-          <w:rStyle w:val="VerbatimChar"/>
-        </w:rPr>
-        <w:t xml:space="preserve">::before</w:t>
-      </w:r>
-      <w:r>
-        <w:t xml:space="preserve"> </w:t>
-      </w:r>
-      <w:r>
-        <w:t xml:space="preserve">/</w:t>
-      </w:r>
-      <w:r>
-        <w:t xml:space="preserve"> </w:t>
-      </w:r>
-      <w:r>
-        <w:rPr>
-          <w:rStyle w:val="VerbatimChar"/>
-        </w:rPr>
-        <w:t xml:space="preserve">::after</w:t>
-      </w:r>
-      <w:r>
-        <w:t xml:space="preserve"> </w:t>
-      </w:r>
-      <w:r>
-        <w:t xml:space="preserve">of a</w:t>
-      </w:r>
-      <w:r>
-        <w:t xml:space="preserve"> </w:t>
-      </w:r>
-      <w:r>
-        <w:rPr>
-          <w:rStyle w:val="VerbatimChar"/>
-        </w:rPr>
-        <w:t xml:space="preserve">display: contents</w:t>
-      </w:r>
-      <w:r>
-        <w:t xml:space="preserve"> </w:t>
-      </w:r>
-      <w:r>
-        <w:t xml:space="preserve">element.</w:t>
+        <w:rPr>
+          <w:rStyle w:val="VerbatimChar"/>
+          <w:b/>
+          <w:bCs/>
+        </w:rPr>
+        <w:t xml:space="preserve">load</w:t>
+      </w:r>
+      <w:r>
+        <w:rPr>
+          <w:b/>
+          <w:bCs/>
+        </w:rPr>
+        <w:t xml:space="preserve"> </w:t>
+      </w:r>
+      <w:r>
+        <w:rPr>
+          <w:b/>
+          <w:bCs/>
+        </w:rPr>
+        <w:t xml:space="preserve">on the element</w:t>
+      </w:r>
+      <w:r>
+        <w:t xml:space="preserve">: when a frame's document has loaded (its window's load event fired:</w:t>
+      </w:r>
+      <w:r>
+        <w:t xml:space="preserve"> </w:t>
+      </w:r>
+      <w:r>
+        <w:rPr>
+          <w:rStyle w:val="VerbatimChar"/>
+        </w:rPr>
+        <w:t xml:space="preserve">qjs_load_later</w:t>
+      </w:r>
+      <w:r>
+        <w:t xml:space="preserve">; a document without scripts or not HTML:</w:t>
+      </w:r>
+      <w:r>
+        <w:t xml:space="preserve"> </w:t>
+      </w:r>
+      <w:r>
+        <w:rPr>
+          <w:rStyle w:val="VerbatimChar"/>
+        </w:rPr>
+        <w:t xml:space="preserve">onyx_frame_content_done</w:t>
+      </w:r>
+      <w:r>
+        <w:t xml:space="preserve">; a failed</w:t>
+      </w:r>
+      <w:r>
+        <w:t xml:space="preserve"> </w:t>
+      </w:r>
+      <w:r>
+        <w:t xml:space="preserve">load too, as Chrome) -- again at each navigation of the frame. A window's own load waits for</w:t>
+      </w:r>
+      <w:r>
+        <w:t xml:space="preserve"> </w:t>
+      </w:r>
+      <w:r>
+        <w:t xml:space="preserve">its frames' (</w:t>
+      </w:r>
+      <w:r>
+        <w:rPr>
+          <w:rStyle w:val="VerbatimChar"/>
+        </w:rPr>
+        <w:t xml:space="preserve">onyx_frames_loading</w:t>
+      </w:r>
+      <w:r>
+        <w:t xml:space="preserve">, within the 30 s the load waits at most).</w:t>
       </w:r>
     </w:p>
     <w:p>
@@ -49198,16 +49942,13 @@
         </w:numPr>
       </w:pPr>
       <w:r>
-        <w:t xml:space="preserve">The compositing layers' gaps (§21: a real perspective,</w:t>
-      </w:r>
-      <w:r>
-        <w:t xml:space="preserve"> </w:t>
-      </w:r>
-      <w:r>
-        <w:rPr>
-          <w:rStyle w:val="VerbatimChar"/>
-        </w:rPr>
-        <w:t xml:space="preserve">clip-path</w:t>
+        <w:t xml:space="preserve">An iframe's window as the scripts see it: its size (</w:t>
+      </w:r>
+      <w:r>
+        <w:rPr>
+          <w:rStyle w:val="VerbatimChar"/>
+        </w:rPr>
+        <w:t xml:space="preserve">innerWidth</w:t>
       </w:r>
       <w:r>
         <w:t xml:space="preserve"> </w:t>
@@ -49222,25 +49963,388 @@
         <w:rPr>
           <w:rStyle w:val="VerbatimChar"/>
         </w:rPr>
-        <w:t xml:space="preserve">mask</w:t>
-      </w:r>
-      <w:r>
-        <w:t xml:space="preserve"> </w:t>
-      </w:r>
-      <w:r>
-        <w:t xml:space="preserve">on a layer, the</w:t>
-      </w:r>
-      <w:r>
-        <w:t xml:space="preserve"> </w:t>
-      </w:r>
-      <w:r>
-        <w:t xml:space="preserve">non-separable blend modes); animations: §22's "Not done"; GPU compositing: §25's (scrollers</w:t>
-      </w:r>
-      <w:r>
-        <w:t xml:space="preserve"> </w:t>
-      </w:r>
-      <w:r>
-        <w:t xml:space="preserve">and groups as layers, fixed boxes that stay in view).</w:t>
+        <w:t xml:space="preserve">innerHeight</w:t>
+      </w:r>
+      <w:r>
+        <w:t xml:space="preserve">), its scroll</w:t>
+      </w:r>
+      <w:r>
+        <w:t xml:space="preserve"> </w:t>
+      </w:r>
+      <w:r>
+        <w:t xml:space="preserve">(</w:t>
+      </w:r>
+      <w:r>
+        <w:rPr>
+          <w:rStyle w:val="VerbatimChar"/>
+        </w:rPr>
+        <w:t xml:space="preserve">scrollX</w:t>
+      </w:r>
+      <w:r>
+        <w:t xml:space="preserve"> </w:t>
+      </w:r>
+      <w:r>
+        <w:t xml:space="preserve">/</w:t>
+      </w:r>
+      <w:r>
+        <w:t xml:space="preserve"> </w:t>
+      </w:r>
+      <w:r>
+        <w:rPr>
+          <w:rStyle w:val="VerbatimChar"/>
+        </w:rPr>
+        <w:t xml:space="preserve">scrollY</w:t>
+      </w:r>
+      <w:r>
+        <w:t xml:space="preserve">,</w:t>
+      </w:r>
+      <w:r>
+        <w:t xml:space="preserve"> </w:t>
+      </w:r>
+      <w:r>
+        <w:rPr>
+          <w:rStyle w:val="VerbatimChar"/>
+        </w:rPr>
+        <w:t xml:space="preserve">scrollTo</w:t>
+      </w:r>
+      <w:r>
+        <w:t xml:space="preserve">) are its scrollbars' (</w:t>
+      </w:r>
+      <w:r>
+        <w:rPr>
+          <w:rStyle w:val="VerbatimChar"/>
+        </w:rPr>
+        <w:t xml:space="preserve">qjs.c</w:t>
+      </w:r>
+      <w:r>
+        <w:t xml:space="preserve">: the frame has no gui</w:t>
+      </w:r>
+      <w:r>
+        <w:t xml:space="preserve"> </w:t>
+      </w:r>
+      <w:r>
+        <w:t xml:space="preserve">window), and a scroll of the frame sends its document a</w:t>
+      </w:r>
+      <w:r>
+        <w:t xml:space="preserve"> </w:t>
+      </w:r>
+      <w:r>
+        <w:rPr>
+          <w:rStyle w:val="VerbatimChar"/>
+        </w:rPr>
+        <w:t xml:space="preserve">scroll</w:t>
+      </w:r>
+      <w:r>
+        <w:t xml:space="preserve"> </w:t>
+      </w:r>
+      <w:r>
+        <w:t xml:space="preserve">event (</w:t>
+      </w:r>
+      <w:r>
+        <w:rPr>
+          <w:rStyle w:val="VerbatimChar"/>
+        </w:rPr>
+        <w:t xml:space="preserve">frames.c</w:t>
+      </w:r>
+      <w:r>
+        <w:t xml:space="preserve">'s scrollbar</w:t>
+      </w:r>
+      <w:r>
+        <w:t xml:space="preserve"> </w:t>
+      </w:r>
+      <w:r>
+        <w:t xml:space="preserve">callback). The scrollbars of an iframe are decided from its content alone (a frame first laid</w:t>
+      </w:r>
+      <w:r>
+        <w:t xml:space="preserve"> </w:t>
+      </w:r>
+      <w:r>
+        <w:t xml:space="preserve">out at another size kept a horizontal scrollbar it did not need).</w:t>
+      </w:r>
+    </w:p>
+    <w:p>
+      <w:pPr>
+        <w:pStyle w:val="FirstParagraph"/>
+      </w:pPr>
+      <w:r>
+        <w:rPr>
+          <w:b/>
+          <w:bCs/>
+        </w:rPr>
+        <w:t xml:space="preserve">One runtime per tab.</w:t>
+      </w:r>
+      <w:r>
+        <w:t xml:space="preserve"> </w:t>
+      </w:r>
+      <w:r>
+        <w:t xml:space="preserve">The frames of a tab run in its QuickJS runtime (</w:t>
+      </w:r>
+      <w:r>
+        <w:rPr>
+          <w:rStyle w:val="VerbatimChar"/>
+        </w:rPr>
+        <w:t xml:space="preserve">js_heap_share</w:t>
+      </w:r>
+      <w:r>
+        <w:t xml:space="preserve">: the</w:t>
+      </w:r>
+      <w:r>
+        <w:t xml:space="preserve"> </w:t>
+      </w:r>
+      <w:r>
+        <w:t xml:space="preserve">iframe's window takes its parent's heap;</w:t>
+      </w:r>
+      <w:r>
+        <w:t xml:space="preserve"> </w:t>
+      </w:r>
+      <w:r>
+        <w:rPr>
+          <w:rStyle w:val="VerbatimChar"/>
+        </w:rPr>
+        <w:t xml:space="preserve">js_destroyheap</w:t>
+      </w:r>
+      <w:r>
+        <w:t xml:space="preserve"> </w:t>
+      </w:r>
+      <w:r>
+        <w:t xml:space="preserve">gives each share back), each document</w:t>
+      </w:r>
+      <w:r>
+        <w:t xml:space="preserve"> </w:t>
+      </w:r>
+      <w:r>
+        <w:t xml:space="preserve">in a realm (context) of its own: a same-origin frame's objects are the objects themselves, as in</w:t>
+      </w:r>
+      <w:r>
+        <w:t xml:space="preserve"> </w:t>
+      </w:r>
+      <w:r>
+        <w:t xml:space="preserve">a browser. What that needed in</w:t>
+      </w:r>
+      <w:r>
+        <w:t xml:space="preserve"> </w:t>
+      </w:r>
+      <w:r>
+        <w:rPr>
+          <w:rStyle w:val="VerbatimChar"/>
+        </w:rPr>
+        <w:t xml:space="preserve">qjs.c</w:t>
+      </w:r>
+      <w:r>
+        <w:t xml:space="preserve">: a script's changes to another frame's DOM (or the</w:t>
+      </w:r>
+      <w:r>
+        <w:t xml:space="preserve"> </w:t>
+      </w:r>
+      <w:r>
+        <w:t xml:space="preserve">runtime's shared promise jobs) lay that frame out again (</w:t>
+      </w:r>
+      <w:r>
+        <w:rPr>
+          <w:rStyle w:val="VerbatimChar"/>
+        </w:rPr>
+        <w:t xml:space="preserve">qjs_leave</w:t>
+      </w:r>
+      <w:r>
+        <w:t xml:space="preserve"> </w:t>
+      </w:r>
+      <w:r>
+        <w:t xml:space="preserve">looks at the heap's other</w:t>
+      </w:r>
+      <w:r>
+        <w:t xml:space="preserve"> </w:t>
+      </w:r>
+      <w:r>
+        <w:t xml:space="preserve">threads); a thread freed while another realm may still hold its objects keeps its record -- its</w:t>
+      </w:r>
+      <w:r>
+        <w:t xml:space="preserve"> </w:t>
+      </w:r>
+      <w:r>
+        <w:t xml:space="preserve">natives find a closed thread with nothing in it, not freed memory -- until the heap goes</w:t>
+      </w:r>
+      <w:r>
+        <w:t xml:space="preserve"> </w:t>
+      </w:r>
+      <w:r>
+        <w:t xml:space="preserve">(</w:t>
+      </w:r>
+      <w:r>
+        <w:rPr>
+          <w:rStyle w:val="VerbatimChar"/>
+        </w:rPr>
+        <w:t xml:space="preserve">zombie</w:t>
+      </w:r>
+      <w:r>
+        <w:t xml:space="preserve">).</w:t>
+      </w:r>
+    </w:p>
+    <w:p>
+      <w:pPr>
+        <w:pStyle w:val="BodyText"/>
+      </w:pPr>
+      <w:r>
+        <w:rPr>
+          <w:b/>
+          <w:bCs/>
+        </w:rPr>
+        <w:t xml:space="preserve">WindowProxy</w:t>
+      </w:r>
+      <w:r>
+        <w:t xml:space="preserve"> </w:t>
+      </w:r>
+      <w:r>
+        <w:t xml:space="preserve">(</w:t>
+      </w:r>
+      <w:r>
+        <w:rPr>
+          <w:rStyle w:val="VerbatimChar"/>
+        </w:rPr>
+        <w:t xml:space="preserve">net.js</w:t>
+      </w:r>
+      <w:r>
+        <w:t xml:space="preserve">, the frames section; the natives in</w:t>
+      </w:r>
+      <w:r>
+        <w:t xml:space="preserve"> </w:t>
+      </w:r>
+      <w:r>
+        <w:rPr>
+          <w:rStyle w:val="VerbatimChar"/>
+        </w:rPr>
+        <w:t xml:space="preserve">quickjs/qjs_frames.c</w:t>
+      </w:r>
+      <w:r>
+        <w:t xml:space="preserve">). Each</w:t>
+      </w:r>
+      <w:r>
+        <w:t xml:space="preserve"> </w:t>
+      </w:r>
+      <w:r>
+        <w:t xml:space="preserve">window has a frame id (</w:t>
+      </w:r>
+      <w:r>
+        <w:rPr>
+          <w:rStyle w:val="VerbatimChar"/>
+        </w:rPr>
+        <w:t xml:space="preserve">onyx_frame_id</w:t>
+      </w:r>
+      <w:r>
+        <w:t xml:space="preserve">); another window --</w:t>
+      </w:r>
+      <w:r>
+        <w:t xml:space="preserve"> </w:t>
+      </w:r>
+      <w:r>
+        <w:rPr>
+          <w:rStyle w:val="VerbatimChar"/>
+        </w:rPr>
+        <w:t xml:space="preserve">iframe.contentWindow</w:t>
+      </w:r>
+      <w:r>
+        <w:t xml:space="preserve">,</w:t>
+      </w:r>
+      <w:r>
+        <w:t xml:space="preserve"> </w:t>
+      </w:r>
+      <w:r>
+        <w:rPr>
+          <w:rStyle w:val="VerbatimChar"/>
+        </w:rPr>
+        <w:t xml:space="preserve">parent</w:t>
+      </w:r>
+      <w:r>
+        <w:t xml:space="preserve">,</w:t>
+      </w:r>
+      <w:r>
+        <w:t xml:space="preserve"> </w:t>
+      </w:r>
+      <w:r>
+        <w:rPr>
+          <w:rStyle w:val="VerbatimChar"/>
+        </w:rPr>
+        <w:t xml:space="preserve">top</w:t>
+      </w:r>
+      <w:r>
+        <w:t xml:space="preserve">,</w:t>
+      </w:r>
+      <w:r>
+        <w:t xml:space="preserve"> </w:t>
+      </w:r>
+      <w:r>
+        <w:rPr>
+          <w:rStyle w:val="VerbatimChar"/>
+        </w:rPr>
+        <w:t xml:space="preserve">frames[i]</w:t>
+      </w:r>
+      <w:r>
+        <w:t xml:space="preserve"> </w:t>
+      </w:r>
+      <w:r>
+        <w:t xml:space="preserve">/</w:t>
+      </w:r>
+      <w:r>
+        <w:t xml:space="preserve"> </w:t>
+      </w:r>
+      <w:r>
+        <w:rPr>
+          <w:rStyle w:val="VerbatimChar"/>
+        </w:rPr>
+        <w:t xml:space="preserve">window[i]</w:t>
+      </w:r>
+      <w:r>
+        <w:t xml:space="preserve">,</w:t>
+      </w:r>
+      <w:r>
+        <w:t xml:space="preserve"> </w:t>
+      </w:r>
+      <w:r>
+        <w:rPr>
+          <w:rStyle w:val="VerbatimChar"/>
+        </w:rPr>
+        <w:t xml:space="preserve">event.source</w:t>
+      </w:r>
+      <w:r>
+        <w:t xml:space="preserve">,</w:t>
+      </w:r>
+      <w:r>
+        <w:t xml:space="preserve"> </w:t>
+      </w:r>
+      <w:r>
+        <w:rPr>
+          <w:rStyle w:val="VerbatimChar"/>
+        </w:rPr>
+        <w:t xml:space="preserve">window.open(url, name)</w:t>
+      </w:r>
+      <w:r>
+        <w:t xml:space="preserve">'s result -- is a</w:t>
+      </w:r>
+      <w:r>
+        <w:t xml:space="preserve"> </w:t>
+      </w:r>
+      <w:r>
+        <w:rPr>
+          <w:rStyle w:val="VerbatimChar"/>
+        </w:rPr>
+        <w:t xml:space="preserve">Proxy</w:t>
+      </w:r>
+      <w:r>
+        <w:t xml:space="preserve">, one per window in each realm (</w:t>
+      </w:r>
+      <w:r>
+        <w:rPr>
+          <w:rStyle w:val="VerbatimChar"/>
+        </w:rPr>
+        <w:t xml:space="preserve">event.source === iframe.contentWindow</w:t>
+      </w:r>
+      <w:r>
+        <w:t xml:space="preserve">), that asks at</w:t>
+      </w:r>
+      <w:r>
+        <w:t xml:space="preserve"> </w:t>
+      </w:r>
+      <w:r>
+        <w:t xml:space="preserve">each use what the window's document is now (it follows its navigations):</w:t>
       </w:r>
     </w:p>
     <w:p>
@@ -49248,347 +50352,59 @@
         <w:pStyle w:val="Compact"/>
         <w:numPr>
           <w:ilvl w:val="0"/>
-          <w:numId w:val="1033"/>
+          <w:numId w:val="1034"/>
         </w:numPr>
       </w:pPr>
       <w:r>
-        <w:t xml:space="preserve">SVG: no</w:t>
-      </w:r>
-      <w:r>
-        <w:t xml:space="preserve"> </w:t>
-      </w:r>
-      <w:r>
-        <w:rPr>
-          <w:rStyle w:val="VerbatimChar"/>
-        </w:rPr>
-        <w:t xml:space="preserve">&lt;mask&gt;</w:t>
-      </w:r>
-      <w:r>
-        <w:t xml:space="preserve">,</w:t>
-      </w:r>
-      <w:r>
-        <w:t xml:space="preserve"> </w:t>
-      </w:r>
-      <w:r>
-        <w:rPr>
-          <w:rStyle w:val="VerbatimChar"/>
-        </w:rPr>
-        <w:t xml:space="preserve">&lt;pattern&gt;</w:t>
-      </w:r>
-      <w:r>
-        <w:t xml:space="preserve">,</w:t>
-      </w:r>
-      <w:r>
-        <w:t xml:space="preserve"> </w:t>
-      </w:r>
-      <w:r>
-        <w:rPr>
-          <w:rStyle w:val="VerbatimChar"/>
-        </w:rPr>
-        <w:t xml:space="preserve">&lt;marker&gt;</w:t>
-      </w:r>
-      <w:r>
-        <w:t xml:space="preserve">, filters, SMIL animations,</w:t>
-      </w:r>
-      <w:r>
-        <w:t xml:space="preserve"> </w:t>
-      </w:r>
-      <w:r>
-        <w:rPr>
-          <w:rStyle w:val="VerbatimChar"/>
-        </w:rPr>
-        <w:t xml:space="preserve">&lt;textPath&gt;</w:t>
-      </w:r>
-      <w:r>
-        <w:t xml:space="preserve">, per-glyph</w:t>
-      </w:r>
-      <w:r>
-        <w:t xml:space="preserve"> </w:t>
-      </w:r>
-      <w:r>
-        <w:t xml:space="preserve">position lists, the page's web fonts in</w:t>
-      </w:r>
-      <w:r>
-        <w:t xml:space="preserve"> </w:t>
-      </w:r>
-      <w:r>
-        <w:rPr>
-          <w:rStyle w:val="VerbatimChar"/>
-        </w:rPr>
-        <w:t xml:space="preserve">&lt;text&gt;</w:t>
-      </w:r>
-      <w:r>
-        <w:t xml:space="preserve">; the page's</w:t>
-      </w:r>
-      <w:r>
-        <w:t xml:space="preserve"> </w:t>
-      </w:r>
-      <w:r>
-        <w:t xml:space="preserve">CSS</w:t>
-      </w:r>
-      <w:r>
-        <w:t xml:space="preserve"> </w:t>
-      </w:r>
-      <w:r>
-        <w:rPr>
-          <w:rStyle w:val="VerbatimChar"/>
-        </w:rPr>
-        <w:t xml:space="preserve">fill</w:t>
-      </w:r>
-      <w:r>
-        <w:t xml:space="preserve"> </w:t>
-      </w:r>
-      <w:r>
-        <w:t xml:space="preserve">/</w:t>
-      </w:r>
-      <w:r>
-        <w:t xml:space="preserve"> </w:t>
-      </w:r>
-      <w:r>
-        <w:rPr>
-          <w:rStyle w:val="VerbatimChar"/>
-        </w:rPr>
-        <w:t xml:space="preserve">stroke</w:t>
-      </w:r>
-      <w:r>
-        <w:t xml:space="preserve"> </w:t>
-      </w:r>
-      <w:r>
-        <w:t xml:space="preserve">(</w:t>
-      </w:r>
-      <w:r>
-        <w:rPr>
-          <w:rStyle w:val="VerbatimChar"/>
-        </w:rPr>
-        <w:t xml:space="preserve">.icon path { fill: red }</w:t>
-      </w:r>
-      <w:r>
-        <w:t xml:space="preserve">) do not reach an inline</w:t>
-      </w:r>
-      <w:r>
-        <w:t xml:space="preserve"> </w:t>
-      </w:r>
-      <w:r>
-        <w:rPr>
-          <w:rStyle w:val="VerbatimChar"/>
-        </w:rPr>
-        <w:t xml:space="preserve">&lt;svg&gt;</w:t>
-      </w:r>
-      <w:r>
-        <w:t xml:space="preserve"> </w:t>
-      </w:r>
-      <w:r>
-        <w:t xml:space="preserve">-- libcss</w:t>
-      </w:r>
-      <w:r>
-        <w:t xml:space="preserve"> </w:t>
-      </w:r>
-      <w:r>
-        <w:t xml:space="preserve">has no</w:t>
-      </w:r>
-      <w:r>
-        <w:t xml:space="preserve"> </w:t>
-      </w:r>
-      <w:r>
-        <w:rPr>
-          <w:rStyle w:val="VerbatimChar"/>
-        </w:rPr>
-        <w:t xml:space="preserve">fill</w:t>
-      </w:r>
-      <w:r>
-        <w:t xml:space="preserve"> </w:t>
-      </w:r>
-      <w:r>
-        <w:t xml:space="preserve">/</w:t>
-      </w:r>
-      <w:r>
-        <w:t xml:space="preserve"> </w:t>
-      </w:r>
-      <w:r>
-        <w:rPr>
-          <w:rStyle w:val="VerbatimChar"/>
-        </w:rPr>
-        <w:t xml:space="preserve">stroke</w:t>
-      </w:r>
-      <w:r>
-        <w:t xml:space="preserve"> </w:t>
-      </w:r>
-      <w:r>
-        <w:t xml:space="preserve">properties (only</w:t>
-      </w:r>
-      <w:r>
-        <w:t xml:space="preserve"> </w:t>
-      </w:r>
-      <w:r>
-        <w:rPr>
-          <w:rStyle w:val="VerbatimChar"/>
-        </w:rPr>
-        <w:t xml:space="preserve">fill-opacity</w:t>
-      </w:r>
-      <w:r>
-        <w:t xml:space="preserve"> </w:t>
-      </w:r>
-      <w:r>
-        <w:t xml:space="preserve">/</w:t>
-      </w:r>
-      <w:r>
-        <w:t xml:space="preserve"> </w:t>
-      </w:r>
-      <w:r>
-        <w:rPr>
-          <w:rStyle w:val="VerbatimChar"/>
-        </w:rPr>
-        <w:t xml:space="preserve">stroke-opacity</w:t>
-      </w:r>
-      <w:r>
-        <w:t xml:space="preserve">): with them</w:t>
-      </w:r>
-      <w:r>
-        <w:t xml:space="preserve"> </w:t>
-      </w:r>
-      <w:r>
-        <w:t xml:space="preserve">(inherited, as text),</w:t>
-      </w:r>
-      <w:r>
-        <w:t xml:space="preserve"> </w:t>
-      </w:r>
-      <w:r>
-        <w:rPr>
-          <w:rStyle w:val="VerbatimChar"/>
-        </w:rPr>
-        <w:t xml:space="preserve">onyx_svg_inline.c</w:t>
-      </w:r>
-      <w:r>
-        <w:t xml:space="preserve"> </w:t>
-      </w:r>
-      <w:r>
-        <w:t xml:space="preserve">would write the</w:t>
-      </w:r>
-      <w:r>
-        <w:t xml:space="preserve"> </w:t>
-      </w:r>
-      <w:r>
-        <w:rPr>
-          <w:rStyle w:val="VerbatimChar"/>
-        </w:rPr>
-        <w:t xml:space="preserve">&lt;svg&gt;</w:t>
-      </w:r>
-      <w:r>
-        <w:t xml:space="preserve">'s computed ones on its</w:t>
-      </w:r>
-      <w:r>
-        <w:t xml:space="preserve"> </w:t>
-      </w:r>
-      <w:r>
-        <w:t xml:space="preserve">root; its</w:t>
-      </w:r>
-      <w:r>
-        <w:t xml:space="preserve"> </w:t>
-      </w:r>
-      <w:r>
-        <w:rPr>
-          <w:rStyle w:val="VerbatimChar"/>
-        </w:rPr>
-        <w:t xml:space="preserve">color</w:t>
-      </w:r>
-      <w:r>
-        <w:t xml:space="preserve">, its custom properties and the SVG's own attributes and</w:t>
-      </w:r>
-      <w:r>
-        <w:t xml:space="preserve"> </w:t>
-      </w:r>
-      <w:r>
-        <w:rPr>
-          <w:rStyle w:val="VerbatimChar"/>
-        </w:rPr>
-        <w:t xml:space="preserve">&lt;style&gt;</w:t>
-      </w:r>
-      <w:r>
-        <w:t xml:space="preserve"> </w:t>
-      </w:r>
-      <w:r>
-        <w:t xml:space="preserve">do. An</w:t>
-      </w:r>
-      <w:r>
-        <w:t xml:space="preserve"> </w:t>
-      </w:r>
-      <w:r>
-        <w:rPr>
-          <w:rStyle w:val="VerbatimChar"/>
-        </w:rPr>
-        <w:t xml:space="preserve">&lt;svg&gt;</w:t>
-      </w:r>
-      <w:r>
-        <w:t xml:space="preserve"> </w:t>
-      </w:r>
-      <w:r>
-        <w:t xml:space="preserve">/ SVG</w:t>
-      </w:r>
-      <w:r>
-        <w:t xml:space="preserve"> </w:t>
-      </w:r>
-      <w:r>
-        <w:rPr>
-          <w:rStyle w:val="VerbatimChar"/>
-        </w:rPr>
-        <w:t xml:space="preserve">&lt;img&gt;</w:t>
-      </w:r>
-      <w:r>
-        <w:t xml:space="preserve"> </w:t>
-      </w:r>
-      <w:r>
-        <w:t xml:space="preserve">with only a viewBox and no CSS size takes the viewBox's size (Chrome:</w:t>
-      </w:r>
-      <w:r>
-        <w:t xml:space="preserve"> </w:t>
-      </w:r>
-      <w:r>
-        <w:t xml:space="preserve">the containing block's width); a</w:t>
-      </w:r>
-      <w:r>
-        <w:t xml:space="preserve"> </w:t>
-      </w:r>
-      <w:r>
-        <w:rPr>
-          <w:rStyle w:val="VerbatimChar"/>
-        </w:rPr>
-        <w:t xml:space="preserve">list-style-image</w:t>
-      </w:r>
-      <w:r>
-        <w:t xml:space="preserve"> </w:t>
-      </w:r>
-      <w:r>
-        <w:t xml:space="preserve">SVG without a size is drawn at its</w:t>
-      </w:r>
-      <w:r>
-        <w:t xml:space="preserve"> </w:t>
-      </w:r>
-      <w:r>
-        <w:t xml:space="preserve">viewBox's size (Chrome: small). The scripts' SVG DOM is dom.js' generic one (</w:t>
-      </w:r>
-      <w:r>
-        <w:rPr>
-          <w:rStyle w:val="VerbatimChar"/>
-        </w:rPr>
-        <w:t xml:space="preserve">namespaceURI</w:t>
-      </w:r>
-      <w:r>
-        <w:t xml:space="preserve">,</w:t>
-      </w:r>
-      <w:r>
-        <w:t xml:space="preserve"> </w:t>
-      </w:r>
-      <w:r>
-        <w:rPr>
-          <w:rStyle w:val="VerbatimChar"/>
-        </w:rPr>
-        <w:t xml:space="preserve">getBBox</w:t>
-      </w:r>
-      <w:r>
-        <w:t xml:space="preserve"> </w:t>
-      </w:r>
-      <w:r>
-        <w:t xml:space="preserve">from the box).</w:t>
+        <w:t xml:space="preserve">same origin (scheme, host, port;</w:t>
+      </w:r>
+      <w:r>
+        <w:t xml:space="preserve"> </w:t>
+      </w:r>
+      <w:r>
+        <w:rPr>
+          <w:rStyle w:val="VerbatimChar"/>
+        </w:rPr>
+        <w:t xml:space="preserve">file:</w:t>
+      </w:r>
+      <w:r>
+        <w:t xml:space="preserve"> </w:t>
+      </w:r>
+      <w:r>
+        <w:t xml:space="preserve">URLs are one origin among themselves, shown as</w:t>
+      </w:r>
+      <w:r>
+        <w:t xml:space="preserve"> </w:t>
+      </w:r>
+      <w:r>
+        <w:t xml:space="preserve">"null" as Chrome does; about:blank and srcdoc take their parent's): the window's global object</w:t>
+      </w:r>
+      <w:r>
+        <w:t xml:space="preserve"> </w:t>
+      </w:r>
+      <w:r>
+        <w:t xml:space="preserve">behind it (</w:t>
+      </w:r>
+      <w:r>
+        <w:rPr>
+          <w:rStyle w:val="VerbatimChar"/>
+        </w:rPr>
+        <w:t xml:space="preserve">contentWindow.document</w:t>
+      </w:r>
+      <w:r>
+        <w:t xml:space="preserve">, its functions and variables,</w:t>
+      </w:r>
+      <w:r>
+        <w:t xml:space="preserve"> </w:t>
+      </w:r>
+      <w:r>
+        <w:rPr>
+          <w:rStyle w:val="VerbatimChar"/>
+        </w:rPr>
+        <w:t xml:space="preserve">frameElement</w:t>
+      </w:r>
+      <w:r>
+        <w:t xml:space="preserve">);</w:t>
       </w:r>
     </w:p>
     <w:p>
@@ -49596,89 +50412,230 @@
         <w:pStyle w:val="Compact"/>
         <w:numPr>
           <w:ilvl w:val="0"/>
-          <w:numId w:val="1033"/>
+          <w:numId w:val="1034"/>
         </w:numPr>
       </w:pPr>
       <w:r>
-        <w:t xml:space="preserve">Canvas: no shadows, filters, blend modes (source-over), conic gradients (a solid colour),</w:t>
-      </w:r>
-      <w:r>
-        <w:t xml:space="preserve"> </w:t>
-      </w:r>
-      <w:r>
-        <w:t xml:space="preserve">per-corner</w:t>
-      </w:r>
-      <w:r>
-        <w:t xml:space="preserve"> </w:t>
-      </w:r>
-      <w:r>
-        <w:rPr>
-          <w:rStyle w:val="VerbatimChar"/>
-        </w:rPr>
-        <w:t xml:space="preserve">roundRect</w:t>
-      </w:r>
-      <w:r>
-        <w:t xml:space="preserve"> </w:t>
-      </w:r>
-      <w:r>
-        <w:t xml:space="preserve">radii;</w:t>
-      </w:r>
-      <w:r>
-        <w:t xml:space="preserve"> </w:t>
-      </w:r>
-      <w:r>
-        <w:rPr>
-          <w:rStyle w:val="VerbatimChar"/>
-        </w:rPr>
-        <w:t xml:space="preserve">drawImage</w:t>
-      </w:r>
-      <w:r>
-        <w:t xml:space="preserve"> </w:t>
-      </w:r>
-      <w:r>
-        <w:t xml:space="preserve">scales with the nearest pixel (PlutoVG's</w:t>
-      </w:r>
-      <w:r>
-        <w:t xml:space="preserve"> </w:t>
-      </w:r>
-      <w:r>
-        <w:t xml:space="preserve">textures), and a canvas shown at another CSS size too (the framebuffer's bitmap plot);</w:t>
-      </w:r>
-      <w:r>
-        <w:t xml:space="preserve"> </w:t>
-      </w:r>
-      <w:r>
-        <w:t xml:space="preserve">no</w:t>
-      </w:r>
-      <w:r>
-        <w:t xml:space="preserve"> </w:t>
-      </w:r>
-      <w:r>
-        <w:rPr>
-          <w:rStyle w:val="VerbatimChar"/>
-        </w:rPr>
-        <w:t xml:space="preserve">getContext('webgl')</w:t>
-      </w:r>
-      <w:r>
-        <w:t xml:space="preserve">,</w:t>
-      </w:r>
-      <w:r>
-        <w:t xml:space="preserve"> </w:t>
-      </w:r>
-      <w:r>
-        <w:rPr>
-          <w:rStyle w:val="VerbatimChar"/>
-        </w:rPr>
-        <w:t xml:space="preserve">captureStream</w:t>
-      </w:r>
-      <w:r>
-        <w:t xml:space="preserve">, video frames; the page's web fonts are not used</w:t>
-      </w:r>
-      <w:r>
-        <w:t xml:space="preserve"> </w:t>
-      </w:r>
-      <w:r>
-        <w:t xml:space="preserve">(the card's fonts by family).</w:t>
+        <w:t xml:space="preserve">another origin: what HTML lets through --</w:t>
+      </w:r>
+      <w:r>
+        <w:t xml:space="preserve"> </w:t>
+      </w:r>
+      <w:r>
+        <w:rPr>
+          <w:rStyle w:val="VerbatimChar"/>
+        </w:rPr>
+        <w:t xml:space="preserve">postMessage</w:t>
+      </w:r>
+      <w:r>
+        <w:t xml:space="preserve">,</w:t>
+      </w:r>
+      <w:r>
+        <w:t xml:space="preserve"> </w:t>
+      </w:r>
+      <w:r>
+        <w:rPr>
+          <w:rStyle w:val="VerbatimChar"/>
+        </w:rPr>
+        <w:t xml:space="preserve">location</w:t>
+      </w:r>
+      <w:r>
+        <w:t xml:space="preserve"> </w:t>
+      </w:r>
+      <w:r>
+        <w:t xml:space="preserve">(set,</w:t>
+      </w:r>
+      <w:r>
+        <w:t xml:space="preserve"> </w:t>
+      </w:r>
+      <w:r>
+        <w:rPr>
+          <w:rStyle w:val="VerbatimChar"/>
+        </w:rPr>
+        <w:t xml:space="preserve">replace</w:t>
+      </w:r>
+      <w:r>
+        <w:t xml:space="preserve">,</w:t>
+      </w:r>
+      <w:r>
+        <w:t xml:space="preserve"> </w:t>
+      </w:r>
+      <w:r>
+        <w:rPr>
+          <w:rStyle w:val="VerbatimChar"/>
+        </w:rPr>
+        <w:t xml:space="preserve">assign</w:t>
+      </w:r>
+      <w:r>
+        <w:t xml:space="preserve">; not read),</w:t>
+      </w:r>
+      <w:r>
+        <w:t xml:space="preserve"> </w:t>
+      </w:r>
+      <w:r>
+        <w:rPr>
+          <w:rStyle w:val="VerbatimChar"/>
+        </w:rPr>
+        <w:t xml:space="preserve">closed</w:t>
+      </w:r>
+      <w:r>
+        <w:t xml:space="preserve">,</w:t>
+      </w:r>
+      <w:r>
+        <w:t xml:space="preserve"> </w:t>
+      </w:r>
+      <w:r>
+        <w:rPr>
+          <w:rStyle w:val="VerbatimChar"/>
+        </w:rPr>
+        <w:t xml:space="preserve">length</w:t>
+      </w:r>
+      <w:r>
+        <w:t xml:space="preserve">,</w:t>
+      </w:r>
+      <w:r>
+        <w:t xml:space="preserve"> </w:t>
+      </w:r>
+      <w:r>
+        <w:rPr>
+          <w:rStyle w:val="VerbatimChar"/>
+        </w:rPr>
+        <w:t xml:space="preserve">frames</w:t>
+      </w:r>
+      <w:r>
+        <w:t xml:space="preserve">,</w:t>
+      </w:r>
+      <w:r>
+        <w:t xml:space="preserve"> </w:t>
+      </w:r>
+      <w:r>
+        <w:rPr>
+          <w:rStyle w:val="VerbatimChar"/>
+        </w:rPr>
+        <w:t xml:space="preserve">window</w:t>
+      </w:r>
+      <w:r>
+        <w:t xml:space="preserve">,</w:t>
+      </w:r>
+      <w:r>
+        <w:t xml:space="preserve"> </w:t>
+      </w:r>
+      <w:r>
+        <w:rPr>
+          <w:rStyle w:val="VerbatimChar"/>
+        </w:rPr>
+        <w:t xml:space="preserve">self</w:t>
+      </w:r>
+      <w:r>
+        <w:t xml:space="preserve">,</w:t>
+      </w:r>
+      <w:r>
+        <w:t xml:space="preserve"> </w:t>
+      </w:r>
+      <w:r>
+        <w:rPr>
+          <w:rStyle w:val="VerbatimChar"/>
+        </w:rPr>
+        <w:t xml:space="preserve">parent</w:t>
+      </w:r>
+      <w:r>
+        <w:t xml:space="preserve">,</w:t>
+      </w:r>
+      <w:r>
+        <w:t xml:space="preserve"> </w:t>
+      </w:r>
+      <w:r>
+        <w:rPr>
+          <w:rStyle w:val="VerbatimChar"/>
+        </w:rPr>
+        <w:t xml:space="preserve">top</w:t>
+      </w:r>
+      <w:r>
+        <w:t xml:space="preserve">,</w:t>
+      </w:r>
+      <w:r>
+        <w:t xml:space="preserve"> </w:t>
+      </w:r>
+      <w:r>
+        <w:rPr>
+          <w:rStyle w:val="VerbatimChar"/>
+        </w:rPr>
+        <w:t xml:space="preserve">opener</w:t>
+      </w:r>
+      <w:r>
+        <w:t xml:space="preserve">,</w:t>
+      </w:r>
+      <w:r>
+        <w:t xml:space="preserve"> </w:t>
+      </w:r>
+      <w:r>
+        <w:rPr>
+          <w:rStyle w:val="VerbatimChar"/>
+        </w:rPr>
+        <w:t xml:space="preserve">close</w:t>
+      </w:r>
+      <w:r>
+        <w:t xml:space="preserve"> </w:t>
+      </w:r>
+      <w:r>
+        <w:t xml:space="preserve">/</w:t>
+      </w:r>
+      <w:r>
+        <w:t xml:space="preserve"> </w:t>
+      </w:r>
+      <w:r>
+        <w:rPr>
+          <w:rStyle w:val="VerbatimChar"/>
+        </w:rPr>
+        <w:t xml:space="preserve">focus</w:t>
+      </w:r>
+      <w:r>
+        <w:t xml:space="preserve"> </w:t>
+      </w:r>
+      <w:r>
+        <w:t xml:space="preserve">/</w:t>
+      </w:r>
+      <w:r>
+        <w:t xml:space="preserve"> </w:t>
+      </w:r>
+      <w:r>
+        <w:rPr>
+          <w:rStyle w:val="VerbatimChar"/>
+        </w:rPr>
+        <w:t xml:space="preserve">blur</w:t>
+      </w:r>
+      <w:r>
+        <w:t xml:space="preserve">, indexed and named child frames -- the rest a</w:t>
+      </w:r>
+      <w:r>
+        <w:t xml:space="preserve"> </w:t>
+      </w:r>
+      <w:r>
+        <w:rPr>
+          <w:rStyle w:val="VerbatimChar"/>
+        </w:rPr>
+        <w:t xml:space="preserve">SecurityError</w:t>
+      </w:r>
+      <w:r>
+        <w:t xml:space="preserve"> </w:t>
+      </w:r>
+      <w:r>
+        <w:t xml:space="preserve">("Blocked a frame with origin ... from accessing a cross-origin frame.");</w:t>
+      </w:r>
+      <w:r>
+        <w:t xml:space="preserve"> </w:t>
+      </w:r>
+      <w:r>
+        <w:rPr>
+          <w:rStyle w:val="VerbatimChar"/>
+        </w:rPr>
+        <w:t xml:space="preserve">then</w:t>
+      </w:r>
+      <w:r>
+        <w:t xml:space="preserve"> </w:t>
+      </w:r>
+      <w:r>
+        <w:t xml:space="preserve">and the symbols undefined (a promise resolved with a window does not throw);</w:t>
       </w:r>
     </w:p>
     <w:p>
@@ -49686,26 +50643,1289 @@
         <w:pStyle w:val="Compact"/>
         <w:numPr>
           <w:ilvl w:val="0"/>
-          <w:numId w:val="1033"/>
+          <w:numId w:val="1034"/>
         </w:numPr>
       </w:pPr>
       <w:r>
-        <w:t xml:space="preserve">A face split by</w:t>
-      </w:r>
-      <w:r>
-        <w:t xml:space="preserve"> </w:t>
-      </w:r>
-      <w:r>
-        <w:rPr>
-          <w:rStyle w:val="VerbatimChar"/>
-        </w:rPr>
-        <w:t xml:space="preserve">unicode-range</w:t>
-      </w:r>
-      <w:r>
-        <w:t xml:space="preserve"> </w:t>
-      </w:r>
-      <w:r>
-        <w:t xml:space="preserve">outside Latin-1 falls back to the card's fonts.</w:t>
+        <w:t xml:space="preserve">no document running scripts yet (a frame just inserted): those fields, and the language's</w:t>
+      </w:r>
+      <w:r>
+        <w:t xml:space="preserve"> </w:t>
+      </w:r>
+      <w:r>
+        <w:t xml:space="preserve">built-ins of the asking realm (</w:t>
+      </w:r>
+      <w:r>
+        <w:rPr>
+          <w:rStyle w:val="VerbatimChar"/>
+        </w:rPr>
+        <w:t xml:space="preserve">Array</w:t>
+      </w:r>
+      <w:r>
+        <w:t xml:space="preserve">,</w:t>
+      </w:r>
+      <w:r>
+        <w:t xml:space="preserve"> </w:t>
+      </w:r>
+      <w:r>
+        <w:rPr>
+          <w:rStyle w:val="VerbatimChar"/>
+        </w:rPr>
+        <w:t xml:space="preserve">JSON</w:t>
+      </w:r>
+      <w:r>
+        <w:t xml:space="preserve">... -- the scripts that take "clean" built-ins</w:t>
+      </w:r>
+      <w:r>
+        <w:t xml:space="preserve"> </w:t>
+      </w:r>
+      <w:r>
+        <w:t xml:space="preserve">from a fresh iframe).</w:t>
+      </w:r>
+    </w:p>
+    <w:p>
+      <w:pPr>
+        <w:pStyle w:val="FirstParagraph"/>
+      </w:pPr>
+      <w:r>
+        <w:rPr>
+          <w:rStyle w:val="VerbatimChar"/>
+        </w:rPr>
+        <w:t xml:space="preserve">window.parent</w:t>
+      </w:r>
+      <w:r>
+        <w:t xml:space="preserve">,</w:t>
+      </w:r>
+      <w:r>
+        <w:t xml:space="preserve"> </w:t>
+      </w:r>
+      <w:r>
+        <w:rPr>
+          <w:rStyle w:val="VerbatimChar"/>
+        </w:rPr>
+        <w:t xml:space="preserve">top</w:t>
+      </w:r>
+      <w:r>
+        <w:t xml:space="preserve">,</w:t>
+      </w:r>
+      <w:r>
+        <w:t xml:space="preserve"> </w:t>
+      </w:r>
+      <w:r>
+        <w:rPr>
+          <w:rStyle w:val="VerbatimChar"/>
+        </w:rPr>
+        <w:t xml:space="preserve">length</w:t>
+      </w:r>
+      <w:r>
+        <w:t xml:space="preserve">,</w:t>
+      </w:r>
+      <w:r>
+        <w:t xml:space="preserve"> </w:t>
+      </w:r>
+      <w:r>
+        <w:rPr>
+          <w:rStyle w:val="VerbatimChar"/>
+        </w:rPr>
+        <w:t xml:space="preserve">frameElement</w:t>
+      </w:r>
+      <w:r>
+        <w:t xml:space="preserve"> </w:t>
+      </w:r>
+      <w:r>
+        <w:t xml:space="preserve">(same origin only),</w:t>
+      </w:r>
+      <w:r>
+        <w:t xml:space="preserve"> </w:t>
+      </w:r>
+      <w:r>
+        <w:rPr>
+          <w:rStyle w:val="VerbatimChar"/>
+        </w:rPr>
+        <w:t xml:space="preserve">name</w:t>
+      </w:r>
+      <w:r>
+        <w:t xml:space="preserve"> </w:t>
+      </w:r>
+      <w:r>
+        <w:t xml:space="preserve">(the frame's target</w:t>
+      </w:r>
+      <w:r>
+        <w:t xml:space="preserve"> </w:t>
+      </w:r>
+      <w:r>
+        <w:t xml:space="preserve">name, settable),</w:t>
+      </w:r>
+      <w:r>
+        <w:t xml:space="preserve"> </w:t>
+      </w:r>
+      <w:r>
+        <w:rPr>
+          <w:rStyle w:val="VerbatimChar"/>
+        </w:rPr>
+        <w:t xml:space="preserve">window[0..31]</w:t>
+      </w:r>
+      <w:r>
+        <w:t xml:space="preserve"> </w:t>
+      </w:r>
+      <w:r>
+        <w:t xml:space="preserve">and</w:t>
+      </w:r>
+      <w:r>
+        <w:t xml:space="preserve"> </w:t>
+      </w:r>
+      <w:r>
+        <w:rPr>
+          <w:rStyle w:val="VerbatimChar"/>
+        </w:rPr>
+        <w:t xml:space="preserve">iframe.contentDocument</w:t>
+      </w:r>
+      <w:r>
+        <w:t xml:space="preserve"> </w:t>
+      </w:r>
+      <w:r>
+        <w:t xml:space="preserve">(same origin) are defined per</w:t>
+      </w:r>
+      <w:r>
+        <w:t xml:space="preserve"> </w:t>
+      </w:r>
+      <w:r>
+        <w:t xml:space="preserve">document; the</w:t>
+      </w:r>
+      <w:r>
+        <w:t xml:space="preserve"> </w:t>
+      </w:r>
+      <w:r>
+        <w:rPr>
+          <w:b/>
+          <w:bCs/>
+        </w:rPr>
+        <w:t xml:space="preserve">named frames</w:t>
+      </w:r>
+      <w:r>
+        <w:t xml:space="preserve"> </w:t>
+      </w:r>
+      <w:r>
+        <w:t xml:space="preserve">--</w:t>
+      </w:r>
+      <w:r>
+        <w:t xml:space="preserve"> </w:t>
+      </w:r>
+      <w:r>
+        <w:rPr>
+          <w:rStyle w:val="VerbatimChar"/>
+        </w:rPr>
+        <w:t xml:space="preserve">window[name]</w:t>
+      </w:r>
+      <w:r>
+        <w:t xml:space="preserve">,</w:t>
+      </w:r>
+      <w:r>
+        <w:t xml:space="preserve"> </w:t>
+      </w:r>
+      <w:r>
+        <w:rPr>
+          <w:rStyle w:val="VerbatimChar"/>
+        </w:rPr>
+        <w:t xml:space="preserve">frames[name]</w:t>
+      </w:r>
+      <w:r>
+        <w:t xml:space="preserve"> </w:t>
+      </w:r>
+      <w:r>
+        <w:t xml:space="preserve">(the consent managers' stubs</w:t>
+      </w:r>
+      <w:r>
+        <w:t xml:space="preserve"> </w:t>
+      </w:r>
+      <w:r>
+        <w:t xml:space="preserve">look for</w:t>
+      </w:r>
+      <w:r>
+        <w:t xml:space="preserve"> </w:t>
+      </w:r>
+      <w:r>
+        <w:rPr>
+          <w:rStyle w:val="VerbatimChar"/>
+        </w:rPr>
+        <w:t xml:space="preserve">frames['__tcfapiLocator']</w:t>
+      </w:r>
+      <w:r>
+        <w:t xml:space="preserve">) -- are getters the frames' sync defines on the window</w:t>
+      </w:r>
+      <w:r>
+        <w:t xml:space="preserve"> </w:t>
+      </w:r>
+      <w:r>
+        <w:t xml:space="preserve">below its own properties (</w:t>
+      </w:r>
+      <w:r>
+        <w:rPr>
+          <w:rStyle w:val="VerbatimChar"/>
+        </w:rPr>
+        <w:t xml:space="preserve">js_frames_changed</w:t>
+      </w:r>
+      <w:r>
+        <w:t xml:space="preserve">), and the WindowProxy finds them by name too;</w:t>
+      </w:r>
+      <w:r>
+        <w:t xml:space="preserve"> </w:t>
+      </w:r>
+      <w:r>
+        <w:rPr>
+          <w:rStyle w:val="VerbatimChar"/>
+        </w:rPr>
+        <w:t xml:space="preserve">window.open(url, name)</w:t>
+      </w:r>
+      <w:r>
+        <w:t xml:space="preserve"> </w:t>
+      </w:r>
+      <w:r>
+        <w:t xml:space="preserve">to a frame's name navigates that frame (and</w:t>
+      </w:r>
+      <w:r>
+        <w:t xml:space="preserve"> </w:t>
+      </w:r>
+      <w:r>
+        <w:rPr>
+          <w:rStyle w:val="VerbatimChar"/>
+        </w:rPr>
+        <w:t xml:space="preserve">_self</w:t>
+      </w:r>
+      <w:r>
+        <w:t xml:space="preserve">,</w:t>
+      </w:r>
+      <w:r>
+        <w:t xml:space="preserve"> </w:t>
+      </w:r>
+      <w:r>
+        <w:rPr>
+          <w:rStyle w:val="VerbatimChar"/>
+        </w:rPr>
+        <w:t xml:space="preserve">_parent</w:t>
+      </w:r>
+      <w:r>
+        <w:t xml:space="preserve">,</w:t>
+      </w:r>
+      <w:r>
+        <w:t xml:space="preserve"> </w:t>
+      </w:r>
+      <w:r>
+        <w:rPr>
+          <w:rStyle w:val="VerbatimChar"/>
+        </w:rPr>
+        <w:t xml:space="preserve">_top</w:t>
+      </w:r>
+      <w:r>
+        <w:t xml:space="preserve">).</w:t>
+      </w:r>
+      <w:r>
+        <w:t xml:space="preserve"> </w:t>
+      </w:r>
+      <w:r>
+        <w:rPr>
+          <w:b/>
+          <w:bCs/>
+        </w:rPr>
+        <w:t xml:space="preserve">Navigating another window</w:t>
+      </w:r>
+      <w:r>
+        <w:t xml:space="preserve"> </w:t>
+      </w:r>
+      <w:r>
+        <w:t xml:space="preserve">(its</w:t>
+      </w:r>
+      <w:r>
+        <w:t xml:space="preserve"> </w:t>
+      </w:r>
+      <w:r>
+        <w:rPr>
+          <w:rStyle w:val="VerbatimChar"/>
+        </w:rPr>
+        <w:t xml:space="preserve">location</w:t>
+      </w:r>
+      <w:r>
+        <w:t xml:space="preserve"> </w:t>
+      </w:r>
+      <w:r>
+        <w:t xml:space="preserve">set through the WindowProxy): its own</w:t>
+      </w:r>
+      <w:r>
+        <w:t xml:space="preserve"> </w:t>
+      </w:r>
+      <w:r>
+        <w:t xml:space="preserve">frames and a same-origin window freely; an ancestor (top, parent: "frame busting") or another</w:t>
+      </w:r>
+      <w:r>
+        <w:t xml:space="preserve"> </w:t>
+      </w:r>
+      <w:r>
+        <w:t xml:space="preserve">frame only within 5 s of the user's click or key in the caller's document, and from a sandboxed</w:t>
+      </w:r>
+      <w:r>
+        <w:t xml:space="preserve"> </w:t>
+      </w:r>
+      <w:r>
+        <w:t xml:space="preserve">frame only with</w:t>
+      </w:r>
+      <w:r>
+        <w:t xml:space="preserve"> </w:t>
+      </w:r>
+      <w:r>
+        <w:rPr>
+          <w:rStyle w:val="VerbatimChar"/>
+        </w:rPr>
+        <w:t xml:space="preserve">allow-top-navigation</w:t>
+      </w:r>
+      <w:r>
+        <w:t xml:space="preserve"> </w:t>
+      </w:r>
+      <w:r>
+        <w:t xml:space="preserve">-- Chrome's rules, simplified (an ad frame cannot send</w:t>
+      </w:r>
+      <w:r>
+        <w:t xml:space="preserve"> </w:t>
+      </w:r>
+      <w:r>
+        <w:t xml:space="preserve">the page elsewhere by itself).</w:t>
+      </w:r>
+    </w:p>
+    <w:p>
+      <w:pPr>
+        <w:pStyle w:val="BodyText"/>
+      </w:pPr>
+      <w:r>
+        <w:rPr>
+          <w:b/>
+          <w:bCs/>
+        </w:rPr>
+        <w:t xml:space="preserve">Nodes between documents</w:t>
+      </w:r>
+      <w:r>
+        <w:t xml:space="preserve"> </w:t>
+      </w:r>
+      <w:r>
+        <w:t xml:space="preserve">(</w:t>
+      </w:r>
+      <w:r>
+        <w:rPr>
+          <w:rStyle w:val="VerbatimChar"/>
+        </w:rPr>
+        <w:t xml:space="preserve">dom.js</w:t>
+      </w:r>
+      <w:r>
+        <w:t xml:space="preserve">:</w:t>
+      </w:r>
+      <w:r>
+        <w:t xml:space="preserve"> </w:t>
+      </w:r>
+      <w:r>
+        <w:rPr>
+          <w:rStyle w:val="VerbatimChar"/>
+        </w:rPr>
+        <w:t xml:space="preserve">insertAdopting</w:t>
+      </w:r>
+      <w:r>
+        <w:t xml:space="preserve">): a node of another document -- the</w:t>
+      </w:r>
+      <w:r>
+        <w:t xml:space="preserve"> </w:t>
+      </w:r>
+      <w:r>
+        <w:t xml:space="preserve">parent's element appended into a same-origin frame's document (ad verification scripts do so),</w:t>
+      </w:r>
+      <w:r>
+        <w:t xml:space="preserve"> </w:t>
+      </w:r>
+      <w:r>
+        <w:t xml:space="preserve">a frame's node into the parent's, a DOMParser document's -- is adopted when it is inserted, as in</w:t>
+      </w:r>
+      <w:r>
+        <w:t xml:space="preserve"> </w:t>
+      </w:r>
+      <w:r>
+        <w:t xml:space="preserve">browsers. libdom cannot move a node between documents (its import keeps the old document as the</w:t>
+      </w:r>
+      <w:r>
+        <w:t xml:space="preserve"> </w:t>
+      </w:r>
+      <w:r>
+        <w:t xml:space="preserve">copy's owner, and the insertion then fails: "not a Node" / WRONG_DOCUMENT before), so the</w:t>
+      </w:r>
+      <w:r>
+        <w:t xml:space="preserve"> </w:t>
+      </w:r>
+      <w:r>
+        <w:t xml:space="preserve">subtree is made again by the target document (elements with their attributes, texts, comments)</w:t>
+      </w:r>
+      <w:r>
+        <w:t xml:space="preserve"> </w:t>
+      </w:r>
+      <w:r>
+        <w:t xml:space="preserve">and the original taken out of its parent; the copy is inserted and returned. Another realm's</w:t>
+      </w:r>
+      <w:r>
+        <w:t xml:space="preserve"> </w:t>
+      </w:r>
+      <w:r>
+        <w:t xml:space="preserve">node is a node (</w:t>
+      </w:r>
+      <w:r>
+        <w:rPr>
+          <w:rStyle w:val="VerbatimChar"/>
+        </w:rPr>
+        <w:t xml:space="preserve">isNode</w:t>
+      </w:r>
+      <w:r>
+        <w:t xml:space="preserve">:</w:t>
+      </w:r>
+      <w:r>
+        <w:t xml:space="preserve"> </w:t>
+      </w:r>
+      <w:r>
+        <w:rPr>
+          <w:rStyle w:val="VerbatimChar"/>
+        </w:rPr>
+        <w:t xml:space="preserve">N.isNode</w:t>
+      </w:r>
+      <w:r>
+        <w:t xml:space="preserve">).</w:t>
+      </w:r>
+    </w:p>
+    <w:p>
+      <w:pPr>
+        <w:pStyle w:val="BodyText"/>
+      </w:pPr>
+      <w:r>
+        <w:rPr>
+          <w:b/>
+          <w:bCs/>
+        </w:rPr>
+        <w:t xml:space="preserve">postMessage between windows</w:t>
+      </w:r>
+      <w:r>
+        <w:t xml:space="preserve"> </w:t>
+      </w:r>
+      <w:r>
+        <w:t xml:space="preserve">(</w:t>
+      </w:r>
+      <w:r>
+        <w:rPr>
+          <w:rStyle w:val="VerbatimChar"/>
+        </w:rPr>
+        <w:t xml:space="preserve">framePost</w:t>
+      </w:r>
+      <w:r>
+        <w:t xml:space="preserve">): the value written by QuickJS's serializer in the</w:t>
+      </w:r>
+      <w:r>
+        <w:t xml:space="preserve"> </w:t>
+      </w:r>
+      <w:r>
+        <w:t xml:space="preserve">sender's realm and read in the receiver's (net.js'</w:t>
+      </w:r>
+      <w:r>
+        <w:t xml:space="preserve"> </w:t>
+      </w:r>
+      <w:r>
+        <w:rPr>
+          <w:rStyle w:val="VerbatimChar"/>
+        </w:rPr>
+        <w:t xml:space="preserve">toWire</w:t>
+      </w:r>
+      <w:r>
+        <w:t xml:space="preserve"> </w:t>
+      </w:r>
+      <w:r>
+        <w:t xml:space="preserve">/</w:t>
+      </w:r>
+      <w:r>
+        <w:t xml:space="preserve"> </w:t>
+      </w:r>
+      <w:r>
+        <w:rPr>
+          <w:rStyle w:val="VerbatimChar"/>
+        </w:rPr>
+        <w:t xml:space="preserve">fromWire</w:t>
+      </w:r>
+      <w:r>
+        <w:t xml:space="preserve"> </w:t>
+      </w:r>
+      <w:r>
+        <w:t xml:space="preserve">around it: Blob, File,</w:t>
+      </w:r>
+      <w:r>
+        <w:t xml:space="preserve"> </w:t>
+      </w:r>
+      <w:r>
+        <w:t xml:space="preserve">Error, ImageData, the ports) -- every object of</w:t>
+      </w:r>
+      <w:r>
+        <w:t xml:space="preserve"> </w:t>
+      </w:r>
+      <w:r>
+        <w:rPr>
+          <w:rStyle w:val="VerbatimChar"/>
+        </w:rPr>
+        <w:t xml:space="preserve">event.data</w:t>
+      </w:r>
+      <w:r>
+        <w:t xml:space="preserve"> </w:t>
+      </w:r>
+      <w:r>
+        <w:t xml:space="preserve">is the receiver's realm's</w:t>
+      </w:r>
+      <w:r>
+        <w:t xml:space="preserve"> </w:t>
+      </w:r>
+      <w:r>
+        <w:t xml:space="preserve">(</w:t>
+      </w:r>
+      <w:r>
+        <w:rPr>
+          <w:rStyle w:val="VerbatimChar"/>
+        </w:rPr>
+        <w:t xml:space="preserve">Object.getPrototypeOf(e.data) === Object.prototype</w:t>
+      </w:r>
+      <w:r>
+        <w:t xml:space="preserve">): nothing of a cross-origin sender leaks</w:t>
+      </w:r>
+      <w:r>
+        <w:t xml:space="preserve"> </w:t>
+      </w:r>
+      <w:r>
+        <w:t xml:space="preserve">through it. Delivered as a task (one scheduler callback for the queue, the receiver's microtasks</w:t>
+      </w:r>
+      <w:r>
+        <w:t xml:space="preserve"> </w:t>
+      </w:r>
+      <w:r>
+        <w:t xml:space="preserve">between messages), to the window's document of that moment; the</w:t>
+      </w:r>
+      <w:r>
+        <w:t xml:space="preserve"> </w:t>
+      </w:r>
+      <w:r>
+        <w:rPr>
+          <w:rStyle w:val="VerbatimChar"/>
+        </w:rPr>
+        <w:t xml:space="preserve">targetOrigin</w:t>
+      </w:r>
+      <w:r>
+        <w:t xml:space="preserve"> </w:t>
+      </w:r>
+      <w:r>
+        <w:t xml:space="preserve">checked then</w:t>
+      </w:r>
+      <w:r>
+        <w:t xml:space="preserve"> </w:t>
+      </w:r>
+      <w:r>
+        <w:t xml:space="preserve">(</w:t>
+      </w:r>
+      <w:r>
+        <w:rPr>
+          <w:rStyle w:val="VerbatimChar"/>
+        </w:rPr>
+        <w:t xml:space="preserve">*</w:t>
+      </w:r>
+      <w:r>
+        <w:t xml:space="preserve">;</w:t>
+      </w:r>
+      <w:r>
+        <w:t xml:space="preserve"> </w:t>
+      </w:r>
+      <w:r>
+        <w:rPr>
+          <w:rStyle w:val="VerbatimChar"/>
+        </w:rPr>
+        <w:t xml:space="preserve">/</w:t>
+      </w:r>
+      <w:r>
+        <w:t xml:space="preserve">: the sender's origin; an origin: the receiver's, never an opaque one) and the message</w:t>
+      </w:r>
+      <w:r>
+        <w:t xml:space="preserve"> </w:t>
+      </w:r>
+      <w:r>
+        <w:t xml:space="preserve">dropped otherwise;</w:t>
+      </w:r>
+      <w:r>
+        <w:t xml:space="preserve"> </w:t>
+      </w:r>
+      <w:r>
+        <w:rPr>
+          <w:rStyle w:val="VerbatimChar"/>
+        </w:rPr>
+        <w:t xml:space="preserve">event.origin</w:t>
+      </w:r>
+      <w:r>
+        <w:t xml:space="preserve"> </w:t>
+      </w:r>
+      <w:r>
+        <w:t xml:space="preserve">the sender's,</w:t>
+      </w:r>
+      <w:r>
+        <w:t xml:space="preserve"> </w:t>
+      </w:r>
+      <w:r>
+        <w:rPr>
+          <w:rStyle w:val="VerbatimChar"/>
+        </w:rPr>
+        <w:t xml:space="preserve">event.source</w:t>
+      </w:r>
+      <w:r>
+        <w:t xml:space="preserve"> </w:t>
+      </w:r>
+      <w:r>
+        <w:t xml:space="preserve">its WindowProxy (to reply).</w:t>
+      </w:r>
+      <w:r>
+        <w:t xml:space="preserve"> </w:t>
+      </w:r>
+      <w:r>
+        <w:rPr>
+          <w:rStyle w:val="VerbatimChar"/>
+        </w:rPr>
+        <w:t xml:space="preserve">postMessage(msg, '/')</w:t>
+      </w:r>
+      <w:r>
+        <w:t xml:space="preserve">,</w:t>
+      </w:r>
+      <w:r>
+        <w:t xml:space="preserve"> </w:t>
+      </w:r>
+      <w:r>
+        <w:rPr>
+          <w:rStyle w:val="VerbatimChar"/>
+        </w:rPr>
+        <w:t xml:space="preserve">{ targetOrigin, transfer }</w:t>
+      </w:r>
+      <w:r>
+        <w:t xml:space="preserve">, a bad targetOrigin (</w:t>
+      </w:r>
+      <w:r>
+        <w:rPr>
+          <w:rStyle w:val="VerbatimChar"/>
+        </w:rPr>
+        <w:t xml:space="preserve">SyntaxError</w:t>
+      </w:r>
+      <w:r>
+        <w:t xml:space="preserve">), a</w:t>
+      </w:r>
+      <w:r>
+        <w:t xml:space="preserve"> </w:t>
+      </w:r>
+      <w:r>
+        <w:t xml:space="preserve">function in the message (</w:t>
+      </w:r>
+      <w:r>
+        <w:rPr>
+          <w:rStyle w:val="VerbatimChar"/>
+        </w:rPr>
+        <w:t xml:space="preserve">DataCloneError</w:t>
+      </w:r>
+      <w:r>
+        <w:t xml:space="preserve">) as Chrome. A window posting to itself keeps</w:t>
+      </w:r>
+      <w:r>
+        <w:t xml:space="preserve"> </w:t>
+      </w:r>
+      <w:r>
+        <w:t xml:space="preserve">html5.js' path (no serializer: a</w:t>
+      </w:r>
+      <w:r>
+        <w:t xml:space="preserve"> </w:t>
+      </w:r>
+      <w:r>
+        <w:rPr>
+          <w:rStyle w:val="VerbatimChar"/>
+        </w:rPr>
+        <w:t xml:space="preserve">setImmediate</w:t>
+      </w:r>
+      <w:r>
+        <w:t xml:space="preserve"> </w:t>
+      </w:r>
+      <w:r>
+        <w:t xml:space="preserve">polyfill posts at each task).</w:t>
+      </w:r>
+    </w:p>
+    <w:p>
+      <w:pPr>
+        <w:pStyle w:val="BodyText"/>
+      </w:pPr>
+      <w:r>
+        <w:rPr>
+          <w:b/>
+          <w:bCs/>
+        </w:rPr>
+        <w:t xml:space="preserve">MessagePort across realms</w:t>
+      </w:r>
+      <w:r>
+        <w:t xml:space="preserve">: a channel within one realm stays html5.js' (React's scheduler</w:t>
+      </w:r>
+      <w:r>
+        <w:t xml:space="preserve"> </w:t>
+      </w:r>
+      <w:r>
+        <w:t xml:space="preserve">posts on one at each task); a port transferred to another realm -- in the transfer list, or in</w:t>
+      </w:r>
+      <w:r>
+        <w:t xml:space="preserve"> </w:t>
+      </w:r>
+      <w:r>
+        <w:t xml:space="preserve">the message itself (</w:t>
+      </w:r>
+      <w:r>
+        <w:rPr>
+          <w:rStyle w:val="VerbatimChar"/>
+        </w:rPr>
+        <w:t xml:space="preserve">{ port: ch.port2 }</w:t>
+      </w:r>
+      <w:r>
+        <w:t xml:space="preserve">) -- becomes a pair of ids in</w:t>
+      </w:r>
+      <w:r>
+        <w:t xml:space="preserve"> </w:t>
+      </w:r>
+      <w:r>
+        <w:rPr>
+          <w:rStyle w:val="VerbatimChar"/>
+        </w:rPr>
+        <w:t xml:space="preserve">qjs_frames.c</w:t>
+      </w:r>
+      <w:r>
+        <w:t xml:space="preserve"> </w:t>
+      </w:r>
+      <w:r>
+        <w:t xml:space="preserve">(</w:t>
+      </w:r>
+      <w:r>
+        <w:rPr>
+          <w:rStyle w:val="VerbatimChar"/>
+        </w:rPr>
+        <w:t xml:space="preserve">portPair</w:t>
+      </w:r>
+      <w:r>
+        <w:t xml:space="preserve">,</w:t>
+      </w:r>
+      <w:r>
+        <w:t xml:space="preserve"> </w:t>
+      </w:r>
+      <w:r>
+        <w:rPr>
+          <w:rStyle w:val="VerbatimChar"/>
+        </w:rPr>
+        <w:t xml:space="preserve">portOwn</w:t>
+      </w:r>
+      <w:r>
+        <w:t xml:space="preserve">,</w:t>
+      </w:r>
+      <w:r>
+        <w:t xml:space="preserve"> </w:t>
+      </w:r>
+      <w:r>
+        <w:rPr>
+          <w:rStyle w:val="VerbatimChar"/>
+        </w:rPr>
+        <w:t xml:space="preserve">portPost</w:t>
+      </w:r>
+      <w:r>
+        <w:t xml:space="preserve">,</w:t>
+      </w:r>
+      <w:r>
+        <w:t xml:space="preserve"> </w:t>
+      </w:r>
+      <w:r>
+        <w:rPr>
+          <w:rStyle w:val="VerbatimChar"/>
+        </w:rPr>
+        <w:t xml:space="preserve">portClose</w:t>
+      </w:r>
+      <w:r>
+        <w:t xml:space="preserve">): its other end, still here, posts through it;</w:t>
+      </w:r>
+      <w:r>
+        <w:t xml:space="preserve"> </w:t>
+      </w:r>
+      <w:r>
+        <w:t xml:space="preserve">the messages that wait for a port in flight are given to the realm that takes it, those it had</w:t>
+      </w:r>
+      <w:r>
+        <w:t xml:space="preserve"> </w:t>
+      </w:r>
+      <w:r>
+        <w:t xml:space="preserve">not given its scripts yet go with it (</w:t>
+      </w:r>
+      <w:r>
+        <w:rPr>
+          <w:rStyle w:val="VerbatimChar"/>
+        </w:rPr>
+        <w:t xml:space="preserve">portQueue</w:t>
+      </w:r>
+      <w:r>
+        <w:t xml:space="preserve">);</w:t>
+      </w:r>
+      <w:r>
+        <w:t xml:space="preserve"> </w:t>
+      </w:r>
+      <w:r>
+        <w:rPr>
+          <w:rStyle w:val="VerbatimChar"/>
+        </w:rPr>
+        <w:t xml:space="preserve">start()</w:t>
+      </w:r>
+      <w:r>
+        <w:t xml:space="preserve">,</w:t>
+      </w:r>
+      <w:r>
+        <w:t xml:space="preserve"> </w:t>
+      </w:r>
+      <w:r>
+        <w:rPr>
+          <w:rStyle w:val="VerbatimChar"/>
+        </w:rPr>
+        <w:t xml:space="preserve">onmessage</w:t>
+      </w:r>
+      <w:r>
+        <w:t xml:space="preserve"> </w:t>
+      </w:r>
+      <w:r>
+        <w:t xml:space="preserve">starting it,</w:t>
+      </w:r>
+      <w:r>
+        <w:t xml:space="preserve"> </w:t>
+      </w:r>
+      <w:r>
+        <w:rPr>
+          <w:rStyle w:val="VerbatimChar"/>
+        </w:rPr>
+        <w:t xml:space="preserve">close()</w:t>
+      </w:r>
+      <w:r>
+        <w:t xml:space="preserve"> </w:t>
+      </w:r>
+      <w:r>
+        <w:t xml:space="preserve">(the other end gets nothing more), a port transferred twice or detached</w:t>
+      </w:r>
+      <w:r>
+        <w:t xml:space="preserve"> </w:t>
+      </w:r>
+      <w:r>
+        <w:t xml:space="preserve">(</w:t>
+      </w:r>
+      <w:r>
+        <w:rPr>
+          <w:rStyle w:val="VerbatimChar"/>
+        </w:rPr>
+        <w:t xml:space="preserve">DataCloneError</w:t>
+      </w:r>
+      <w:r>
+        <w:t xml:space="preserve">). Both ends of a channel can go to two other realms (reCAPTCHA's anchor and</w:t>
+      </w:r>
+      <w:r>
+        <w:t xml:space="preserve"> </w:t>
+      </w:r>
+      <w:r>
+        <w:t xml:space="preserve">challenge frames talk so).</w:t>
+      </w:r>
+      <w:r>
+        <w:t xml:space="preserve"> </w:t>
+      </w:r>
+      <w:r>
+        <w:rPr>
+          <w:b/>
+          <w:bCs/>
+        </w:rPr>
+        <w:t xml:space="preserve">BroadcastChannel</w:t>
+      </w:r>
+      <w:r>
+        <w:t xml:space="preserve"> </w:t>
+      </w:r>
+      <w:r>
+        <w:t xml:space="preserve">reaches the same-origin documents of the app and</w:t>
+      </w:r>
+      <w:r>
+        <w:t xml:space="preserve"> </w:t>
+      </w:r>
+      <w:r>
+        <w:t xml:space="preserve">their workers (</w:t>
+      </w:r>
+      <w:r>
+        <w:rPr>
+          <w:rStyle w:val="VerbatimChar"/>
+        </w:rPr>
+        <w:t xml:space="preserve">qjs_net.c</w:t>
+      </w:r>
+      <w:r>
+        <w:t xml:space="preserve">:</w:t>
+      </w:r>
+      <w:r>
+        <w:t xml:space="preserve"> </w:t>
+      </w:r>
+      <w:r>
+        <w:rPr>
+          <w:rStyle w:val="VerbatimChar"/>
+        </w:rPr>
+        <w:t xml:space="preserve">n_broadcast</w:t>
+      </w:r>
+      <w:r>
+        <w:t xml:space="preserve"> </w:t>
+      </w:r>
+      <w:r>
+        <w:t xml:space="preserve">looked at a page's own workers only).</w:t>
+      </w:r>
+    </w:p>
+    <w:p>
+      <w:pPr>
+        <w:pStyle w:val="BodyText"/>
+      </w:pPr>
+      <w:r>
+        <w:rPr>
+          <w:b/>
+          <w:bCs/>
+        </w:rPr>
+        <w:t xml:space="preserve">The tests</w:t>
+      </w:r>
+      <w:r>
+        <w:t xml:space="preserve"> </w:t>
+      </w:r>
+      <w:r>
+        <w:t xml:space="preserve">(</w:t>
+      </w:r>
+      <w:r>
+        <w:rPr>
+          <w:rStyle w:val="VerbatimChar"/>
+        </w:rPr>
+        <w:t xml:space="preserve">tools/tests/netsurf/iframetest.sh</w:t>
+      </w:r>
+      <w:r>
+        <w:t xml:space="preserve">, checked against Chromium headless for the</w:t>
+      </w:r>
+      <w:r>
+        <w:t xml:space="preserve"> </w:t>
+      </w:r>
+      <w:r>
+        <w:t xml:space="preserve">same pages):</w:t>
+      </w:r>
+      <w:r>
+        <w:t xml:space="preserve"> </w:t>
+      </w:r>
+      <w:r>
+        <w:rPr>
+          <w:rStyle w:val="VerbatimChar"/>
+        </w:rPr>
+        <w:t xml:space="preserve">pages/frames-api.html</w:t>
+      </w:r>
+      <w:r>
+        <w:t xml:space="preserve"> </w:t>
+      </w:r>
+      <w:r>
+        <w:t xml:space="preserve">(52 checks: the parser's and a script's frames, srcdoc,</w:t>
+      </w:r>
+      <w:r>
+        <w:t xml:space="preserve"> </w:t>
+      </w:r>
+      <w:r>
+        <w:t xml:space="preserve">about:blank written by its parent, a</w:t>
+      </w:r>
+      <w:r>
+        <w:t xml:space="preserve"> </w:t>
+      </w:r>
+      <w:r>
+        <w:rPr>
+          <w:rStyle w:val="VerbatimChar"/>
+        </w:rPr>
+        <w:t xml:space="preserve">src</w:t>
+      </w:r>
+      <w:r>
+        <w:t xml:space="preserve"> </w:t>
+      </w:r>
+      <w:r>
+        <w:t xml:space="preserve">changed, a frame removed (</w:t>
+      </w:r>
+      <w:r>
+        <w:rPr>
+          <w:rStyle w:val="VerbatimChar"/>
+        </w:rPr>
+        <w:t xml:space="preserve">closed</w:t>
+      </w:r>
+      <w:r>
+        <w:t xml:space="preserve">), the parent's DOM</w:t>
+      </w:r>
+      <w:r>
+        <w:t xml:space="preserve"> </w:t>
+      </w:r>
+      <w:r>
+        <w:t xml:space="preserve">changed (the frame kept with its state), a frame in a frame talking to the top window, sibling</w:t>
+      </w:r>
+      <w:r>
+        <w:t xml:space="preserve"> </w:t>
+      </w:r>
+      <w:r>
+        <w:t xml:space="preserve">frames, sandbox, the structured clone each way, the targetOrigin checks, ports in the transfer</w:t>
+      </w:r>
+      <w:r>
+        <w:t xml:space="preserve"> </w:t>
+      </w:r>
+      <w:r>
+        <w:t xml:space="preserve">list and in the value, a port closed, BroadcastChannel across frames,</w:t>
+      </w:r>
+      <w:r>
+        <w:t xml:space="preserve"> </w:t>
+      </w:r>
+      <w:r>
+        <w:rPr>
+          <w:rStyle w:val="VerbatimChar"/>
+        </w:rPr>
+        <w:t xml:space="preserve">window.open</w:t>
+      </w:r>
+      <w:r>
+        <w:t xml:space="preserve"> </w:t>
+      </w:r>
+      <w:r>
+        <w:t xml:space="preserve">to a frame</w:t>
+      </w:r>
+      <w:r>
+        <w:t xml:space="preserve"> </w:t>
+      </w:r>
+      <w:r>
+        <w:t xml:space="preserve">name);</w:t>
+      </w:r>
+      <w:r>
+        <w:t xml:space="preserve"> </w:t>
+      </w:r>
+      <w:r>
+        <w:rPr>
+          <w:rStyle w:val="VerbatimChar"/>
+        </w:rPr>
+        <w:t xml:space="preserve">pages/frames-input.html</w:t>
+      </w:r>
+      <w:r>
+        <w:t xml:space="preserve"> </w:t>
+      </w:r>
+      <w:r>
+        <w:t xml:space="preserve">(a checkbox clicked, an input focused and typed into, Enter, the</w:t>
+      </w:r>
+      <w:r>
+        <w:t xml:space="preserve"> </w:t>
+      </w:r>
+      <w:r>
+        <w:t xml:space="preserve">wheel in a frame; a link targeting the frame's name);</w:t>
+      </w:r>
+      <w:r>
+        <w:t xml:space="preserve"> </w:t>
+      </w:r>
+      <w:r>
+        <w:rPr>
+          <w:rStyle w:val="VerbatimChar"/>
+        </w:rPr>
+        <w:t xml:space="preserve">pages/recaptcha-outer.html</w:t>
+      </w:r>
+      <w:r>
+        <w:t xml:space="preserve"> </w:t>
+      </w:r>
+      <w:r>
+        <w:t xml:space="preserve">(a local</w:t>
+      </w:r>
+      <w:r>
+        <w:t xml:space="preserve"> </w:t>
+      </w:r>
+      <w:r>
+        <w:t xml:space="preserve">mimic of reCAPTCHA v2 over two servers -- two origins: the page renders the anchor frame and a</w:t>
+      </w:r>
+      <w:r>
+        <w:t xml:space="preserve"> </w:t>
+      </w:r>
+      <w:r>
+        <w:t xml:space="preserve">hidden challenge frame as api.js does, the frames say they are ready, the page gives each a port</w:t>
+      </w:r>
+      <w:r>
+        <w:t xml:space="preserve"> </w:t>
+      </w:r>
+      <w:r>
+        <w:t xml:space="preserve">and the two of them a channel of their own, the anchor's checkbox clicked shows the challenge,</w:t>
+      </w:r>
+      <w:r>
+        <w:t xml:space="preserve"> </w:t>
+      </w:r>
+      <w:r>
+        <w:t xml:space="preserve">its tile and "Verify" clicked, the token goes to the anchor, then to the page, which fills the</w:t>
+      </w:r>
+      <w:r>
+        <w:t xml:space="preserve"> </w:t>
+      </w:r>
+      <w:r>
+        <w:t xml:space="preserve">hidden</w:t>
+      </w:r>
+      <w:r>
+        <w:t xml:space="preserve"> </w:t>
+      </w:r>
+      <w:r>
+        <w:rPr>
+          <w:rStyle w:val="VerbatimChar"/>
+        </w:rPr>
+        <w:t xml:space="preserve">g-recaptcha-response</w:t>
+      </w:r>
+      <w:r>
+        <w:t xml:space="preserve"> </w:t>
+      </w:r>
+      <w:r>
+        <w:t xml:space="preserve">and calls the site's callback; the cross-origin limits checked</w:t>
+      </w:r>
+      <w:r>
+        <w:t xml:space="preserve"> </w:t>
+      </w:r>
+      <w:r>
+        <w:t xml:space="preserve">both ways, a message for another origin dropped, the anchor's try at sending the page elsewhere</w:t>
+      </w:r>
+      <w:r>
+        <w:t xml:space="preserve"> </w:t>
+      </w:r>
+      <w:r>
+        <w:t xml:space="preserve">refused). Google's own reCAPTCHA is not touched by the</w:t>
+      </w:r>
+      <w:r>
+        <w:t xml:space="preserve"> </w:t>
+      </w:r>
+      <w:r>
+        <w:t xml:space="preserve">tests.</w:t>
+      </w:r>
+    </w:p>
+    <w:p>
+      <w:pPr>
+        <w:pStyle w:val="BodyText"/>
+      </w:pPr>
+      <w:r>
+        <w:rPr>
+          <w:b/>
+          <w:bCs/>
+        </w:rPr>
+        <w:t xml:space="preserve">Not done</w:t>
+      </w:r>
+      <w:r>
+        <w:t xml:space="preserve">: a frame's initial about:blank is not there synchronously (a script that writes</w:t>
+      </w:r>
+      <w:r>
+        <w:t xml:space="preserve"> </w:t>
+      </w:r>
+      <w:r>
+        <w:t xml:space="preserve">into</w:t>
+      </w:r>
+      <w:r>
+        <w:t xml:space="preserve"> </w:t>
+      </w:r>
+      <w:r>
+        <w:rPr>
+          <w:rStyle w:val="VerbatimChar"/>
+        </w:rPr>
+        <w:t xml:space="preserve">contentDocument</w:t>
+      </w:r>
+      <w:r>
+        <w:t xml:space="preserve"> </w:t>
+      </w:r>
+      <w:r>
+        <w:t xml:space="preserve">right after inserting the iframe finds null until it has loaded, a few ms</w:t>
+      </w:r>
+      <w:r>
+        <w:t xml:space="preserve"> </w:t>
+      </w:r>
+      <w:r>
+        <w:t xml:space="preserve">-- the built-ins above aside);</w:t>
+      </w:r>
+      <w:r>
+        <w:t xml:space="preserve"> </w:t>
+      </w:r>
+      <w:r>
+        <w:rPr>
+          <w:rStyle w:val="VerbatimChar"/>
+        </w:rPr>
+        <w:t xml:space="preserve">document.domain</w:t>
+      </w:r>
+      <w:r>
+        <w:t xml:space="preserve">; a node adopted from another document is a</w:t>
+      </w:r>
+      <w:r>
+        <w:t xml:space="preserve"> </w:t>
+      </w:r>
+      <w:r>
+        <w:t xml:space="preserve">copy (its listeners and form state stay on the original, which a script may still hold);</w:t>
+      </w:r>
+      <w:r>
+        <w:t xml:space="preserve"> </w:t>
+      </w:r>
+      <w:r>
+        <w:rPr>
+          <w:rStyle w:val="VerbatimChar"/>
+        </w:rPr>
+        <w:t xml:space="preserve">location.href</w:t>
+      </w:r>
+      <w:r>
+        <w:t xml:space="preserve"> </w:t>
+      </w:r>
+      <w:r>
+        <w:t xml:space="preserve">of a srcdoc document is its data: URL (Chrome: about:srcdoc); the frames share</w:t>
+      </w:r>
+      <w:r>
+        <w:t xml:space="preserve"> </w:t>
+      </w:r>
+      <w:r>
+        <w:t xml:space="preserve">the tab's process and runtime (no site isolation: a cross-origin frame's long script holds the</w:t>
+      </w:r>
+      <w:r>
+        <w:t xml:space="preserve"> </w:t>
+      </w:r>
+      <w:r>
+        <w:t xml:space="preserve">page, as it did);</w:t>
+      </w:r>
+      <w:r>
+        <w:t xml:space="preserve"> </w:t>
+      </w:r>
+      <w:r>
+        <w:rPr>
+          <w:rStyle w:val="VerbatimChar"/>
+        </w:rPr>
+        <w:t xml:space="preserve">loading="lazy"</w:t>
+      </w:r>
+      <w:r>
+        <w:t xml:space="preserve"> </w:t>
+      </w:r>
+      <w:r>
+        <w:t xml:space="preserve">frames load at once; focus does not move between frames by</w:t>
+      </w:r>
+      <w:r>
+        <w:t xml:space="preserve"> </w:t>
+      </w:r>
+      <w:r>
+        <w:t xml:space="preserve">script (</w:t>
+      </w:r>
+      <w:r>
+        <w:rPr>
+          <w:rStyle w:val="VerbatimChar"/>
+        </w:rPr>
+        <w:t xml:space="preserve">contentWindow.focus()</w:t>
+      </w:r>
+      <w:r>
+        <w:t xml:space="preserve"> </w:t>
+      </w:r>
+      <w:r>
+        <w:t xml:space="preserve">does nothing; a click does); a frame inside a shadow root has no</w:t>
+      </w:r>
+      <w:r>
+        <w:t xml:space="preserve"> </w:t>
+      </w:r>
+      <w:r>
+        <w:t xml:space="preserve">window; MessagePort to a worker.</w:t>
+      </w:r>
+    </w:p>
+    <w:bookmarkEnd w:id="51"/>
+    <w:bookmarkStart w:id="52" w:name="X2d96bac25f45ec9241507797951d2bb0b2591ad"/>
+    <w:p>
+      <w:pPr>
+        <w:pStyle w:val="Heading2"/>
+      </w:pPr>
+      <w:r>
+        <w:t xml:space="preserve">8. Known gaps</w:t>
       </w:r>
     </w:p>
     <w:p>
@@ -49713,10 +51933,958 @@
         <w:pStyle w:val="Compact"/>
         <w:numPr>
           <w:ilvl w:val="0"/>
-          <w:numId w:val="1033"/>
+          <w:numId w:val="1035"/>
         </w:numPr>
       </w:pPr>
       <w:r>
+        <w:t xml:space="preserve">JavaScript: synchronous XHR (runs async), multipart request bodies, binary request bodies</w:t>
+      </w:r>
+      <w:r>
+        <w:t xml:space="preserve"> </w:t>
+      </w:r>
+      <w:r>
+        <w:t xml:space="preserve">(sent as text: a NUL ends them); no IndexedDB, editing APIs, Service</w:t>
+      </w:r>
+      <w:r>
+        <w:t xml:space="preserve"> </w:t>
+      </w:r>
+      <w:r>
+        <w:t xml:space="preserve">Workers; CSS</w:t>
+      </w:r>
+      <w:r>
+        <w:t xml:space="preserve"> </w:t>
+      </w:r>
+      <w:r>
+        <w:rPr>
+          <w:rStyle w:val="VerbatimChar"/>
+        </w:rPr>
+        <w:t xml:space="preserve">:active</w:t>
+      </w:r>
+      <w:r>
+        <w:t xml:space="preserve"> </w:t>
+      </w:r>
+      <w:r>
+        <w:t xml:space="preserve">/</w:t>
+      </w:r>
+      <w:r>
+        <w:t xml:space="preserve"> </w:t>
+      </w:r>
+      <w:r>
+        <w:rPr>
+          <w:rStyle w:val="VerbatimChar"/>
+        </w:rPr>
+        <w:t xml:space="preserve">:focus</w:t>
+      </w:r>
+      <w:r>
+        <w:t xml:space="preserve">.</w:t>
+      </w:r>
+    </w:p>
+    <w:p>
+      <w:pPr>
+        <w:pStyle w:val="Compact"/>
+        <w:numPr>
+          <w:ilvl w:val="0"/>
+          <w:numId w:val="1035"/>
+        </w:numPr>
+      </w:pPr>
+      <w:r>
+        <w:t xml:space="preserve">The network APIs (§19): a worker runs on the UI thread (a long computation in a worker</w:t>
+      </w:r>
+      <w:r>
+        <w:t xml:space="preserve"> </w:t>
+      </w:r>
+      <w:r>
+        <w:t xml:space="preserve">holds the window as a page's script does;</w:t>
+      </w:r>
+      <w:r>
+        <w:t xml:space="preserve"> </w:t>
+      </w:r>
+      <w:r>
+        <w:rPr>
+          <w:rStyle w:val="VerbatimChar"/>
+        </w:rPr>
+        <w:t xml:space="preserve">script_timeout</w:t>
+      </w:r>
+      <w:r>
+        <w:t xml:space="preserve"> </w:t>
+      </w:r>
+      <w:r>
+        <w:t xml:space="preserve">stops it); an</w:t>
+      </w:r>
+      <w:r>
+        <w:t xml:space="preserve"> </w:t>
+      </w:r>
+      <w:r>
+        <w:rPr>
+          <w:rStyle w:val="VerbatimChar"/>
+        </w:rPr>
+        <w:t xml:space="preserve">importScripts</w:t>
+      </w:r>
+      <w:r>
+        <w:t xml:space="preserve"> </w:t>
+      </w:r>
+      <w:r>
+        <w:t xml:space="preserve">whose URL is not a literal in the script, over http(s), blocks the UI thread while it is</w:t>
+      </w:r>
+      <w:r>
+        <w:t xml:space="preserve"> </w:t>
+      </w:r>
+      <w:r>
+        <w:t xml:space="preserve">read; a SharedWorker is shared within its document only; no</w:t>
+      </w:r>
+      <w:r>
+        <w:t xml:space="preserve"> </w:t>
+      </w:r>
+      <w:r>
+        <w:rPr>
+          <w:rStyle w:val="VerbatimChar"/>
+        </w:rPr>
+        <w:t xml:space="preserve">MessagePort</w:t>
+      </w:r>
+      <w:r>
+        <w:t xml:space="preserve"> </w:t>
+      </w:r>
+      <w:r>
+        <w:t xml:space="preserve">transferred to a</w:t>
+      </w:r>
+      <w:r>
+        <w:t xml:space="preserve"> </w:t>
+      </w:r>
+      <w:r>
+        <w:t xml:space="preserve">worker, no</w:t>
+      </w:r>
+      <w:r>
+        <w:t xml:space="preserve"> </w:t>
+      </w:r>
+      <w:r>
+        <w:rPr>
+          <w:rStyle w:val="VerbatimChar"/>
+        </w:rPr>
+        <w:t xml:space="preserve">OffscreenCanvas</w:t>
+      </w:r>
+      <w:r>
+        <w:t xml:space="preserve">,</w:t>
+      </w:r>
+      <w:r>
+        <w:t xml:space="preserve"> </w:t>
+      </w:r>
+      <w:r>
+        <w:rPr>
+          <w:rStyle w:val="VerbatimChar"/>
+        </w:rPr>
+        <w:t xml:space="preserve">SharedArrayBuffer</w:t>
+      </w:r>
+      <w:r>
+        <w:t xml:space="preserve"> </w:t>
+      </w:r>
+      <w:r>
+        <w:t xml:space="preserve">/</w:t>
+      </w:r>
+      <w:r>
+        <w:t xml:space="preserve"> </w:t>
+      </w:r>
+      <w:r>
+        <w:rPr>
+          <w:rStyle w:val="VerbatimChar"/>
+        </w:rPr>
+        <w:t xml:space="preserve">Atomics</w:t>
+      </w:r>
+      <w:r>
+        <w:t xml:space="preserve"> </w:t>
+      </w:r>
+      <w:r>
+        <w:t xml:space="preserve">between workers; the</w:t>
+      </w:r>
+      <w:r>
+        <w:t xml:space="preserve"> </w:t>
+      </w:r>
+      <w:r>
+        <w:t xml:space="preserve">WebSocket client sends its messages uncompressed (permessage-deflate inflates only) and</w:t>
+      </w:r>
+      <w:r>
+        <w:t xml:space="preserve"> </w:t>
+      </w:r>
+      <w:r>
+        <w:t xml:space="preserve">never pings; CORS is not checked for EventSource either.</w:t>
+      </w:r>
+    </w:p>
+    <w:p>
+      <w:pPr>
+        <w:pStyle w:val="Compact"/>
+        <w:numPr>
+          <w:ilvl w:val="0"/>
+          <w:numId w:val="1035"/>
+        </w:numPr>
+      </w:pPr>
+      <w:r>
+        <w:t xml:space="preserve">The network (§24): no revocation checks, no CSP, no SameSite cookies, no</w:t>
+      </w:r>
+      <w:r>
+        <w:t xml:space="preserve"> </w:t>
+      </w:r>
+      <w:r>
+        <w:t xml:space="preserve">CORS for the core's loads (EventSource, fonts,</w:t>
+      </w:r>
+      <w:r>
+        <w:t xml:space="preserve"> </w:t>
+      </w:r>
+      <w:r>
+        <w:rPr>
+          <w:rStyle w:val="VerbatimChar"/>
+        </w:rPr>
+        <w:t xml:space="preserve">&lt;img crossorigin&gt;</w:t>
+      </w:r>
+      <w:r>
+        <w:t xml:space="preserve">, module scripts), no</w:t>
+      </w:r>
+      <w:r>
+        <w:t xml:space="preserve"> </w:t>
+      </w:r>
+      <w:r>
+        <w:t xml:space="preserve">HTTP/3, no back-forward cache.</w:t>
+      </w:r>
+    </w:p>
+    <w:p>
+      <w:pPr>
+        <w:pStyle w:val="Compact"/>
+        <w:numPr>
+          <w:ilvl w:val="0"/>
+          <w:numId w:val="1035"/>
+        </w:numPr>
+      </w:pPr>
+      <w:r>
+        <w:t xml:space="preserve">Frames (§26): a frame's initial about:blank is not there synchronously, no</w:t>
+      </w:r>
+      <w:r>
+        <w:t xml:space="preserve"> </w:t>
+      </w:r>
+      <w:r>
+        <w:rPr>
+          <w:rStyle w:val="VerbatimChar"/>
+        </w:rPr>
+        <w:t xml:space="preserve">document.domain</w:t>
+      </w:r>
+      <w:r>
+        <w:t xml:space="preserve">, a srcdoc's</w:t>
+      </w:r>
+      <w:r>
+        <w:t xml:space="preserve"> </w:t>
+      </w:r>
+      <w:r>
+        <w:rPr>
+          <w:rStyle w:val="VerbatimChar"/>
+        </w:rPr>
+        <w:t xml:space="preserve">location.href</w:t>
+      </w:r>
+      <w:r>
+        <w:t xml:space="preserve"> </w:t>
+      </w:r>
+      <w:r>
+        <w:t xml:space="preserve">is its data: URL, no</w:t>
+      </w:r>
+      <w:r>
+        <w:t xml:space="preserve"> </w:t>
+      </w:r>
+      <w:r>
+        <w:t xml:space="preserve">focus moved between frames by script,</w:t>
+      </w:r>
+      <w:r>
+        <w:t xml:space="preserve"> </w:t>
+      </w:r>
+      <w:r>
+        <w:rPr>
+          <w:rStyle w:val="VerbatimChar"/>
+        </w:rPr>
+        <w:t xml:space="preserve">loading="lazy"</w:t>
+      </w:r>
+      <w:r>
+        <w:t xml:space="preserve"> </w:t>
+      </w:r>
+      <w:r>
+        <w:t xml:space="preserve">frames load at once, no frames in</w:t>
+      </w:r>
+      <w:r>
+        <w:t xml:space="preserve"> </w:t>
+      </w:r>
+      <w:r>
+        <w:t xml:space="preserve">shadow trees.</w:t>
+      </w:r>
+    </w:p>
+    <w:p>
+      <w:pPr>
+        <w:pStyle w:val="Compact"/>
+        <w:numPr>
+          <w:ilvl w:val="0"/>
+          <w:numId w:val="1035"/>
+        </w:numPr>
+      </w:pPr>
+      <w:r>
+        <w:t xml:space="preserve">Shadow DOM (§20): the manual slot assignment's rendering,</w:t>
+      </w:r>
+      <w:r>
+        <w:t xml:space="preserve"> </w:t>
+      </w:r>
+      <w:r>
+        <w:rPr>
+          <w:rStyle w:val="VerbatimChar"/>
+        </w:rPr>
+        <w:t xml:space="preserve">exportparts</w:t>
+      </w:r>
+      <w:r>
+        <w:t xml:space="preserve">, a clonable root's</w:t>
+      </w:r>
+      <w:r>
+        <w:t xml:space="preserve"> </w:t>
+      </w:r>
+      <w:r>
+        <w:t xml:space="preserve">cloning,</w:t>
+      </w:r>
+      <w:r>
+        <w:t xml:space="preserve"> </w:t>
+      </w:r>
+      <w:r>
+        <w:rPr>
+          <w:rStyle w:val="VerbatimChar"/>
+        </w:rPr>
+        <w:t xml:space="preserve">&lt;link&gt;</w:t>
+      </w:r>
+      <w:r>
+        <w:t xml:space="preserve"> </w:t>
+      </w:r>
+      <w:r>
+        <w:t xml:space="preserve">/</w:t>
+      </w:r>
+      <w:r>
+        <w:t xml:space="preserve"> </w:t>
+      </w:r>
+      <w:r>
+        <w:rPr>
+          <w:rStyle w:val="VerbatimChar"/>
+        </w:rPr>
+        <w:t xml:space="preserve">@import</w:t>
+      </w:r>
+      <w:r>
+        <w:t xml:space="preserve"> </w:t>
+      </w:r>
+      <w:r>
+        <w:t xml:space="preserve">/</w:t>
+      </w:r>
+      <w:r>
+        <w:t xml:space="preserve"> </w:t>
+      </w:r>
+      <w:r>
+        <w:rPr>
+          <w:rStyle w:val="VerbatimChar"/>
+        </w:rPr>
+        <w:t xml:space="preserve">@font-face</w:t>
+      </w:r>
+      <w:r>
+        <w:t xml:space="preserve"> </w:t>
+      </w:r>
+      <w:r>
+        <w:t xml:space="preserve">in shadow trees,</w:t>
+      </w:r>
+      <w:r>
+        <w:t xml:space="preserve"> </w:t>
+      </w:r>
+      <w:r>
+        <w:rPr>
+          <w:rStyle w:val="VerbatimChar"/>
+        </w:rPr>
+        <w:t xml:space="preserve">:host</w:t>
+      </w:r>
+      <w:r>
+        <w:t xml:space="preserve"> </w:t>
+      </w:r>
+      <w:r>
+        <w:t xml:space="preserve">in</w:t>
+      </w:r>
+      <w:r>
+        <w:t xml:space="preserve"> </w:t>
+      </w:r>
+      <w:r>
+        <w:rPr>
+          <w:rStyle w:val="VerbatimChar"/>
+        </w:rPr>
+        <w:t xml:space="preserve">matches()</w:t>
+      </w:r>
+      <w:r>
+        <w:t xml:space="preserve">;</w:t>
+      </w:r>
+      <w:r>
+        <w:t xml:space="preserve"> </w:t>
+      </w:r>
+      <w:r>
+        <w:rPr>
+          <w:rStyle w:val="VerbatimChar"/>
+        </w:rPr>
+        <w:t xml:space="preserve">::before</w:t>
+      </w:r>
+      <w:r>
+        <w:t xml:space="preserve"> </w:t>
+      </w:r>
+      <w:r>
+        <w:t xml:space="preserve">/</w:t>
+      </w:r>
+      <w:r>
+        <w:t xml:space="preserve"> </w:t>
+      </w:r>
+      <w:r>
+        <w:rPr>
+          <w:rStyle w:val="VerbatimChar"/>
+        </w:rPr>
+        <w:t xml:space="preserve">::after</w:t>
+      </w:r>
+      <w:r>
+        <w:t xml:space="preserve"> </w:t>
+      </w:r>
+      <w:r>
+        <w:t xml:space="preserve">of a</w:t>
+      </w:r>
+      <w:r>
+        <w:t xml:space="preserve"> </w:t>
+      </w:r>
+      <w:r>
+        <w:rPr>
+          <w:rStyle w:val="VerbatimChar"/>
+        </w:rPr>
+        <w:t xml:space="preserve">display: contents</w:t>
+      </w:r>
+      <w:r>
+        <w:t xml:space="preserve"> </w:t>
+      </w:r>
+      <w:r>
+        <w:t xml:space="preserve">element.</w:t>
+      </w:r>
+    </w:p>
+    <w:p>
+      <w:pPr>
+        <w:pStyle w:val="Compact"/>
+        <w:numPr>
+          <w:ilvl w:val="0"/>
+          <w:numId w:val="1035"/>
+        </w:numPr>
+      </w:pPr>
+      <w:r>
+        <w:t xml:space="preserve">The compositing layers' gaps (§21: a real perspective,</w:t>
+      </w:r>
+      <w:r>
+        <w:t xml:space="preserve"> </w:t>
+      </w:r>
+      <w:r>
+        <w:rPr>
+          <w:rStyle w:val="VerbatimChar"/>
+        </w:rPr>
+        <w:t xml:space="preserve">clip-path</w:t>
+      </w:r>
+      <w:r>
+        <w:t xml:space="preserve"> </w:t>
+      </w:r>
+      <w:r>
+        <w:t xml:space="preserve">/</w:t>
+      </w:r>
+      <w:r>
+        <w:t xml:space="preserve"> </w:t>
+      </w:r>
+      <w:r>
+        <w:rPr>
+          <w:rStyle w:val="VerbatimChar"/>
+        </w:rPr>
+        <w:t xml:space="preserve">mask</w:t>
+      </w:r>
+      <w:r>
+        <w:t xml:space="preserve"> </w:t>
+      </w:r>
+      <w:r>
+        <w:t xml:space="preserve">on a layer, the</w:t>
+      </w:r>
+      <w:r>
+        <w:t xml:space="preserve"> </w:t>
+      </w:r>
+      <w:r>
+        <w:t xml:space="preserve">non-separable blend modes); animations: §22's "Not done"; GPU compositing: §25's (scrollers</w:t>
+      </w:r>
+      <w:r>
+        <w:t xml:space="preserve"> </w:t>
+      </w:r>
+      <w:r>
+        <w:t xml:space="preserve">and groups as layers, fixed boxes that stay in view).</w:t>
+      </w:r>
+    </w:p>
+    <w:p>
+      <w:pPr>
+        <w:pStyle w:val="Compact"/>
+        <w:numPr>
+          <w:ilvl w:val="0"/>
+          <w:numId w:val="1035"/>
+        </w:numPr>
+      </w:pPr>
+      <w:r>
+        <w:t xml:space="preserve">SVG: no</w:t>
+      </w:r>
+      <w:r>
+        <w:t xml:space="preserve"> </w:t>
+      </w:r>
+      <w:r>
+        <w:rPr>
+          <w:rStyle w:val="VerbatimChar"/>
+        </w:rPr>
+        <w:t xml:space="preserve">&lt;mask&gt;</w:t>
+      </w:r>
+      <w:r>
+        <w:t xml:space="preserve">,</w:t>
+      </w:r>
+      <w:r>
+        <w:t xml:space="preserve"> </w:t>
+      </w:r>
+      <w:r>
+        <w:rPr>
+          <w:rStyle w:val="VerbatimChar"/>
+        </w:rPr>
+        <w:t xml:space="preserve">&lt;pattern&gt;</w:t>
+      </w:r>
+      <w:r>
+        <w:t xml:space="preserve">,</w:t>
+      </w:r>
+      <w:r>
+        <w:t xml:space="preserve"> </w:t>
+      </w:r>
+      <w:r>
+        <w:rPr>
+          <w:rStyle w:val="VerbatimChar"/>
+        </w:rPr>
+        <w:t xml:space="preserve">&lt;marker&gt;</w:t>
+      </w:r>
+      <w:r>
+        <w:t xml:space="preserve">, filters, SMIL animations,</w:t>
+      </w:r>
+      <w:r>
+        <w:t xml:space="preserve"> </w:t>
+      </w:r>
+      <w:r>
+        <w:rPr>
+          <w:rStyle w:val="VerbatimChar"/>
+        </w:rPr>
+        <w:t xml:space="preserve">&lt;textPath&gt;</w:t>
+      </w:r>
+      <w:r>
+        <w:t xml:space="preserve">, per-glyph</w:t>
+      </w:r>
+      <w:r>
+        <w:t xml:space="preserve"> </w:t>
+      </w:r>
+      <w:r>
+        <w:t xml:space="preserve">position lists, the page's web fonts in</w:t>
+      </w:r>
+      <w:r>
+        <w:t xml:space="preserve"> </w:t>
+      </w:r>
+      <w:r>
+        <w:rPr>
+          <w:rStyle w:val="VerbatimChar"/>
+        </w:rPr>
+        <w:t xml:space="preserve">&lt;text&gt;</w:t>
+      </w:r>
+      <w:r>
+        <w:t xml:space="preserve">; the page's</w:t>
+      </w:r>
+      <w:r>
+        <w:t xml:space="preserve"> </w:t>
+      </w:r>
+      <w:r>
+        <w:t xml:space="preserve">CSS</w:t>
+      </w:r>
+      <w:r>
+        <w:t xml:space="preserve"> </w:t>
+      </w:r>
+      <w:r>
+        <w:rPr>
+          <w:rStyle w:val="VerbatimChar"/>
+        </w:rPr>
+        <w:t xml:space="preserve">fill</w:t>
+      </w:r>
+      <w:r>
+        <w:t xml:space="preserve"> </w:t>
+      </w:r>
+      <w:r>
+        <w:t xml:space="preserve">/</w:t>
+      </w:r>
+      <w:r>
+        <w:t xml:space="preserve"> </w:t>
+      </w:r>
+      <w:r>
+        <w:rPr>
+          <w:rStyle w:val="VerbatimChar"/>
+        </w:rPr>
+        <w:t xml:space="preserve">stroke</w:t>
+      </w:r>
+      <w:r>
+        <w:t xml:space="preserve"> </w:t>
+      </w:r>
+      <w:r>
+        <w:t xml:space="preserve">(</w:t>
+      </w:r>
+      <w:r>
+        <w:rPr>
+          <w:rStyle w:val="VerbatimChar"/>
+        </w:rPr>
+        <w:t xml:space="preserve">.icon path { fill: red }</w:t>
+      </w:r>
+      <w:r>
+        <w:t xml:space="preserve">) do not reach an inline</w:t>
+      </w:r>
+      <w:r>
+        <w:t xml:space="preserve"> </w:t>
+      </w:r>
+      <w:r>
+        <w:rPr>
+          <w:rStyle w:val="VerbatimChar"/>
+        </w:rPr>
+        <w:t xml:space="preserve">&lt;svg&gt;</w:t>
+      </w:r>
+      <w:r>
+        <w:t xml:space="preserve"> </w:t>
+      </w:r>
+      <w:r>
+        <w:t xml:space="preserve">-- libcss</w:t>
+      </w:r>
+      <w:r>
+        <w:t xml:space="preserve"> </w:t>
+      </w:r>
+      <w:r>
+        <w:t xml:space="preserve">has no</w:t>
+      </w:r>
+      <w:r>
+        <w:t xml:space="preserve"> </w:t>
+      </w:r>
+      <w:r>
+        <w:rPr>
+          <w:rStyle w:val="VerbatimChar"/>
+        </w:rPr>
+        <w:t xml:space="preserve">fill</w:t>
+      </w:r>
+      <w:r>
+        <w:t xml:space="preserve"> </w:t>
+      </w:r>
+      <w:r>
+        <w:t xml:space="preserve">/</w:t>
+      </w:r>
+      <w:r>
+        <w:t xml:space="preserve"> </w:t>
+      </w:r>
+      <w:r>
+        <w:rPr>
+          <w:rStyle w:val="VerbatimChar"/>
+        </w:rPr>
+        <w:t xml:space="preserve">stroke</w:t>
+      </w:r>
+      <w:r>
+        <w:t xml:space="preserve"> </w:t>
+      </w:r>
+      <w:r>
+        <w:t xml:space="preserve">properties (only</w:t>
+      </w:r>
+      <w:r>
+        <w:t xml:space="preserve"> </w:t>
+      </w:r>
+      <w:r>
+        <w:rPr>
+          <w:rStyle w:val="VerbatimChar"/>
+        </w:rPr>
+        <w:t xml:space="preserve">fill-opacity</w:t>
+      </w:r>
+      <w:r>
+        <w:t xml:space="preserve"> </w:t>
+      </w:r>
+      <w:r>
+        <w:t xml:space="preserve">/</w:t>
+      </w:r>
+      <w:r>
+        <w:t xml:space="preserve"> </w:t>
+      </w:r>
+      <w:r>
+        <w:rPr>
+          <w:rStyle w:val="VerbatimChar"/>
+        </w:rPr>
+        <w:t xml:space="preserve">stroke-opacity</w:t>
+      </w:r>
+      <w:r>
+        <w:t xml:space="preserve">): with them</w:t>
+      </w:r>
+      <w:r>
+        <w:t xml:space="preserve"> </w:t>
+      </w:r>
+      <w:r>
+        <w:t xml:space="preserve">(inherited, as text),</w:t>
+      </w:r>
+      <w:r>
+        <w:t xml:space="preserve"> </w:t>
+      </w:r>
+      <w:r>
+        <w:rPr>
+          <w:rStyle w:val="VerbatimChar"/>
+        </w:rPr>
+        <w:t xml:space="preserve">onyx_svg_inline.c</w:t>
+      </w:r>
+      <w:r>
+        <w:t xml:space="preserve"> </w:t>
+      </w:r>
+      <w:r>
+        <w:t xml:space="preserve">would write the</w:t>
+      </w:r>
+      <w:r>
+        <w:t xml:space="preserve"> </w:t>
+      </w:r>
+      <w:r>
+        <w:rPr>
+          <w:rStyle w:val="VerbatimChar"/>
+        </w:rPr>
+        <w:t xml:space="preserve">&lt;svg&gt;</w:t>
+      </w:r>
+      <w:r>
+        <w:t xml:space="preserve">'s computed ones on its</w:t>
+      </w:r>
+      <w:r>
+        <w:t xml:space="preserve"> </w:t>
+      </w:r>
+      <w:r>
+        <w:t xml:space="preserve">root; its</w:t>
+      </w:r>
+      <w:r>
+        <w:t xml:space="preserve"> </w:t>
+      </w:r>
+      <w:r>
+        <w:rPr>
+          <w:rStyle w:val="VerbatimChar"/>
+        </w:rPr>
+        <w:t xml:space="preserve">color</w:t>
+      </w:r>
+      <w:r>
+        <w:t xml:space="preserve">, its custom properties and the SVG's own attributes and</w:t>
+      </w:r>
+      <w:r>
+        <w:t xml:space="preserve"> </w:t>
+      </w:r>
+      <w:r>
+        <w:rPr>
+          <w:rStyle w:val="VerbatimChar"/>
+        </w:rPr>
+        <w:t xml:space="preserve">&lt;style&gt;</w:t>
+      </w:r>
+      <w:r>
+        <w:t xml:space="preserve"> </w:t>
+      </w:r>
+      <w:r>
+        <w:t xml:space="preserve">do. An</w:t>
+      </w:r>
+      <w:r>
+        <w:t xml:space="preserve"> </w:t>
+      </w:r>
+      <w:r>
+        <w:rPr>
+          <w:rStyle w:val="VerbatimChar"/>
+        </w:rPr>
+        <w:t xml:space="preserve">&lt;svg&gt;</w:t>
+      </w:r>
+      <w:r>
+        <w:t xml:space="preserve"> </w:t>
+      </w:r>
+      <w:r>
+        <w:t xml:space="preserve">/ SVG</w:t>
+      </w:r>
+      <w:r>
+        <w:t xml:space="preserve"> </w:t>
+      </w:r>
+      <w:r>
+        <w:rPr>
+          <w:rStyle w:val="VerbatimChar"/>
+        </w:rPr>
+        <w:t xml:space="preserve">&lt;img&gt;</w:t>
+      </w:r>
+      <w:r>
+        <w:t xml:space="preserve"> </w:t>
+      </w:r>
+      <w:r>
+        <w:t xml:space="preserve">with only a viewBox and no CSS size takes the viewBox's size (Chrome:</w:t>
+      </w:r>
+      <w:r>
+        <w:t xml:space="preserve"> </w:t>
+      </w:r>
+      <w:r>
+        <w:t xml:space="preserve">the containing block's width); a</w:t>
+      </w:r>
+      <w:r>
+        <w:t xml:space="preserve"> </w:t>
+      </w:r>
+      <w:r>
+        <w:rPr>
+          <w:rStyle w:val="VerbatimChar"/>
+        </w:rPr>
+        <w:t xml:space="preserve">list-style-image</w:t>
+      </w:r>
+      <w:r>
+        <w:t xml:space="preserve"> </w:t>
+      </w:r>
+      <w:r>
+        <w:t xml:space="preserve">SVG without a size is drawn at its</w:t>
+      </w:r>
+      <w:r>
+        <w:t xml:space="preserve"> </w:t>
+      </w:r>
+      <w:r>
+        <w:t xml:space="preserve">viewBox's size (Chrome: small). The scripts' SVG DOM is dom.js' generic one (</w:t>
+      </w:r>
+      <w:r>
+        <w:rPr>
+          <w:rStyle w:val="VerbatimChar"/>
+        </w:rPr>
+        <w:t xml:space="preserve">namespaceURI</w:t>
+      </w:r>
+      <w:r>
+        <w:t xml:space="preserve">,</w:t>
+      </w:r>
+      <w:r>
+        <w:t xml:space="preserve"> </w:t>
+      </w:r>
+      <w:r>
+        <w:rPr>
+          <w:rStyle w:val="VerbatimChar"/>
+        </w:rPr>
+        <w:t xml:space="preserve">getBBox</w:t>
+      </w:r>
+      <w:r>
+        <w:t xml:space="preserve"> </w:t>
+      </w:r>
+      <w:r>
+        <w:t xml:space="preserve">from the box).</w:t>
+      </w:r>
+    </w:p>
+    <w:p>
+      <w:pPr>
+        <w:pStyle w:val="Compact"/>
+        <w:numPr>
+          <w:ilvl w:val="0"/>
+          <w:numId w:val="1035"/>
+        </w:numPr>
+      </w:pPr>
+      <w:r>
+        <w:t xml:space="preserve">Canvas: no shadows, filters, blend modes (source-over), conic gradients (a solid colour),</w:t>
+      </w:r>
+      <w:r>
+        <w:t xml:space="preserve"> </w:t>
+      </w:r>
+      <w:r>
+        <w:t xml:space="preserve">per-corner</w:t>
+      </w:r>
+      <w:r>
+        <w:t xml:space="preserve"> </w:t>
+      </w:r>
+      <w:r>
+        <w:rPr>
+          <w:rStyle w:val="VerbatimChar"/>
+        </w:rPr>
+        <w:t xml:space="preserve">roundRect</w:t>
+      </w:r>
+      <w:r>
+        <w:t xml:space="preserve"> </w:t>
+      </w:r>
+      <w:r>
+        <w:t xml:space="preserve">radii;</w:t>
+      </w:r>
+      <w:r>
+        <w:t xml:space="preserve"> </w:t>
+      </w:r>
+      <w:r>
+        <w:rPr>
+          <w:rStyle w:val="VerbatimChar"/>
+        </w:rPr>
+        <w:t xml:space="preserve">drawImage</w:t>
+      </w:r>
+      <w:r>
+        <w:t xml:space="preserve"> </w:t>
+      </w:r>
+      <w:r>
+        <w:t xml:space="preserve">scales with the nearest pixel (PlutoVG's</w:t>
+      </w:r>
+      <w:r>
+        <w:t xml:space="preserve"> </w:t>
+      </w:r>
+      <w:r>
+        <w:t xml:space="preserve">textures), and a canvas shown at another CSS size too (the framebuffer's bitmap plot);</w:t>
+      </w:r>
+      <w:r>
+        <w:t xml:space="preserve"> </w:t>
+      </w:r>
+      <w:r>
+        <w:t xml:space="preserve">no</w:t>
+      </w:r>
+      <w:r>
+        <w:t xml:space="preserve"> </w:t>
+      </w:r>
+      <w:r>
+        <w:rPr>
+          <w:rStyle w:val="VerbatimChar"/>
+        </w:rPr>
+        <w:t xml:space="preserve">getContext('webgl')</w:t>
+      </w:r>
+      <w:r>
+        <w:t xml:space="preserve">,</w:t>
+      </w:r>
+      <w:r>
+        <w:t xml:space="preserve"> </w:t>
+      </w:r>
+      <w:r>
+        <w:rPr>
+          <w:rStyle w:val="VerbatimChar"/>
+        </w:rPr>
+        <w:t xml:space="preserve">captureStream</w:t>
+      </w:r>
+      <w:r>
+        <w:t xml:space="preserve">, video frames; the page's web fonts are not used</w:t>
+      </w:r>
+      <w:r>
+        <w:t xml:space="preserve"> </w:t>
+      </w:r>
+      <w:r>
+        <w:t xml:space="preserve">(the card's fonts by family).</w:t>
+      </w:r>
+    </w:p>
+    <w:p>
+      <w:pPr>
+        <w:pStyle w:val="Compact"/>
+        <w:numPr>
+          <w:ilvl w:val="0"/>
+          <w:numId w:val="1035"/>
+        </w:numPr>
+      </w:pPr>
+      <w:r>
+        <w:t xml:space="preserve">A face split by</w:t>
+      </w:r>
+      <w:r>
+        <w:t xml:space="preserve"> </w:t>
+      </w:r>
+      <w:r>
+        <w:rPr>
+          <w:rStyle w:val="VerbatimChar"/>
+        </w:rPr>
+        <w:t xml:space="preserve">unicode-range</w:t>
+      </w:r>
+      <w:r>
+        <w:t xml:space="preserve"> </w:t>
+      </w:r>
+      <w:r>
+        <w:t xml:space="preserve">outside Latin-1 falls back to the card's fonts.</w:t>
+      </w:r>
+    </w:p>
+    <w:p>
+      <w:pPr>
+        <w:pStyle w:val="Compact"/>
+        <w:numPr>
+          <w:ilvl w:val="0"/>
+          <w:numId w:val="1035"/>
+        </w:numPr>
+      </w:pPr>
+      <w:r>
         <w:t xml:space="preserve">Intl (§15): no</w:t>
       </w:r>
       <w:r>
@@ -49819,7 +52987,7 @@
         <w:t xml:space="preserve">(ja, zh, ko, ru, pl, sv, da, nb, fi, tr, cs) have English units, display names and zone names.</w:t>
       </w:r>
     </w:p>
-    <w:bookmarkEnd w:id="50"/>
+    <w:bookmarkEnd w:id="52"/>
     <w:sectPr>
       <w:footerReference r:id="rId9" w:type="default"/>
       <w:footnotePr>
@@ -50291,6 +53459,12 @@
     <w:abstractNumId w:val="991"/>
   </w:num>
   <w:num w:numId="1033">
+    <w:abstractNumId w:val="991"/>
+  </w:num>
+  <w:num w:numId="1034">
+    <w:abstractNumId w:val="991"/>
+  </w:num>
+  <w:num w:numId="1035">
     <w:abstractNumId w:val="991"/>
   </w:num>
 </w:numbering>

</xml_diff>

<commit_message>
docs: the 06 export (.docx) again
Co-Authored-By: Claude Opus 5.5 <noreply@anthropic.com>
Claude-Session: https://claude.ai/code/session_01UcY36na7Mp1DEYttKiw1pa
</commit_message>
<xml_diff>
--- a/docs/exports/06-NETSURF-CHANGES.docx
+++ b/docs/exports/06-NETSURF-CHANGES.docx
@@ -49716,7 +49716,22 @@
         <w:t xml:space="preserve"> </w:t>
       </w:r>
       <w:r>
-        <w:t xml:space="preserve">base URL is set); no src:</w:t>
+        <w:t xml:space="preserve">base URL is set); no src (or a</w:t>
+      </w:r>
+      <w:r>
+        <w:t xml:space="preserve"> </w:t>
+      </w:r>
+      <w:r>
+        <w:rPr>
+          <w:rStyle w:val="VerbatimChar"/>
+        </w:rPr>
+        <w:t xml:space="preserve">javascript:</w:t>
+      </w:r>
+      <w:r>
+        <w:t xml:space="preserve"> </w:t>
+      </w:r>
+      <w:r>
+        <w:t xml:space="preserve">one):</w:t>
       </w:r>
       <w:r>
         <w:t xml:space="preserve"> </w:t>
@@ -51621,7 +51636,7 @@
         <w:t xml:space="preserve"> </w:t>
       </w:r>
       <w:r>
-        <w:t xml:space="preserve">(52 checks: the parser's and a script's frames, srcdoc,</w:t>
+        <w:t xml:space="preserve">(55 checks: the parser's and a script's frames, srcdoc,</w:t>
       </w:r>
       <w:r>
         <w:t xml:space="preserve"> </w:t>

</xml_diff>